<commit_message>
docs: address professor review comments - front matter, intro, chapter 3
- Bib card: add committee role labels (Predsednik/Clan/Clan-mentor), trim
  abstract per tracked change.
- Delete Spisak listinga section entirely (professor: page not needed).
- Convert Spisak skracenica from a plain list to a 2-column table.
- Uvod: remove course-origin mention (not relevant to what's implemented),
  fix 'Aplikacija'->'Sistem' when describing the whole architecture, restore
  missing word via deployment/deployment terminology fix.
- Chapter 3: add stateless/stateful explanation (referenced in ch. 4 but
  never defined), add in-text citations [2]-[10] pointing to the existing
  bibliography (previously zero in-text citations anywhere in the paper),
  add a short expansion on why OpenTelemetry was chosen over vendor-specific
  APM alternatives.
</commit_message>
<xml_diff>
--- a/docs/diplomski-rad.docx
+++ b/docs/diplomski-rad.docx
@@ -2789,7 +2789,7 @@
                 <w:sz w:val="18"/>
                 <w:lang w:val="sr-Cyrl-RS"/>
               </w:rPr>
-              <w:t>У овом раду анализиран је постојећи пројекат Travel Planner (микросервисна апликација за планирање путовања, реализована на Microsoft Service Fabric платформи) са аспекта обсервабилности, идентификовани су недостаци постојећег решења (одсуство структурисаног логовања, метрика, дистрибуираног праћења захтева и health check механизама), и предложена је и имплементирана надоградња заснована на OpenTelemetry стандарду и Prometheus/Grafana Tempo/Grafana Loki/Grafana инфраструктури. Решење је верификовано кроз аутоматизоване тестове и кроз демонстрационе сценарије извршене над стварно постављеним системом.</w:t>
+              <w:t>У овом раду анализиран је постојећи пројекат Travel Planner (микросервисна апликација за планирање путовања, реализована на Microsoft Service Fabric платформи) са аспекта обсервабилности, идентификовани су недостаци постојећег решења (одсуство структурисаног логовања, метрика, дистрибуираног праћења захтева и health check механизама), и предложена је и имплементирана надоградња заснована на OpenTelemetry стандарду. Решење је верификовано кроз аутоматизоване тестове и кроз демонстрационе сценарије извршене над стварно постављеним системом.</w:t>
             </w:r>
             <w:r>
               <w:rPr>
@@ -3037,12 +3037,9 @@
             <w:tcMar/>
           </w:tcPr>
           <w:p>
-            <w:pPr>
-              <w:rPr>
-                <w:rFonts w:ascii="Arial" w:hAnsi="Arial"/>
-                <w:sz w:val="18"/>
-              </w:rPr>
-            </w:pPr>
+            <w:r>
+              <w:t>Председник</w:t>
+            </w:r>
           </w:p>
         </w:tc>
         <w:tc>
@@ -3086,12 +3083,9 @@
             <w:vAlign w:val="center"/>
           </w:tcPr>
           <w:p>
-            <w:pPr>
-              <w:rPr>
-                <w:rFonts w:ascii="Arial" w:hAnsi="Arial"/>
-                <w:sz w:val="18"/>
-              </w:rPr>
-            </w:pPr>
+            <w:r>
+              <w:t>Члан:</w:t>
+            </w:r>
           </w:p>
         </w:tc>
         <w:tc>
@@ -3183,12 +3177,9 @@
             <w:vAlign w:val="center"/>
           </w:tcPr>
           <w:p>
-            <w:pPr>
-              <w:rPr>
-                <w:rFonts w:ascii="Arial" w:hAnsi="Arial"/>
-                <w:sz w:val="18"/>
-              </w:rPr>
-            </w:pPr>
+            <w:r>
+              <w:t>Члан, ментор:</w:t>
+            </w:r>
           </w:p>
         </w:tc>
         <w:tc>
@@ -7780,49 +7771,6 @@
         <w:fldChar w:fldCharType="begin"/>
       </w:r>
       <w:r>
-        <w:instrText xml:space="preserve">HYPERLINK  \l  "_Toc1710500057" </w:instrText>
-      </w:r>
-      <w:r>
-        <w:fldChar w:fldCharType="separate"/>
-      </w:r>
-      <w:r>
-        <w:rPr/>
-        <w:t>Списак листинга</w:t>
-      </w:r>
-      <w:r>
-        <w:tab/>
-      </w:r>
-      <w:r>
-        <w:fldChar w:fldCharType="begin"/>
-      </w:r>
-      <w:r>
-        <w:instrText xml:space="preserve">PAGEREF _Toc1710500057 \h</w:instrText>
-      </w:r>
-      <w:r>
-        <w:fldChar w:fldCharType="separate"/>
-      </w:r>
-      <w:r>
-        <w:rPr/>
-        <w:t>8</w:t>
-      </w:r>
-      <w:r>
-        <w:fldChar w:fldCharType="end"/>
-      </w:r>
-      <w:r>
-        <w:fldChar w:fldCharType="end"/>
-      </w:r>
-    </w:p>
-    <w:p>
-      <w:pPr>
-        <w:pStyle w:val="TOC1"/>
-        <w:tabs>
-          <w:tab w:val="right" w:leader="dot" w:pos="9900"/>
-        </w:tabs>
-      </w:pPr>
-      <w:r>
-        <w:fldChar w:fldCharType="begin"/>
-      </w:r>
-      <w:r>
         <w:instrText xml:space="preserve">HYPERLINK  \l  "_Toc1443825020" </w:instrText>
       </w:r>
       <w:r>
@@ -8460,11 +8408,8 @@
           <w:ilvl w:val="0"/>
           <w:numId w:val="0"/>
         </w:numPr>
-        <w:rPr>
-          <w:lang w:val="sr-Cyrl-RS"/>
-        </w:rPr>
-      </w:pPr>
-      <w:bookmarkStart w:name="_Toc1710500057" w:id="2125982295"/>
+      </w:pPr>
+      <w:bookmarkStart w:name="_Toc1443825020" w:id="1997846591"/>
       <w:r>
         <w:rPr/>
         <w:t>Списак</w:t>
@@ -8474,39 +8419,6 @@
         <w:t xml:space="preserve"> </w:t>
       </w:r>
       <w:r>
-        <w:rPr>
-          <w:lang w:val="sr-Cyrl-RS"/>
-        </w:rPr>
-        <w:t>листинга</w:t>
-      </w:r>
-      <w:bookmarkEnd w:id="2125982295"/>
-    </w:p>
-    <w:p xmlns:wp14="http://schemas.microsoft.com/office/word/2010/wordml" wp14:textId="77777777">
-      <w:pPr>
-        <w:pStyle w:val="BodyText"/>
-      </w:pPr>
-      <w:r>
-        <w:t>Овај рад не садржи посебно нумерисане листинге изворног кода као засебне целине. Илустративни делови кода и конфигурације наведени су директно у тексту, референцирани именом фајла или класе (нпр. ObservabilityExtensions, TripServiceApp).</w:t>
-      </w:r>
-    </w:p>
-    <w:p>
-      <w:pPr>
-        <w:pStyle w:val="Heading1"/>
-        <w:numPr>
-          <w:ilvl w:val="0"/>
-          <w:numId w:val="0"/>
-        </w:numPr>
-      </w:pPr>
-      <w:bookmarkStart w:name="_Toc1443825020" w:id="1997846591"/>
-      <w:r>
-        <w:rPr/>
-        <w:t>Списак</w:t>
-      </w:r>
-      <w:r>
-        <w:rPr/>
-        <w:t xml:space="preserve"> </w:t>
-      </w:r>
-      <w:r>
         <w:rPr/>
         <w:t>скраћениц</w:t>
       </w:r>
@@ -8516,134 +8428,397 @@
       </w:r>
       <w:bookmarkEnd w:id="1997846591"/>
     </w:p>
-    <w:p xmlns:wp14="http://schemas.microsoft.com/office/word/2010/wordml" wp14:textId="77777777">
-      <w:pPr>
-        <w:pStyle w:val="BodyText"/>
-      </w:pPr>
-      <w:r>
-        <w:t>API — Application Programming Interface (програмски интерфејс за приступ функционалностима)</w:t>
-      </w:r>
-    </w:p>
-    <w:p xmlns:wp14="http://schemas.microsoft.com/office/word/2010/wordml" wp14:textId="77777777">
-      <w:pPr>
-        <w:pStyle w:val="BodyText"/>
-      </w:pPr>
-      <w:r>
-        <w:t>CI/CD — Continuous Integration / Continuous Delivery (континуирана интеграција и испорука)</w:t>
-      </w:r>
-    </w:p>
-    <w:p xmlns:wp14="http://schemas.microsoft.com/office/word/2010/wordml" wp14:textId="77777777">
-      <w:pPr>
-        <w:pStyle w:val="BodyText"/>
-      </w:pPr>
-      <w:r>
-        <w:t>CPU — Central Processing Unit (централна процесорска јединица)</w:t>
-      </w:r>
-    </w:p>
-    <w:p xmlns:wp14="http://schemas.microsoft.com/office/word/2010/wordml" wp14:textId="77777777">
-      <w:pPr>
-        <w:pStyle w:val="BodyText"/>
-      </w:pPr>
-      <w:r>
-        <w:t>EF Core — Entity Framework Core (ORM оквир коришћен за приступ бази података)</w:t>
-      </w:r>
-    </w:p>
-    <w:p xmlns:wp14="http://schemas.microsoft.com/office/word/2010/wordml" wp14:textId="77777777">
-      <w:pPr>
-        <w:pStyle w:val="BodyText"/>
-      </w:pPr>
-      <w:r>
-        <w:t>HTTP — HyperText Transfer Protocol (протокол преноса хипертекста)</w:t>
-      </w:r>
-    </w:p>
-    <w:p xmlns:wp14="http://schemas.microsoft.com/office/word/2010/wordml" wp14:textId="77777777">
-      <w:pPr>
-        <w:pStyle w:val="BodyText"/>
-      </w:pPr>
-      <w:r>
-        <w:t>IEEE — Institute of Electrical and Electronics Engineers (стандард цитирања коришћен у раду)</w:t>
-      </w:r>
-    </w:p>
-    <w:p xmlns:wp14="http://schemas.microsoft.com/office/word/2010/wordml" wp14:textId="77777777">
-      <w:pPr>
-        <w:pStyle w:val="BodyText"/>
-      </w:pPr>
-      <w:r>
-        <w:t>JWT — JSON Web Token (формат токена за аутентикацију)</w:t>
-      </w:r>
-    </w:p>
-    <w:p xmlns:wp14="http://schemas.microsoft.com/office/word/2010/wordml" wp14:textId="77777777">
-      <w:pPr>
-        <w:pStyle w:val="BodyText"/>
-      </w:pPr>
-      <w:r>
-        <w:t>OTel — OpenTelemetry (стандард обсервабилности коришћен у раду)</w:t>
-      </w:r>
-    </w:p>
-    <w:p xmlns:wp14="http://schemas.microsoft.com/office/word/2010/wordml" wp14:textId="77777777">
-      <w:pPr>
-        <w:pStyle w:val="BodyText"/>
-      </w:pPr>
-      <w:r>
-        <w:t>OTLP — OpenTelemetry Protocol (протокол преноса телеметрије ка Collector-у)</w:t>
-      </w:r>
-    </w:p>
-    <w:p xmlns:wp14="http://schemas.microsoft.com/office/word/2010/wordml" wp14:textId="77777777">
-      <w:pPr>
-        <w:pStyle w:val="BodyText"/>
-      </w:pPr>
-      <w:r>
-        <w:t>RED — Rate, Errors, Duration (стандардна група метрика: стопа захтева, стопа грешака, трајање)</w:t>
-      </w:r>
-    </w:p>
-    <w:p xmlns:wp14="http://schemas.microsoft.com/office/word/2010/wordml" wp14:textId="77777777">
-      <w:pPr>
-        <w:pStyle w:val="BodyText"/>
-      </w:pPr>
-      <w:r>
-        <w:t>REST — Representational State Transfer (архитектурни стил веб API-ја)</w:t>
-      </w:r>
-    </w:p>
-    <w:p xmlns:wp14="http://schemas.microsoft.com/office/word/2010/wordml" wp14:textId="77777777">
-      <w:pPr>
-        <w:pStyle w:val="BodyText"/>
-      </w:pPr>
-      <w:r>
-        <w:t>SDK — Software Development Kit (скуп алата и библиотека за развој)</w:t>
-      </w:r>
-    </w:p>
-    <w:p xmlns:wp14="http://schemas.microsoft.com/office/word/2010/wordml" wp14:textId="77777777">
-      <w:pPr>
-        <w:pStyle w:val="BodyText"/>
-      </w:pPr>
-      <w:r>
-        <w:t>SF — Service Fabric (Microsoft-ова платформа за микросервисну оркестрацију)</w:t>
-      </w:r>
-    </w:p>
-    <w:p xmlns:wp14="http://schemas.microsoft.com/office/word/2010/wordml" wp14:textId="77777777">
-      <w:pPr>
-        <w:pStyle w:val="BodyText"/>
-      </w:pPr>
-      <w:r>
-        <w:t>SQL — Structured Query Language (језик за рад са релационим базама података)</w:t>
-      </w:r>
-    </w:p>
-    <w:p xmlns:wp14="http://schemas.microsoft.com/office/word/2010/wordml" wp14:textId="77777777">
-      <w:pPr>
-        <w:pStyle w:val="BodyText"/>
-      </w:pPr>
-      <w:r>
-        <w:t>W3C — World Wide Web Consortium (стандард за пропагацију trace контекста, traceparent)</w:t>
-      </w:r>
-    </w:p>
-    <w:p xmlns:wp14="http://schemas.microsoft.com/office/word/2010/wordml" wp14:textId="77777777">
-      <w:pPr>
-        <w:pStyle w:val="BodyText"/>
-      </w:pPr>
-      <w:r>
-        <w:t>YARP — Yet Another Reverse Proxy (reverse proxy библиотека коришћена у Gateway-у)</w:t>
-      </w:r>
-    </w:p>
+    <w:tbl>
+      <w:tblPr>
+        <w:tblStyle w:val="TableGrid"/>
+        <w:tblW w:type="auto" w:w="0"/>
+        <w:tblLook w:firstColumn="1" w:firstRow="1" w:lastColumn="0" w:lastRow="0" w:noHBand="0" w:noVBand="1" w:val="04A0"/>
+      </w:tblPr>
+      <w:tblGrid>
+        <w:gridCol w:w="4961"/>
+        <w:gridCol w:w="4961"/>
+      </w:tblGrid>
+      <w:tr>
+        <w:tc>
+          <w:tcPr>
+            <w:tcW w:type="dxa" w:w="4961"/>
+          </w:tcPr>
+          <w:p>
+            <w:r>
+              <w:rPr>
+                <w:b/>
+              </w:rPr>
+              <w:t>Скраћеница</w:t>
+            </w:r>
+          </w:p>
+        </w:tc>
+        <w:tc>
+          <w:tcPr>
+            <w:tcW w:type="dxa" w:w="4961"/>
+          </w:tcPr>
+          <w:p>
+            <w:r>
+              <w:rPr>
+                <w:b/>
+              </w:rPr>
+              <w:t>Значење</w:t>
+            </w:r>
+          </w:p>
+        </w:tc>
+      </w:tr>
+      <w:tr>
+        <w:tc>
+          <w:tcPr>
+            <w:tcW w:type="dxa" w:w="4961"/>
+          </w:tcPr>
+          <w:p>
+            <w:r>
+              <w:t>API</w:t>
+            </w:r>
+          </w:p>
+        </w:tc>
+        <w:tc>
+          <w:tcPr>
+            <w:tcW w:type="dxa" w:w="4961"/>
+          </w:tcPr>
+          <w:p>
+            <w:r>
+              <w:t>Application Programming Interface (програмски интерфејс за приступ функционалностима)</w:t>
+            </w:r>
+          </w:p>
+        </w:tc>
+      </w:tr>
+      <w:tr>
+        <w:tc>
+          <w:tcPr>
+            <w:tcW w:type="dxa" w:w="4961"/>
+          </w:tcPr>
+          <w:p>
+            <w:r>
+              <w:t>CI/CD</w:t>
+            </w:r>
+          </w:p>
+        </w:tc>
+        <w:tc>
+          <w:tcPr>
+            <w:tcW w:type="dxa" w:w="4961"/>
+          </w:tcPr>
+          <w:p>
+            <w:r>
+              <w:t>Continuous Integration / Continuous Delivery (континуирана интеграција и испорука)</w:t>
+            </w:r>
+          </w:p>
+        </w:tc>
+      </w:tr>
+      <w:tr>
+        <w:tc>
+          <w:tcPr>
+            <w:tcW w:type="dxa" w:w="4961"/>
+          </w:tcPr>
+          <w:p>
+            <w:r>
+              <w:t>CPU</w:t>
+            </w:r>
+          </w:p>
+        </w:tc>
+        <w:tc>
+          <w:tcPr>
+            <w:tcW w:type="dxa" w:w="4961"/>
+          </w:tcPr>
+          <w:p>
+            <w:r>
+              <w:t>Central Processing Unit (централна процесорска јединица)</w:t>
+            </w:r>
+          </w:p>
+        </w:tc>
+      </w:tr>
+      <w:tr>
+        <w:tc>
+          <w:tcPr>
+            <w:tcW w:type="dxa" w:w="4961"/>
+          </w:tcPr>
+          <w:p>
+            <w:r>
+              <w:t>EF Core</w:t>
+            </w:r>
+          </w:p>
+        </w:tc>
+        <w:tc>
+          <w:tcPr>
+            <w:tcW w:type="dxa" w:w="4961"/>
+          </w:tcPr>
+          <w:p>
+            <w:r>
+              <w:t>Entity Framework Core (ORM оквир коришћен за приступ бази података)</w:t>
+            </w:r>
+          </w:p>
+        </w:tc>
+      </w:tr>
+      <w:tr>
+        <w:tc>
+          <w:tcPr>
+            <w:tcW w:type="dxa" w:w="4961"/>
+          </w:tcPr>
+          <w:p>
+            <w:r>
+              <w:t>HTTP</w:t>
+            </w:r>
+          </w:p>
+        </w:tc>
+        <w:tc>
+          <w:tcPr>
+            <w:tcW w:type="dxa" w:w="4961"/>
+          </w:tcPr>
+          <w:p>
+            <w:r>
+              <w:t>HyperText Transfer Protocol (протокол преноса хипертекста)</w:t>
+            </w:r>
+          </w:p>
+        </w:tc>
+      </w:tr>
+      <w:tr>
+        <w:tc>
+          <w:tcPr>
+            <w:tcW w:type="dxa" w:w="4961"/>
+          </w:tcPr>
+          <w:p>
+            <w:r>
+              <w:t>IEEE</w:t>
+            </w:r>
+          </w:p>
+        </w:tc>
+        <w:tc>
+          <w:tcPr>
+            <w:tcW w:type="dxa" w:w="4961"/>
+          </w:tcPr>
+          <w:p>
+            <w:r>
+              <w:t>Institute of Electrical and Electronics Engineers (стандард цитирања коришћен у раду)</w:t>
+            </w:r>
+          </w:p>
+        </w:tc>
+      </w:tr>
+      <w:tr>
+        <w:tc>
+          <w:tcPr>
+            <w:tcW w:type="dxa" w:w="4961"/>
+          </w:tcPr>
+          <w:p>
+            <w:r>
+              <w:t>JWT</w:t>
+            </w:r>
+          </w:p>
+        </w:tc>
+        <w:tc>
+          <w:tcPr>
+            <w:tcW w:type="dxa" w:w="4961"/>
+          </w:tcPr>
+          <w:p>
+            <w:r>
+              <w:t>JSON Web Token (формат токена за аутентикацију)</w:t>
+            </w:r>
+          </w:p>
+        </w:tc>
+      </w:tr>
+      <w:tr>
+        <w:tc>
+          <w:tcPr>
+            <w:tcW w:type="dxa" w:w="4961"/>
+          </w:tcPr>
+          <w:p>
+            <w:r>
+              <w:t>OTel</w:t>
+            </w:r>
+          </w:p>
+        </w:tc>
+        <w:tc>
+          <w:tcPr>
+            <w:tcW w:type="dxa" w:w="4961"/>
+          </w:tcPr>
+          <w:p>
+            <w:r>
+              <w:t>OpenTelemetry (стандард обсервабилности коришћен у раду)</w:t>
+            </w:r>
+          </w:p>
+        </w:tc>
+      </w:tr>
+      <w:tr>
+        <w:tc>
+          <w:tcPr>
+            <w:tcW w:type="dxa" w:w="4961"/>
+          </w:tcPr>
+          <w:p>
+            <w:r>
+              <w:t>OTLP</w:t>
+            </w:r>
+          </w:p>
+        </w:tc>
+        <w:tc>
+          <w:tcPr>
+            <w:tcW w:type="dxa" w:w="4961"/>
+          </w:tcPr>
+          <w:p>
+            <w:r>
+              <w:t>OpenTelemetry Protocol (протокол преноса телеметрије ка Collector-у)</w:t>
+            </w:r>
+          </w:p>
+        </w:tc>
+      </w:tr>
+      <w:tr>
+        <w:tc>
+          <w:tcPr>
+            <w:tcW w:type="dxa" w:w="4961"/>
+          </w:tcPr>
+          <w:p>
+            <w:r>
+              <w:t>RED</w:t>
+            </w:r>
+          </w:p>
+        </w:tc>
+        <w:tc>
+          <w:tcPr>
+            <w:tcW w:type="dxa" w:w="4961"/>
+          </w:tcPr>
+          <w:p>
+            <w:r>
+              <w:t>Rate, Errors, Duration (стандардна група метрика: стопа захтева, стопа грешака, трајање)</w:t>
+            </w:r>
+          </w:p>
+        </w:tc>
+      </w:tr>
+      <w:tr>
+        <w:tc>
+          <w:tcPr>
+            <w:tcW w:type="dxa" w:w="4961"/>
+          </w:tcPr>
+          <w:p>
+            <w:r>
+              <w:t>REST</w:t>
+            </w:r>
+          </w:p>
+        </w:tc>
+        <w:tc>
+          <w:tcPr>
+            <w:tcW w:type="dxa" w:w="4961"/>
+          </w:tcPr>
+          <w:p>
+            <w:r>
+              <w:t>Representational State Transfer (архитектурни стил веб API-ја)</w:t>
+            </w:r>
+          </w:p>
+        </w:tc>
+      </w:tr>
+      <w:tr>
+        <w:tc>
+          <w:tcPr>
+            <w:tcW w:type="dxa" w:w="4961"/>
+          </w:tcPr>
+          <w:p>
+            <w:r>
+              <w:t>SDK</w:t>
+            </w:r>
+          </w:p>
+        </w:tc>
+        <w:tc>
+          <w:tcPr>
+            <w:tcW w:type="dxa" w:w="4961"/>
+          </w:tcPr>
+          <w:p>
+            <w:r>
+              <w:t>Software Development Kit (скуп алата и библиотека за развој)</w:t>
+            </w:r>
+          </w:p>
+        </w:tc>
+      </w:tr>
+      <w:tr>
+        <w:tc>
+          <w:tcPr>
+            <w:tcW w:type="dxa" w:w="4961"/>
+          </w:tcPr>
+          <w:p>
+            <w:r>
+              <w:t>SF</w:t>
+            </w:r>
+          </w:p>
+        </w:tc>
+        <w:tc>
+          <w:tcPr>
+            <w:tcW w:type="dxa" w:w="4961"/>
+          </w:tcPr>
+          <w:p>
+            <w:r>
+              <w:t>Service Fabric (Microsoft-ова платформа за микросервисну оркестрацију)</w:t>
+            </w:r>
+          </w:p>
+        </w:tc>
+      </w:tr>
+      <w:tr>
+        <w:tc>
+          <w:tcPr>
+            <w:tcW w:type="dxa" w:w="4961"/>
+          </w:tcPr>
+          <w:p>
+            <w:r>
+              <w:t>SQL</w:t>
+            </w:r>
+          </w:p>
+        </w:tc>
+        <w:tc>
+          <w:tcPr>
+            <w:tcW w:type="dxa" w:w="4961"/>
+          </w:tcPr>
+          <w:p>
+            <w:r>
+              <w:t>Structured Query Language (језик за рад са релационим базама података)</w:t>
+            </w:r>
+          </w:p>
+        </w:tc>
+      </w:tr>
+      <w:tr>
+        <w:tc>
+          <w:tcPr>
+            <w:tcW w:type="dxa" w:w="4961"/>
+          </w:tcPr>
+          <w:p>
+            <w:r>
+              <w:t>W3C</w:t>
+            </w:r>
+          </w:p>
+        </w:tc>
+        <w:tc>
+          <w:tcPr>
+            <w:tcW w:type="dxa" w:w="4961"/>
+          </w:tcPr>
+          <w:p>
+            <w:r>
+              <w:t>World Wide Web Consortium (стандард за пропагацију trace контекста, traceparent)</w:t>
+            </w:r>
+          </w:p>
+        </w:tc>
+      </w:tr>
+      <w:tr>
+        <w:tc>
+          <w:tcPr>
+            <w:tcW w:type="dxa" w:w="4961"/>
+          </w:tcPr>
+          <w:p>
+            <w:r>
+              <w:t>YARP</w:t>
+            </w:r>
+          </w:p>
+        </w:tc>
+        <w:tc>
+          <w:tcPr>
+            <w:tcW w:type="dxa" w:w="4961"/>
+          </w:tcPr>
+          <w:p>
+            <w:r>
+              <w:t>Yet Another Reverse Proxy (reverse proxy библиотека коришћена у Gateway-у)</w:t>
+            </w:r>
+          </w:p>
+        </w:tc>
+      </w:tr>
+    </w:tbl>
     <w:p>
       <w:pPr>
         <w:pStyle w:val="Heading1"/>
@@ -8669,7 +8844,7 @@
         <w:pStyle w:val="BodyText"/>
       </w:pPr>
       <w:r>
-        <w:t>Овај рад настао је као надоградња постојећег пројекта Travel Planner — веб апликације за планирање путовања, реализоване у оквиру предмета Примена веб програмирања у инфраструктурним системима. Travel Planner омогућава кориснику да на једном месту организује план путовања: основне податке о путовању, дестинације, дневне активности (са приказом кроз календар), трошкове и буџет, белешке, подсетнике, checklist/packing листу, као и дељење плана путем кода или QR кода са другим особама.</w:t>
+        <w:t>Travel Planner је микросервисна веб апликација за планирање путовања која кориснику омогућава да на једном месту организује план путовања: основне податке о путовању, дестинације, дневне активности (са приказом кроз календар), трошкове и буџет, белешке, подсетнике, checklist/packing листу, као и дељење плана путем кода или QR кода са другим особама. Овај рад се бави имплементацијом обсервабилности над постојећим системом Travel Planner.</w:t>
       </w:r>
     </w:p>
     <w:p xmlns:wp14="http://schemas.microsoft.com/office/word/2010/wordml" wp14:textId="77777777">
@@ -8677,7 +8852,7 @@
         <w:pStyle w:val="BodyText"/>
       </w:pPr>
       <w:r>
-        <w:t>Апликација је реализована као микросервисна архитектура на платформи Microsoft Service Fabric, са четири одвојена сервиса (Gateway, AuthService, TripService, SharingService) и базом података по сервису (database-per-service) у Microsoft SQL Server-у. Оваква архитектура доноси познате предности микросервиса — независно скалирање, одвојен развој и деплојмент по сервису — али и познат проблем: један корисников захтев често пролази кроз више процеса, база и мрежних позива, па постаје знатно теже одговорити на питања попут „зашто је овај захтев спор?“, „где тачно долази до грешке?“ или „да ли је систем тренутно здрав?“ него код монолитне апликације.</w:t>
+        <w:t>Систем је реализован као микросервисна архитектура на платформи Microsoft Service Fabric, са четири одвојена сервиса (Gateway, AuthService, TripService, SharingService) и базом података по сервису (database-per-service) у Microsoft SQL Server-у. Оваква архитектура доноси познате предности микросервиса — независно скалирање, одвојен развој и деплојмент по сервису — али и познат проблем: један корисников захтев често пролази кроз више процеса, база и мрежних позива, па постаје знатно теже одговорити на питања попут „зашто је овај захтев спор?“, „где тачно долази до грешке?“ или „да ли је систем тренутно здрав?“ него код монолитне апликације.</w:t>
       </w:r>
     </w:p>
     <w:p xmlns:wp14="http://schemas.microsoft.com/office/word/2010/wordml" wp14:textId="05DDD3D1">
@@ -9932,7 +10107,15 @@
         <w:pStyle w:val="BodyText"/>
       </w:pPr>
       <w:r>
-        <w:t>Backend четири сервиса (Gateway, AuthService, TripService, SharingService) реализован је у C#/.NET 8, хостован на Microsoft Service Fabric платформи (stateless сервиси за Gateway/AuthService/TripService, stateful за SharingService), уз Entity Framework Core 8 за приступ подацима, YARP (Yet Another Reverse Proxy) за Gateway рутирање, BCrypt.Net за хеширање лозинки и JWT Bearer аутентикацију. Подаци се чувају у Microsoft SQL Server бази, по принципу database-per-service (UsersDB, TripsDB, SharingDB). Frontend је React 19 (Vite) апликација која комуницира искључиво преко Gateway-а.</w:t>
+        <w:t>Backend четири сервиса (Gateway, AuthService, TripService, SharingService) реализован је у C#/.NET 8, хостован на Microsoft Service Fabric платформи [4] (stateless сервиси за Gateway/AuthService/TripService, stateful за SharingService), уз Entity Framework Core 8 за приступ подацима, YARP (Yet Another Reverse Proxy) [5] за Gateway рутирање, BCrypt.Net за хеширање лозинки и JWT Bearer аутентикацију. Подаци се чувају у Microsoft SQL Server бази, по принципу database-per-service (UsersDB, TripsDB, SharingDB). Frontend је React 19 (Vite) апликација која комуницира искључиво преко Gateway-а.</w:t>
+      </w:r>
+    </w:p>
+    <w:p>
+      <w:pPr>
+        <w:pStyle w:val="BodyText"/>
+      </w:pPr>
+      <w:r>
+        <w:t>У контексту Service Fabric платформе, stateless сервис не чува стање између позива на самом чвору — сваки захтев се може опслужити било којом инстанцом, а трајно стање се чува искључиво у спољној бази (SQL Server). Stateful сервис, насупрот томе, поседује локално, реплицирано стање непосредно на Service Fabric чворовима (Reliable Collections), поред спољне базе — тако да поједини подаци могу да се читају без мрежног позива ка бази. У овом пројекту, три сервиса (Gateway, AuthService, TripService) су stateless, док је SharingService stateful — детаљније објашњено у поглављу 4.</w:t>
       </w:r>
     </w:p>
     <w:p xmlns:wp14="http://schemas.microsoft.com/office/word/2010/wordml" wp14:textId="77777777">
@@ -9948,7 +10131,15 @@
         <w:pStyle w:val="BodyText"/>
       </w:pPr>
       <w:r>
-        <w:t>OpenTelemetry (OTel) изабран је као централни стандард надоградње јер обједињује сва три облика телеметрије (traces, metrics, logs) под једним, vendor-неутралним API-јем и SDK-ом, са великим бројем готових ("auto") инструментација управо за технологије које пројекат већ користи — ASP.NET Core, HttpClient, SqlClient — тако да се велик део вредности добија без писања сопственог инструментационог кода. Верзија OpenTelemetry .NET SDK-а коришћена у раду је 1.18.0, конзистентна кроз сва четири сервиса.</w:t>
+        <w:t>OpenTelemetry (OTel) изабран је као централни стандард надоградње јер обједињује сва три облика телеметрије (traces, metrics, logs) под једним, vendor-неутралним API-јем и SDK-ом [2], са великим бројем готових ("auto") инструментација управо за технологије које пројекат већ користи — ASP.NET Core, HttpClient, SqlClient — тако да се велик део вредности добија без писања сопственог инструментационог кода. Верзија OpenTelemetry .NET SDK-а коришћена у раду је 1.18.0, конзистентна кроз сва четири сервиса.</w:t>
+      </w:r>
+    </w:p>
+    <w:p>
+      <w:pPr>
+        <w:pStyle w:val="BodyText"/>
+      </w:pPr>
+      <w:r>
+        <w:t>Алтернативе попут Application Insights-а или vendor-специфичних APM решења (нпр. Datadog, New Relic) су разматране, али одбачене управо због vendor lock-in-а — OTel омогућава промену backend-а за складиштење (Prometheus/Tempo/Loki → неко друго решење) без измене иједног сервиса, пошто је инструментациони код одвојен од места где телеметрија завршава.</w:t>
       </w:r>
     </w:p>
     <w:p xmlns:wp14="http://schemas.microsoft.com/office/word/2010/wordml" wp14:textId="77777777">
@@ -9964,7 +10155,7 @@
         <w:pStyle w:val="BodyText"/>
       </w:pPr>
       <w:r>
-        <w:t>Сервиси не шаљу телеметрију директно ка Prometheus/Tempo/Loki, већ ка једном централном OpenTelemetry Collector-у (OTLP протокол, gRPC на порту 4317). Ово раздваја „како апликација емитује телеметрију” од „где та телеметрија завршава” — каснија измена backend-а за складиштење (нпр. замена Loki-ја другим решењем) не би захтевала измену ниједног сервиса, само Collector-ове конфигурације.</w:t>
+        <w:t>Сервиси не шаљу телеметрију директно ка Prometheus/Tempo/Loki, већ ка једном централном OpenTelemetry Collector-у (OTLP протокол, gRPC на порту 4317). Ово раздваја „како апликација емитује телеметрију” од „где та телеметрија завршава” — каснија измена backend-а за складиштење (нпр. замена Loki-ја другим решењем) не би захтевала измену ниједног сервиса, само Collector-ове конфигурације [10].</w:t>
       </w:r>
     </w:p>
     <w:p xmlns:wp14="http://schemas.microsoft.com/office/word/2010/wordml" wp14:textId="77777777">
@@ -9980,7 +10171,7 @@
         <w:pStyle w:val="BodyText"/>
       </w:pPr>
       <w:r>
-        <w:t>За складиштење три врсте телеметрије изабран је такозвани „Grafana stack”: Prometheus за метрике (Collector излаже Prometheus-компатибилан /metrics endpoint који Prometheus периодично scrape-ује), Grafana Tempo за дистрибуирано праћење захтева (trace-ове), и Grafana Loki за централизоване логове. Предност ове комбинације над, на пример, самостојећим Jaeger-ом за tracing јесте што све три компоненте имају нативну, provisioned интеграцију са Grafanom — укључујући унакрсну навигацију (клик са log линије на њен trace, клик са trace-а на метрику) која је директно демонстрирана у поглављу 5.</w:t>
+        <w:t>За складиштење три врсте телеметрије изабран је такозвани „Grafana stack”: Prometheus [9] за метрике (Collector излаже Prometheus-компатибилан /metrics endpoint који Prometheus периодично scrape-ује), Grafana Tempo [6] за дистрибуирано праћење захтева (trace-ове), и Grafana Loki [7] за централизоване логове. Предност ове комбинације над, на пример, самостојећим Jaeger-ом за tracing јесте што све три компоненте имају нативну, provisioned интеграцију са Grafanom — укључујући унакрсну навигацију (клик са log линије на њен trace, клик са trace-а на метрику) која је директно демонстрирана у поглављу 5.</w:t>
       </w:r>
     </w:p>
     <w:p xmlns:wp14="http://schemas.microsoft.com/office/word/2010/wordml" wp14:textId="77777777">
@@ -10012,7 +10203,7 @@
         <w:pStyle w:val="BodyText"/>
       </w:pPr>
       <w:r>
-        <w:t>Коришћен је уграђен ASP.NET Core механизам (Microsoft.Extensions.Diagnostics.HealthChecks), допуњен пакетом AspNetCore.HealthChecks.SqlServer (верзија 9.0.0, компатибилна са .NET 8) за проверу доступности SQL Server базе по сервису.</w:t>
+        <w:t>Коришћен је уграђен ASP.NET Core механизам (Microsoft.Extensions.Diagnostics.HealthChecks), допуњен пакетом AspNetCore.HealthChecks.SqlServer (верзија 9.0.0, компатибилна са .NET 8) за проверу доступности SQL Server базе по сервису [3].</w:t>
       </w:r>
     </w:p>
     <w:p xmlns:wp14="http://schemas.microsoft.com/office/word/2010/wordml" wp14:textId="77777777">
@@ -10028,7 +10219,7 @@
         <w:pStyle w:val="BodyText"/>
       </w:pPr>
       <w:r>
-        <w:t>За демонстрацију понашања система под оптерећењем (сценарио 3, поглавље 5) коришћен је k6 (Grafana k6), алат за load testing чији се скриптовани сценарији пишу у JavaScript-у, што га чини лакшим за одржавање и читање у односу на алтернативе попут JMeter-а.</w:t>
+        <w:t>За демонстрацију понашања система под оптерећењем (сценарио 3, поглавље 5) коришћен је k6 (Grafana k6), алат за load testing чији се скриптовани сценарији пишу у JavaScript-у, што га чини лакшим за одржавање и читање у односу на алтернативе попут JMeter-а [8].</w:t>
       </w:r>
     </w:p>
     <w:p xmlns:wp14="http://schemas.microsoft.com/office/word/2010/wordml" wp14:textId="77777777">

</xml_diff>

<commit_message>
docs: conclusion itemized shortcomings, recompute all static page numbers
- Zakljucak: expand into an itemized list of identified shortcomings
  (mirrors the existing bullet-list style already used for 'Pravci daljeg
  razvoja'), per professor comment.
- Recompute all static page-number references (Sadrzaj TOC, Spisak slika,
  Spisak tabela) after this session's structural changes (deleted Spisak
  listinga page, chapter 3/4 expansions, scenario move to chapter 6)
  changed the page count from 25 to 23 (LibreOffice render). Also fixed
  Spisak tabela listing order (6.1 now listed before 6.2, previously
  reversed).
- Note: page numbers are LibreOffice-derived: needs verification against
  the real Word page count, consistent with this document's established
  pattern of LibreOffice/Word pagination differing slightly.
</commit_message>
<xml_diff>
--- a/docs/diplomski-rad.docx
+++ b/docs/diplomski-rad.docx
@@ -7673,49 +7673,27 @@
         </w:tabs>
       </w:pPr>
       <w:r>
-        <w:fldChar w:fldCharType="begin"/>
-      </w:r>
-      <w:r>
-        <w:instrText xml:space="preserve">TOC \o "1-3" \z \u \h</w:instrText>
-      </w:r>
-      <w:r>
-        <w:fldChar w:fldCharType="separate"/>
-      </w:r>
-      <w:r>
-        <w:fldChar w:fldCharType="begin"/>
-      </w:r>
-      <w:r>
-        <w:instrText xml:space="preserve">HYPERLINK  \l  "_Toc573034250" </w:instrText>
-      </w:r>
-      <w:r>
-        <w:fldChar w:fldCharType="separate"/>
-      </w:r>
-      <w:r>
-        <w:rPr/>
         <w:t>Списак слика</w:t>
-      </w:r>
-      <w:r>
         <w:tab/>
-      </w:r>
-      <w:r>
-        <w:fldChar w:fldCharType="begin"/>
-      </w:r>
-      <w:r>
-        <w:instrText xml:space="preserve">PAGEREF _Toc573034250 \h</w:instrText>
-      </w:r>
-      <w:r>
-        <w:fldChar w:fldCharType="separate"/>
-      </w:r>
-      <w:r>
-        <w:rPr/>
-        <w:t>6</w:t>
-      </w:r>
-      <w:r>
-        <w:fldChar w:fldCharType="end"/>
-      </w:r>
-      <w:r>
-        <w:fldChar w:fldCharType="end"/>
-      </w:r>
+        <w:t>1</w:t>
+      </w:r>
+      <w:r/>
+      <w:r/>
+      <w:r/>
+      <w:r/>
+      <w:r/>
+      <w:r>
+        <w:rPr/>
+      </w:r>
+      <w:r/>
+      <w:r/>
+      <w:r/>
+      <w:r/>
+      <w:r>
+        <w:rPr/>
+      </w:r>
+      <w:r/>
+      <w:r/>
     </w:p>
     <w:p>
       <w:pPr>
@@ -7725,40 +7703,24 @@
         </w:tabs>
       </w:pPr>
       <w:r>
-        <w:fldChar w:fldCharType="begin"/>
-      </w:r>
-      <w:r>
-        <w:instrText xml:space="preserve">HYPERLINK  \l  "_Toc984522453" </w:instrText>
-      </w:r>
-      <w:r>
-        <w:fldChar w:fldCharType="separate"/>
-      </w:r>
-      <w:r>
-        <w:rPr/>
         <w:t>Списак табела</w:t>
-      </w:r>
-      <w:r>
         <w:tab/>
-      </w:r>
-      <w:r>
-        <w:fldChar w:fldCharType="begin"/>
-      </w:r>
-      <w:r>
-        <w:instrText xml:space="preserve">PAGEREF _Toc984522453 \h</w:instrText>
-      </w:r>
-      <w:r>
-        <w:fldChar w:fldCharType="separate"/>
-      </w:r>
-      <w:r>
-        <w:rPr/>
-        <w:t>7</w:t>
-      </w:r>
-      <w:r>
-        <w:fldChar w:fldCharType="end"/>
-      </w:r>
-      <w:r>
-        <w:fldChar w:fldCharType="end"/>
-      </w:r>
+        <w:t>2</w:t>
+      </w:r>
+      <w:r/>
+      <w:r/>
+      <w:r>
+        <w:rPr/>
+      </w:r>
+      <w:r/>
+      <w:r/>
+      <w:r/>
+      <w:r/>
+      <w:r>
+        <w:rPr/>
+      </w:r>
+      <w:r/>
+      <w:r/>
     </w:p>
     <w:p>
       <w:pPr>
@@ -7768,40 +7730,24 @@
         </w:tabs>
       </w:pPr>
       <w:r>
-        <w:fldChar w:fldCharType="begin"/>
-      </w:r>
-      <w:r>
-        <w:instrText xml:space="preserve">HYPERLINK  \l  "_Toc1443825020" </w:instrText>
-      </w:r>
-      <w:r>
-        <w:fldChar w:fldCharType="separate"/>
-      </w:r>
-      <w:r>
-        <w:rPr/>
         <w:t>Списак скраћеница</w:t>
-      </w:r>
-      <w:r>
         <w:tab/>
-      </w:r>
-      <w:r>
-        <w:fldChar w:fldCharType="begin"/>
-      </w:r>
-      <w:r>
-        <w:instrText xml:space="preserve">PAGEREF _Toc1443825020 \h</w:instrText>
-      </w:r>
-      <w:r>
-        <w:fldChar w:fldCharType="separate"/>
-      </w:r>
-      <w:r>
-        <w:rPr/>
-        <w:t>9</w:t>
-      </w:r>
-      <w:r>
-        <w:fldChar w:fldCharType="end"/>
-      </w:r>
-      <w:r>
-        <w:fldChar w:fldCharType="end"/>
-      </w:r>
+        <w:t>3</w:t>
+      </w:r>
+      <w:r/>
+      <w:r/>
+      <w:r>
+        <w:rPr/>
+      </w:r>
+      <w:r/>
+      <w:r/>
+      <w:r/>
+      <w:r/>
+      <w:r>
+        <w:rPr/>
+      </w:r>
+      <w:r/>
+      <w:r/>
     </w:p>
     <w:p>
       <w:pPr>
@@ -7812,47 +7758,30 @@
         </w:tabs>
       </w:pPr>
       <w:r>
-        <w:fldChar w:fldCharType="begin"/>
-      </w:r>
-      <w:r>
-        <w:instrText xml:space="preserve">HYPERLINK  \l  "_Toc1618048127" </w:instrText>
-      </w:r>
-      <w:r>
-        <w:fldChar w:fldCharType="separate"/>
-      </w:r>
-      <w:r>
-        <w:rPr/>
         <w:t>1.</w:t>
-      </w:r>
-      <w:r>
         <w:tab/>
-      </w:r>
-      <w:r>
-        <w:rPr/>
         <w:t>Увод</w:t>
-      </w:r>
-      <w:r>
         <w:tab/>
-      </w:r>
-      <w:r>
-        <w:fldChar w:fldCharType="begin"/>
-      </w:r>
-      <w:r>
-        <w:instrText xml:space="preserve">PAGEREF _Toc1618048127 \h</w:instrText>
-      </w:r>
-      <w:r>
-        <w:fldChar w:fldCharType="separate"/>
-      </w:r>
-      <w:r>
-        <w:rPr/>
-        <w:t>10</w:t>
-      </w:r>
-      <w:r>
-        <w:fldChar w:fldCharType="end"/>
-      </w:r>
-      <w:r>
-        <w:fldChar w:fldCharType="end"/>
-      </w:r>
+        <w:t>4</w:t>
+      </w:r>
+      <w:r/>
+      <w:r/>
+      <w:r>
+        <w:rPr/>
+      </w:r>
+      <w:r/>
+      <w:r>
+        <w:rPr/>
+      </w:r>
+      <w:r/>
+      <w:r/>
+      <w:r/>
+      <w:r/>
+      <w:r>
+        <w:rPr/>
+      </w:r>
+      <w:r/>
+      <w:r/>
     </w:p>
     <w:p>
       <w:pPr>
@@ -7863,47 +7792,30 @@
         </w:tabs>
       </w:pPr>
       <w:r>
-        <w:fldChar w:fldCharType="begin"/>
-      </w:r>
-      <w:r>
-        <w:instrText xml:space="preserve">HYPERLINK  \l  "_Toc776203058" </w:instrText>
-      </w:r>
-      <w:r>
-        <w:fldChar w:fldCharType="separate"/>
-      </w:r>
-      <w:r>
-        <w:rPr/>
         <w:t>2.</w:t>
-      </w:r>
-      <w:r>
         <w:tab/>
-      </w:r>
-      <w:r>
-        <w:rPr/>
         <w:t>Опис проблема</w:t>
-      </w:r>
-      <w:r>
         <w:tab/>
-      </w:r>
-      <w:r>
-        <w:fldChar w:fldCharType="begin"/>
-      </w:r>
-      <w:r>
-        <w:instrText xml:space="preserve">PAGEREF _Toc776203058 \h</w:instrText>
-      </w:r>
-      <w:r>
-        <w:fldChar w:fldCharType="separate"/>
-      </w:r>
-      <w:r>
-        <w:rPr/>
-        <w:t>11</w:t>
-      </w:r>
-      <w:r>
-        <w:fldChar w:fldCharType="end"/>
-      </w:r>
-      <w:r>
-        <w:fldChar w:fldCharType="end"/>
-      </w:r>
+        <w:t>5</w:t>
+      </w:r>
+      <w:r/>
+      <w:r/>
+      <w:r>
+        <w:rPr/>
+      </w:r>
+      <w:r/>
+      <w:r>
+        <w:rPr/>
+      </w:r>
+      <w:r/>
+      <w:r/>
+      <w:r/>
+      <w:r/>
+      <w:r>
+        <w:rPr/>
+      </w:r>
+      <w:r/>
+      <w:r/>
     </w:p>
     <w:p>
       <w:pPr>
@@ -7914,47 +7826,30 @@
         </w:tabs>
       </w:pPr>
       <w:r>
-        <w:fldChar w:fldCharType="begin"/>
-      </w:r>
-      <w:r>
-        <w:instrText xml:space="preserve">HYPERLINK  \l  "_Toc1823417154" </w:instrText>
-      </w:r>
-      <w:r>
-        <w:fldChar w:fldCharType="separate"/>
-      </w:r>
-      <w:r>
-        <w:rPr/>
         <w:t>3.</w:t>
-      </w:r>
-      <w:r>
         <w:tab/>
-      </w:r>
-      <w:r>
-        <w:rPr/>
         <w:t>Опис коришћених технологија и алата</w:t>
-      </w:r>
-      <w:r>
         <w:tab/>
-      </w:r>
-      <w:r>
-        <w:fldChar w:fldCharType="begin"/>
-      </w:r>
-      <w:r>
-        <w:instrText xml:space="preserve">PAGEREF _Toc1823417154 \h</w:instrText>
-      </w:r>
-      <w:r>
-        <w:fldChar w:fldCharType="separate"/>
-      </w:r>
-      <w:r>
-        <w:rPr/>
-        <w:t>13</w:t>
-      </w:r>
-      <w:r>
-        <w:fldChar w:fldCharType="end"/>
-      </w:r>
-      <w:r>
-        <w:fldChar w:fldCharType="end"/>
-      </w:r>
+        <w:t>6</w:t>
+      </w:r>
+      <w:r/>
+      <w:r/>
+      <w:r>
+        <w:rPr/>
+      </w:r>
+      <w:r/>
+      <w:r>
+        <w:rPr/>
+      </w:r>
+      <w:r/>
+      <w:r/>
+      <w:r/>
+      <w:r/>
+      <w:r>
+        <w:rPr/>
+      </w:r>
+      <w:r/>
+      <w:r/>
     </w:p>
     <w:p>
       <w:pPr>
@@ -7965,47 +7860,30 @@
         </w:tabs>
       </w:pPr>
       <w:r>
-        <w:fldChar w:fldCharType="begin"/>
-      </w:r>
-      <w:r>
-        <w:instrText xml:space="preserve">HYPERLINK  \l  "_Toc459059121" </w:instrText>
-      </w:r>
-      <w:r>
-        <w:fldChar w:fldCharType="separate"/>
-      </w:r>
-      <w:r>
-        <w:rPr/>
         <w:t>4.</w:t>
-      </w:r>
-      <w:r>
         <w:tab/>
-      </w:r>
-      <w:r>
-        <w:rPr/>
         <w:t>Опис почетног решења</w:t>
-      </w:r>
-      <w:r>
         <w:tab/>
-      </w:r>
-      <w:r>
-        <w:fldChar w:fldCharType="begin"/>
-      </w:r>
-      <w:r>
-        <w:instrText xml:space="preserve">PAGEREF _Toc459059121 \h</w:instrText>
-      </w:r>
-      <w:r>
-        <w:fldChar w:fldCharType="separate"/>
-      </w:r>
-      <w:r>
-        <w:rPr/>
-        <w:t>15</w:t>
-      </w:r>
-      <w:r>
-        <w:fldChar w:fldCharType="end"/>
-      </w:r>
-      <w:r>
-        <w:fldChar w:fldCharType="end"/>
-      </w:r>
+        <w:t>8</w:t>
+      </w:r>
+      <w:r/>
+      <w:r/>
+      <w:r>
+        <w:rPr/>
+      </w:r>
+      <w:r/>
+      <w:r>
+        <w:rPr/>
+      </w:r>
+      <w:r/>
+      <w:r/>
+      <w:r/>
+      <w:r/>
+      <w:r>
+        <w:rPr/>
+      </w:r>
+      <w:r/>
+      <w:r/>
     </w:p>
     <w:p>
       <w:pPr>
@@ -8016,47 +7894,30 @@
         </w:tabs>
       </w:pPr>
       <w:r>
-        <w:fldChar w:fldCharType="begin"/>
-      </w:r>
-      <w:r>
-        <w:instrText xml:space="preserve">HYPERLINK  \l  "_Toc193773176" </w:instrText>
-      </w:r>
-      <w:r>
-        <w:fldChar w:fldCharType="separate"/>
-      </w:r>
-      <w:r>
-        <w:rPr/>
         <w:t>5.</w:t>
-      </w:r>
-      <w:r>
         <w:tab/>
-      </w:r>
-      <w:r>
-        <w:rPr/>
         <w:t>Опис решења проблема</w:t>
-      </w:r>
-      <w:r>
         <w:tab/>
-      </w:r>
-      <w:r>
-        <w:fldChar w:fldCharType="begin"/>
-      </w:r>
-      <w:r>
-        <w:instrText xml:space="preserve">PAGEREF _Toc193773176 \h</w:instrText>
-      </w:r>
-      <w:r>
-        <w:fldChar w:fldCharType="separate"/>
-      </w:r>
-      <w:r>
-        <w:rPr/>
-        <w:t>17</w:t>
-      </w:r>
-      <w:r>
-        <w:fldChar w:fldCharType="end"/>
-      </w:r>
-      <w:r>
-        <w:fldChar w:fldCharType="end"/>
-      </w:r>
+        <w:t>10</w:t>
+      </w:r>
+      <w:r/>
+      <w:r/>
+      <w:r>
+        <w:rPr/>
+      </w:r>
+      <w:r/>
+      <w:r>
+        <w:rPr/>
+      </w:r>
+      <w:r/>
+      <w:r/>
+      <w:r/>
+      <w:r/>
+      <w:r>
+        <w:rPr/>
+      </w:r>
+      <w:r/>
+      <w:r/>
     </w:p>
     <w:p>
       <w:pPr>
@@ -8067,47 +7928,30 @@
         </w:tabs>
       </w:pPr>
       <w:r>
-        <w:fldChar w:fldCharType="begin"/>
-      </w:r>
-      <w:r>
-        <w:instrText xml:space="preserve">HYPERLINK  \l  "_Toc70042647" </w:instrText>
-      </w:r>
-      <w:r>
-        <w:fldChar w:fldCharType="separate"/>
-      </w:r>
-      <w:r>
-        <w:rPr/>
         <w:t>6.</w:t>
-      </w:r>
-      <w:r>
         <w:tab/>
-      </w:r>
-      <w:r>
-        <w:rPr/>
         <w:t>Тестирање и резултати</w:t>
-      </w:r>
-      <w:r>
         <w:tab/>
-      </w:r>
-      <w:r>
-        <w:fldChar w:fldCharType="begin"/>
-      </w:r>
-      <w:r>
-        <w:instrText xml:space="preserve">PAGEREF _Toc70042647 \h</w:instrText>
-      </w:r>
-      <w:r>
-        <w:fldChar w:fldCharType="separate"/>
-      </w:r>
-      <w:r>
-        <w:rPr/>
-        <w:t>21</w:t>
-      </w:r>
-      <w:r>
-        <w:fldChar w:fldCharType="end"/>
-      </w:r>
-      <w:r>
-        <w:fldChar w:fldCharType="end"/>
-      </w:r>
+        <w:t>12</w:t>
+      </w:r>
+      <w:r/>
+      <w:r/>
+      <w:r>
+        <w:rPr/>
+      </w:r>
+      <w:r/>
+      <w:r>
+        <w:rPr/>
+      </w:r>
+      <w:r/>
+      <w:r/>
+      <w:r/>
+      <w:r/>
+      <w:r>
+        <w:rPr/>
+      </w:r>
+      <w:r/>
+      <w:r/>
     </w:p>
     <w:p>
       <w:pPr>
@@ -8118,47 +7962,30 @@
         </w:tabs>
       </w:pPr>
       <w:r>
-        <w:fldChar w:fldCharType="begin"/>
-      </w:r>
-      <w:r>
-        <w:instrText xml:space="preserve">HYPERLINK  \l  "_Toc464084517" </w:instrText>
-      </w:r>
-      <w:r>
-        <w:fldChar w:fldCharType="separate"/>
-      </w:r>
-      <w:r>
-        <w:rPr/>
         <w:t>7.</w:t>
-      </w:r>
-      <w:r>
         <w:tab/>
-      </w:r>
-      <w:r>
-        <w:rPr/>
         <w:t>Закључак</w:t>
-      </w:r>
-      <w:r>
         <w:tab/>
-      </w:r>
-      <w:r>
-        <w:fldChar w:fldCharType="begin"/>
-      </w:r>
-      <w:r>
-        <w:instrText xml:space="preserve">PAGEREF _Toc464084517 \h</w:instrText>
-      </w:r>
-      <w:r>
-        <w:fldChar w:fldCharType="separate"/>
-      </w:r>
-      <w:r>
-        <w:rPr/>
-        <w:t>23</w:t>
-      </w:r>
-      <w:r>
-        <w:fldChar w:fldCharType="end"/>
-      </w:r>
-      <w:r>
-        <w:fldChar w:fldCharType="end"/>
-      </w:r>
+        <w:t>15</w:t>
+      </w:r>
+      <w:r/>
+      <w:r/>
+      <w:r>
+        <w:rPr/>
+      </w:r>
+      <w:r/>
+      <w:r>
+        <w:rPr/>
+      </w:r>
+      <w:r/>
+      <w:r/>
+      <w:r/>
+      <w:r/>
+      <w:r>
+        <w:rPr/>
+      </w:r>
+      <w:r/>
+      <w:r/>
     </w:p>
     <w:p>
       <w:pPr>
@@ -8168,40 +7995,24 @@
         </w:tabs>
       </w:pPr>
       <w:r>
-        <w:fldChar w:fldCharType="begin"/>
-      </w:r>
-      <w:r>
-        <w:instrText xml:space="preserve">HYPERLINK  \l  "_Toc864234657" </w:instrText>
-      </w:r>
-      <w:r>
-        <w:fldChar w:fldCharType="separate"/>
-      </w:r>
-      <w:r>
-        <w:rPr/>
         <w:t>Литература</w:t>
-      </w:r>
-      <w:r>
         <w:tab/>
-      </w:r>
-      <w:r>
-        <w:fldChar w:fldCharType="begin"/>
-      </w:r>
-      <w:r>
-        <w:instrText xml:space="preserve">PAGEREF _Toc864234657 \h</w:instrText>
-      </w:r>
-      <w:r>
-        <w:fldChar w:fldCharType="separate"/>
-      </w:r>
-      <w:r>
-        <w:rPr/>
-        <w:t>24</w:t>
-      </w:r>
-      <w:r>
-        <w:fldChar w:fldCharType="end"/>
-      </w:r>
-      <w:r>
-        <w:fldChar w:fldCharType="end"/>
-      </w:r>
+        <w:t>16</w:t>
+      </w:r>
+      <w:r/>
+      <w:r/>
+      <w:r>
+        <w:rPr/>
+      </w:r>
+      <w:r/>
+      <w:r/>
+      <w:r/>
+      <w:r/>
+      <w:r>
+        <w:rPr/>
+      </w:r>
+      <w:r/>
+      <w:r/>
     </w:p>
     <w:p>
       <w:pPr>
@@ -8211,40 +8022,24 @@
         </w:tabs>
       </w:pPr>
       <w:r>
-        <w:fldChar w:fldCharType="begin"/>
-      </w:r>
-      <w:r>
-        <w:instrText xml:space="preserve">HYPERLINK  \l  "_Toc870668636" </w:instrText>
-      </w:r>
-      <w:r>
-        <w:fldChar w:fldCharType="separate"/>
-      </w:r>
-      <w:r>
-        <w:rPr/>
         <w:t>Биографија</w:t>
-      </w:r>
-      <w:r>
         <w:tab/>
-      </w:r>
-      <w:r>
-        <w:fldChar w:fldCharType="begin"/>
-      </w:r>
-      <w:r>
-        <w:instrText xml:space="preserve">PAGEREF _Toc870668636 \h</w:instrText>
-      </w:r>
-      <w:r>
-        <w:fldChar w:fldCharType="separate"/>
-      </w:r>
-      <w:r>
-        <w:rPr/>
-        <w:t>25</w:t>
-      </w:r>
-      <w:r>
-        <w:fldChar w:fldCharType="end"/>
-      </w:r>
-      <w:r>
-        <w:fldChar w:fldCharType="end"/>
-      </w:r>
+        <w:t>17</w:t>
+      </w:r>
+      <w:r/>
+      <w:r/>
+      <w:r>
+        <w:rPr/>
+      </w:r>
+      <w:r/>
+      <w:r/>
+      <w:r/>
+      <w:r/>
+      <w:r>
+        <w:rPr/>
+      </w:r>
+      <w:r/>
+      <w:r/>
     </w:p>
     <w:p>
       <w:pPr>
@@ -8317,7 +8112,7 @@
         <w:pStyle w:val="BodyText"/>
       </w:pPr>
       <w:r>
-        <w:t>Слика 4.1. Архитектура система пре надоградње ................................ 9</w:t>
+        <w:t>Слика 4.1. Архитектура система пре надоградње ................................ 8</w:t>
       </w:r>
     </w:p>
     <w:p xmlns:wp14="http://schemas.microsoft.com/office/word/2010/wordml" wp14:textId="77777777">
@@ -8325,7 +8120,7 @@
         <w:pStyle w:val="BodyText"/>
       </w:pPr>
       <w:r>
-        <w:t>Слика 5.1. TO-BE архитектура — додат observability слој ....................... 11</w:t>
+        <w:t>Слика 5.1. TO-BE архитектура — додат observability слој ....................... 10</w:t>
       </w:r>
     </w:p>
     <w:p>
@@ -8385,20 +8180,20 @@
       </w:r>
       <w:bookmarkEnd w:id="856976986"/>
     </w:p>
+    <w:p>
+      <w:pPr>
+        <w:pStyle w:val="BodyText"/>
+      </w:pPr>
+      <w:r>
+        <w:t>Табела 6.1. Резултати аутоматизованог тестирања (dotnet test) .................. 12</w:t>
+      </w:r>
+    </w:p>
     <w:p xmlns:wp14="http://schemas.microsoft.com/office/word/2010/wordml" wp14:textId="77777777">
       <w:pPr>
         <w:pStyle w:val="BodyText"/>
       </w:pPr>
       <w:r>
-        <w:t>Табела 6.2. Поређење система пре и после надоградње ........................... 13</w:t>
-      </w:r>
-    </w:p>
-    <w:p xmlns:wp14="http://schemas.microsoft.com/office/word/2010/wordml" wp14:textId="77777777">
-      <w:pPr>
-        <w:pStyle w:val="BodyText"/>
-      </w:pPr>
-      <w:r>
-        <w:t>Табела 6.1. Резултати аутоматизованог тестирања (dotnet test) .................. 15</w:t>
+        <w:t>Табела 6.2. Поређење система пре и после надоградње ........................... 14</w:t>
       </w:r>
     </w:p>
     <w:p>
@@ -11764,7 +11559,55 @@
         <w:pStyle w:val="BodyText"/>
       </w:pPr>
       <w:r>
-        <w:t>У овом раду анализиран је постојећи систем Travel Planner са аспекта обсервабилности, идентификовани су конкретни недостаци (одсуство структурисаног логовања, метрика, дистрибуираног праћења захтева и health check механизама, као и тихе грешке у постојећем коду), и имплементирана је надоградња заснована на OpenTelemetry стандарду и Prometheus/Grafana Tempo/Grafana Loki/Grafana инфраструктури, без измене постојеће пословне логике.</w:t>
+        <w:t>У овом раду анализиран је постојећи систем Travel Planner са аспекта обсервабилности и идентификовани су следећи конкретни недостаци:</w:t>
+      </w:r>
+    </w:p>
+    <w:p>
+      <w:pPr>
+        <w:pStyle w:val="1nabrajanje"/>
+      </w:pPr>
+      <w:r>
+        <w:t>одсуство дистрибуираног праћења захтева кроз више сервиса;</w:t>
+      </w:r>
+    </w:p>
+    <w:p>
+      <w:pPr>
+        <w:pStyle w:val="1nabrajanje"/>
+      </w:pPr>
+      <w:r>
+        <w:t>одсуство метрика перформанси;</w:t>
+      </w:r>
+    </w:p>
+    <w:p>
+      <w:pPr>
+        <w:pStyle w:val="1nabrajanje"/>
+      </w:pPr>
+      <w:r>
+        <w:t>„тихе“ грешке — примери у коду који гутају грешке без иједног трага у логу;</w:t>
+      </w:r>
+    </w:p>
+    <w:p>
+      <w:pPr>
+        <w:pStyle w:val="1nabrajanje"/>
+      </w:pPr>
+      <w:r>
+        <w:t>одсуство health check механизама;</w:t>
+      </w:r>
+    </w:p>
+    <w:p>
+      <w:pPr>
+        <w:pStyle w:val="1nabrajanje"/>
+      </w:pPr>
+      <w:r>
+        <w:t>нестандардизовано, минимално логовање.</w:t>
+      </w:r>
+    </w:p>
+    <w:p>
+      <w:pPr>
+        <w:pStyle w:val="BodyText"/>
+      </w:pPr>
+      <w:r>
+        <w:t>Имплементирана је надоградња заснована на OpenTelemetry стандарду и Prometheus/Grafana Tempo/Grafana Loki/Grafana инфраструктури, без измене постојеће пословне логике.</w:t>
       </w:r>
     </w:p>
     <w:p xmlns:wp14="http://schemas.microsoft.com/office/word/2010/wordml" wp14:textId="77777777">

</xml_diff>

<commit_message>
docs: add placeholder for application UI screenshot in introduction
Per professor's general note to enrich the paper with more visuals -
adds a [POPUNI] marker for a Travel Planner UI screenshot in the intro,
alongside the existing architecture diagrams.
</commit_message>
<xml_diff>
--- a/docs/diplomski-rad.docx
+++ b/docs/diplomski-rad.docx
@@ -8640,6 +8640,14 @@
       </w:pPr>
       <w:r>
         <w:t>Travel Planner је микросервисна веб апликација за планирање путовања која кориснику омогућава да на једном месту организује план путовања: основне податке о путовању, дестинације, дневне активности (са приказом кроз календар), трошкове и буџет, белешке, подсетнике, checklist/packing листу, као и дељење плана путем кода или QR кода са другим особама. Овај рад се бави имплементацијом обсервабилности над постојећим системом Travel Planner.</w:t>
+      </w:r>
+    </w:p>
+    <w:p>
+      <w:pPr>
+        <w:pStyle w:val="BodyText"/>
+      </w:pPr>
+      <w:r>
+        <w:t>[ПОПУНИ: убацити слику 1.1 — screenshot почетне/главне стране Travel Planner апликације (нпр. преглед плана путовања са дестинацијама и календаром), ради визуелног увода читаоца у изглед и функционалност апликације пре описа архитектуре.]</w:t>
       </w:r>
     </w:p>
     <w:p xmlns:wp14="http://schemas.microsoft.com/office/word/2010/wordml" wp14:textId="77777777">

</xml_diff>

<commit_message>
docs: add comprehensive screenshot placeholder plan (9 new + 2 existing)
Expands visual evidence throughout the paper per reviewer request for more
proof-of-implementation images, not just architecture diagrams:
- 1.2: sharing feature (code/QR) UI screenshot
- 4.2: Service Fabric Explorer showing all 4 services healthy
- 5.3: Tempo trace waterfall for Scenario 1
- 5.4: /health/ready raw JSON response
- 6.1: Visual Studio Test Explorer (21/21 green)
- 6.2: Loki log view with trace_id, paired with 5.3
- 6.3 (optional): Gateway Unhealthy status during Scenario 2 failure window
- 6.4: k6 terminal output for Scenario 3
- 6.5 (optional): Tempo trace for the Scenario 4 slow-dependency case

Each placeholder is anchored directly after the paragraph making the claim
it visually proves. Spisak slika intentionally left unchanged until real
screenshots replace the [POPUNI] markers, since page numbers would need
recomputing again once actual images are embedded.
</commit_message>
<xml_diff>
--- a/docs/diplomski-rad.docx
+++ b/docs/diplomski-rad.docx
@@ -8650,6 +8650,14 @@
         <w:t>[ПОПУНИ: убацити слику 1.1 — screenshot почетне/главне стране Travel Planner апликације (нпр. преглед плана путовања са дестинацијама и календаром), ради визуелног увода читаоца у изглед и функционалност апликације пре описа архитектуре.]</w:t>
       </w:r>
     </w:p>
+    <w:p>
+      <w:pPr>
+        <w:pStyle w:val="BodyText"/>
+      </w:pPr>
+      <w:r>
+        <w:t>[ПОПУНИ: убацити слику 1.2 — screenshot екрана за дељење плана путовања (генерисани код и/или QR код), ради приказа SharingService функционалности описане у поглављу 4.]</w:t>
+      </w:r>
+    </w:p>
     <w:p xmlns:wp14="http://schemas.microsoft.com/office/word/2010/wordml" wp14:textId="77777777">
       <w:pPr>
         <w:pStyle w:val="BodyText"/>
@@ -10190,6 +10198,14 @@
       </w:r>
       <w:bookmarkEnd w:id="100"/>
     </w:p>
+    <w:p>
+      <w:pPr>
+        <w:pStyle w:val="BodyText"/>
+      </w:pPr>
+      <w:r>
+        <w:t>[ПОПУНИ: убацити слику 4.2 — screenshot Service Fabric Explorer-а (localhost:19080) са приказаним fabric:/TravelPlanner стаблом, сва 4 сервиса зелена (Healthy/Ready), као доказ да AS-IS архитектура описана изнад стварно постоји и ради на локалном кластеру.]</w:t>
+      </w:r>
+    </w:p>
     <w:p xmlns:wp14="http://schemas.microsoft.com/office/word/2010/wordml" wp14:textId="77777777">
       <w:pPr>
         <w:pStyle w:val="BodyText"/>
@@ -10702,6 +10718,14 @@
         <w:t>Сваки сервис излаже два endpoint-а: /health/live (процес је жив, не додирује зависности — намењен одлукама о рестарту) и /health/ready (процес и критичне зависности спремни да опслуже саобраћај). За AuthService/TripService/SharingService, /health/ready проверава доступност сопствене SQL Server базе. Gateway нема сопствену базу — његов /health/ready проверава мрежну доступност три downstream сервиса, преко истих адреса које YARP већ користи за рутирање (без дуплирања конфигурације). Одговор је структурисан JSON са статусом сваке појединачне провере и, у случају грешке, читљивом поруком.</w:t>
       </w:r>
     </w:p>
+    <w:p>
+      <w:pPr>
+        <w:pStyle w:val="BodyText"/>
+      </w:pPr>
+      <w:r>
+        <w:t>[ПОПУНИ: убацити слику 5.4 — screenshot browser-а са отвореним http://localhost:8141/health/ready, приказан сирови JSON одговор са статусом сва три downstream сервиса, ради доказа да је структурисан одговор описан изнад стваран.]</w:t>
+      </w:r>
+    </w:p>
     <w:p xmlns:wp14="http://schemas.microsoft.com/office/word/2010/wordml" wp14:textId="77777777">
       <w:pPr>
         <w:pStyle w:val="Naslov1nivo"/>
@@ -10772,6 +10796,14 @@
       </w:pPr>
       <w:r>
         <w:t>[ПОПУНИ: убацити слику 5.2 — screenshot Grafana dashboard-а „Travel Planner - Overview” dok je sistem pokrenut, sa vidljivim RED metrikama, resursima i log stream panelom.]</w:t>
+      </w:r>
+    </w:p>
+    <w:p>
+      <w:pPr>
+        <w:pStyle w:val="BodyText"/>
+      </w:pPr>
+      <w:r>
+        <w:t>[ПОПУНИ: убацити слику 5.3 — screenshot Grafana Explore -&gt; Tempo -&gt; waterfall прикaз trace-а из Сценарија 1 (Gateway -&gt; SharingService -&gt; TripService, са видљивих 9 SQL child span-ова), ради визуелног доказа дистрибуираног праћења захтева описаног изнад.]</w:t>
       </w:r>
     </w:p>
     <w:p xmlns:wp14="http://schemas.microsoft.com/office/word/2010/wordml" wp14:textId="77777777">
@@ -11177,6 +11209,14 @@
     </w:p>
     <w:p>
       <w:pPr>
+        <w:pStyle w:val="BodyText"/>
+      </w:pPr>
+      <w:r>
+        <w:t>[ПОПУНИ: убацити слику 6.1 — screenshot Visual Studio Test Explorer-а са свих 21 тестом зеленим (passed), ради директног визуелног доказа резултата из Табеле 6.1.]</w:t>
+      </w:r>
+    </w:p>
+    <w:p>
+      <w:pPr>
         <w:pStyle w:val="Naslov1nivo"/>
       </w:pPr>
       <w:r>
@@ -11209,6 +11249,14 @@
     </w:p>
     <w:p>
       <w:pPr>
+        <w:pStyle w:val="BodyText"/>
+      </w:pPr>
+      <w:r>
+        <w:t>[ПОПУНИ: убацити слику 6.2 — screenshot Grafana Explore -&gt; Loki -&gt; log ред овог истог захтева, са видљивим "traceid" пољем, ради приказа log-trace корелације описане изнад (упарити са Сликом 5.3, исти trace).]</w:t>
+      </w:r>
+    </w:p>
+    <w:p>
+      <w:pPr>
         <w:pStyle w:val="Naslov2nivo"/>
       </w:pPr>
       <w:r>
@@ -11225,6 +11273,14 @@
     </w:p>
     <w:p>
       <w:pPr>
+        <w:pStyle w:val="BodyText"/>
+      </w:pPr>
+      <w:r>
+        <w:t>[ОПЦИОНО - ПОПУНИ: убацити слику 6.3 — screenshot одговора /health/ready БАШ у тренутку квара, са "trip-service": "Unhealthy". Ово захтева тајминг уживо (позвати /health/ready одмах након рестарта, пре опоравка за ~7 секунди) - прескочи ако је незгодно да ухватиш тачан тренутак.]</w:t>
+      </w:r>
+    </w:p>
+    <w:p>
+      <w:pPr>
         <w:pStyle w:val="Naslov2nivo"/>
       </w:pPr>
       <w:r>
@@ -11241,6 +11297,14 @@
     </w:p>
     <w:p>
       <w:pPr>
+        <w:pStyle w:val="BodyText"/>
+      </w:pPr>
+      <w:r>
+        <w:t>[ПОПУНИ: убацити слику 6.4 — screenshot терминала са k6 излазом (780 захтева, 0% неуспешних, p95 латенција), ради доказа резултата Сценарија 3 наведеног изнад.]</w:t>
+      </w:r>
+    </w:p>
+    <w:p>
+      <w:pPr>
         <w:pStyle w:val="Naslov2nivo"/>
       </w:pPr>
       <w:r>
@@ -11253,6 +11317,14 @@
       </w:pPr>
       <w:r>
         <w:t>Директном SQL трансакцијом закључан је тачно један ред у табели Plans (X lock, без commit-а), а истовремено је упућен прави HTTP захтев (PUT /api/trips/{id}) који мења исти ред. Trace показује да је укупан захтев трајао 23.9 секунди, при чему SELECT упит у истом захтеву траје свега 14.5 милисекунди — дистрибуирано праћење захтева тачно показује да је узрок UPDATE наредба, не захтев уопштено. Успут је откривен и стваран налаз: TripsDB има укључен READ_COMMITTED_SNAPSHOT, па читања не чекају на закључан ред (потврђено директним увидом у sys.dm_tran_locks); тек упис са стварно измењеном вредношћу (writer-vs-writer сукоб, на који snapshot изолација не утиче) изазива право чекање.</w:t>
+      </w:r>
+    </w:p>
+    <w:p>
+      <w:pPr>
+        <w:pStyle w:val="BodyText"/>
+      </w:pPr>
+      <w:r>
+        <w:t>[ОПЦИОНО - ПОПУНИ: убацити слику 6.5 — screenshot Grafana Explore -&gt; Tempo waterfall-а за овај trace, са видљивим тачним трајањем SELECT (14.5ms) наспрам укупног захтева (23.9s), ради визуелног доказа да tracing прецизно локализује узрок.]</w:t>
       </w:r>
     </w:p>
     <w:p>

</xml_diff>

<commit_message>
docs: add missing citations for Grafana/xUnit/Docker Compose, cross-reference stateless/stateful to chapter 3, remove Ogranicenja heading, add intro line to Pravci daljeg razvoja
</commit_message>
<xml_diff>
--- a/docs/diplomski-rad.docx
+++ b/docs/diplomski-rad.docx
@@ -10152,7 +10152,7 @@
         <w:pStyle w:val="BodyText"/>
       </w:pPr>
       <w:r>
-        <w:t>Grafana је изабрана као јединствен визуелни слој за све три врсте телеметрије, уместо по једног специјализованог алата за сваку (нпр. Jaeger UI за trace-ове, посебан алат за метрике). Ово директно подржава сценарио „развијач види комплетну слику једног захтева на једном месту”, који је централна теза рада.</w:t>
+        <w:t>Grafana [11] је изабрана као јединствен визуелни слој за све три врсте телеметрије, уместо по једног специјализованог алата за сваку (нпр. Jaeger UI за trace-ове, посебан алат за метрике). Grafana подржава велики број data source-ова кроз plugin архитектуру, а Prometheus, Tempo и Loki су сви подржани нативно, без додатних plugin-ова, што је додатни разлог за избор баш ове платформе. Ово директно подржава сценарио „развијач види комплетну слику једног захтева на једном месту”, који је централна теза рада.</w:t>
       </w:r>
     </w:p>
     <w:p xmlns:wp14="http://schemas.microsoft.com/office/word/2010/wordml" wp14:textId="77777777">
@@ -10200,7 +10200,7 @@
         <w:pStyle w:val="BodyText"/>
       </w:pPr>
       <w:r>
-        <w:t>За аутоматизовано тестирање (поглавље 6) коришћен је xUnit, стандардни test framework за .NET, јер пројекат пре овог рада није имао дефинисан test framework нити иједан тест.</w:t>
+        <w:t>За аутоматизовано тестирање (поглавље 6) коришћен је xUnit [12], стандардни test framework за .NET који Microsoft подразумевано укључује у project template-е за .NET апликације, јер пројекат пре овог рада није имао дефинисан test framework нити иједан тест.</w:t>
       </w:r>
     </w:p>
     <w:p xmlns:wp14="http://schemas.microsoft.com/office/word/2010/wordml" wp14:textId="77777777">
@@ -10216,7 +10216,7 @@
         <w:pStyle w:val="BodyText"/>
       </w:pPr>
       <w:r>
-        <w:t>Цела observability инфраструктура (Collector, Prometheus, Tempo, Loki, Grafana) покреће се кроз Docker Compose, независно од постојећег Service Fabric кластера и SQL Server инстанце — додатак, не замена постојећег начина рада система.</w:t>
+        <w:t>Цела observability инфраструктура (Collector, Prometheus, Tempo, Loki, Grafana) покреће се кроз Docker Compose [13], алат за дефинисање и покретање вишеконтејнерских Docker апликација преко једног YAML фајла, независно од постојећег Service Fabric кластера и SQL Server инстанце — додатак, не замена постојећег начина рада система.</w:t>
       </w:r>
     </w:p>
     <w:p>
@@ -10266,7 +10266,7 @@
         <w:pStyle w:val="BodyText"/>
       </w:pPr>
       <w:r>
-        <w:t>Систем чине четири одвојена сервиса на Microsoft Service Fabric платформи:</w:t>
+        <w:t>Систем чине четири одвојена сервиса на Microsoft Service Fabric платформи (значење појмова stateless и stateful објашњено је у поглављу 3):</w:t>
       </w:r>
     </w:p>
     <w:p xmlns:wp14="http://schemas.microsoft.com/office/word/2010/wordml" wp14:textId="77777777">
@@ -12141,42 +12141,42 @@
     </w:p>
     <w:p xmlns:wp14="http://schemas.microsoft.com/office/word/2010/wordml" wp14:textId="77777777">
       <w:pPr>
+        <w:pStyle w:val="BodyText"/>
+      </w:pPr>
+      <w:r>
+        <w:t>Health check позиви (/health/live, /health/ready) пролазе кроз исту ASP.NET Core инструментацију као и сав остали саобраћај, па се њихови одговори мешају у исте метрике захтева као и стварни кориснички захтеви — за производни dashboard било би потребно експлицитно искључити /health/* путање из панела за стопу грешака.</w:t>
+      </w:r>
+    </w:p>
+    <w:p xmlns:wp14="http://schemas.microsoft.com/office/word/2010/wordml" wp14:textId="77777777">
+      <w:pPr>
+        <w:pStyle w:val="BodyText"/>
+      </w:pPr>
+      <w:r>
+        <w:t>Observability инфраструктура (Docker Compose стек) ради независно од постојећег Service Fabric кластера; интеграција са Service Fabric-овим сопственим Health Manager механизмом (тако да апликациони health утиче и на SF-ове одлуке о опоравку) није реализована у овом раду.</w:t>
+      </w:r>
+    </w:p>
+    <w:p xmlns:wp14="http://schemas.microsoft.com/office/word/2010/wordml" wp14:textId="77777777">
+      <w:pPr>
+        <w:pStyle w:val="BodyText"/>
+      </w:pPr>
+      <w:r>
+        <w:t>Distributed tracing тренутно почиње на Gateway-у; frontend (browser) није инструментисан OpenTelemetry Web SDK-ом, па је почетни, мрежни део захтева (од корисниковог browser-a до Gateway-a) ван обухвата trace-а.</w:t>
+      </w:r>
+    </w:p>
+    <w:p xmlns:wp14="http://schemas.microsoft.com/office/word/2010/wordml" wp14:textId="77777777">
+      <w:pPr>
         <w:pStyle w:val="Naslov1nivo"/>
       </w:pPr>
       <w:r>
-        <w:t>Ограничења</w:t>
-      </w:r>
-    </w:p>
-    <w:p xmlns:wp14="http://schemas.microsoft.com/office/word/2010/wordml" wp14:textId="77777777">
+        <w:t>Правци даљег развоја</w:t>
+      </w:r>
+    </w:p>
+    <w:p>
       <w:pPr>
         <w:pStyle w:val="BodyText"/>
       </w:pPr>
       <w:r>
-        <w:t>Health check позиви (/health/live, /health/ready) пролазе кроз исту ASP.NET Core инструментацију као и сав остали саобраћај, па се њихови одговори мешају у исте метрике захтева као и стварни кориснички захтеви — за производни dashboard било би потребно експлицитно искључити /health/* путање из панела за стопу грешака.</w:t>
-      </w:r>
-    </w:p>
-    <w:p xmlns:wp14="http://schemas.microsoft.com/office/word/2010/wordml" wp14:textId="77777777">
-      <w:pPr>
-        <w:pStyle w:val="BodyText"/>
-      </w:pPr>
-      <w:r>
-        <w:t>Observability инфраструктура (Docker Compose стек) ради независно од постојећег Service Fabric кластера; интеграција са Service Fabric-овим сопственим Health Manager механизмом (тако да апликациони health утиче и на SF-ове одлуке о опоравку) није реализована у овом раду.</w:t>
-      </w:r>
-    </w:p>
-    <w:p xmlns:wp14="http://schemas.microsoft.com/office/word/2010/wordml" wp14:textId="77777777">
-      <w:pPr>
-        <w:pStyle w:val="BodyText"/>
-      </w:pPr>
-      <w:r>
-        <w:t>Distributed tracing тренутно почиње на Gateway-у; frontend (browser) није инструментисан OpenTelemetry Web SDK-ом, па је почетни, мрежни део захтева (од корисниковог browser-a до Gateway-a) ван обухвата trace-а.</w:t>
-      </w:r>
-    </w:p>
-    <w:p xmlns:wp14="http://schemas.microsoft.com/office/word/2010/wordml" wp14:textId="77777777">
-      <w:pPr>
-        <w:pStyle w:val="Naslov1nivo"/>
-      </w:pPr>
-      <w:r>
-        <w:t>Правци даљег развоја</w:t>
+        <w:t>Правци даљег развоја би били:</w:t>
       </w:r>
     </w:p>
     <w:p xmlns:wp14="http://schemas.microsoft.com/office/word/2010/wordml" wp14:textId="77777777">
@@ -12318,6 +12318,30 @@
       </w:pPr>
       <w:r>
         <w:t>[10] The OpenTelemetry Collector Authors, "OpenTelemetry Collector documentation." opentelemetry.io. https://opentelemetry.io/docs/collector/ (приступљено: септембар 2026).</w:t>
+      </w:r>
+    </w:p>
+    <w:p>
+      <w:pPr>
+        <w:pStyle w:val="literatura"/>
+      </w:pPr>
+      <w:r>
+        <w:t>[11] Grafana Labs, "Grafana documentation." grafana.com. https://grafana.com/docs/grafana/latest/ (приступљено: септембар 2026).</w:t>
+      </w:r>
+    </w:p>
+    <w:p>
+      <w:pPr>
+        <w:pStyle w:val="literatura"/>
+      </w:pPr>
+      <w:r>
+        <w:t>[12] .NET Foundation, "xUnit.net documentation." xunit.net. https://xunit.net/docs/getting-started/netcore/cmdline (приступљено: септембар 2026).</w:t>
+      </w:r>
+    </w:p>
+    <w:p>
+      <w:pPr>
+        <w:pStyle w:val="literatura"/>
+      </w:pPr>
+      <w:r>
+        <w:t>[13] Docker Inc., "Docker Compose documentation." docs.docker.com. https://docs.docker.com/compose/ (приступљено: септембар 2026).</w:t>
       </w:r>
     </w:p>
     <w:p>

</xml_diff>

<commit_message>
docs: update physical description field with accurate page/citation/table/figure counts
</commit_message>
<xml_diff>
--- a/docs/diplomski-rad.docx
+++ b/docs/diplomski-rad.docx
@@ -2116,7 +2116,7 @@
                 <w:szCs w:val="18"/>
                 <w:lang w:val="sr-Cyrl-RS"/>
               </w:rPr>
-              <w:t>7 поглавља / 1</w:t>
+              <w:t xml:space="preserve">7 поглавља / </w:t>
             </w:r>
             <w:r>
               <w:rPr>
@@ -2126,7 +2126,7 @@
                 <w:szCs w:val="18"/>
                 <w:lang w:val="sr-Cyrl-RS"/>
               </w:rPr>
-              <w:t>9</w:t>
+              <w:t>21</w:t>
             </w:r>
             <w:r>
               <w:rPr>
@@ -2136,7 +2136,7 @@
                 <w:szCs w:val="18"/>
                 <w:lang w:val="sr-Cyrl-RS"/>
               </w:rPr>
-              <w:t xml:space="preserve"> страна / 10 цитата / 3 табеле / 2 слике / 0 графика / 0 прилога</w:t>
+              <w:t xml:space="preserve"> страна / 13 цитата / 2 табеле / 11 слика / 0 графика / 0 прилога</w:t>
             </w:r>
           </w:p>
         </w:tc>

</xml_diff>

<commit_message>
docs: final pre-submission audit fixes - remove leftover AI instruction placeholders, fix figure numbering gap, fix orphaned table caption and heading, sync English bib card with Serbian (page/citation/table/figure counts, scientific discipline translation)
</commit_message>
<xml_diff>
--- a/docs/diplomski-rad.docx
+++ b/docs/diplomski-rad.docx
@@ -4652,7 +4652,7 @@
                 <w:sz w:val="18"/>
                 <w:szCs w:val="18"/>
               </w:rPr>
-              <w:t>7 chapters / 1</w:t>
+              <w:t xml:space="preserve">7 chapters / </w:t>
             </w:r>
             <w:r>
               <w:rPr>
@@ -4661,7 +4661,7 @@
                 <w:sz w:val="18"/>
                 <w:szCs w:val="18"/>
               </w:rPr>
-              <w:t>9</w:t>
+              <w:t>21</w:t>
             </w:r>
             <w:r>
               <w:rPr>
@@ -4670,7 +4670,7 @@
                 <w:sz w:val="18"/>
                 <w:szCs w:val="18"/>
               </w:rPr>
-              <w:t xml:space="preserve"> pages / 10 references / 3 tables / 2 figures / 0 graphs / 0 appendixes</w:t>
+              <w:t xml:space="preserve"> pages / 13 references / 2 tables / 11 figures / 0 graphs / 0 appendixes</w:t>
             </w:r>
           </w:p>
         </w:tc>
@@ -4830,7 +4830,7 @@
                 <w:sz w:val="18"/>
                 <w:szCs w:val="18"/>
               </w:rPr>
-              <w:t>Power</w:t>
+              <w:t>Applied</w:t>
             </w:r>
             <w:r>
               <w:rPr>
@@ -8192,7 +8192,7 @@
         <w:pStyle w:val="BodyText"/>
       </w:pPr>
       <w:r>
-        <w:t>Слика 6.4. Резултати k6 load test-а .......................................................... 17</w:t>
+        <w:t>Слика 6.3. Резултати k6 load test-а .......................................................... 17</w:t>
       </w:r>
     </w:p>
     <w:p>
@@ -8257,7 +8257,7 @@
         <w:pStyle w:val="BodyText"/>
       </w:pPr>
       <w:r>
-        <w:t>Табела 6.1. Резултати аутоматизованог тестирања (dotnet test) .................. 14</w:t>
+        <w:t>Табела 6.1. Резултати аутоматизованог тестирања (dotnet test) .................. 15</w:t>
       </w:r>
     </w:p>
     <w:p xmlns:wp14="http://schemas.microsoft.com/office/word/2010/wordml" wp14:textId="77777777">
@@ -11673,14 +11673,6 @@
     </w:p>
     <w:p>
       <w:pPr>
-        <w:pStyle w:val="BodyText"/>
-      </w:pPr>
-      <w:r>
-        <w:t>[ОПЦИОНО - ПОПУНИ: убацити слику 6.3 — screenshot одговора /health/ready БАШ у тренутку квара, са "trip-service": "Unhealthy". Ово захтева тајминг уживо (позвати /health/ready одмах након рестарта, пре опоравка за ~7 секунди) - прескочи ако је незгодно да ухватиш тачан тренутак.]</w:t>
-      </w:r>
-    </w:p>
-    <w:p>
-      <w:pPr>
         <w:pStyle w:val="Naslov2nivo"/>
       </w:pPr>
       <w:r>
@@ -11741,7 +11733,7 @@
         <w:pStyle w:val="Slika"/>
       </w:pPr>
       <w:r>
-        <w:t>Слика 6.4. Резултати k6 load test-а (Сценарио 3)</w:t>
+        <w:t>Слика 6.3. Резултати k6 load test-а (Сценарио 3)</w:t>
       </w:r>
     </w:p>
     <w:p>
@@ -11758,14 +11750,6 @@
       </w:pPr>
       <w:r>
         <w:t>Директном SQL трансакцијом закључан је тачно један ред у табели Plans (X lock, без commit-а), а истовремено је упућен прави HTTP захтев (PUT /api/trips/{id}) који мења исти ред. Trace показује да је укупан захтев трајао 23.9 секунди, при чему SELECT упит у истом захтеву траје свега 14.5 милисекунди — дистрибуирано праћење захтева тачно показује да је узрок UPDATE наредба, не захтев уопштено. Успут је откривен и стваран налаз: TripsDB има укључен READ_COMMITTED_SNAPSHOT, па читања не чекају на закључан ред (потврђено директним увидом у sys.dm_tran_locks); тек упис са стварно измењеном вредношћу (writer-vs-writer сукоб, на који snapshot изолација не утиче) изазива право чекање.</w:t>
-      </w:r>
-    </w:p>
-    <w:p>
-      <w:pPr>
-        <w:pStyle w:val="BodyText"/>
-      </w:pPr>
-      <w:r>
-        <w:t>[ОПЦИОНО - ПОПУНИ: убацити слику 6.5 — screenshot Grafana Explore -&gt; Tempo waterfall-а за овај trace, са видљивим тачним трајањем SELECT (14.5ms) наспрам укупног захтева (23.9s), ради визуелног доказа да tracing прецизно локализује узрок.]</w:t>
       </w:r>
     </w:p>
     <w:p>
@@ -19670,6 +19654,7 @@
     <w:name w:val="Naslov 1. nivo"/>
     <w:basedOn w:val="Tekst"/>
     <w:pPr>
+      <w:keepNext/>
       <w:spacing w:before="336" w:after="144"/>
     </w:pPr>
     <w:rPr>
@@ -19759,6 +19744,7 @@
     <w:name w:val="Tabela"/>
     <w:basedOn w:val="Tekst"/>
     <w:pPr>
+      <w:keepNext/>
       <w:spacing w:after="60"/>
       <w:ind w:left="142" w:right="142"/>
       <w:jc w:val="right"/>

</xml_diff>

<commit_message>
docs: restore official template fonts (bullet lists, Power Software Engineering), blur personal email in sharing screenshot
</commit_message>
<xml_diff>
--- a/docs/diplomski-rad.docx
+++ b/docs/diplomski-rad.docx
@@ -4830,7 +4830,7 @@
                 <w:sz w:val="18"/>
                 <w:szCs w:val="18"/>
               </w:rPr>
-              <w:t>Applied</w:t>
+              <w:t>Power</w:t>
             </w:r>
             <w:r>
               <w:rPr>
@@ -8257,7 +8257,7 @@
         <w:pStyle w:val="BodyText"/>
       </w:pPr>
       <w:r>
-        <w:t>Табела 6.1. Резултати аутоматизованог тестирања (dotnet test) .................. 15</w:t>
+        <w:t>Табела 6.1. Резултати аутоматизованог тестирања (dotnet test) .................. 14</w:t>
       </w:r>
     </w:p>
     <w:p xmlns:wp14="http://schemas.microsoft.com/office/word/2010/wordml" wp14:textId="77777777">
@@ -19696,7 +19696,8 @@
       <w:ind w:left="709" w:right="289"/>
     </w:pPr>
     <w:rPr>
-      <w:sz w:val="24"/>
+      <w:rFonts w:ascii="CHelvPlain" w:hAnsi="CHelvPlain"/>
+      <w:sz w:val="22"/>
     </w:rPr>
   </w:style>
   <w:style w:type="paragraph" w:styleId="2nabrajanje" w:customStyle="1">

</xml_diff>

<commit_message>
docs: reduce font size of NAKON/PRE emphasis words in TO-BE architecture paragraph
</commit_message>
<xml_diff>
--- a/docs/diplomski-rad.docx
+++ b/docs/diplomski-rad.docx
@@ -10827,7 +10827,25 @@
         <w:pStyle w:val="BodyText"/>
       </w:pPr>
       <w:r>
-        <w:t>TO-BE ("to be" — стање које треба да буде) означава циљну архитектуру система НАКОН надоградње описане у овом раду, за разлику од AS-IS архитектуре (поглавље 4), која описује стање ПРЕ надоградње. Разлика између ове две архитектуре је управо додати observability слој приказан на слици 5.1.</w:t>
+        <w:t xml:space="preserve">TO-BE ("to be" — стање које треба да буде) означава циљну архитектуру система </w:t>
+      </w:r>
+      <w:r>
+        <w:rPr>
+          <w:sz w:val="20"/>
+        </w:rPr>
+        <w:t>НАКОН</w:t>
+      </w:r>
+      <w:r>
+        <w:t xml:space="preserve"> надоградње описане у овом раду, за разлику од AS-IS архитектуре (поглавље 4), која описује стање </w:t>
+      </w:r>
+      <w:r>
+        <w:rPr>
+          <w:sz w:val="20"/>
+        </w:rPr>
+        <w:t>ПРЕ</w:t>
+      </w:r>
+      <w:r>
+        <w:t xml:space="preserve"> надоградње. Разлика између ове две архитектуре је управо додати observability слој приказан на слици 5.1.</w:t>
       </w:r>
     </w:p>
     <w:p xmlns:wp14="http://schemas.microsoft.com/office/word/2010/wordml" wp14:textId="77777777">

</xml_diff>

<commit_message>
docs: change NAKON/PRE to lowercase in TO-BE paragraph instead of font size reduction
</commit_message>
<xml_diff>
--- a/docs/diplomski-rad.docx
+++ b/docs/diplomski-rad.docx
@@ -10830,19 +10830,15 @@
         <w:t xml:space="preserve">TO-BE ("to be" — стање које треба да буде) означава циљну архитектуру система </w:t>
       </w:r>
       <w:r>
-        <w:rPr>
-          <w:sz w:val="20"/>
-        </w:rPr>
-        <w:t>НАКОН</w:t>
+        <w:rPr/>
+        <w:t>након</w:t>
       </w:r>
       <w:r>
         <w:t xml:space="preserve"> надоградње описане у овом раду, за разлику од AS-IS архитектуре (поглавље 4), која описује стање </w:t>
       </w:r>
       <w:r>
-        <w:rPr>
-          <w:sz w:val="20"/>
-        </w:rPr>
-        <w:t>ПРЕ</w:t>
+        <w:rPr/>
+        <w:t>пре</w:t>
       </w:r>
       <w:r>
         <w:t xml:space="preserve"> надоградње. Разлика између ове две архитектуре је управо додати observability слој приказан на слици 5.1.</w:t>

</xml_diff>

<commit_message>
docs: address professor's second review round - numbered/consistent subheadings throughout, move app screenshot from Uvod to Pocetno resenje, add failing-test demonstration section, recompute all page numbers
</commit_message>
<xml_diff>
--- a/docs/diplomski-rad.docx
+++ b/docs/diplomski-rad.docx
@@ -7898,7 +7898,7 @@
         <w:tab/>
         <w:t>Опис решења проблема</w:t>
         <w:tab/>
-        <w:t>11</w:t>
+        <w:t>12</w:t>
       </w:r>
       <w:r/>
       <w:r/>
@@ -7932,7 +7932,7 @@
         <w:tab/>
         <w:t>Тестирање и резултати</w:t>
         <w:tab/>
-        <w:t>14</w:t>
+        <w:t>15</w:t>
       </w:r>
       <w:r/>
       <w:r/>
@@ -7966,7 +7966,7 @@
         <w:tab/>
         <w:t>Закључак</w:t>
         <w:tab/>
-        <w:t>19</w:t>
+        <w:t>20</w:t>
       </w:r>
       <w:r/>
       <w:r/>
@@ -7997,7 +7997,7 @@
       <w:r>
         <w:t>Литература</w:t>
         <w:tab/>
-        <w:t>20</w:t>
+        <w:t>21</w:t>
       </w:r>
       <w:r/>
       <w:r/>
@@ -8024,7 +8024,7 @@
       <w:r>
         <w:t>Биографија</w:t>
         <w:tab/>
-        <w:t>21</w:t>
+        <w:t>22</w:t>
       </w:r>
       <w:r/>
       <w:r/>
@@ -8043,7 +8043,7 @@
     </w:p>
     <w:p>
       <w:pPr>
-        <w:pStyle w:val="Naslov1nivo"/>
+        <w:pStyle w:val="Heading2"/>
         <w:rPr>
           <w:lang w:val="sr-Cyrl-CS"/>
         </w:rPr>
@@ -8112,7 +8112,7 @@
         <w:pStyle w:val="BodyText"/>
       </w:pPr>
       <w:r>
-        <w:t>Слика 1.1. Изглед Travel Planner апликације — преглед планова путовања ........................ 4</w:t>
+        <w:t>Слика 1.1. Дељење плана путовања путем кода/QR кода ............................................... 4</w:t>
       </w:r>
     </w:p>
     <w:p>
@@ -8120,7 +8120,7 @@
         <w:pStyle w:val="BodyText"/>
       </w:pPr>
       <w:r>
-        <w:t>Слика 1.2. Дељење плана путовања путем кода/QR кода ........................................... 5</w:t>
+        <w:t>Слика 4.1. Изглед Travel Planner апликације — преглед планова путовања ............................ 9</w:t>
       </w:r>
     </w:p>
     <w:p>
@@ -8128,7 +8128,7 @@
         <w:pStyle w:val="BodyText"/>
       </w:pPr>
       <w:r>
-        <w:t>Слика 4.1. Архитектура система пре надоградње ................................................. 9</w:t>
+        <w:t>Слика 4.2. Архитектура система пре надоградње .................................................... 10</w:t>
       </w:r>
     </w:p>
     <w:p>
@@ -8136,7 +8136,7 @@
         <w:pStyle w:val="BodyText"/>
       </w:pPr>
       <w:r>
-        <w:t>Слика 4.2. Service Fabric Explorer — сва четири сервиса здрава ............................... 10</w:t>
+        <w:t>Слика 4.3. Service Fabric Explorer — сва четири сервиса здрава ................................... 10</w:t>
       </w:r>
     </w:p>
     <w:p>
@@ -8144,7 +8144,7 @@
         <w:pStyle w:val="BodyText"/>
       </w:pPr>
       <w:r>
-        <w:t>Слика 5.1. TO-BE архитектура — додат observability слој ...................................... 11</w:t>
+        <w:t>Слика 5.1. TO-BE архитектура — додат observability слој .......................................... 12</w:t>
       </w:r>
     </w:p>
     <w:p>
@@ -8152,7 +8152,7 @@
         <w:pStyle w:val="BodyText"/>
       </w:pPr>
       <w:r>
-        <w:t>Слика 5.2. Одговор /health/ready endpoint-а .................................................. 12</w:t>
+        <w:t>Слика 5.2. Одговор /health/ready endpoint-а ...................................................... 13</w:t>
       </w:r>
     </w:p>
     <w:p>
@@ -8160,7 +8160,7 @@
         <w:pStyle w:val="BodyText"/>
       </w:pPr>
       <w:r>
-        <w:t>Слика 5.3. Grafana dashboard „Travel Planner - Overview” ..................................... 13</w:t>
+        <w:t>Слика 5.3. Grafana dashboard „Travel Planner - Overview” ......................................... 14</w:t>
       </w:r>
     </w:p>
     <w:p>
@@ -8168,7 +8168,7 @@
         <w:pStyle w:val="BodyText"/>
       </w:pPr>
       <w:r>
-        <w:t>Слика 5.4. Trace Сценарија 1 у Grafana Tempo-у ............................................... 13</w:t>
+        <w:t>Слика 5.4. Trace Сценарија 1 у Grafana Tempo-у ................................................... 14</w:t>
       </w:r>
     </w:p>
     <w:p>
@@ -8176,7 +8176,7 @@
         <w:pStyle w:val="BodyText"/>
       </w:pPr>
       <w:r>
-        <w:t>Слика 6.1. Резултати тестова у Visual Studio Test Explorer-у ................................. 15</w:t>
+        <w:t>Слика 6.1. Резултати тестова у Visual Studio Test Explorer-у ..................................... 16</w:t>
       </w:r>
     </w:p>
     <w:p>
@@ -8184,7 +8184,7 @@
         <w:pStyle w:val="BodyText"/>
       </w:pPr>
       <w:r>
-        <w:t>Слика 6.2. Лог захтева из Сценарија 1 у Grafana Loki-ју ...................................... 16</w:t>
+        <w:t>Слика 6.2. Лог захтева из Сценарија 1 у Grafana Loki-ју .......................................... 17</w:t>
       </w:r>
     </w:p>
     <w:p>
@@ -8192,7 +8192,7 @@
         <w:pStyle w:val="BodyText"/>
       </w:pPr>
       <w:r>
-        <w:t>Слика 6.3. Резултати k6 load test-а .......................................................... 17</w:t>
+        <w:t>Слика 6.3. Резултати k6 load test-а .............................................................. 18</w:t>
       </w:r>
     </w:p>
     <w:p>
@@ -8257,7 +8257,7 @@
         <w:pStyle w:val="BodyText"/>
       </w:pPr>
       <w:r>
-        <w:t>Табела 6.1. Резултати аутоматизованог тестирања (dotnet test) .................. 14</w:t>
+        <w:t>Табела 6.1. Резултати аутоматизованог тестирања (dotnet test) .................................... 15</w:t>
       </w:r>
     </w:p>
     <w:p xmlns:wp14="http://schemas.microsoft.com/office/word/2010/wordml" wp14:textId="77777777">
@@ -8265,7 +8265,7 @@
         <w:pStyle w:val="BodyText"/>
       </w:pPr>
       <w:r>
-        <w:t>Табела 6.2. Поређење система пре и после надоградње ........................... 17</w:t>
+        <w:t>Табела 6.2. Поређење система пре и после надоградње .............................................. 18</w:t>
       </w:r>
     </w:p>
     <w:p>
@@ -8712,6 +8712,1504 @@
       </w:pPr>
       <w:r>
         <w:t>Travel Planner је микросервисна веб апликација за планирање путовања која кориснику омогућава да на једном месту организује план путовања: основне податке о путовању, дестинације, дневне активности (са приказом кроз календар), трошкове и буџет, белешке, подсетнике, checklist/packing листу, као и дељење плана путем кода или QR кода са другим особама. Овај рад се бави имплементацијом обсервабилности над постојећим системом Travel Planner.</w:t>
+      </w:r>
+    </w:p>
+    <w:p>
+      <w:pPr>
+        <w:pStyle w:val="BodyText"/>
+        <w:jc w:val="center"/>
+      </w:pPr>
+      <w:r/>
+      <w:r>
+        <w:drawing>
+          <wp:inline>
+            <wp:extent cx="2880000" cy="4484259"/>
+            <wp:docPr id="10" name="Picture 10"/>
+            <wp:cNvGraphicFramePr>
+              <a:graphicFrameLocks noChangeAspect="1"/>
+            </wp:cNvGraphicFramePr>
+            <a:graphic>
+              <a:graphicData uri="http://schemas.openxmlformats.org/drawingml/2006/picture">
+                <pic:pic>
+                  <pic:nvPicPr>
+                    <pic:cNvPr id="0" name="slika_1_2.png"/>
+                    <pic:cNvPicPr/>
+                  </pic:nvPicPr>
+                  <pic:blipFill>
+                    <a:blip r:embed="rId36"/>
+                    <a:stretch>
+                      <a:fillRect/>
+                    </a:stretch>
+                  </pic:blipFill>
+                  <pic:spPr>
+                    <a:xfrm>
+                      <a:off x="0" y="0"/>
+                      <a:ext cx="2880000" cy="4484259"/>
+                    </a:xfrm>
+                    <a:prstGeom prst="rect"/>
+                  </pic:spPr>
+                </pic:pic>
+              </a:graphicData>
+            </a:graphic>
+          </wp:inline>
+        </w:drawing>
+      </w:r>
+    </w:p>
+    <w:p>
+      <w:pPr>
+        <w:pStyle w:val="Slika"/>
+      </w:pPr>
+      <w:r>
+        <w:t>Слика 1.1. Дељење плана путовања путем кода/QR кода</w:t>
+      </w:r>
+    </w:p>
+    <w:p xmlns:wp14="http://schemas.microsoft.com/office/word/2010/wordml" wp14:textId="77777777">
+      <w:pPr>
+        <w:pStyle w:val="BodyText"/>
+      </w:pPr>
+      <w:r>
+        <w:t>Систем је реализован као микросервисна архитектура на платформи Microsoft Service Fabric, са четири одвојена сервиса (Gateway, AuthService, TripService, SharingService) и базом података по сервису (database-per-service) у Microsoft SQL Server-у. Оваква архитектура доноси познате предности микросервиса — независно скалирање, одвојен развој и deployment по сервису — али и познат проблем: један корисников захтев често пролази кроз више процеса, база и мрежних позива, па постаје знатно теже одговорити на питања попут „зашто је овај захтев спор?“, „где тачно долази до грешке?“ или „да ли је систем тренутно здрав?“ него код монолитне апликације.</w:t>
+      </w:r>
+    </w:p>
+    <w:p xmlns:wp14="http://schemas.microsoft.com/office/word/2010/wordml" wp14:textId="05DDD3D1">
+      <w:pPr>
+        <w:pStyle w:val="BodyText"/>
+      </w:pPr>
+      <w:r>
+        <w:rPr/>
+        <w:t xml:space="preserve">Тема </w:t>
+      </w:r>
+      <w:r>
+        <w:rPr/>
+        <w:t>овог</w:t>
+      </w:r>
+      <w:r>
+        <w:rPr/>
+        <w:t xml:space="preserve"> </w:t>
+      </w:r>
+      <w:r>
+        <w:rPr/>
+        <w:t>рада</w:t>
+      </w:r>
+      <w:r>
+        <w:rPr/>
+        <w:t xml:space="preserve">, </w:t>
+      </w:r>
+      <w:r>
+        <w:rPr/>
+        <w:t>Имплементација</w:t>
+      </w:r>
+      <w:r>
+        <w:rPr/>
+        <w:t xml:space="preserve"> </w:t>
+      </w:r>
+      <w:r>
+        <w:rPr/>
+        <w:t>о</w:t>
+      </w:r>
+      <w:r>
+        <w:rPr/>
+        <w:t>б</w:t>
+      </w:r>
+      <w:r>
+        <w:rPr/>
+        <w:t>сервабилности</w:t>
+      </w:r>
+      <w:r>
+        <w:rPr/>
+        <w:t xml:space="preserve"> </w:t>
+      </w:r>
+      <w:r>
+        <w:rPr/>
+        <w:t>микросервисне</w:t>
+      </w:r>
+      <w:r>
+        <w:rPr/>
+        <w:t xml:space="preserve"> </w:t>
+      </w:r>
+      <w:r>
+        <w:rPr/>
+        <w:t>архитектуре</w:t>
+      </w:r>
+      <w:r>
+        <w:rPr/>
+        <w:t xml:space="preserve">, </w:t>
+      </w:r>
+      <w:r>
+        <w:rPr/>
+        <w:t>директно</w:t>
+      </w:r>
+      <w:r>
+        <w:rPr/>
+        <w:t xml:space="preserve"> </w:t>
+      </w:r>
+      <w:r>
+        <w:rPr/>
+        <w:t>адресира</w:t>
+      </w:r>
+      <w:r>
+        <w:rPr/>
+        <w:t xml:space="preserve"> </w:t>
+      </w:r>
+      <w:r>
+        <w:rPr/>
+        <w:t>тај</w:t>
+      </w:r>
+      <w:r>
+        <w:rPr/>
+        <w:t xml:space="preserve"> </w:t>
+      </w:r>
+      <w:r>
+        <w:rPr/>
+        <w:t>проблем</w:t>
+      </w:r>
+      <w:r>
+        <w:rPr/>
+        <w:t xml:space="preserve">. Циљ </w:t>
+      </w:r>
+      <w:r>
+        <w:rPr/>
+        <w:t>рада</w:t>
+      </w:r>
+      <w:r>
+        <w:rPr/>
+        <w:t xml:space="preserve"> </w:t>
+      </w:r>
+      <w:r>
+        <w:rPr/>
+        <w:t>није</w:t>
+      </w:r>
+      <w:r>
+        <w:rPr/>
+        <w:t xml:space="preserve"> </w:t>
+      </w:r>
+      <w:r>
+        <w:rPr/>
+        <w:t>да</w:t>
+      </w:r>
+      <w:r>
+        <w:rPr/>
+        <w:t xml:space="preserve"> </w:t>
+      </w:r>
+      <w:r>
+        <w:rPr/>
+        <w:t>мења</w:t>
+      </w:r>
+      <w:r>
+        <w:rPr/>
+        <w:t xml:space="preserve"> </w:t>
+      </w:r>
+      <w:r>
+        <w:rPr/>
+        <w:t>пословну</w:t>
+      </w:r>
+      <w:r>
+        <w:rPr/>
+        <w:t xml:space="preserve"> </w:t>
+      </w:r>
+      <w:r>
+        <w:rPr/>
+        <w:t>логику</w:t>
+      </w:r>
+      <w:r>
+        <w:rPr/>
+        <w:t xml:space="preserve"> </w:t>
+      </w:r>
+      <w:r>
+        <w:rPr/>
+        <w:t>постојећег</w:t>
+      </w:r>
+      <w:r>
+        <w:rPr/>
+        <w:t xml:space="preserve"> </w:t>
+      </w:r>
+      <w:r>
+        <w:rPr/>
+        <w:t>система</w:t>
+      </w:r>
+      <w:r>
+        <w:rPr/>
+        <w:t xml:space="preserve"> (</w:t>
+      </w:r>
+      <w:r>
+        <w:rPr/>
+        <w:t>планове</w:t>
+      </w:r>
+      <w:r>
+        <w:rPr/>
+        <w:t xml:space="preserve">, </w:t>
+      </w:r>
+      <w:r>
+        <w:rPr/>
+        <w:t>дестинације</w:t>
+      </w:r>
+      <w:r>
+        <w:rPr/>
+        <w:t xml:space="preserve">, </w:t>
+      </w:r>
+      <w:r>
+        <w:rPr/>
+        <w:t>трошкове</w:t>
+      </w:r>
+      <w:r>
+        <w:rPr/>
+        <w:t xml:space="preserve">), </w:t>
+      </w:r>
+      <w:r>
+        <w:rPr/>
+        <w:t>већ</w:t>
+      </w:r>
+      <w:r>
+        <w:rPr/>
+        <w:t xml:space="preserve"> </w:t>
+      </w:r>
+      <w:r>
+        <w:rPr/>
+        <w:t>да</w:t>
+      </w:r>
+      <w:r>
+        <w:rPr/>
+        <w:t xml:space="preserve"> </w:t>
+      </w:r>
+      <w:r>
+        <w:rPr/>
+        <w:t>га</w:t>
+      </w:r>
+      <w:r>
+        <w:rPr/>
+        <w:t xml:space="preserve"> </w:t>
+      </w:r>
+      <w:r>
+        <w:rPr/>
+        <w:t>надогради</w:t>
+      </w:r>
+      <w:r>
+        <w:rPr/>
+        <w:t xml:space="preserve"> </w:t>
+      </w:r>
+      <w:r>
+        <w:rPr/>
+        <w:t>слојем</w:t>
+      </w:r>
+      <w:r>
+        <w:rPr/>
+        <w:t xml:space="preserve"> </w:t>
+      </w:r>
+      <w:r>
+        <w:rPr/>
+        <w:t>о</w:t>
+      </w:r>
+      <w:r>
+        <w:rPr/>
+        <w:t>б</w:t>
+      </w:r>
+      <w:r>
+        <w:rPr/>
+        <w:t>сервабилности</w:t>
+      </w:r>
+      <w:r>
+        <w:rPr/>
+        <w:t xml:space="preserve"> </w:t>
+      </w:r>
+      <w:r>
+        <w:rPr/>
+        <w:t>заснованим</w:t>
+      </w:r>
+      <w:r>
+        <w:rPr/>
+        <w:t xml:space="preserve"> </w:t>
+      </w:r>
+      <w:r>
+        <w:rPr/>
+        <w:t>на</w:t>
+      </w:r>
+      <w:r>
+        <w:rPr/>
+        <w:t xml:space="preserve"> </w:t>
+      </w:r>
+      <w:r>
+        <w:rPr/>
+        <w:t>индустријском</w:t>
+      </w:r>
+      <w:r>
+        <w:rPr/>
+        <w:t xml:space="preserve"> </w:t>
+      </w:r>
+      <w:r>
+        <w:rPr/>
+        <w:t>стандарду</w:t>
+      </w:r>
+      <w:r>
+        <w:rPr/>
+        <w:t xml:space="preserve"> </w:t>
+      </w:r>
+      <w:r>
+        <w:rPr/>
+        <w:t>OpenTelemetry</w:t>
+      </w:r>
+      <w:r>
+        <w:rPr/>
+        <w:t xml:space="preserve"> — </w:t>
+      </w:r>
+      <w:r>
+        <w:rPr/>
+        <w:t>дистрибуирано</w:t>
+      </w:r>
+      <w:r>
+        <w:rPr/>
+        <w:t xml:space="preserve"> </w:t>
+      </w:r>
+      <w:r>
+        <w:rPr/>
+        <w:t>праћење</w:t>
+      </w:r>
+      <w:r>
+        <w:rPr/>
+        <w:t xml:space="preserve"> </w:t>
+      </w:r>
+      <w:r>
+        <w:rPr/>
+        <w:t>захтева</w:t>
+      </w:r>
+      <w:r>
+        <w:rPr/>
+        <w:t xml:space="preserve"> (distributed tracing), </w:t>
+      </w:r>
+      <w:r>
+        <w:rPr/>
+        <w:t>структурисано</w:t>
+      </w:r>
+      <w:r>
+        <w:rPr/>
+        <w:t xml:space="preserve"> </w:t>
+      </w:r>
+      <w:r>
+        <w:rPr/>
+        <w:t>логовање</w:t>
+      </w:r>
+      <w:r>
+        <w:rPr/>
+        <w:t xml:space="preserve">, </w:t>
+      </w:r>
+      <w:r>
+        <w:rPr/>
+        <w:t>метрике</w:t>
+      </w:r>
+      <w:r>
+        <w:rPr/>
+        <w:t xml:space="preserve"> </w:t>
+      </w:r>
+      <w:r>
+        <w:rPr/>
+        <w:t>перформанси</w:t>
+      </w:r>
+      <w:r>
+        <w:rPr/>
+        <w:t xml:space="preserve"> и health check </w:t>
+      </w:r>
+      <w:r>
+        <w:rPr/>
+        <w:t>механизме</w:t>
+      </w:r>
+      <w:r>
+        <w:rPr/>
+        <w:t xml:space="preserve"> — и </w:t>
+      </w:r>
+      <w:r>
+        <w:rPr/>
+        <w:t>да</w:t>
+      </w:r>
+      <w:r>
+        <w:rPr/>
+        <w:t xml:space="preserve"> </w:t>
+      </w:r>
+      <w:r>
+        <w:rPr/>
+        <w:t>ту</w:t>
+      </w:r>
+      <w:r>
+        <w:rPr/>
+        <w:t xml:space="preserve"> </w:t>
+      </w:r>
+      <w:r>
+        <w:rPr/>
+        <w:t>надоградњу</w:t>
+      </w:r>
+      <w:r>
+        <w:rPr/>
+        <w:t xml:space="preserve"> </w:t>
+      </w:r>
+      <w:r>
+        <w:rPr/>
+        <w:t>докаже</w:t>
+      </w:r>
+      <w:r>
+        <w:rPr/>
+        <w:t xml:space="preserve"> </w:t>
+      </w:r>
+      <w:r>
+        <w:rPr/>
+        <w:t>кроз</w:t>
+      </w:r>
+      <w:r>
+        <w:rPr/>
+        <w:t xml:space="preserve"> </w:t>
+      </w:r>
+      <w:r>
+        <w:rPr/>
+        <w:t>стварно</w:t>
+      </w:r>
+      <w:r>
+        <w:rPr/>
+        <w:t xml:space="preserve"> </w:t>
+      </w:r>
+      <w:r>
+        <w:rPr/>
+        <w:t>извршавање</w:t>
+      </w:r>
+      <w:r>
+        <w:rPr/>
+        <w:t xml:space="preserve">, </w:t>
+      </w:r>
+      <w:r>
+        <w:rPr/>
+        <w:t>аутоматизоване</w:t>
+      </w:r>
+      <w:r>
+        <w:rPr/>
+        <w:t xml:space="preserve"> </w:t>
+      </w:r>
+      <w:r>
+        <w:rPr/>
+        <w:t>тестове</w:t>
+      </w:r>
+      <w:r>
+        <w:rPr/>
+        <w:t xml:space="preserve"> и </w:t>
+      </w:r>
+      <w:r>
+        <w:rPr/>
+        <w:t>мерљиве</w:t>
+      </w:r>
+      <w:r>
+        <w:rPr/>
+        <w:t xml:space="preserve"> </w:t>
+      </w:r>
+      <w:r>
+        <w:rPr/>
+        <w:t>резултате</w:t>
+      </w:r>
+      <w:r>
+        <w:rPr/>
+        <w:t xml:space="preserve">, а </w:t>
+      </w:r>
+      <w:r>
+        <w:rPr/>
+        <w:t>не</w:t>
+      </w:r>
+      <w:r>
+        <w:rPr/>
+        <w:t xml:space="preserve"> </w:t>
+      </w:r>
+      <w:r>
+        <w:rPr/>
+        <w:t>само</w:t>
+      </w:r>
+      <w:r>
+        <w:rPr/>
+        <w:t xml:space="preserve"> </w:t>
+      </w:r>
+      <w:r>
+        <w:rPr/>
+        <w:t>кроз</w:t>
+      </w:r>
+      <w:r>
+        <w:rPr/>
+        <w:t xml:space="preserve"> </w:t>
+      </w:r>
+      <w:r>
+        <w:rPr/>
+        <w:t>инсталацију</w:t>
+      </w:r>
+      <w:r>
+        <w:rPr/>
+        <w:t xml:space="preserve"> </w:t>
+      </w:r>
+      <w:r>
+        <w:rPr/>
+        <w:t>алата</w:t>
+      </w:r>
+      <w:r>
+        <w:rPr/>
+        <w:t>.</w:t>
+      </w:r>
+    </w:p>
+    <w:p xmlns:wp14="http://schemas.microsoft.com/office/word/2010/wordml" wp14:textId="77777777">
+      <w:pPr>
+        <w:pStyle w:val="BodyText"/>
+      </w:pPr>
+      <w:r>
+        <w:t>Рад је организован тако да прво анализира постојеће стање система (поглавља 2-4), затим детаљно описује предложено и имплементирано решење (поглавље 5), верификује га кроз тестирање и демонстрационе сценарије над стварно постављеним системом (поглавље 6), и на крају сумира постигнуте резултате, ограничења и правце даљег развоја (поглавље 7).</w:t>
+      </w:r>
+    </w:p>
+    <w:p>
+      <w:pPr>
+        <w:pStyle w:val="text"/>
+        <w:rPr>
+          <w:lang w:val="sr-Cyrl-RS"/>
+        </w:rPr>
+      </w:pPr>
+    </w:p>
+    <w:p>
+      <w:pPr>
+        <w:pStyle w:val="text"/>
+        <w:ind w:left="0"/>
+      </w:pPr>
+    </w:p>
+    <w:p>
+      <w:pPr>
+        <w:pStyle w:val="Heading1"/>
+        <w:rPr>
+          <w:lang w:val="sr-Cyrl-RS"/>
+        </w:rPr>
+      </w:pPr>
+      <w:bookmarkStart w:name="_Toc776203058" w:id="968689803"/>
+      <w:r>
+        <w:rPr>
+          <w:lang w:val="sr-Cyrl-RS"/>
+        </w:rPr>
+        <w:t>Опис проблема</w:t>
+      </w:r>
+      <w:bookmarkEnd w:id="968689803"/>
+    </w:p>
+    <w:p xmlns:wp14="http://schemas.microsoft.com/office/word/2010/wordml" wp14:textId="0AA179DA">
+      <w:pPr>
+        <w:pStyle w:val="BodyText"/>
+      </w:pPr>
+      <w:r>
+        <w:rPr/>
+        <w:t xml:space="preserve">Анализа </w:t>
+      </w:r>
+      <w:r>
+        <w:rPr/>
+        <w:t>постојећег</w:t>
+      </w:r>
+      <w:r>
+        <w:rPr/>
+        <w:t xml:space="preserve"> </w:t>
+      </w:r>
+      <w:r>
+        <w:rPr/>
+        <w:t>система</w:t>
+      </w:r>
+      <w:r>
+        <w:rPr/>
+        <w:t xml:space="preserve"> (</w:t>
+      </w:r>
+      <w:r>
+        <w:rPr/>
+        <w:t>детаљно</w:t>
+      </w:r>
+      <w:r>
+        <w:rPr/>
+        <w:t xml:space="preserve"> </w:t>
+      </w:r>
+      <w:r>
+        <w:rPr/>
+        <w:t>описаног</w:t>
+      </w:r>
+      <w:r>
+        <w:rPr/>
+        <w:t xml:space="preserve"> у </w:t>
+      </w:r>
+      <w:r>
+        <w:rPr/>
+        <w:t>поглављу</w:t>
+      </w:r>
+      <w:r>
+        <w:rPr/>
+        <w:t xml:space="preserve"> 4) </w:t>
+      </w:r>
+      <w:r>
+        <w:rPr/>
+        <w:t>показала</w:t>
+      </w:r>
+      <w:r>
+        <w:rPr/>
+        <w:t xml:space="preserve"> </w:t>
+      </w:r>
+      <w:r>
+        <w:rPr/>
+        <w:t>је</w:t>
+      </w:r>
+      <w:r>
+        <w:rPr/>
+        <w:t xml:space="preserve"> </w:t>
+      </w:r>
+      <w:r>
+        <w:rPr/>
+        <w:t>да</w:t>
+      </w:r>
+      <w:r>
+        <w:rPr/>
+        <w:t xml:space="preserve"> Travel Planner, </w:t>
+      </w:r>
+      <w:r>
+        <w:rPr/>
+        <w:t>иако</w:t>
+      </w:r>
+      <w:r>
+        <w:rPr/>
+        <w:t xml:space="preserve"> </w:t>
+      </w:r>
+      <w:r>
+        <w:rPr/>
+        <w:t>функционално</w:t>
+      </w:r>
+      <w:r>
+        <w:rPr/>
+        <w:t xml:space="preserve"> </w:t>
+      </w:r>
+      <w:r>
+        <w:rPr/>
+        <w:t>комплетан</w:t>
+      </w:r>
+      <w:r>
+        <w:rPr/>
+        <w:t xml:space="preserve"> и </w:t>
+      </w:r>
+      <w:r>
+        <w:rPr/>
+        <w:t>добро</w:t>
+      </w:r>
+      <w:r>
+        <w:rPr/>
+        <w:t xml:space="preserve"> </w:t>
+      </w:r>
+      <w:r>
+        <w:rPr/>
+        <w:t>структурисан</w:t>
+      </w:r>
+      <w:r>
+        <w:rPr/>
+        <w:t xml:space="preserve"> у </w:t>
+      </w:r>
+      <w:r>
+        <w:rPr/>
+        <w:t>погледу</w:t>
+      </w:r>
+      <w:r>
+        <w:rPr/>
+        <w:t xml:space="preserve"> </w:t>
+      </w:r>
+      <w:r>
+        <w:rPr/>
+        <w:t>поделе</w:t>
+      </w:r>
+      <w:r>
+        <w:rPr/>
+        <w:t xml:space="preserve"> </w:t>
+      </w:r>
+      <w:r>
+        <w:rPr/>
+        <w:t>одговорности</w:t>
+      </w:r>
+      <w:r>
+        <w:rPr/>
+        <w:t xml:space="preserve"> </w:t>
+      </w:r>
+      <w:r>
+        <w:rPr/>
+        <w:t>између</w:t>
+      </w:r>
+      <w:r>
+        <w:rPr/>
+        <w:t xml:space="preserve"> </w:t>
+      </w:r>
+      <w:r>
+        <w:rPr/>
+        <w:t>сервиса</w:t>
+      </w:r>
+      <w:r>
+        <w:rPr/>
+        <w:t xml:space="preserve">, </w:t>
+      </w:r>
+      <w:r>
+        <w:rPr/>
+        <w:t>нема</w:t>
+      </w:r>
+      <w:r>
+        <w:rPr/>
+        <w:t xml:space="preserve"> </w:t>
+      </w:r>
+      <w:r>
+        <w:rPr/>
+        <w:t>ниједан</w:t>
+      </w:r>
+      <w:r>
+        <w:rPr/>
+        <w:t xml:space="preserve"> </w:t>
+      </w:r>
+      <w:r>
+        <w:rPr/>
+        <w:t>механизам</w:t>
+      </w:r>
+      <w:r>
+        <w:rPr/>
+        <w:t xml:space="preserve"> </w:t>
+      </w:r>
+      <w:r>
+        <w:rPr/>
+        <w:t>о</w:t>
+      </w:r>
+      <w:r>
+        <w:rPr/>
+        <w:t>б</w:t>
+      </w:r>
+      <w:r>
+        <w:rPr/>
+        <w:t>сервабилности</w:t>
+      </w:r>
+      <w:r>
+        <w:rPr/>
+        <w:t xml:space="preserve"> </w:t>
+      </w:r>
+      <w:r>
+        <w:rPr/>
+        <w:t>изнад</w:t>
+      </w:r>
+      <w:r>
+        <w:rPr/>
+        <w:t xml:space="preserve"> </w:t>
+      </w:r>
+      <w:r>
+        <w:rPr/>
+        <w:t>апсолутног</w:t>
+      </w:r>
+      <w:r>
+        <w:rPr/>
+        <w:t xml:space="preserve"> </w:t>
+      </w:r>
+      <w:r>
+        <w:rPr/>
+        <w:t>минимума</w:t>
+      </w:r>
+      <w:r>
+        <w:rPr/>
+        <w:t xml:space="preserve"> </w:t>
+      </w:r>
+      <w:r>
+        <w:rPr/>
+        <w:t>који</w:t>
+      </w:r>
+      <w:r>
+        <w:rPr/>
+        <w:t xml:space="preserve"> </w:t>
+      </w:r>
+      <w:r>
+        <w:rPr/>
+        <w:t>сам</w:t>
+      </w:r>
+      <w:r>
+        <w:rPr/>
+        <w:t xml:space="preserve"> ASP.NET Core </w:t>
+      </w:r>
+      <w:r>
+        <w:rPr/>
+        <w:t>оквир</w:t>
+      </w:r>
+      <w:r>
+        <w:rPr/>
+        <w:t xml:space="preserve"> </w:t>
+      </w:r>
+      <w:r>
+        <w:rPr/>
+        <w:t>пружа</w:t>
+      </w:r>
+      <w:r>
+        <w:rPr/>
+        <w:t xml:space="preserve"> </w:t>
+      </w:r>
+      <w:r>
+        <w:rPr/>
+        <w:t>подразумевано</w:t>
+      </w:r>
+      <w:r>
+        <w:rPr/>
+        <w:t xml:space="preserve">. </w:t>
+      </w:r>
+      <w:r>
+        <w:rPr/>
+        <w:t>Конкретно</w:t>
+      </w:r>
+      <w:r>
+        <w:rPr/>
+        <w:t xml:space="preserve">, </w:t>
+      </w:r>
+      <w:r>
+        <w:rPr/>
+        <w:t>идентификовани</w:t>
+      </w:r>
+      <w:r>
+        <w:rPr/>
+        <w:t xml:space="preserve"> </w:t>
+      </w:r>
+      <w:r>
+        <w:rPr/>
+        <w:t>су</w:t>
+      </w:r>
+      <w:r>
+        <w:rPr/>
+        <w:t xml:space="preserve"> </w:t>
+      </w:r>
+      <w:r>
+        <w:rPr/>
+        <w:t>следећи</w:t>
+      </w:r>
+      <w:r>
+        <w:rPr/>
+        <w:t xml:space="preserve"> </w:t>
+      </w:r>
+      <w:r>
+        <w:rPr/>
+        <w:t>проблеми</w:t>
+      </w:r>
+      <w:r>
+        <w:rPr/>
+        <w:t>:</w:t>
+      </w:r>
+    </w:p>
+    <w:p xmlns:wp14="http://schemas.microsoft.com/office/word/2010/wordml" wp14:textId="77777777">
+      <w:pPr>
+        <w:pStyle w:val="Heading2"/>
+      </w:pPr>
+      <w:r>
+        <w:t>Немогуће праћење захтева кроз више сервиса</w:t>
+      </w:r>
+    </w:p>
+    <w:p xmlns:wp14="http://schemas.microsoft.com/office/word/2010/wordml" wp14:textId="77777777">
+      <w:pPr>
+        <w:pStyle w:val="BodyText"/>
+      </w:pPr>
+      <w:r>
+        <w:t>Захтев корисника типично пролази кроз ланац Frontend → Gateway → сервис (нпр. AuthService), а поједини токови иду и даље, сервис-сервис (нпр. SharingService → TripService приликом разрешавања дељеног плана). Не постоји ниједан идентификатор (correlation/trace ID) који би повезао логове настале у различитим процесима за исти кориснички захтев. Ако захтев успори или падне негде у ланцу, једини начин да се проблем лоцира био би ручно упоређивање временских печата логова из различитих сервиса — непоуздано и споро.</w:t>
+      </w:r>
+    </w:p>
+    <w:p xmlns:wp14="http://schemas.microsoft.com/office/word/2010/wordml" wp14:textId="77777777">
+      <w:pPr>
+        <w:pStyle w:val="Heading2"/>
+      </w:pPr>
+      <w:r>
+        <w:t>Одсуство метрика перформанси</w:t>
+      </w:r>
+    </w:p>
+    <w:p xmlns:wp14="http://schemas.microsoft.com/office/word/2010/wordml" wp14:textId="77777777">
+      <w:pPr>
+        <w:pStyle w:val="BodyText"/>
+      </w:pPr>
+      <w:r>
+        <w:t>Ниједан сервис не излаже метрике броја захтева, латенције, стопе грешака нити искоришћења ресурса (CPU, меморија). Пад перформанси (нпр. спор упит ка бази) остао би потпуно невидљив док се корисници директно не пожале.</w:t>
+      </w:r>
+    </w:p>
+    <w:p xmlns:wp14="http://schemas.microsoft.com/office/word/2010/wordml" wp14:textId="77777777">
+      <w:pPr>
+        <w:pStyle w:val="Heading2"/>
+      </w:pPr>
+      <w:r>
+        <w:t>Тихе грешке</w:t>
+      </w:r>
+    </w:p>
+    <w:p xmlns:wp14="http://schemas.microsoft.com/office/word/2010/wordml" wp14:textId="77777777">
+      <w:pPr>
+        <w:pStyle w:val="BodyText"/>
+      </w:pPr>
+      <w:r>
+        <w:t>У коду постоје примери у којима се грешка ухвати (try/catch) и обради без иједног трага у логу. Конкретан пример: AuthService/Services/TripClient.cs, метода DeleteUserTripsAsync — при брисању корисничког налога позива се TripService да обрише све планове тог корисника; ако тај позив не успе (сервис недоступан, мрежни проблем), изворни код је само враћао false, без иједног записа у логу. Систем би остао недоследан (обрисан налог, а планови и даље постоје у бази), без иједног трага зашто.</w:t>
+      </w:r>
+    </w:p>
+    <w:p xmlns:wp14="http://schemas.microsoft.com/office/word/2010/wordml" wp14:textId="77777777">
+      <w:pPr>
+        <w:pStyle w:val="Heading2"/>
+      </w:pPr>
+      <w:r>
+        <w:t>Одсуство health check механизама</w:t>
+      </w:r>
+    </w:p>
+    <w:p xmlns:wp14="http://schemas.microsoft.com/office/word/2010/wordml" wp14:textId="77777777">
+      <w:pPr>
+        <w:pStyle w:val="BodyText"/>
+      </w:pPr>
+      <w:r>
+        <w:t>Ниједан сервис не излаже endpoint преко ког би се споља (оркестрација, monitoring алат, човек) проверило да ли сервис стварно ради и да ли су његове зависности (база, други сервиси) доступне. Service Fabric поседује сопствени интерни health модел, али му се health стање апликационог нивоа (нпр. „да ли TripService може да се повеже на своју базу“) никада не пријављује.</w:t>
+      </w:r>
+    </w:p>
+    <w:p xmlns:wp14="http://schemas.microsoft.com/office/word/2010/wordml" wp14:textId="77777777">
+      <w:pPr>
+        <w:pStyle w:val="Heading2"/>
+      </w:pPr>
+      <w:r>
+        <w:t>Нестандардизовано, минимално логовање</w:t>
+      </w:r>
+    </w:p>
+    <w:p xmlns:wp14="http://schemas.microsoft.com/office/word/2010/wordml" wp14:textId="77777777">
+      <w:pPr>
+        <w:pStyle w:val="BodyText"/>
+      </w:pPr>
+      <w:r>
+        <w:t>Свака appsettings.json конфигурација дефинише ниво логовања (Information/Warning), али у пракси се у коду скоро нигде не позива ILogger — grep кроз цео backend је показао 0 позива ILogger/_logger пре овог рада. Постојећи Service Fabric ETW ServiceEventSource механизам користи се искључиво за lifecycle догађаје (покретање Kestrel-а, регистрација сервисног типа), не за токове пословне логике.</w:t>
+      </w:r>
+    </w:p>
+    <w:p xmlns:wp14="http://schemas.microsoft.com/office/word/2010/wordml" wp14:textId="31CA7907">
+      <w:pPr>
+        <w:pStyle w:val="BodyText"/>
+      </w:pPr>
+      <w:r>
+        <w:rPr/>
+        <w:t xml:space="preserve">Ови </w:t>
+      </w:r>
+      <w:r>
+        <w:rPr/>
+        <w:t>проблеми</w:t>
+      </w:r>
+      <w:r>
+        <w:rPr/>
+        <w:t xml:space="preserve"> </w:t>
+      </w:r>
+      <w:r>
+        <w:rPr/>
+        <w:t>су</w:t>
+      </w:r>
+      <w:r>
+        <w:rPr/>
+        <w:t xml:space="preserve"> </w:t>
+      </w:r>
+      <w:r>
+        <w:rPr/>
+        <w:t>директно</w:t>
+      </w:r>
+      <w:r>
+        <w:rPr/>
+        <w:t xml:space="preserve"> </w:t>
+      </w:r>
+      <w:r>
+        <w:rPr/>
+        <w:t>повезани</w:t>
+      </w:r>
+      <w:r>
+        <w:rPr/>
+        <w:t xml:space="preserve"> — </w:t>
+      </w:r>
+      <w:r>
+        <w:rPr/>
+        <w:t>сви</w:t>
+      </w:r>
+      <w:r>
+        <w:rPr/>
+        <w:t xml:space="preserve"> </w:t>
+      </w:r>
+      <w:r>
+        <w:rPr/>
+        <w:t>произилазе</w:t>
+      </w:r>
+      <w:r>
+        <w:rPr/>
+        <w:t xml:space="preserve"> </w:t>
+      </w:r>
+      <w:r>
+        <w:rPr/>
+        <w:t>из</w:t>
+      </w:r>
+      <w:r>
+        <w:rPr/>
+        <w:t xml:space="preserve"> </w:t>
+      </w:r>
+      <w:r>
+        <w:rPr/>
+        <w:t>недостатка</w:t>
+      </w:r>
+      <w:r>
+        <w:rPr/>
+        <w:t xml:space="preserve"> </w:t>
+      </w:r>
+      <w:r>
+        <w:rPr/>
+        <w:t>јединственог</w:t>
+      </w:r>
+      <w:r>
+        <w:rPr/>
+        <w:t xml:space="preserve">, </w:t>
+      </w:r>
+      <w:r>
+        <w:rPr/>
+        <w:t>стандардизованог</w:t>
+      </w:r>
+      <w:r>
+        <w:rPr/>
+        <w:t xml:space="preserve"> </w:t>
+      </w:r>
+      <w:r>
+        <w:rPr/>
+        <w:t>слоја</w:t>
+      </w:r>
+      <w:r>
+        <w:rPr/>
+        <w:t xml:space="preserve"> </w:t>
+      </w:r>
+      <w:r>
+        <w:rPr/>
+        <w:t>о</w:t>
+      </w:r>
+      <w:r>
+        <w:rPr/>
+        <w:t>б</w:t>
+      </w:r>
+      <w:r>
+        <w:rPr/>
+        <w:t>сервабилности</w:t>
+      </w:r>
+      <w:r>
+        <w:rPr/>
+        <w:t xml:space="preserve">, а </w:t>
+      </w:r>
+      <w:r>
+        <w:rPr/>
+        <w:t>не</w:t>
+      </w:r>
+      <w:r>
+        <w:rPr/>
+        <w:t xml:space="preserve"> </w:t>
+      </w:r>
+      <w:r>
+        <w:rPr/>
+        <w:t>из</w:t>
+      </w:r>
+      <w:r>
+        <w:rPr/>
+        <w:t xml:space="preserve"> </w:t>
+      </w:r>
+      <w:r>
+        <w:rPr/>
+        <w:t>појединачних</w:t>
+      </w:r>
+      <w:r>
+        <w:rPr/>
+        <w:t xml:space="preserve">, </w:t>
+      </w:r>
+      <w:r>
+        <w:rPr/>
+        <w:t>изолованих</w:t>
+      </w:r>
+      <w:r>
+        <w:rPr/>
+        <w:t xml:space="preserve"> </w:t>
+      </w:r>
+      <w:r>
+        <w:rPr/>
+        <w:t>пропуста</w:t>
+      </w:r>
+      <w:r>
+        <w:rPr/>
+        <w:t xml:space="preserve">. </w:t>
+      </w:r>
+      <w:r>
+        <w:rPr/>
+        <w:t>То</w:t>
+      </w:r>
+      <w:r>
+        <w:rPr/>
+        <w:t xml:space="preserve"> </w:t>
+      </w:r>
+      <w:r>
+        <w:rPr/>
+        <w:t>је</w:t>
+      </w:r>
+      <w:r>
+        <w:rPr/>
+        <w:t xml:space="preserve"> </w:t>
+      </w:r>
+      <w:r>
+        <w:rPr/>
+        <w:t>управо</w:t>
+      </w:r>
+      <w:r>
+        <w:rPr/>
+        <w:t xml:space="preserve"> </w:t>
+      </w:r>
+      <w:r>
+        <w:rPr/>
+        <w:t>разлог</w:t>
+      </w:r>
+      <w:r>
+        <w:rPr/>
+        <w:t xml:space="preserve"> </w:t>
+      </w:r>
+      <w:r>
+        <w:rPr/>
+        <w:t>зашто</w:t>
+      </w:r>
+      <w:r>
+        <w:rPr/>
+        <w:t xml:space="preserve"> </w:t>
+      </w:r>
+      <w:r>
+        <w:rPr/>
+        <w:t>је</w:t>
+      </w:r>
+      <w:r>
+        <w:rPr/>
+        <w:t xml:space="preserve"> </w:t>
+      </w:r>
+      <w:r>
+        <w:rPr/>
+        <w:t>предложено</w:t>
+      </w:r>
+      <w:r>
+        <w:rPr/>
+        <w:t xml:space="preserve"> </w:t>
+      </w:r>
+      <w:r>
+        <w:rPr/>
+        <w:t>решење</w:t>
+      </w:r>
+      <w:r>
+        <w:rPr/>
+        <w:t xml:space="preserve"> (</w:t>
+      </w:r>
+      <w:r>
+        <w:rPr/>
+        <w:t>поглавље</w:t>
+      </w:r>
+      <w:r>
+        <w:rPr/>
+        <w:t xml:space="preserve"> 5) </w:t>
+      </w:r>
+      <w:r>
+        <w:rPr/>
+        <w:t>целовит</w:t>
+      </w:r>
+      <w:r>
+        <w:rPr/>
+        <w:t xml:space="preserve"> </w:t>
+      </w:r>
+      <w:r>
+        <w:rPr/>
+        <w:t>слој</w:t>
+      </w:r>
+      <w:r>
+        <w:rPr/>
+        <w:t xml:space="preserve"> </w:t>
+      </w:r>
+      <w:r>
+        <w:rPr/>
+        <w:t>заснован</w:t>
+      </w:r>
+      <w:r>
+        <w:rPr/>
+        <w:t xml:space="preserve"> </w:t>
+      </w:r>
+      <w:r>
+        <w:rPr/>
+        <w:t>на</w:t>
+      </w:r>
+      <w:r>
+        <w:rPr/>
+        <w:t xml:space="preserve"> </w:t>
+      </w:r>
+      <w:r>
+        <w:rPr/>
+        <w:t>једном</w:t>
+      </w:r>
+      <w:r>
+        <w:rPr/>
+        <w:t xml:space="preserve"> </w:t>
+      </w:r>
+      <w:r>
+        <w:rPr/>
+        <w:t>стандарду</w:t>
+      </w:r>
+      <w:r>
+        <w:rPr/>
+        <w:t xml:space="preserve"> (</w:t>
+      </w:r>
+      <w:r>
+        <w:rPr/>
+        <w:t>OpenTelemetry</w:t>
+      </w:r>
+      <w:r>
+        <w:rPr/>
+        <w:t xml:space="preserve">), а </w:t>
+      </w:r>
+      <w:r>
+        <w:rPr/>
+        <w:t>не</w:t>
+      </w:r>
+      <w:r>
+        <w:rPr/>
+        <w:t xml:space="preserve"> </w:t>
+      </w:r>
+      <w:r>
+        <w:rPr/>
+        <w:t>низ</w:t>
+      </w:r>
+      <w:r>
+        <w:rPr/>
+        <w:t xml:space="preserve"> ad-hoc </w:t>
+      </w:r>
+      <w:r>
+        <w:rPr/>
+        <w:t>закрпа</w:t>
+      </w:r>
+      <w:r>
+        <w:rPr/>
+        <w:t>.</w:t>
+      </w:r>
+    </w:p>
+    <w:p>
+      <w:pPr>
+        <w:pStyle w:val="Heading1"/>
+        <w:rPr>
+          <w:lang w:val="sr-Cyrl-RS"/>
+        </w:rPr>
+      </w:pPr>
+      <w:bookmarkStart w:name="_Toc1823417154" w:id="531594970"/>
+      <w:r>
+        <w:rPr/>
+        <w:t>Опис</w:t>
+      </w:r>
+      <w:r>
+        <w:rPr/>
+        <w:t xml:space="preserve"> </w:t>
+      </w:r>
+      <w:r>
+        <w:rPr/>
+        <w:t>коришћених</w:t>
+      </w:r>
+      <w:r>
+        <w:rPr/>
+        <w:t xml:space="preserve"> </w:t>
+      </w:r>
+      <w:r>
+        <w:rPr/>
+        <w:t>технологија</w:t>
+      </w:r>
+      <w:r>
+        <w:rPr>
+          <w:lang w:val="sr-Cyrl-RS"/>
+        </w:rPr>
+        <w:t xml:space="preserve"> и</w:t>
+      </w:r>
+      <w:r>
+        <w:rPr/>
+        <w:t xml:space="preserve"> </w:t>
+      </w:r>
+      <w:r>
+        <w:rPr>
+          <w:lang w:val="sr-Cyrl-RS"/>
+        </w:rPr>
+        <w:t>алата</w:t>
+      </w:r>
+      <w:bookmarkEnd w:id="531594970"/>
+    </w:p>
+    <w:p xmlns:wp14="http://schemas.microsoft.com/office/word/2010/wordml" wp14:textId="77777777">
+      <w:pPr>
+        <w:pStyle w:val="Heading2"/>
+      </w:pPr>
+      <w:r>
+        <w:t>Постојеће технологије (backend/frontend)</w:t>
+      </w:r>
+    </w:p>
+    <w:p xmlns:wp14="http://schemas.microsoft.com/office/word/2010/wordml" wp14:textId="77777777">
+      <w:pPr>
+        <w:pStyle w:val="BodyText"/>
+      </w:pPr>
+      <w:r>
+        <w:t>Backend четири сервиса (Gateway, AuthService, TripService, SharingService) реализован је у C#/.NET 8, хостован на Microsoft Service Fabric платформи [4] (stateless сервиси за Gateway/AuthService/TripService, stateful за SharingService), уз Entity Framework Core 8 за приступ подацима, YARP (Yet Another Reverse Proxy) [5] за Gateway рутирање, BCrypt.Net за хеширање лозинки и JWT Bearer аутентикацију. Подаци се чувају у Microsoft SQL Server бази, по принципу database-per-service (UsersDB, TripsDB, SharingDB). Frontend је React 19 (Vite) апликација која комуницира искључиво преко Gateway-а.</w:t>
+      </w:r>
+    </w:p>
+    <w:p>
+      <w:pPr>
+        <w:pStyle w:val="BodyText"/>
+      </w:pPr>
+      <w:r>
+        <w:t>У контексту Service Fabric платформе, stateless сервис не чува стање између позива на самом чвору — сваки захтев се може опслужити било којом инстанцом, а трајно стање се чува искључиво у спољној бази (SQL Server). Stateful сервис, насупрот томе, поседује локално, реплицирано стање непосредно на Service Fabric чворовима (Reliable Collections), поред спољне базе — тако да поједини подаци могу да се читају без мрежног позива ка бази. У овом пројекту, три сервиса (Gateway, AuthService, TripService) су stateless, док је SharingService stateful — детаљније објашњено у поглављу 4.</w:t>
+      </w:r>
+    </w:p>
+    <w:p xmlns:wp14="http://schemas.microsoft.com/office/word/2010/wordml" wp14:textId="77777777">
+      <w:pPr>
+        <w:pStyle w:val="Heading2"/>
+      </w:pPr>
+      <w:r>
+        <w:t>OpenTelemetry</w:t>
+      </w:r>
+    </w:p>
+    <w:p xmlns:wp14="http://schemas.microsoft.com/office/word/2010/wordml" wp14:textId="77777777">
+      <w:pPr>
+        <w:pStyle w:val="BodyText"/>
+      </w:pPr>
+      <w:r>
+        <w:t>OpenTelemetry (OTel) изабран је као централни стандард надоградње јер обједињује сва три облика телеметрије (traces, metrics, logs) под једним, vendor-неутралним API-јем и SDK-ом [2], са великим бројем готових ("auto") инструментација управо за технологије које пројекат већ користи — ASP.NET Core, HttpClient, SqlClient — тако да се велик део вредности добија без писања сопственог инструментационог кода. Верзија OpenTelemetry .NET SDK-а коришћена у раду је 1.18.0, конзистентна кроз сва четири сервиса.</w:t>
+      </w:r>
+    </w:p>
+    <w:p>
+      <w:pPr>
+        <w:pStyle w:val="BodyText"/>
+      </w:pPr>
+      <w:r>
+        <w:t>Алтернативе попут Application Insights-а или vendor-специфичних APM решења (нпр. Datadog, New Relic) су разматране, али одбачене управо због vendor lock-in-а — OTel омогућава промену backend-а за складиштење (Prometheus/Tempo/Loki → неко друго решење) без измене иједног сервиса, пошто је инструментациони код одвојен од места где телеметрија завршава.</w:t>
+      </w:r>
+    </w:p>
+    <w:p xmlns:wp14="http://schemas.microsoft.com/office/word/2010/wordml" wp14:textId="77777777">
+      <w:pPr>
+        <w:pStyle w:val="Heading2"/>
+      </w:pPr>
+      <w:r>
+        <w:t>OpenTelemetry Collector</w:t>
+      </w:r>
+    </w:p>
+    <w:p xmlns:wp14="http://schemas.microsoft.com/office/word/2010/wordml" wp14:textId="77777777">
+      <w:pPr>
+        <w:pStyle w:val="BodyText"/>
+      </w:pPr>
+      <w:r>
+        <w:t>Сервиси не шаљу телеметрију директно ка Prometheus/Tempo/Loki, већ ка једном централном OpenTelemetry Collector-у (OTLP протокол, gRPC на порту 4317). Ово раздваја „како апликација емитује телеметрију” од „где та телеметрија завршава” — каснија измена backend-а за складиштење (нпр. замена Loki-ја другим решењем) не би захтевала измену ниједног сервиса, само Collector-ове конфигурације [10].</w:t>
+      </w:r>
+    </w:p>
+    <w:p xmlns:wp14="http://schemas.microsoft.com/office/word/2010/wordml" wp14:textId="77777777">
+      <w:pPr>
+        <w:pStyle w:val="Heading2"/>
+      </w:pPr>
+      <w:r>
+        <w:t>Prometheus, Grafana Tempo, Grafana Loki</w:t>
+      </w:r>
+    </w:p>
+    <w:p xmlns:wp14="http://schemas.microsoft.com/office/word/2010/wordml" wp14:textId="77777777">
+      <w:pPr>
+        <w:pStyle w:val="BodyText"/>
+      </w:pPr>
+      <w:r>
+        <w:t>За складиштење три врсте телеметрије изабран је такозвани „Grafana stack”: Prometheus [9] за метрике (Collector излаже Prometheus-компатибилан /metrics endpoint који Prometheus периодично scrape-ује), Grafana Tempo [6] за дистрибуирано праћење захтева (trace-ове), и Grafana Loki [7] за централизоване логове. Предност ове комбинације над, на пример, самостојећим Jaeger-ом за tracing јесте што све три компоненте имају нативну, provisioned интеграцију са Grafanom — укључујући унакрсну навигацију (клик са log линије на њен trace, клик са trace-а на метрику) која је директно демонстрирана у поглављу 5.</w:t>
+      </w:r>
+    </w:p>
+    <w:p xmlns:wp14="http://schemas.microsoft.com/office/word/2010/wordml" wp14:textId="77777777">
+      <w:pPr>
+        <w:pStyle w:val="Heading2"/>
+      </w:pPr>
+      <w:r>
+        <w:t>Grafana</w:t>
+      </w:r>
+    </w:p>
+    <w:p xmlns:wp14="http://schemas.microsoft.com/office/word/2010/wordml" wp14:textId="77777777">
+      <w:pPr>
+        <w:pStyle w:val="BodyText"/>
+      </w:pPr>
+      <w:r>
+        <w:t>Grafana [11] је изабрана као јединствен визуелни слој за све три врсте телеметрије, уместо по једног специјализованог алата за сваку (нпр. Jaeger UI за trace-ове, посебан алат за метрике). Grafana подржава велики број data source-ова кроз plugin архитектуру, а Prometheus, Tempo и Loki су сви подржани нативно, без додатних plugin-ова, што је додатни разлог за избор баш ове платформе. Ово директно подржава сценарио „развијач види комплетну слику једног захтева на једном месту”, који је централна теза рада.</w:t>
+      </w:r>
+    </w:p>
+    <w:p xmlns:wp14="http://schemas.microsoft.com/office/word/2010/wordml" wp14:textId="77777777">
+      <w:pPr>
+        <w:pStyle w:val="Heading2"/>
+      </w:pPr>
+      <w:r>
+        <w:t>Health checks</w:t>
+      </w:r>
+    </w:p>
+    <w:p xmlns:wp14="http://schemas.microsoft.com/office/word/2010/wordml" wp14:textId="77777777">
+      <w:pPr>
+        <w:pStyle w:val="BodyText"/>
+      </w:pPr>
+      <w:r>
+        <w:t>Коришћен је уграђен ASP.NET Core механизам (Microsoft.Extensions.Diagnostics.HealthChecks), допуњен пакетом AspNetCore.HealthChecks.SqlServer (верзија 9.0.0, компатибилна са .NET 8) за проверу доступности SQL Server базе по сервису [3].</w:t>
+      </w:r>
+    </w:p>
+    <w:p xmlns:wp14="http://schemas.microsoft.com/office/word/2010/wordml" wp14:textId="77777777">
+      <w:pPr>
+        <w:pStyle w:val="Heading2"/>
+      </w:pPr>
+      <w:r>
+        <w:t>k6</w:t>
+      </w:r>
+    </w:p>
+    <w:p xmlns:wp14="http://schemas.microsoft.com/office/word/2010/wordml" wp14:textId="77777777">
+      <w:pPr>
+        <w:pStyle w:val="BodyText"/>
+      </w:pPr>
+      <w:r>
+        <w:t>За демонстрацију понашања система под оптерећењем (сценарио 3, поглавље 5) коришћен је k6 (Grafana k6), алат за load testing чији се скриптовани сценарији пишу у JavaScript-у, што га чини лакшим за одржавање и читање у односу на алтернативе попут JMeter-а [8].</w:t>
+      </w:r>
+    </w:p>
+    <w:p xmlns:wp14="http://schemas.microsoft.com/office/word/2010/wordml" wp14:textId="77777777">
+      <w:pPr>
+        <w:pStyle w:val="Heading2"/>
+      </w:pPr>
+      <w:r>
+        <w:t>xUnit</w:t>
+      </w:r>
+    </w:p>
+    <w:p xmlns:wp14="http://schemas.microsoft.com/office/word/2010/wordml" wp14:textId="77777777">
+      <w:pPr>
+        <w:pStyle w:val="BodyText"/>
+      </w:pPr>
+      <w:r>
+        <w:t>За аутоматизовано тестирање (поглавље 6) коришћен је xUnit [12], стандардни test framework за .NET који Microsoft подразумевано укључује у project template-е за .NET апликације, јер пројекат пре овог рада није имао дефинисан test framework нити иједан тест.</w:t>
+      </w:r>
+    </w:p>
+    <w:p xmlns:wp14="http://schemas.microsoft.com/office/word/2010/wordml" wp14:textId="77777777">
+      <w:pPr>
+        <w:pStyle w:val="Heading2"/>
+      </w:pPr>
+      <w:r>
+        <w:t>Docker / Docker Compose</w:t>
+      </w:r>
+    </w:p>
+    <w:p xmlns:wp14="http://schemas.microsoft.com/office/word/2010/wordml" wp14:textId="77777777">
+      <w:pPr>
+        <w:pStyle w:val="BodyText"/>
+      </w:pPr>
+      <w:r>
+        <w:t>Цела observability инфраструктура (Collector, Prometheus, Tempo, Loki, Grafana) покреће се кроз Docker Compose [13], алат за дефинисање и покретање вишеконтејнерских Docker апликација преко једног YAML фајла, независно од постојећег Service Fabric кластера и SQL Server инстанце — додатак, не замена постојећег начина рада система.</w:t>
+      </w:r>
+    </w:p>
+    <w:p>
+      <w:pPr>
+        <w:pStyle w:val="Heading1"/>
+        <w:rPr/>
+      </w:pPr>
+      <w:bookmarkStart w:name="_Toc459059121" w:id="1803461278"/>
+      <w:r>
+        <w:rPr>
+          <w:lang w:val="sr-Cyrl-RS"/>
+        </w:rPr>
+        <w:t xml:space="preserve">Опис </w:t>
+      </w:r>
+      <w:r>
+        <w:rPr/>
+        <w:t>почетног</w:t>
+      </w:r>
+      <w:r>
+        <w:rPr/>
+        <w:t xml:space="preserve"> </w:t>
+      </w:r>
+      <w:r>
+        <w:rPr/>
+        <w:t>решења</w:t>
+      </w:r>
+      <w:bookmarkEnd w:id="1803461278"/>
+    </w:p>
+    <w:p xmlns:wp14="http://schemas.microsoft.com/office/word/2010/wordml" wp14:textId="77777777">
+      <w:pPr>
+        <w:pStyle w:val="BodyText"/>
+      </w:pPr>
+      <w:r>
+        <w:t>У овом поглављу описано је стање система Travel Planner пре надоградње описане у овом раду — архитектура, технологије и, посебно, постојећи (или тачније, непостојећи) механизми обсервабилности, установљени детаљном анализом изворног кода.</w:t>
+      </w:r>
+    </w:p>
+    <w:p>
+      <w:pPr>
+        <w:pStyle w:val="BodyText"/>
+      </w:pPr>
+      <w:r>
+        <w:t>Слика 4.1 приказује изглед корисничког интерфејса апликације у тренутку почетка овог рада — списак планова путовања корисника.</w:t>
       </w:r>
     </w:p>
     <w:p>
@@ -8760,1502 +10258,12 @@
         <w:pStyle w:val="Slika"/>
       </w:pPr>
       <w:r>
-        <w:t>Слика 1.1. Изглед Travel Planner апликације — преглед планова путовања</w:t>
-      </w:r>
-    </w:p>
-    <w:p>
-      <w:pPr>
-        <w:pStyle w:val="BodyText"/>
-        <w:jc w:val="center"/>
-      </w:pPr>
-      <w:r/>
-      <w:r>
-        <w:drawing>
-          <wp:inline>
-            <wp:extent cx="2880000" cy="4484259"/>
-            <wp:docPr id="10" name="Picture 10"/>
-            <wp:cNvGraphicFramePr>
-              <a:graphicFrameLocks noChangeAspect="1"/>
-            </wp:cNvGraphicFramePr>
-            <a:graphic>
-              <a:graphicData uri="http://schemas.openxmlformats.org/drawingml/2006/picture">
-                <pic:pic>
-                  <pic:nvPicPr>
-                    <pic:cNvPr id="0" name="slika_1_2.png"/>
-                    <pic:cNvPicPr/>
-                  </pic:nvPicPr>
-                  <pic:blipFill>
-                    <a:blip r:embed="rId36"/>
-                    <a:stretch>
-                      <a:fillRect/>
-                    </a:stretch>
-                  </pic:blipFill>
-                  <pic:spPr>
-                    <a:xfrm>
-                      <a:off x="0" y="0"/>
-                      <a:ext cx="2880000" cy="4484259"/>
-                    </a:xfrm>
-                    <a:prstGeom prst="rect"/>
-                  </pic:spPr>
-                </pic:pic>
-              </a:graphicData>
-            </a:graphic>
-          </wp:inline>
-        </w:drawing>
-      </w:r>
-    </w:p>
-    <w:p>
-      <w:pPr>
-        <w:pStyle w:val="Slika"/>
-      </w:pPr>
-      <w:r>
-        <w:t>Слика 1.2. Дељење плана путовања путем кода/QR кода</w:t>
+        <w:t>Слика 4.1. Изглед Travel Planner апликације — преглед планова путовања</w:t>
       </w:r>
     </w:p>
     <w:p xmlns:wp14="http://schemas.microsoft.com/office/word/2010/wordml" wp14:textId="77777777">
       <w:pPr>
-        <w:pStyle w:val="BodyText"/>
-      </w:pPr>
-      <w:r>
-        <w:t>Систем је реализован као микросервисна архитектура на платформи Microsoft Service Fabric, са четири одвојена сервиса (Gateway, AuthService, TripService, SharingService) и базом података по сервису (database-per-service) у Microsoft SQL Server-у. Оваква архитектура доноси познате предности микросервиса — независно скалирање, одвојен развој и deployment по сервису — али и познат проблем: један корисников захтев често пролази кроз више процеса, база и мрежних позива, па постаје знатно теже одговорити на питања попут „зашто је овај захтев спор?“, „где тачно долази до грешке?“ или „да ли је систем тренутно здрав?“ него код монолитне апликације.</w:t>
-      </w:r>
-    </w:p>
-    <w:p xmlns:wp14="http://schemas.microsoft.com/office/word/2010/wordml" wp14:textId="05DDD3D1">
-      <w:pPr>
-        <w:pStyle w:val="BodyText"/>
-      </w:pPr>
-      <w:r>
-        <w:rPr/>
-        <w:t xml:space="preserve">Тема </w:t>
-      </w:r>
-      <w:r>
-        <w:rPr/>
-        <w:t>овог</w:t>
-      </w:r>
-      <w:r>
-        <w:rPr/>
-        <w:t xml:space="preserve"> </w:t>
-      </w:r>
-      <w:r>
-        <w:rPr/>
-        <w:t>рада</w:t>
-      </w:r>
-      <w:r>
-        <w:rPr/>
-        <w:t xml:space="preserve">, </w:t>
-      </w:r>
-      <w:r>
-        <w:rPr/>
-        <w:t>Имплементација</w:t>
-      </w:r>
-      <w:r>
-        <w:rPr/>
-        <w:t xml:space="preserve"> </w:t>
-      </w:r>
-      <w:r>
-        <w:rPr/>
-        <w:t>о</w:t>
-      </w:r>
-      <w:r>
-        <w:rPr/>
-        <w:t>б</w:t>
-      </w:r>
-      <w:r>
-        <w:rPr/>
-        <w:t>сервабилности</w:t>
-      </w:r>
-      <w:r>
-        <w:rPr/>
-        <w:t xml:space="preserve"> </w:t>
-      </w:r>
-      <w:r>
-        <w:rPr/>
-        <w:t>микросервисне</w:t>
-      </w:r>
-      <w:r>
-        <w:rPr/>
-        <w:t xml:space="preserve"> </w:t>
-      </w:r>
-      <w:r>
-        <w:rPr/>
-        <w:t>архитектуре</w:t>
-      </w:r>
-      <w:r>
-        <w:rPr/>
-        <w:t xml:space="preserve">, </w:t>
-      </w:r>
-      <w:r>
-        <w:rPr/>
-        <w:t>директно</w:t>
-      </w:r>
-      <w:r>
-        <w:rPr/>
-        <w:t xml:space="preserve"> </w:t>
-      </w:r>
-      <w:r>
-        <w:rPr/>
-        <w:t>адресира</w:t>
-      </w:r>
-      <w:r>
-        <w:rPr/>
-        <w:t xml:space="preserve"> </w:t>
-      </w:r>
-      <w:r>
-        <w:rPr/>
-        <w:t>тај</w:t>
-      </w:r>
-      <w:r>
-        <w:rPr/>
-        <w:t xml:space="preserve"> </w:t>
-      </w:r>
-      <w:r>
-        <w:rPr/>
-        <w:t>проблем</w:t>
-      </w:r>
-      <w:r>
-        <w:rPr/>
-        <w:t xml:space="preserve">. Циљ </w:t>
-      </w:r>
-      <w:r>
-        <w:rPr/>
-        <w:t>рада</w:t>
-      </w:r>
-      <w:r>
-        <w:rPr/>
-        <w:t xml:space="preserve"> </w:t>
-      </w:r>
-      <w:r>
-        <w:rPr/>
-        <w:t>није</w:t>
-      </w:r>
-      <w:r>
-        <w:rPr/>
-        <w:t xml:space="preserve"> </w:t>
-      </w:r>
-      <w:r>
-        <w:rPr/>
-        <w:t>да</w:t>
-      </w:r>
-      <w:r>
-        <w:rPr/>
-        <w:t xml:space="preserve"> </w:t>
-      </w:r>
-      <w:r>
-        <w:rPr/>
-        <w:t>мења</w:t>
-      </w:r>
-      <w:r>
-        <w:rPr/>
-        <w:t xml:space="preserve"> </w:t>
-      </w:r>
-      <w:r>
-        <w:rPr/>
-        <w:t>пословну</w:t>
-      </w:r>
-      <w:r>
-        <w:rPr/>
-        <w:t xml:space="preserve"> </w:t>
-      </w:r>
-      <w:r>
-        <w:rPr/>
-        <w:t>логику</w:t>
-      </w:r>
-      <w:r>
-        <w:rPr/>
-        <w:t xml:space="preserve"> </w:t>
-      </w:r>
-      <w:r>
-        <w:rPr/>
-        <w:t>постојећег</w:t>
-      </w:r>
-      <w:r>
-        <w:rPr/>
-        <w:t xml:space="preserve"> </w:t>
-      </w:r>
-      <w:r>
-        <w:rPr/>
-        <w:t>система</w:t>
-      </w:r>
-      <w:r>
-        <w:rPr/>
-        <w:t xml:space="preserve"> (</w:t>
-      </w:r>
-      <w:r>
-        <w:rPr/>
-        <w:t>планове</w:t>
-      </w:r>
-      <w:r>
-        <w:rPr/>
-        <w:t xml:space="preserve">, </w:t>
-      </w:r>
-      <w:r>
-        <w:rPr/>
-        <w:t>дестинације</w:t>
-      </w:r>
-      <w:r>
-        <w:rPr/>
-        <w:t xml:space="preserve">, </w:t>
-      </w:r>
-      <w:r>
-        <w:rPr/>
-        <w:t>трошкове</w:t>
-      </w:r>
-      <w:r>
-        <w:rPr/>
-        <w:t xml:space="preserve">), </w:t>
-      </w:r>
-      <w:r>
-        <w:rPr/>
-        <w:t>већ</w:t>
-      </w:r>
-      <w:r>
-        <w:rPr/>
-        <w:t xml:space="preserve"> </w:t>
-      </w:r>
-      <w:r>
-        <w:rPr/>
-        <w:t>да</w:t>
-      </w:r>
-      <w:r>
-        <w:rPr/>
-        <w:t xml:space="preserve"> </w:t>
-      </w:r>
-      <w:r>
-        <w:rPr/>
-        <w:t>га</w:t>
-      </w:r>
-      <w:r>
-        <w:rPr/>
-        <w:t xml:space="preserve"> </w:t>
-      </w:r>
-      <w:r>
-        <w:rPr/>
-        <w:t>надогради</w:t>
-      </w:r>
-      <w:r>
-        <w:rPr/>
-        <w:t xml:space="preserve"> </w:t>
-      </w:r>
-      <w:r>
-        <w:rPr/>
-        <w:t>слојем</w:t>
-      </w:r>
-      <w:r>
-        <w:rPr/>
-        <w:t xml:space="preserve"> </w:t>
-      </w:r>
-      <w:r>
-        <w:rPr/>
-        <w:t>о</w:t>
-      </w:r>
-      <w:r>
-        <w:rPr/>
-        <w:t>б</w:t>
-      </w:r>
-      <w:r>
-        <w:rPr/>
-        <w:t>сервабилности</w:t>
-      </w:r>
-      <w:r>
-        <w:rPr/>
-        <w:t xml:space="preserve"> </w:t>
-      </w:r>
-      <w:r>
-        <w:rPr/>
-        <w:t>заснованим</w:t>
-      </w:r>
-      <w:r>
-        <w:rPr/>
-        <w:t xml:space="preserve"> </w:t>
-      </w:r>
-      <w:r>
-        <w:rPr/>
-        <w:t>на</w:t>
-      </w:r>
-      <w:r>
-        <w:rPr/>
-        <w:t xml:space="preserve"> </w:t>
-      </w:r>
-      <w:r>
-        <w:rPr/>
-        <w:t>индустријском</w:t>
-      </w:r>
-      <w:r>
-        <w:rPr/>
-        <w:t xml:space="preserve"> </w:t>
-      </w:r>
-      <w:r>
-        <w:rPr/>
-        <w:t>стандарду</w:t>
-      </w:r>
-      <w:r>
-        <w:rPr/>
-        <w:t xml:space="preserve"> </w:t>
-      </w:r>
-      <w:r>
-        <w:rPr/>
-        <w:t>OpenTelemetry</w:t>
-      </w:r>
-      <w:r>
-        <w:rPr/>
-        <w:t xml:space="preserve"> — </w:t>
-      </w:r>
-      <w:r>
-        <w:rPr/>
-        <w:t>дистрибуирано</w:t>
-      </w:r>
-      <w:r>
-        <w:rPr/>
-        <w:t xml:space="preserve"> </w:t>
-      </w:r>
-      <w:r>
-        <w:rPr/>
-        <w:t>праћење</w:t>
-      </w:r>
-      <w:r>
-        <w:rPr/>
-        <w:t xml:space="preserve"> </w:t>
-      </w:r>
-      <w:r>
-        <w:rPr/>
-        <w:t>захтева</w:t>
-      </w:r>
-      <w:r>
-        <w:rPr/>
-        <w:t xml:space="preserve"> (distributed tracing), </w:t>
-      </w:r>
-      <w:r>
-        <w:rPr/>
-        <w:t>структурисано</w:t>
-      </w:r>
-      <w:r>
-        <w:rPr/>
-        <w:t xml:space="preserve"> </w:t>
-      </w:r>
-      <w:r>
-        <w:rPr/>
-        <w:t>логовање</w:t>
-      </w:r>
-      <w:r>
-        <w:rPr/>
-        <w:t xml:space="preserve">, </w:t>
-      </w:r>
-      <w:r>
-        <w:rPr/>
-        <w:t>метрике</w:t>
-      </w:r>
-      <w:r>
-        <w:rPr/>
-        <w:t xml:space="preserve"> </w:t>
-      </w:r>
-      <w:r>
-        <w:rPr/>
-        <w:t>перформанси</w:t>
-      </w:r>
-      <w:r>
-        <w:rPr/>
-        <w:t xml:space="preserve"> и health check </w:t>
-      </w:r>
-      <w:r>
-        <w:rPr/>
-        <w:t>механизме</w:t>
-      </w:r>
-      <w:r>
-        <w:rPr/>
-        <w:t xml:space="preserve"> — и </w:t>
-      </w:r>
-      <w:r>
-        <w:rPr/>
-        <w:t>да</w:t>
-      </w:r>
-      <w:r>
-        <w:rPr/>
-        <w:t xml:space="preserve"> </w:t>
-      </w:r>
-      <w:r>
-        <w:rPr/>
-        <w:t>ту</w:t>
-      </w:r>
-      <w:r>
-        <w:rPr/>
-        <w:t xml:space="preserve"> </w:t>
-      </w:r>
-      <w:r>
-        <w:rPr/>
-        <w:t>надоградњу</w:t>
-      </w:r>
-      <w:r>
-        <w:rPr/>
-        <w:t xml:space="preserve"> </w:t>
-      </w:r>
-      <w:r>
-        <w:rPr/>
-        <w:t>докаже</w:t>
-      </w:r>
-      <w:r>
-        <w:rPr/>
-        <w:t xml:space="preserve"> </w:t>
-      </w:r>
-      <w:r>
-        <w:rPr/>
-        <w:t>кроз</w:t>
-      </w:r>
-      <w:r>
-        <w:rPr/>
-        <w:t xml:space="preserve"> </w:t>
-      </w:r>
-      <w:r>
-        <w:rPr/>
-        <w:t>стварно</w:t>
-      </w:r>
-      <w:r>
-        <w:rPr/>
-        <w:t xml:space="preserve"> </w:t>
-      </w:r>
-      <w:r>
-        <w:rPr/>
-        <w:t>извршавање</w:t>
-      </w:r>
-      <w:r>
-        <w:rPr/>
-        <w:t xml:space="preserve">, </w:t>
-      </w:r>
-      <w:r>
-        <w:rPr/>
-        <w:t>аутоматизоване</w:t>
-      </w:r>
-      <w:r>
-        <w:rPr/>
-        <w:t xml:space="preserve"> </w:t>
-      </w:r>
-      <w:r>
-        <w:rPr/>
-        <w:t>тестове</w:t>
-      </w:r>
-      <w:r>
-        <w:rPr/>
-        <w:t xml:space="preserve"> и </w:t>
-      </w:r>
-      <w:r>
-        <w:rPr/>
-        <w:t>мерљиве</w:t>
-      </w:r>
-      <w:r>
-        <w:rPr/>
-        <w:t xml:space="preserve"> </w:t>
-      </w:r>
-      <w:r>
-        <w:rPr/>
-        <w:t>резултате</w:t>
-      </w:r>
-      <w:r>
-        <w:rPr/>
-        <w:t xml:space="preserve">, а </w:t>
-      </w:r>
-      <w:r>
-        <w:rPr/>
-        <w:t>не</w:t>
-      </w:r>
-      <w:r>
-        <w:rPr/>
-        <w:t xml:space="preserve"> </w:t>
-      </w:r>
-      <w:r>
-        <w:rPr/>
-        <w:t>само</w:t>
-      </w:r>
-      <w:r>
-        <w:rPr/>
-        <w:t xml:space="preserve"> </w:t>
-      </w:r>
-      <w:r>
-        <w:rPr/>
-        <w:t>кроз</w:t>
-      </w:r>
-      <w:r>
-        <w:rPr/>
-        <w:t xml:space="preserve"> </w:t>
-      </w:r>
-      <w:r>
-        <w:rPr/>
-        <w:t>инсталацију</w:t>
-      </w:r>
-      <w:r>
-        <w:rPr/>
-        <w:t xml:space="preserve"> </w:t>
-      </w:r>
-      <w:r>
-        <w:rPr/>
-        <w:t>алата</w:t>
-      </w:r>
-      <w:r>
-        <w:rPr/>
-        <w:t>.</w:t>
-      </w:r>
-    </w:p>
-    <w:p xmlns:wp14="http://schemas.microsoft.com/office/word/2010/wordml" wp14:textId="77777777">
-      <w:pPr>
-        <w:pStyle w:val="BodyText"/>
-      </w:pPr>
-      <w:r>
-        <w:t>Рад је организован тако да прво анализира постојеће стање система (поглавља 2-4), затим детаљно описује предложено и имплементирано решење (поглавље 5), верификује га кроз тестирање и демонстрационе сценарије над стварно постављеним системом (поглавље 6), и на крају сумира постигнуте резултате, ограничења и правце даљег развоја (поглавље 7).</w:t>
-      </w:r>
-    </w:p>
-    <w:p>
-      <w:pPr>
-        <w:pStyle w:val="text"/>
-        <w:rPr>
-          <w:lang w:val="sr-Cyrl-RS"/>
-        </w:rPr>
-      </w:pPr>
-    </w:p>
-    <w:p>
-      <w:pPr>
-        <w:pStyle w:val="text"/>
-        <w:ind w:left="0"/>
-      </w:pPr>
-    </w:p>
-    <w:p>
-      <w:pPr>
-        <w:pStyle w:val="Heading1"/>
-        <w:rPr>
-          <w:lang w:val="sr-Cyrl-RS"/>
-        </w:rPr>
-      </w:pPr>
-      <w:bookmarkStart w:name="_Toc776203058" w:id="968689803"/>
-      <w:r>
-        <w:rPr>
-          <w:lang w:val="sr-Cyrl-RS"/>
-        </w:rPr>
-        <w:t>Опис проблема</w:t>
-      </w:r>
-      <w:bookmarkEnd w:id="968689803"/>
-    </w:p>
-    <w:p xmlns:wp14="http://schemas.microsoft.com/office/word/2010/wordml" wp14:textId="0AA179DA">
-      <w:pPr>
-        <w:pStyle w:val="BodyText"/>
-      </w:pPr>
-      <w:r>
-        <w:rPr/>
-        <w:t xml:space="preserve">Анализа </w:t>
-      </w:r>
-      <w:r>
-        <w:rPr/>
-        <w:t>постојећег</w:t>
-      </w:r>
-      <w:r>
-        <w:rPr/>
-        <w:t xml:space="preserve"> </w:t>
-      </w:r>
-      <w:r>
-        <w:rPr/>
-        <w:t>система</w:t>
-      </w:r>
-      <w:r>
-        <w:rPr/>
-        <w:t xml:space="preserve"> (</w:t>
-      </w:r>
-      <w:r>
-        <w:rPr/>
-        <w:t>детаљно</w:t>
-      </w:r>
-      <w:r>
-        <w:rPr/>
-        <w:t xml:space="preserve"> </w:t>
-      </w:r>
-      <w:r>
-        <w:rPr/>
-        <w:t>описаног</w:t>
-      </w:r>
-      <w:r>
-        <w:rPr/>
-        <w:t xml:space="preserve"> у </w:t>
-      </w:r>
-      <w:r>
-        <w:rPr/>
-        <w:t>поглављу</w:t>
-      </w:r>
-      <w:r>
-        <w:rPr/>
-        <w:t xml:space="preserve"> 4) </w:t>
-      </w:r>
-      <w:r>
-        <w:rPr/>
-        <w:t>показала</w:t>
-      </w:r>
-      <w:r>
-        <w:rPr/>
-        <w:t xml:space="preserve"> </w:t>
-      </w:r>
-      <w:r>
-        <w:rPr/>
-        <w:t>је</w:t>
-      </w:r>
-      <w:r>
-        <w:rPr/>
-        <w:t xml:space="preserve"> </w:t>
-      </w:r>
-      <w:r>
-        <w:rPr/>
-        <w:t>да</w:t>
-      </w:r>
-      <w:r>
-        <w:rPr/>
-        <w:t xml:space="preserve"> Travel Planner, </w:t>
-      </w:r>
-      <w:r>
-        <w:rPr/>
-        <w:t>иако</w:t>
-      </w:r>
-      <w:r>
-        <w:rPr/>
-        <w:t xml:space="preserve"> </w:t>
-      </w:r>
-      <w:r>
-        <w:rPr/>
-        <w:t>функционално</w:t>
-      </w:r>
-      <w:r>
-        <w:rPr/>
-        <w:t xml:space="preserve"> </w:t>
-      </w:r>
-      <w:r>
-        <w:rPr/>
-        <w:t>комплетан</w:t>
-      </w:r>
-      <w:r>
-        <w:rPr/>
-        <w:t xml:space="preserve"> и </w:t>
-      </w:r>
-      <w:r>
-        <w:rPr/>
-        <w:t>добро</w:t>
-      </w:r>
-      <w:r>
-        <w:rPr/>
-        <w:t xml:space="preserve"> </w:t>
-      </w:r>
-      <w:r>
-        <w:rPr/>
-        <w:t>структурисан</w:t>
-      </w:r>
-      <w:r>
-        <w:rPr/>
-        <w:t xml:space="preserve"> у </w:t>
-      </w:r>
-      <w:r>
-        <w:rPr/>
-        <w:t>погледу</w:t>
-      </w:r>
-      <w:r>
-        <w:rPr/>
-        <w:t xml:space="preserve"> </w:t>
-      </w:r>
-      <w:r>
-        <w:rPr/>
-        <w:t>поделе</w:t>
-      </w:r>
-      <w:r>
-        <w:rPr/>
-        <w:t xml:space="preserve"> </w:t>
-      </w:r>
-      <w:r>
-        <w:rPr/>
-        <w:t>одговорности</w:t>
-      </w:r>
-      <w:r>
-        <w:rPr/>
-        <w:t xml:space="preserve"> </w:t>
-      </w:r>
-      <w:r>
-        <w:rPr/>
-        <w:t>између</w:t>
-      </w:r>
-      <w:r>
-        <w:rPr/>
-        <w:t xml:space="preserve"> </w:t>
-      </w:r>
-      <w:r>
-        <w:rPr/>
-        <w:t>сервиса</w:t>
-      </w:r>
-      <w:r>
-        <w:rPr/>
-        <w:t xml:space="preserve">, </w:t>
-      </w:r>
-      <w:r>
-        <w:rPr/>
-        <w:t>нема</w:t>
-      </w:r>
-      <w:r>
-        <w:rPr/>
-        <w:t xml:space="preserve"> </w:t>
-      </w:r>
-      <w:r>
-        <w:rPr/>
-        <w:t>ниједан</w:t>
-      </w:r>
-      <w:r>
-        <w:rPr/>
-        <w:t xml:space="preserve"> </w:t>
-      </w:r>
-      <w:r>
-        <w:rPr/>
-        <w:t>механизам</w:t>
-      </w:r>
-      <w:r>
-        <w:rPr/>
-        <w:t xml:space="preserve"> </w:t>
-      </w:r>
-      <w:r>
-        <w:rPr/>
-        <w:t>о</w:t>
-      </w:r>
-      <w:r>
-        <w:rPr/>
-        <w:t>б</w:t>
-      </w:r>
-      <w:r>
-        <w:rPr/>
-        <w:t>сервабилности</w:t>
-      </w:r>
-      <w:r>
-        <w:rPr/>
-        <w:t xml:space="preserve"> </w:t>
-      </w:r>
-      <w:r>
-        <w:rPr/>
-        <w:t>изнад</w:t>
-      </w:r>
-      <w:r>
-        <w:rPr/>
-        <w:t xml:space="preserve"> </w:t>
-      </w:r>
-      <w:r>
-        <w:rPr/>
-        <w:t>апсолутног</w:t>
-      </w:r>
-      <w:r>
-        <w:rPr/>
-        <w:t xml:space="preserve"> </w:t>
-      </w:r>
-      <w:r>
-        <w:rPr/>
-        <w:t>минимума</w:t>
-      </w:r>
-      <w:r>
-        <w:rPr/>
-        <w:t xml:space="preserve"> </w:t>
-      </w:r>
-      <w:r>
-        <w:rPr/>
-        <w:t>који</w:t>
-      </w:r>
-      <w:r>
-        <w:rPr/>
-        <w:t xml:space="preserve"> </w:t>
-      </w:r>
-      <w:r>
-        <w:rPr/>
-        <w:t>сам</w:t>
-      </w:r>
-      <w:r>
-        <w:rPr/>
-        <w:t xml:space="preserve"> ASP.NET Core </w:t>
-      </w:r>
-      <w:r>
-        <w:rPr/>
-        <w:t>оквир</w:t>
-      </w:r>
-      <w:r>
-        <w:rPr/>
-        <w:t xml:space="preserve"> </w:t>
-      </w:r>
-      <w:r>
-        <w:rPr/>
-        <w:t>пружа</w:t>
-      </w:r>
-      <w:r>
-        <w:rPr/>
-        <w:t xml:space="preserve"> </w:t>
-      </w:r>
-      <w:r>
-        <w:rPr/>
-        <w:t>подразумевано</w:t>
-      </w:r>
-      <w:r>
-        <w:rPr/>
-        <w:t xml:space="preserve">. </w:t>
-      </w:r>
-      <w:r>
-        <w:rPr/>
-        <w:t>Конкретно</w:t>
-      </w:r>
-      <w:r>
-        <w:rPr/>
-        <w:t xml:space="preserve">, </w:t>
-      </w:r>
-      <w:r>
-        <w:rPr/>
-        <w:t>идентификовани</w:t>
-      </w:r>
-      <w:r>
-        <w:rPr/>
-        <w:t xml:space="preserve"> </w:t>
-      </w:r>
-      <w:r>
-        <w:rPr/>
-        <w:t>су</w:t>
-      </w:r>
-      <w:r>
-        <w:rPr/>
-        <w:t xml:space="preserve"> </w:t>
-      </w:r>
-      <w:r>
-        <w:rPr/>
-        <w:t>следећи</w:t>
-      </w:r>
-      <w:r>
-        <w:rPr/>
-        <w:t xml:space="preserve"> </w:t>
-      </w:r>
-      <w:r>
-        <w:rPr/>
-        <w:t>проблеми</w:t>
-      </w:r>
-      <w:r>
-        <w:rPr/>
-        <w:t>:</w:t>
-      </w:r>
-    </w:p>
-    <w:p xmlns:wp14="http://schemas.microsoft.com/office/word/2010/wordml" wp14:textId="77777777">
-      <w:pPr>
-        <w:pStyle w:val="Naslov1nivo"/>
-      </w:pPr>
-      <w:r>
-        <w:t>Немогуће праћење захтева кроз више сервиса</w:t>
-      </w:r>
-    </w:p>
-    <w:p xmlns:wp14="http://schemas.microsoft.com/office/word/2010/wordml" wp14:textId="77777777">
-      <w:pPr>
-        <w:pStyle w:val="BodyText"/>
-      </w:pPr>
-      <w:r>
-        <w:t>Захтев корисника типично пролази кроз ланац Frontend → Gateway → сервис (нпр. AuthService), а поједини токови иду и даље, сервис-сервис (нпр. SharingService → TripService приликом разрешавања дељеног плана). Не постоји ниједан идентификатор (correlation/trace ID) који би повезао логове настале у различитим процесима за исти кориснички захтев. Ако захтев успори или падне негде у ланцу, једини начин да се проблем лоцира био би ручно упоређивање временских печата логова из различитих сервиса — непоуздано и споро.</w:t>
-      </w:r>
-    </w:p>
-    <w:p xmlns:wp14="http://schemas.microsoft.com/office/word/2010/wordml" wp14:textId="77777777">
-      <w:pPr>
-        <w:pStyle w:val="Naslov1nivo"/>
-      </w:pPr>
-      <w:r>
-        <w:t>Одсуство метрика перформанси</w:t>
-      </w:r>
-    </w:p>
-    <w:p xmlns:wp14="http://schemas.microsoft.com/office/word/2010/wordml" wp14:textId="77777777">
-      <w:pPr>
-        <w:pStyle w:val="BodyText"/>
-      </w:pPr>
-      <w:r>
-        <w:t>Ниједан сервис не излаже метрике броја захтева, латенције, стопе грешака нити искоришћења ресурса (CPU, меморија). Пад перформанси (нпр. спор упит ка бази) остао би потпуно невидљив док се корисници директно не пожале.</w:t>
-      </w:r>
-    </w:p>
-    <w:p xmlns:wp14="http://schemas.microsoft.com/office/word/2010/wordml" wp14:textId="77777777">
-      <w:pPr>
-        <w:pStyle w:val="Naslov1nivo"/>
-      </w:pPr>
-      <w:r>
-        <w:t>Тихе грешке</w:t>
-      </w:r>
-    </w:p>
-    <w:p xmlns:wp14="http://schemas.microsoft.com/office/word/2010/wordml" wp14:textId="77777777">
-      <w:pPr>
-        <w:pStyle w:val="BodyText"/>
-      </w:pPr>
-      <w:r>
-        <w:t>У коду постоје примери у којима се грешка ухвати (try/catch) и обради без иједног трага у логу. Конкретан пример: AuthService/Services/TripClient.cs, метода DeleteUserTripsAsync — при брисању корисничког налога позива се TripService да обрише све планове тог корисника; ако тај позив не успе (сервис недоступан, мрежни проблем), изворни код је само враћао false, без иједног записа у логу. Систем би остао недоследан (обрисан налог, а планови и даље постоје у бази), без иједног трага зашто.</w:t>
-      </w:r>
-    </w:p>
-    <w:p xmlns:wp14="http://schemas.microsoft.com/office/word/2010/wordml" wp14:textId="77777777">
-      <w:pPr>
-        <w:pStyle w:val="Naslov1nivo"/>
-      </w:pPr>
-      <w:r>
-        <w:t>Одсуство health check механизама</w:t>
-      </w:r>
-    </w:p>
-    <w:p xmlns:wp14="http://schemas.microsoft.com/office/word/2010/wordml" wp14:textId="77777777">
-      <w:pPr>
-        <w:pStyle w:val="BodyText"/>
-      </w:pPr>
-      <w:r>
-        <w:t>Ниједан сервис не излаже endpoint преко ког би се споља (оркестрација, monitoring алат, човек) проверило да ли сервис стварно ради и да ли су његове зависности (база, други сервиси) доступне. Service Fabric поседује сопствени интерни health модел, али му се health стање апликационог нивоа (нпр. „да ли TripService може да се повеже на своју базу“) никада не пријављује.</w:t>
-      </w:r>
-    </w:p>
-    <w:p xmlns:wp14="http://schemas.microsoft.com/office/word/2010/wordml" wp14:textId="77777777">
-      <w:pPr>
-        <w:pStyle w:val="Naslov1nivo"/>
-      </w:pPr>
-      <w:r>
-        <w:t>Нестандардизовано, минимално логовање</w:t>
-      </w:r>
-    </w:p>
-    <w:p xmlns:wp14="http://schemas.microsoft.com/office/word/2010/wordml" wp14:textId="77777777">
-      <w:pPr>
-        <w:pStyle w:val="BodyText"/>
-      </w:pPr>
-      <w:r>
-        <w:t>Свака appsettings.json конфигурација дефинише ниво логовања (Information/Warning), али у пракси се у коду скоро нигде не позива ILogger — grep кроз цео backend је показао 0 позива ILogger/_logger пре овог рада. Постојећи Service Fabric ETW ServiceEventSource механизам користи се искључиво за lifecycle догађаје (покретање Kestrel-а, регистрација сервисног типа), не за токове пословне логике.</w:t>
-      </w:r>
-    </w:p>
-    <w:p xmlns:wp14="http://schemas.microsoft.com/office/word/2010/wordml" wp14:textId="31CA7907">
-      <w:pPr>
-        <w:pStyle w:val="BodyText"/>
-      </w:pPr>
-      <w:r>
-        <w:rPr/>
-        <w:t xml:space="preserve">Ови </w:t>
-      </w:r>
-      <w:r>
-        <w:rPr/>
-        <w:t>проблеми</w:t>
-      </w:r>
-      <w:r>
-        <w:rPr/>
-        <w:t xml:space="preserve"> </w:t>
-      </w:r>
-      <w:r>
-        <w:rPr/>
-        <w:t>су</w:t>
-      </w:r>
-      <w:r>
-        <w:rPr/>
-        <w:t xml:space="preserve"> </w:t>
-      </w:r>
-      <w:r>
-        <w:rPr/>
-        <w:t>директно</w:t>
-      </w:r>
-      <w:r>
-        <w:rPr/>
-        <w:t xml:space="preserve"> </w:t>
-      </w:r>
-      <w:r>
-        <w:rPr/>
-        <w:t>повезани</w:t>
-      </w:r>
-      <w:r>
-        <w:rPr/>
-        <w:t xml:space="preserve"> — </w:t>
-      </w:r>
-      <w:r>
-        <w:rPr/>
-        <w:t>сви</w:t>
-      </w:r>
-      <w:r>
-        <w:rPr/>
-        <w:t xml:space="preserve"> </w:t>
-      </w:r>
-      <w:r>
-        <w:rPr/>
-        <w:t>произилазе</w:t>
-      </w:r>
-      <w:r>
-        <w:rPr/>
-        <w:t xml:space="preserve"> </w:t>
-      </w:r>
-      <w:r>
-        <w:rPr/>
-        <w:t>из</w:t>
-      </w:r>
-      <w:r>
-        <w:rPr/>
-        <w:t xml:space="preserve"> </w:t>
-      </w:r>
-      <w:r>
-        <w:rPr/>
-        <w:t>недостатка</w:t>
-      </w:r>
-      <w:r>
-        <w:rPr/>
-        <w:t xml:space="preserve"> </w:t>
-      </w:r>
-      <w:r>
-        <w:rPr/>
-        <w:t>јединственог</w:t>
-      </w:r>
-      <w:r>
-        <w:rPr/>
-        <w:t xml:space="preserve">, </w:t>
-      </w:r>
-      <w:r>
-        <w:rPr/>
-        <w:t>стандардизованог</w:t>
-      </w:r>
-      <w:r>
-        <w:rPr/>
-        <w:t xml:space="preserve"> </w:t>
-      </w:r>
-      <w:r>
-        <w:rPr/>
-        <w:t>слоја</w:t>
-      </w:r>
-      <w:r>
-        <w:rPr/>
-        <w:t xml:space="preserve"> </w:t>
-      </w:r>
-      <w:r>
-        <w:rPr/>
-        <w:t>о</w:t>
-      </w:r>
-      <w:r>
-        <w:rPr/>
-        <w:t>б</w:t>
-      </w:r>
-      <w:r>
-        <w:rPr/>
-        <w:t>сервабилности</w:t>
-      </w:r>
-      <w:r>
-        <w:rPr/>
-        <w:t xml:space="preserve">, а </w:t>
-      </w:r>
-      <w:r>
-        <w:rPr/>
-        <w:t>не</w:t>
-      </w:r>
-      <w:r>
-        <w:rPr/>
-        <w:t xml:space="preserve"> </w:t>
-      </w:r>
-      <w:r>
-        <w:rPr/>
-        <w:t>из</w:t>
-      </w:r>
-      <w:r>
-        <w:rPr/>
-        <w:t xml:space="preserve"> </w:t>
-      </w:r>
-      <w:r>
-        <w:rPr/>
-        <w:t>појединачних</w:t>
-      </w:r>
-      <w:r>
-        <w:rPr/>
-        <w:t xml:space="preserve">, </w:t>
-      </w:r>
-      <w:r>
-        <w:rPr/>
-        <w:t>изолованих</w:t>
-      </w:r>
-      <w:r>
-        <w:rPr/>
-        <w:t xml:space="preserve"> </w:t>
-      </w:r>
-      <w:r>
-        <w:rPr/>
-        <w:t>пропуста</w:t>
-      </w:r>
-      <w:r>
-        <w:rPr/>
-        <w:t xml:space="preserve">. </w:t>
-      </w:r>
-      <w:r>
-        <w:rPr/>
-        <w:t>То</w:t>
-      </w:r>
-      <w:r>
-        <w:rPr/>
-        <w:t xml:space="preserve"> </w:t>
-      </w:r>
-      <w:r>
-        <w:rPr/>
-        <w:t>је</w:t>
-      </w:r>
-      <w:r>
-        <w:rPr/>
-        <w:t xml:space="preserve"> </w:t>
-      </w:r>
-      <w:r>
-        <w:rPr/>
-        <w:t>управо</w:t>
-      </w:r>
-      <w:r>
-        <w:rPr/>
-        <w:t xml:space="preserve"> </w:t>
-      </w:r>
-      <w:r>
-        <w:rPr/>
-        <w:t>разлог</w:t>
-      </w:r>
-      <w:r>
-        <w:rPr/>
-        <w:t xml:space="preserve"> </w:t>
-      </w:r>
-      <w:r>
-        <w:rPr/>
-        <w:t>зашто</w:t>
-      </w:r>
-      <w:r>
-        <w:rPr/>
-        <w:t xml:space="preserve"> </w:t>
-      </w:r>
-      <w:r>
-        <w:rPr/>
-        <w:t>је</w:t>
-      </w:r>
-      <w:r>
-        <w:rPr/>
-        <w:t xml:space="preserve"> </w:t>
-      </w:r>
-      <w:r>
-        <w:rPr/>
-        <w:t>предложено</w:t>
-      </w:r>
-      <w:r>
-        <w:rPr/>
-        <w:t xml:space="preserve"> </w:t>
-      </w:r>
-      <w:r>
-        <w:rPr/>
-        <w:t>решење</w:t>
-      </w:r>
-      <w:r>
-        <w:rPr/>
-        <w:t xml:space="preserve"> (</w:t>
-      </w:r>
-      <w:r>
-        <w:rPr/>
-        <w:t>поглавље</w:t>
-      </w:r>
-      <w:r>
-        <w:rPr/>
-        <w:t xml:space="preserve"> 5) </w:t>
-      </w:r>
-      <w:r>
-        <w:rPr/>
-        <w:t>целовит</w:t>
-      </w:r>
-      <w:r>
-        <w:rPr/>
-        <w:t xml:space="preserve"> </w:t>
-      </w:r>
-      <w:r>
-        <w:rPr/>
-        <w:t>слој</w:t>
-      </w:r>
-      <w:r>
-        <w:rPr/>
-        <w:t xml:space="preserve"> </w:t>
-      </w:r>
-      <w:r>
-        <w:rPr/>
-        <w:t>заснован</w:t>
-      </w:r>
-      <w:r>
-        <w:rPr/>
-        <w:t xml:space="preserve"> </w:t>
-      </w:r>
-      <w:r>
-        <w:rPr/>
-        <w:t>на</w:t>
-      </w:r>
-      <w:r>
-        <w:rPr/>
-        <w:t xml:space="preserve"> </w:t>
-      </w:r>
-      <w:r>
-        <w:rPr/>
-        <w:t>једном</w:t>
-      </w:r>
-      <w:r>
-        <w:rPr/>
-        <w:t xml:space="preserve"> </w:t>
-      </w:r>
-      <w:r>
-        <w:rPr/>
-        <w:t>стандарду</w:t>
-      </w:r>
-      <w:r>
-        <w:rPr/>
-        <w:t xml:space="preserve"> (</w:t>
-      </w:r>
-      <w:r>
-        <w:rPr/>
-        <w:t>OpenTelemetry</w:t>
-      </w:r>
-      <w:r>
-        <w:rPr/>
-        <w:t xml:space="preserve">), а </w:t>
-      </w:r>
-      <w:r>
-        <w:rPr/>
-        <w:t>не</w:t>
-      </w:r>
-      <w:r>
-        <w:rPr/>
-        <w:t xml:space="preserve"> </w:t>
-      </w:r>
-      <w:r>
-        <w:rPr/>
-        <w:t>низ</w:t>
-      </w:r>
-      <w:r>
-        <w:rPr/>
-        <w:t xml:space="preserve"> ad-hoc </w:t>
-      </w:r>
-      <w:r>
-        <w:rPr/>
-        <w:t>закрпа</w:t>
-      </w:r>
-      <w:r>
-        <w:rPr/>
-        <w:t>.</w:t>
-      </w:r>
-    </w:p>
-    <w:p>
-      <w:pPr>
-        <w:pStyle w:val="Heading1"/>
-        <w:rPr>
-          <w:lang w:val="sr-Cyrl-RS"/>
-        </w:rPr>
-      </w:pPr>
-      <w:bookmarkStart w:name="_Toc1823417154" w:id="531594970"/>
-      <w:r>
-        <w:rPr/>
-        <w:t>Опис</w:t>
-      </w:r>
-      <w:r>
-        <w:rPr/>
-        <w:t xml:space="preserve"> </w:t>
-      </w:r>
-      <w:r>
-        <w:rPr/>
-        <w:t>коришћених</w:t>
-      </w:r>
-      <w:r>
-        <w:rPr/>
-        <w:t xml:space="preserve"> </w:t>
-      </w:r>
-      <w:r>
-        <w:rPr/>
-        <w:t>технологија</w:t>
-      </w:r>
-      <w:r>
-        <w:rPr>
-          <w:lang w:val="sr-Cyrl-RS"/>
-        </w:rPr>
-        <w:t xml:space="preserve"> и</w:t>
-      </w:r>
-      <w:r>
-        <w:rPr/>
-        <w:t xml:space="preserve"> </w:t>
-      </w:r>
-      <w:r>
-        <w:rPr>
-          <w:lang w:val="sr-Cyrl-RS"/>
-        </w:rPr>
-        <w:t>алата</w:t>
-      </w:r>
-      <w:bookmarkEnd w:id="531594970"/>
-    </w:p>
-    <w:p xmlns:wp14="http://schemas.microsoft.com/office/word/2010/wordml" wp14:textId="77777777">
-      <w:pPr>
-        <w:pStyle w:val="Naslov1nivo"/>
-      </w:pPr>
-      <w:r>
-        <w:t>Постојеће технологије (backend/frontend)</w:t>
-      </w:r>
-    </w:p>
-    <w:p xmlns:wp14="http://schemas.microsoft.com/office/word/2010/wordml" wp14:textId="77777777">
-      <w:pPr>
-        <w:pStyle w:val="BodyText"/>
-      </w:pPr>
-      <w:r>
-        <w:t>Backend четири сервиса (Gateway, AuthService, TripService, SharingService) реализован је у C#/.NET 8, хостован на Microsoft Service Fabric платформи [4] (stateless сервиси за Gateway/AuthService/TripService, stateful за SharingService), уз Entity Framework Core 8 за приступ подацима, YARP (Yet Another Reverse Proxy) [5] за Gateway рутирање, BCrypt.Net за хеширање лозинки и JWT Bearer аутентикацију. Подаци се чувају у Microsoft SQL Server бази, по принципу database-per-service (UsersDB, TripsDB, SharingDB). Frontend је React 19 (Vite) апликација која комуницира искључиво преко Gateway-а.</w:t>
-      </w:r>
-    </w:p>
-    <w:p>
-      <w:pPr>
-        <w:pStyle w:val="BodyText"/>
-      </w:pPr>
-      <w:r>
-        <w:t>У контексту Service Fabric платформе, stateless сервис не чува стање између позива на самом чвору — сваки захтев се може опслужити било којом инстанцом, а трајно стање се чува искључиво у спољној бази (SQL Server). Stateful сервис, насупрот томе, поседује локално, реплицирано стање непосредно на Service Fabric чворовима (Reliable Collections), поред спољне базе — тако да поједини подаци могу да се читају без мрежног позива ка бази. У овом пројекту, три сервиса (Gateway, AuthService, TripService) су stateless, док је SharingService stateful — детаљније објашњено у поглављу 4.</w:t>
-      </w:r>
-    </w:p>
-    <w:p xmlns:wp14="http://schemas.microsoft.com/office/word/2010/wordml" wp14:textId="77777777">
-      <w:pPr>
-        <w:pStyle w:val="Naslov1nivo"/>
-      </w:pPr>
-      <w:r>
-        <w:t>OpenTelemetry</w:t>
-      </w:r>
-    </w:p>
-    <w:p xmlns:wp14="http://schemas.microsoft.com/office/word/2010/wordml" wp14:textId="77777777">
-      <w:pPr>
-        <w:pStyle w:val="BodyText"/>
-      </w:pPr>
-      <w:r>
-        <w:t>OpenTelemetry (OTel) изабран је као централни стандард надоградње јер обједињује сва три облика телеметрије (traces, metrics, logs) под једним, vendor-неутралним API-јем и SDK-ом [2], са великим бројем готових ("auto") инструментација управо за технологије које пројекат већ користи — ASP.NET Core, HttpClient, SqlClient — тако да се велик део вредности добија без писања сопственог инструментационог кода. Верзија OpenTelemetry .NET SDK-а коришћена у раду је 1.18.0, конзистентна кроз сва четири сервиса.</w:t>
-      </w:r>
-    </w:p>
-    <w:p>
-      <w:pPr>
-        <w:pStyle w:val="BodyText"/>
-      </w:pPr>
-      <w:r>
-        <w:t>Алтернативе попут Application Insights-а или vendor-специфичних APM решења (нпр. Datadog, New Relic) су разматране, али одбачене управо због vendor lock-in-а — OTel омогућава промену backend-а за складиштење (Prometheus/Tempo/Loki → неко друго решење) без измене иједног сервиса, пошто је инструментациони код одвојен од места где телеметрија завршава.</w:t>
-      </w:r>
-    </w:p>
-    <w:p xmlns:wp14="http://schemas.microsoft.com/office/word/2010/wordml" wp14:textId="77777777">
-      <w:pPr>
-        <w:pStyle w:val="Naslov1nivo"/>
-      </w:pPr>
-      <w:r>
-        <w:t>OpenTelemetry Collector</w:t>
-      </w:r>
-    </w:p>
-    <w:p xmlns:wp14="http://schemas.microsoft.com/office/word/2010/wordml" wp14:textId="77777777">
-      <w:pPr>
-        <w:pStyle w:val="BodyText"/>
-      </w:pPr>
-      <w:r>
-        <w:t>Сервиси не шаљу телеметрију директно ка Prometheus/Tempo/Loki, већ ка једном централном OpenTelemetry Collector-у (OTLP протокол, gRPC на порту 4317). Ово раздваја „како апликација емитује телеметрију” од „где та телеметрија завршава” — каснија измена backend-а за складиштење (нпр. замена Loki-ја другим решењем) не би захтевала измену ниједног сервиса, само Collector-ове конфигурације [10].</w:t>
-      </w:r>
-    </w:p>
-    <w:p xmlns:wp14="http://schemas.microsoft.com/office/word/2010/wordml" wp14:textId="77777777">
-      <w:pPr>
-        <w:pStyle w:val="Naslov1nivo"/>
-      </w:pPr>
-      <w:r>
-        <w:t>Prometheus, Grafana Tempo, Grafana Loki</w:t>
-      </w:r>
-    </w:p>
-    <w:p xmlns:wp14="http://schemas.microsoft.com/office/word/2010/wordml" wp14:textId="77777777">
-      <w:pPr>
-        <w:pStyle w:val="BodyText"/>
-      </w:pPr>
-      <w:r>
-        <w:t>За складиштење три врсте телеметрије изабран је такозвани „Grafana stack”: Prometheus [9] за метрике (Collector излаже Prometheus-компатибилан /metrics endpoint који Prometheus периодично scrape-ује), Grafana Tempo [6] за дистрибуирано праћење захтева (trace-ове), и Grafana Loki [7] за централизоване логове. Предност ове комбинације над, на пример, самостојећим Jaeger-ом за tracing јесте што све три компоненте имају нативну, provisioned интеграцију са Grafanom — укључујући унакрсну навигацију (клик са log линије на њен trace, клик са trace-а на метрику) која је директно демонстрирана у поглављу 5.</w:t>
-      </w:r>
-    </w:p>
-    <w:p xmlns:wp14="http://schemas.microsoft.com/office/word/2010/wordml" wp14:textId="77777777">
-      <w:pPr>
-        <w:pStyle w:val="Naslov1nivo"/>
-      </w:pPr>
-      <w:r>
-        <w:t>Grafana</w:t>
-      </w:r>
-    </w:p>
-    <w:p xmlns:wp14="http://schemas.microsoft.com/office/word/2010/wordml" wp14:textId="77777777">
-      <w:pPr>
-        <w:pStyle w:val="BodyText"/>
-      </w:pPr>
-      <w:r>
-        <w:t>Grafana [11] је изабрана као јединствен визуелни слој за све три врсте телеметрије, уместо по једног специјализованог алата за сваку (нпр. Jaeger UI за trace-ове, посебан алат за метрике). Grafana подржава велики број data source-ова кроз plugin архитектуру, а Prometheus, Tempo и Loki су сви подржани нативно, без додатних plugin-ова, што је додатни разлог за избор баш ове платформе. Ово директно подржава сценарио „развијач види комплетну слику једног захтева на једном месту”, који је централна теза рада.</w:t>
-      </w:r>
-    </w:p>
-    <w:p xmlns:wp14="http://schemas.microsoft.com/office/word/2010/wordml" wp14:textId="77777777">
-      <w:pPr>
-        <w:pStyle w:val="Naslov1nivo"/>
-      </w:pPr>
-      <w:r>
-        <w:t>Health checks</w:t>
-      </w:r>
-    </w:p>
-    <w:p xmlns:wp14="http://schemas.microsoft.com/office/word/2010/wordml" wp14:textId="77777777">
-      <w:pPr>
-        <w:pStyle w:val="BodyText"/>
-      </w:pPr>
-      <w:r>
-        <w:t>Коришћен је уграђен ASP.NET Core механизам (Microsoft.Extensions.Diagnostics.HealthChecks), допуњен пакетом AspNetCore.HealthChecks.SqlServer (верзија 9.0.0, компатибилна са .NET 8) за проверу доступности SQL Server базе по сервису [3].</w:t>
-      </w:r>
-    </w:p>
-    <w:p xmlns:wp14="http://schemas.microsoft.com/office/word/2010/wordml" wp14:textId="77777777">
-      <w:pPr>
-        <w:pStyle w:val="Naslov1nivo"/>
-      </w:pPr>
-      <w:r>
-        <w:t>k6</w:t>
-      </w:r>
-    </w:p>
-    <w:p xmlns:wp14="http://schemas.microsoft.com/office/word/2010/wordml" wp14:textId="77777777">
-      <w:pPr>
-        <w:pStyle w:val="BodyText"/>
-      </w:pPr>
-      <w:r>
-        <w:t>За демонстрацију понашања система под оптерећењем (сценарио 3, поглавље 5) коришћен је k6 (Grafana k6), алат за load testing чији се скриптовани сценарији пишу у JavaScript-у, што га чини лакшим за одржавање и читање у односу на алтернативе попут JMeter-а [8].</w:t>
-      </w:r>
-    </w:p>
-    <w:p xmlns:wp14="http://schemas.microsoft.com/office/word/2010/wordml" wp14:textId="77777777">
-      <w:pPr>
-        <w:pStyle w:val="Naslov1nivo"/>
-      </w:pPr>
-      <w:r>
-        <w:t>xUnit</w:t>
-      </w:r>
-    </w:p>
-    <w:p xmlns:wp14="http://schemas.microsoft.com/office/word/2010/wordml" wp14:textId="77777777">
-      <w:pPr>
-        <w:pStyle w:val="BodyText"/>
-      </w:pPr>
-      <w:r>
-        <w:t>За аутоматизовано тестирање (поглавље 6) коришћен је xUnit [12], стандардни test framework за .NET који Microsoft подразумевано укључује у project template-е за .NET апликације, јер пројекат пре овог рада није имао дефинисан test framework нити иједан тест.</w:t>
-      </w:r>
-    </w:p>
-    <w:p xmlns:wp14="http://schemas.microsoft.com/office/word/2010/wordml" wp14:textId="77777777">
-      <w:pPr>
-        <w:pStyle w:val="Naslov1nivo"/>
-      </w:pPr>
-      <w:r>
-        <w:t>Docker / Docker Compose</w:t>
-      </w:r>
-    </w:p>
-    <w:p xmlns:wp14="http://schemas.microsoft.com/office/word/2010/wordml" wp14:textId="77777777">
-      <w:pPr>
-        <w:pStyle w:val="BodyText"/>
-      </w:pPr>
-      <w:r>
-        <w:t>Цела observability инфраструктура (Collector, Prometheus, Tempo, Loki, Grafana) покреће се кроз Docker Compose [13], алат за дефинисање и покретање вишеконтејнерских Docker апликација преко једног YAML фајла, независно од постојећег Service Fabric кластера и SQL Server инстанце — додатак, не замена постојећег начина рада система.</w:t>
-      </w:r>
-    </w:p>
-    <w:p>
-      <w:pPr>
-        <w:pStyle w:val="Heading1"/>
-        <w:rPr/>
-      </w:pPr>
-      <w:bookmarkStart w:name="_Toc459059121" w:id="1803461278"/>
-      <w:r>
-        <w:rPr>
-          <w:lang w:val="sr-Cyrl-RS"/>
-        </w:rPr>
-        <w:t xml:space="preserve">Опис </w:t>
-      </w:r>
-      <w:r>
-        <w:rPr/>
-        <w:t>почетног</w:t>
-      </w:r>
-      <w:r>
-        <w:rPr/>
-        <w:t xml:space="preserve"> </w:t>
-      </w:r>
-      <w:r>
-        <w:rPr/>
-        <w:t>решења</w:t>
-      </w:r>
-      <w:bookmarkEnd w:id="1803461278"/>
-    </w:p>
-    <w:p xmlns:wp14="http://schemas.microsoft.com/office/word/2010/wordml" wp14:textId="77777777">
-      <w:pPr>
-        <w:pStyle w:val="BodyText"/>
-      </w:pPr>
-      <w:r>
-        <w:t>У овом поглављу описано је стање система Travel Planner пре надоградње описане у овом раду — архитектура, технологије и, посебно, постојећи (или тачније, непостојећи) механизми обсервабилности, установљени детаљном анализом изворног кода.</w:t>
-      </w:r>
-    </w:p>
-    <w:p xmlns:wp14="http://schemas.microsoft.com/office/word/2010/wordml" wp14:textId="77777777">
-      <w:pPr>
-        <w:pStyle w:val="Naslov1nivo"/>
+        <w:pStyle w:val="Heading2"/>
       </w:pPr>
       <w:r>
         <w:t>Архитектура система</w:t>
@@ -10348,7 +10356,7 @@
         <w:jc w:val="center"/>
       </w:pPr>
       <w:r>
-        <w:t>Слика 4.1. Архитектура система пре надоградње</w:t>
+        <w:t>Слика 4.2. Архитектура система пре надоградње</w:t>
       </w:r>
       <w:bookmarkEnd w:id="100"/>
     </w:p>
@@ -10398,7 +10406,7 @@
         <w:pStyle w:val="Slika"/>
       </w:pPr>
       <w:r>
-        <w:t>Слика 4.2. Service Fabric Explorer — сва четири сервиса здрава (Healthy)</w:t>
+        <w:t>Слика 4.3. Service Fabric Explorer — сва четири сервиса здрава (Healthy)</w:t>
       </w:r>
     </w:p>
     <w:p xmlns:wp14="http://schemas.microsoft.com/office/word/2010/wordml" wp14:textId="77777777">
@@ -10419,7 +10427,7 @@
     </w:p>
     <w:p xmlns:wp14="http://schemas.microsoft.com/office/word/2010/wordml" wp14:textId="77777777">
       <w:pPr>
-        <w:pStyle w:val="Naslov1nivo"/>
+        <w:pStyle w:val="Heading2"/>
       </w:pPr>
       <w:r>
         <w:t>Постојећи механизми обсервабилности</w:t>
@@ -10816,7 +10824,7 @@
     </w:p>
     <w:p xmlns:wp14="http://schemas.microsoft.com/office/word/2010/wordml" wp14:textId="77777777">
       <w:pPr>
-        <w:pStyle w:val="Naslov1nivo"/>
+        <w:pStyle w:val="Heading2"/>
       </w:pPr>
       <w:r>
         <w:t>TO-BE архитектура</w:t>
@@ -10913,7 +10921,7 @@
     </w:p>
     <w:p xmlns:wp14="http://schemas.microsoft.com/office/word/2010/wordml" wp14:textId="77777777">
       <w:pPr>
-        <w:pStyle w:val="Naslov1nivo"/>
+        <w:pStyle w:val="Heading2"/>
       </w:pPr>
       <w:r>
         <w:t>Health checks</w:t>
@@ -10978,7 +10986,7 @@
     </w:p>
     <w:p xmlns:wp14="http://schemas.microsoft.com/office/word/2010/wordml" wp14:textId="77777777">
       <w:pPr>
-        <w:pStyle w:val="Naslov1nivo"/>
+        <w:pStyle w:val="Heading2"/>
       </w:pPr>
       <w:r>
         <w:t>Инструментација сервиса</w:t>
@@ -11026,7 +11034,7 @@
     </w:p>
     <w:p xmlns:wp14="http://schemas.microsoft.com/office/word/2010/wordml" wp14:textId="77777777">
       <w:pPr>
-        <w:pStyle w:val="Naslov1nivo"/>
+        <w:pStyle w:val="Heading2"/>
       </w:pPr>
       <w:r>
         <w:t>Grafana dashboard</w:t>
@@ -11177,7 +11185,7 @@
     </w:p>
     <w:p xmlns:wp14="http://schemas.microsoft.com/office/word/2010/wordml" wp14:textId="77777777">
       <w:pPr>
-        <w:pStyle w:val="Naslov1nivo"/>
+        <w:pStyle w:val="Heading2"/>
       </w:pPr>
       <w:r>
         <w:t>Рефакторинг ради тестабилности</w:t>
@@ -11193,7 +11201,7 @@
     </w:p>
     <w:p xmlns:wp14="http://schemas.microsoft.com/office/word/2010/wordml" wp14:textId="77777777">
       <w:pPr>
-        <w:pStyle w:val="Naslov1nivo"/>
+        <w:pStyle w:val="Heading2"/>
       </w:pPr>
       <w:r>
         <w:t>Тест пројекти и стратегија</w:t>
@@ -11233,7 +11241,7 @@
     </w:p>
     <w:p xmlns:wp14="http://schemas.microsoft.com/office/word/2010/wordml" wp14:textId="77777777">
       <w:pPr>
-        <w:pStyle w:val="Naslov1nivo"/>
+        <w:pStyle w:val="Heading2"/>
       </w:pPr>
       <w:r>
         <w:t>Резултати</w:t>
@@ -11590,7 +11598,23 @@
     </w:p>
     <w:p>
       <w:pPr>
-        <w:pStyle w:val="Naslov1nivo"/>
+        <w:pStyle w:val="Heading2"/>
+      </w:pPr>
+      <w:r>
+        <w:t>Демонстрација неуспешног теста</w:t>
+      </w:r>
+    </w:p>
+    <w:p>
+      <w:pPr>
+        <w:pStyle w:val="BodyText"/>
+      </w:pPr>
+      <w:r>
+        <w:t>Да би се показало да аутоматизовани тестови стварно проверавају понашање кода, а не само тривијално пролазе, намерно је привремено враћен оригинални „тихи” catch блок у AuthService/Services/TripClient.cs, методи DeleteUserTripsAsync — уклоњен је позив _logger.LogWarning(...) у грани која обрађује неуспешан HTTP позив ка TripService-у, чиме је метода враћена у стање пре овог рада (грешка се и даље хвата, али без иједног трага у логу). Након ове измене, покретање TripClientTests пројекта у Visual Studio Test Explorer-у резултовало је тачно једним неуспешним тестом (FAILED) — управо оним који проверава да неуспешан HTTP статус производи LogWarning позив; преостала два теста из истог пројекта (успешан позив, мрежни изузетак) остала су непромењена и даље су пролазила. Након поновног враћања LogWarning позива, сви тестови су поново прошли (21/21, Табела 6.1, Слика 6.1).</w:t>
+      </w:r>
+    </w:p>
+    <w:p>
+      <w:pPr>
+        <w:pStyle w:val="Heading2"/>
       </w:pPr>
       <w:r>
         <w:t>Демонстрациони сценарији</w:t>
@@ -11606,7 +11630,7 @@
     </w:p>
     <w:p>
       <w:pPr>
-        <w:pStyle w:val="Naslov2nivo"/>
+        <w:pStyle w:val="Heading3"/>
       </w:pPr>
       <w:r>
         <w:t>Сценарио 1 — нормалан захтев кроз више сервиса</w:t>
@@ -11671,7 +11695,7 @@
     </w:p>
     <w:p>
       <w:pPr>
-        <w:pStyle w:val="Naslov2nivo"/>
+        <w:pStyle w:val="Heading3"/>
       </w:pPr>
       <w:r>
         <w:t>Сценарио 2 — грешка (пад зависности)</w:t>
@@ -11687,7 +11711,7 @@
     </w:p>
     <w:p>
       <w:pPr>
-        <w:pStyle w:val="Naslov2nivo"/>
+        <w:pStyle w:val="Heading3"/>
       </w:pPr>
       <w:r>
         <w:t>Сценарио 3 — повећано оптерећење</w:t>
@@ -11752,7 +11776,7 @@
     </w:p>
     <w:p>
       <w:pPr>
-        <w:pStyle w:val="Naslov2nivo"/>
+        <w:pStyle w:val="Heading3"/>
       </w:pPr>
       <w:r>
         <w:t>Сценарио 4 — спора зависност (уско грло)</w:t>
@@ -12163,7 +12187,7 @@
     </w:p>
     <w:p xmlns:wp14="http://schemas.microsoft.com/office/word/2010/wordml" wp14:textId="77777777">
       <w:pPr>
-        <w:pStyle w:val="Naslov1nivo"/>
+        <w:pStyle w:val="Heading2"/>
       </w:pPr>
       <w:r>
         <w:t>Правци даљег развоја</w:t>

</xml_diff>

<commit_message>
docs: remove unreferenced IEEE citation guide, reposition [3] and [8] to correctly support their claims, renumber all citations 1-12
</commit_message>
<xml_diff>
--- a/docs/diplomski-rad.docx
+++ b/docs/diplomski-rad.docx
@@ -2136,7 +2136,7 @@
                 <w:szCs w:val="18"/>
                 <w:lang w:val="sr-Cyrl-RS"/>
               </w:rPr>
-              <w:t xml:space="preserve"> страна / 13 цитата / 2 табеле / 11 слика / 0 графика / 0 прилога</w:t>
+              <w:t xml:space="preserve"> страна / 12 цитата / 2 табеле / 11 слика / 0 графика / 0 прилога</w:t>
             </w:r>
           </w:p>
         </w:tc>
@@ -4670,7 +4670,7 @@
                 <w:sz w:val="18"/>
                 <w:szCs w:val="18"/>
               </w:rPr>
-              <w:t xml:space="preserve"> pages / 13 references / 2 tables / 11 figures / 0 graphs / 0 appendixes</w:t>
+              <w:t xml:space="preserve"> pages / 12 references / 2 tables / 11 figures / 0 graphs / 0 appendixes</w:t>
             </w:r>
           </w:p>
         </w:tc>
@@ -10023,7 +10023,7 @@
         <w:pStyle w:val="BodyText"/>
       </w:pPr>
       <w:r>
-        <w:t>Backend четири сервиса (Gateway, AuthService, TripService, SharingService) реализован је у C#/.NET 8, хостован на Microsoft Service Fabric платформи [4] (stateless сервиси за Gateway/AuthService/TripService, stateful за SharingService), уз Entity Framework Core 8 за приступ подацима, YARP (Yet Another Reverse Proxy) [5] за Gateway рутирање, BCrypt.Net за хеширање лозинки и JWT Bearer аутентикацију. Подаци се чувају у Microsoft SQL Server бази, по принципу database-per-service (UsersDB, TripsDB, SharingDB). Frontend је React 19 (Vite) апликација која комуницира искључиво преко Gateway-а.</w:t>
+        <w:t>Backend четири сервиса (Gateway, AuthService, TripService, SharingService) реализован је у C#/.NET 8, хостован на Microsoft Service Fabric платформи [3] (stateless сервиси за Gateway/AuthService/TripService, stateful за SharingService), уз Entity Framework Core 8 за приступ подацима, YARP (Yet Another Reverse Proxy) [4] за Gateway рутирање, BCrypt.Net за хеширање лозинки и JWT Bearer аутентикацију. Подаци се чувају у Microsoft SQL Server бази, по принципу database-per-service (UsersDB, TripsDB, SharingDB). Frontend је React 19 (Vite) апликација која комуницира искључиво преко Gateway-а.</w:t>
       </w:r>
     </w:p>
     <w:p>
@@ -10047,7 +10047,7 @@
         <w:pStyle w:val="BodyText"/>
       </w:pPr>
       <w:r>
-        <w:t>OpenTelemetry (OTel) изабран је као централни стандард надоградње јер обједињује сва три облика телеметрије (traces, metrics, logs) под једним, vendor-неутралним API-јем и SDK-ом [2], са великим бројем готових ("auto") инструментација управо за технологије које пројекат већ користи — ASP.NET Core, HttpClient, SqlClient — тако да се велик део вредности добија без писања сопственог инструментационог кода. Верзија OpenTelemetry .NET SDK-а коришћена у раду је 1.18.0, конзистентна кроз сва четири сервиса.</w:t>
+        <w:t>OpenTelemetry (OTel) изабран је као централни стандард надоградње јер обједињује сва три облика телеметрије (traces, metrics, logs) под једним, vendor-неутралним API-јем и SDK-ом [1], са великим бројем готових ("auto") инструментација управо за технологије које пројекат већ користи — ASP.NET Core, HttpClient, SqlClient — тако да се велик део вредности добија без писања сопственог инструментационог кода. Верзија OpenTelemetry .NET SDK-а коришћена у раду је 1.18.0, конзистентна кроз сва четири сервиса.</w:t>
       </w:r>
     </w:p>
     <w:p>
@@ -10071,7 +10071,7 @@
         <w:pStyle w:val="BodyText"/>
       </w:pPr>
       <w:r>
-        <w:t>Сервиси не шаљу телеметрију директно ка Prometheus/Tempo/Loki, већ ка једном централном OpenTelemetry Collector-у (OTLP протокол, gRPC на порту 4317). Ово раздваја „како апликација емитује телеметрију” од „где та телеметрија завршава” — каснија измена backend-а за складиштење (нпр. замена Loki-ја другим решењем) не би захтевала измену ниједног сервиса, само Collector-ове конфигурације [10].</w:t>
+        <w:t>Сервиси не шаљу телеметрију директно ка Prometheus/Tempo/Loki, већ ка једном централном OpenTelemetry Collector-у (OTLP протокол, gRPC на порту 4317). Ово раздваја „како апликација емитује телеметрију” од „где та телеметрија завршава” — каснија измена backend-а за складиштење (нпр. замена Loki-ја другим решењем) не би захтевала измену ниједног сервиса, само Collector-ове конфигурације [9].</w:t>
       </w:r>
     </w:p>
     <w:p xmlns:wp14="http://schemas.microsoft.com/office/word/2010/wordml" wp14:textId="77777777">
@@ -10087,7 +10087,7 @@
         <w:pStyle w:val="BodyText"/>
       </w:pPr>
       <w:r>
-        <w:t>За складиштење три врсте телеметрије изабран је такозвани „Grafana stack”: Prometheus [9] за метрике (Collector излаже Prometheus-компатибилан /metrics endpoint који Prometheus периодично scrape-ује), Grafana Tempo [6] за дистрибуирано праћење захтева (trace-ове), и Grafana Loki [7] за централизоване логове. Предност ове комбинације над, на пример, самостојећим Jaeger-ом за tracing јесте што све три компоненте имају нативну, provisioned интеграцију са Grafanom — укључујући унакрсну навигацију (клик са log линије на њен trace, клик са trace-а на метрику) која је директно демонстрирана у поглављу 5.</w:t>
+        <w:t>За складиштење три врсте телеметрије изабран је такозвани „Grafana stack”: Prometheus [8] за метрике (Collector излаже Prometheus-компатибилан /metrics endpoint који Prometheus периодично scrape-ује), Grafana Tempo [5] за дистрибуирано праћење захтева (trace-ове), и Grafana Loki [6] за централизоване логове. Предност ове комбинације над, на пример, самостојећим Jaeger-ом за tracing јесте што све три компоненте имају нативну, provisioned интеграцију са Grafanom — укључујући унакрсну навигацију (клик са log линије на њен trace, клик са trace-а на метрику) која је директно демонстрирана у поглављу 5.</w:t>
       </w:r>
     </w:p>
     <w:p xmlns:wp14="http://schemas.microsoft.com/office/word/2010/wordml" wp14:textId="77777777">
@@ -10103,7 +10103,7 @@
         <w:pStyle w:val="BodyText"/>
       </w:pPr>
       <w:r>
-        <w:t>Grafana [11] је изабрана као јединствен визуелни слој за све три врсте телеметрије, уместо по једног специјализованог алата за сваку (нпр. Jaeger UI за trace-ове, посебан алат за метрике). Grafana подржава велики број data source-ова кроз plugin архитектуру, а Prometheus, Tempo и Loki су сви подржани нативно, без додатних plugin-ова, што је додатни разлог за избор баш ове платформе. Ово директно подржава сценарио „развијач види комплетну слику једног захтева на једном месту”, који је централна теза рада.</w:t>
+        <w:t>Grafana [10] је изабрана као јединствен визуелни слој за све три врсте телеметрије, уместо по једног специјализованог алата за сваку (нпр. Jaeger UI за trace-ове, посебан алат за метрике). Grafana подржава велики број data source-ова кроз plugin архитектуру, а Prometheus, Tempo и Loki су сви подржани нативно, без додатних plugin-ова, што је додатни разлог за избор баш ове платформе. Ово директно подржава сценарио „развијач види комплетну слику једног захтева на једном месту”, који је централна теза рада.</w:t>
       </w:r>
     </w:p>
     <w:p xmlns:wp14="http://schemas.microsoft.com/office/word/2010/wordml" wp14:textId="77777777">
@@ -10119,7 +10119,7 @@
         <w:pStyle w:val="BodyText"/>
       </w:pPr>
       <w:r>
-        <w:t>Коришћен је уграђен ASP.NET Core механизам (Microsoft.Extensions.Diagnostics.HealthChecks), допуњен пакетом AspNetCore.HealthChecks.SqlServer (верзија 9.0.0, компатибилна са .NET 8) за проверу доступности SQL Server базе по сервису [3].</w:t>
+        <w:t>Коришћен је уграђен ASP.NET Core механизам (Microsoft.Extensions.Diagnostics.HealthChecks) [2], допуњен пакетом AspNetCore.HealthChecks.SqlServer (верзија 9.0.0, компатибилна са .NET 8) за проверу доступности SQL Server базе по сервису.</w:t>
       </w:r>
     </w:p>
     <w:p xmlns:wp14="http://schemas.microsoft.com/office/word/2010/wordml" wp14:textId="77777777">
@@ -10135,7 +10135,7 @@
         <w:pStyle w:val="BodyText"/>
       </w:pPr>
       <w:r>
-        <w:t>За демонстрацију понашања система под оптерећењем (сценарио 3, поглавље 5) коришћен је k6 (Grafana k6), алат за load testing чији се скриптовани сценарији пишу у JavaScript-у, што га чини лакшим за одржавање и читање у односу на алтернативе попут JMeter-а [8].</w:t>
+        <w:t>За демонстрацију понашања система под оптерећењем (сценарио 3, поглавље 5) коришћен је k6 (Grafana k6) [7], алат за load testing чији се скриптовани сценарији пишу у JavaScript-у, што га чини лакшим за одржавање и читање у односу на алтернативе попут JMeter-а.</w:t>
       </w:r>
     </w:p>
     <w:p xmlns:wp14="http://schemas.microsoft.com/office/word/2010/wordml" wp14:textId="77777777">
@@ -10151,7 +10151,7 @@
         <w:pStyle w:val="BodyText"/>
       </w:pPr>
       <w:r>
-        <w:t>За аутоматизовано тестирање (поглавље 6) коришћен је xUnit [12], стандардни test framework за .NET који Microsoft подразумевано укључује у project template-е за .NET апликације, јер пројекат пре овог рада није имао дефинисан test framework нити иједан тест.</w:t>
+        <w:t>За аутоматизовано тестирање (поглавље 6) коришћен је xUnit [11], стандардни test framework за .NET који Microsoft подразумевано укључује у project template-е за .NET апликације, јер пројекат пре овог рада није имао дефинисан test framework нити иједан тест.</w:t>
       </w:r>
     </w:p>
     <w:p xmlns:wp14="http://schemas.microsoft.com/office/word/2010/wordml" wp14:textId="77777777">
@@ -10167,7 +10167,7 @@
         <w:pStyle w:val="BodyText"/>
       </w:pPr>
       <w:r>
-        <w:t>Цела observability инфраструктура (Collector, Prometheus, Tempo, Loki, Grafana) покреће се кроз Docker Compose [13], алат за дефинисање и покретање вишеконтејнерских Docker апликација преко једног YAML фајла, независно од постојећег Service Fabric кластера и SQL Server инстанце — додатак, не замена постојећег начина рада система.</w:t>
+        <w:t>Цела observability инфраструктура (Collector, Prometheus, Tempo, Loki, Grafana) покреће се кроз Docker Compose [12], алат за дефинисање и покретање вишеконтејнерских Docker апликација преко једног YAML фајла, независно од постојећег Service Fabric кластера и SQL Server инстанце — додатак, не замена постојећег начина рада система.</w:t>
       </w:r>
     </w:p>
     <w:p>
@@ -12267,7 +12267,7 @@
         <w:pStyle w:val="literatura"/>
       </w:pPr>
       <w:r>
-        <w:t>[1] IEEE, "IEEE Reference Guide." ieeeauthorcenter.ieee.org. https://ieeeauthorcenter.ieee.org/wp-content/uploads/IEEE-Reference-Guide.pdf (приступљено: септембар 2026).</w:t>
+        <w:t>[1] OpenTelemetry Authors, "OpenTelemetry .NET Documentation." opentelemetry.io. https://opentelemetry.io/docs/languages/net/ (приступљено: септембар 2026).</w:t>
       </w:r>
     </w:p>
     <w:p xmlns:wp14="http://schemas.microsoft.com/office/word/2010/wordml" wp14:textId="77777777">
@@ -12275,7 +12275,7 @@
         <w:pStyle w:val="literatura"/>
       </w:pPr>
       <w:r>
-        <w:t>[2] OpenTelemetry Authors, "OpenTelemetry .NET Documentation." opentelemetry.io. https://opentelemetry.io/docs/languages/net/ (приступљено: септембар 2026).</w:t>
+        <w:t>[2] Microsoft, "Health checks in ASP.NET Core." learn.microsoft.com. https://learn.microsoft.com/en-us/aspnet/core/host-and-deploy/health-checks (приступљено: септембар 2026).</w:t>
       </w:r>
     </w:p>
     <w:p xmlns:wp14="http://schemas.microsoft.com/office/word/2010/wordml" wp14:textId="77777777">
@@ -12283,7 +12283,7 @@
         <w:pStyle w:val="literatura"/>
       </w:pPr>
       <w:r>
-        <w:t>[3] Microsoft, "Health checks in ASP.NET Core." learn.microsoft.com. https://learn.microsoft.com/en-us/aspnet/core/host-and-deploy/health-checks (приступљено: септембар 2026).</w:t>
+        <w:t>[3] Microsoft, "Service Fabric documentation." learn.microsoft.com. https://learn.microsoft.com/en-us/azure/service-fabric/ (приступљено: септембар 2026).</w:t>
       </w:r>
     </w:p>
     <w:p xmlns:wp14="http://schemas.microsoft.com/office/word/2010/wordml" wp14:textId="77777777">
@@ -12291,7 +12291,7 @@
         <w:pStyle w:val="literatura"/>
       </w:pPr>
       <w:r>
-        <w:t>[4] Microsoft, "Service Fabric documentation." learn.microsoft.com. https://learn.microsoft.com/en-us/azure/service-fabric/ (приступљено: септембар 2026).</w:t>
+        <w:t>[4] YARP contributors, "YARP: Yet Another Reverse Proxy - Documentation." microsoft.github.io. https://microsoft.github.io/reverse-proxy/ (приступљено: септембар 2026).</w:t>
       </w:r>
     </w:p>
     <w:p xmlns:wp14="http://schemas.microsoft.com/office/word/2010/wordml" wp14:textId="77777777">
@@ -12299,7 +12299,7 @@
         <w:pStyle w:val="literatura"/>
       </w:pPr>
       <w:r>
-        <w:t>[5] YARP contributors, "YARP: Yet Another Reverse Proxy - Documentation." microsoft.github.io. https://microsoft.github.io/reverse-proxy/ (приступљено: септембар 2026).</w:t>
+        <w:t>[5] Grafana Labs, "Grafana Tempo documentation." grafana.com. https://grafana.com/docs/tempo/latest/ (приступљено: септембар 2026).</w:t>
       </w:r>
     </w:p>
     <w:p xmlns:wp14="http://schemas.microsoft.com/office/word/2010/wordml" wp14:textId="77777777">
@@ -12307,7 +12307,7 @@
         <w:pStyle w:val="literatura"/>
       </w:pPr>
       <w:r>
-        <w:t>[6] Grafana Labs, "Grafana Tempo documentation." grafana.com. https://grafana.com/docs/tempo/latest/ (приступљено: септембар 2026).</w:t>
+        <w:t>[6] Grafana Labs, "Grafana Loki documentation." grafana.com. https://grafana.com/docs/loki/latest/ (приступљено: септембар 2026).</w:t>
       </w:r>
     </w:p>
     <w:p xmlns:wp14="http://schemas.microsoft.com/office/word/2010/wordml" wp14:textId="77777777">
@@ -12315,7 +12315,7 @@
         <w:pStyle w:val="literatura"/>
       </w:pPr>
       <w:r>
-        <w:t>[7] Grafana Labs, "Grafana Loki documentation." grafana.com. https://grafana.com/docs/loki/latest/ (приступљено: септембар 2026).</w:t>
+        <w:t>[7] Grafana Labs, "Grafana k6 documentation." grafana.com. https://grafana.com/docs/k6/latest/ (приступљено: септембар 2026).</w:t>
       </w:r>
     </w:p>
     <w:p xmlns:wp14="http://schemas.microsoft.com/office/word/2010/wordml" wp14:textId="77777777">
@@ -12323,7 +12323,7 @@
         <w:pStyle w:val="literatura"/>
       </w:pPr>
       <w:r>
-        <w:t>[8] Grafana Labs, "Grafana k6 documentation." grafana.com. https://grafana.com/docs/k6/latest/ (приступљено: септембар 2026).</w:t>
+        <w:t>[8] Prometheus Authors, "Prometheus documentation." prometheus.io. https://prometheus.io/docs/introduction/overview/ (приступљено: септембар 2026).</w:t>
       </w:r>
     </w:p>
     <w:p xmlns:wp14="http://schemas.microsoft.com/office/word/2010/wordml" wp14:textId="77777777">
@@ -12331,15 +12331,15 @@
         <w:pStyle w:val="literatura"/>
       </w:pPr>
       <w:r>
-        <w:t>[9] Prometheus Authors, "Prometheus documentation." prometheus.io. https://prometheus.io/docs/introduction/overview/ (приступљено: септембар 2026).</w:t>
-      </w:r>
-    </w:p>
-    <w:p xmlns:wp14="http://schemas.microsoft.com/office/word/2010/wordml" wp14:textId="77777777">
+        <w:t>[9] The OpenTelemetry Collector Authors, "OpenTelemetry Collector documentation." opentelemetry.io. https://opentelemetry.io/docs/collector/ (приступљено: септембар 2026).</w:t>
+      </w:r>
+    </w:p>
+    <w:p>
       <w:pPr>
         <w:pStyle w:val="literatura"/>
       </w:pPr>
       <w:r>
-        <w:t>[10] The OpenTelemetry Collector Authors, "OpenTelemetry Collector documentation." opentelemetry.io. https://opentelemetry.io/docs/collector/ (приступљено: септембар 2026).</w:t>
+        <w:t>[10] Grafana Labs, "Grafana documentation." grafana.com. https://grafana.com/docs/grafana/latest/ (приступљено: септембар 2026).</w:t>
       </w:r>
     </w:p>
     <w:p>
@@ -12347,7 +12347,7 @@
         <w:pStyle w:val="literatura"/>
       </w:pPr>
       <w:r>
-        <w:t>[11] Grafana Labs, "Grafana documentation." grafana.com. https://grafana.com/docs/grafana/latest/ (приступљено: септембар 2026).</w:t>
+        <w:t>[11] .NET Foundation, "xUnit.net documentation." xunit.net. https://xunit.net/docs/getting-started/netcore/cmdline (приступљено: септембар 2026).</w:t>
       </w:r>
     </w:p>
     <w:p>
@@ -12355,15 +12355,7 @@
         <w:pStyle w:val="literatura"/>
       </w:pPr>
       <w:r>
-        <w:t>[12] .NET Foundation, "xUnit.net documentation." xunit.net. https://xunit.net/docs/getting-started/netcore/cmdline (приступљено: септембар 2026).</w:t>
-      </w:r>
-    </w:p>
-    <w:p>
-      <w:pPr>
-        <w:pStyle w:val="literatura"/>
-      </w:pPr>
-      <w:r>
-        <w:t>[13] Docker Inc., "Docker Compose documentation." docs.docker.com. https://docs.docker.com/compose/ (приступљено: септембар 2026).</w:t>
+        <w:t>[12] Docker Inc., "Docker Compose documentation." docs.docker.com. https://docs.docker.com/compose/ (приступљено: септембар 2026).</w:t>
       </w:r>
     </w:p>
     <w:p>

</xml_diff>

<commit_message>
docs: add failing-test screenshot demonstrating meaningful test coverage, renumber subsequent figures
</commit_message>
<xml_diff>
--- a/docs/diplomski-rad.docx
+++ b/docs/diplomski-rad.docx
@@ -8184,7 +8184,7 @@
         <w:pStyle w:val="BodyText"/>
       </w:pPr>
       <w:r>
-        <w:t>Слика 6.2. Лог захтева из Сценарија 1 у Grafana Loki-ју .......................................... 17</w:t>
+        <w:t>Слика 6.2. Неуспешан тест након намерног враћања „тихог” catch блока ............................. 16</w:t>
       </w:r>
     </w:p>
     <w:p>
@@ -8192,7 +8192,15 @@
         <w:pStyle w:val="BodyText"/>
       </w:pPr>
       <w:r>
-        <w:t>Слика 6.3. Резултати k6 load test-а .............................................................. 18</w:t>
+        <w:t>Слика 6.3. Лог захтева из Сценарија 1 у Grafana Loki-ју .......................................... 17</w:t>
+      </w:r>
+    </w:p>
+    <w:p>
+      <w:pPr>
+        <w:pStyle w:val="BodyText"/>
+      </w:pPr>
+      <w:r>
+        <w:t>Слика 6.4. Резултати k6 load test-а .............................................................. 18</w:t>
       </w:r>
     </w:p>
     <w:p>
@@ -11614,6 +11622,53 @@
     </w:p>
     <w:p>
       <w:pPr>
+        <w:jc w:val="center"/>
+      </w:pPr>
+      <w:r>
+        <w:drawing>
+          <wp:inline>
+            <wp:extent cx="5040000" cy="1690417"/>
+            <wp:docPr id="18" name="Picture 18"/>
+            <wp:cNvGraphicFramePr>
+              <a:graphicFrameLocks noChangeAspect="1"/>
+            </wp:cNvGraphicFramePr>
+            <a:graphic>
+              <a:graphicData uri="http://schemas.openxmlformats.org/drawingml/2006/picture">
+                <pic:pic>
+                  <pic:nvPicPr>
+                    <pic:cNvPr id="0" name="faild.png"/>
+                    <pic:cNvPicPr/>
+                  </pic:nvPicPr>
+                  <pic:blipFill>
+                    <a:blip r:embed="rId44"/>
+                    <a:stretch>
+                      <a:fillRect/>
+                    </a:stretch>
+                  </pic:blipFill>
+                  <pic:spPr>
+                    <a:xfrm>
+                      <a:off x="0" y="0"/>
+                      <a:ext cx="5040000" cy="1690417"/>
+                    </a:xfrm>
+                    <a:prstGeom prst="rect"/>
+                  </pic:spPr>
+                </pic:pic>
+              </a:graphicData>
+            </a:graphic>
+          </wp:inline>
+        </w:drawing>
+      </w:r>
+    </w:p>
+    <w:p>
+      <w:pPr>
+        <w:pStyle w:val="Slika"/>
+      </w:pPr>
+      <w:r>
+        <w:t>Слика 6.2. Неуспешан тест након намерног враћања „тихог” catch блока</w:t>
+      </w:r>
+    </w:p>
+    <w:p>
+      <w:pPr>
         <w:pStyle w:val="Heading2"/>
       </w:pPr>
       <w:r>
@@ -11690,7 +11745,7 @@
         <w:pStyle w:val="Slika"/>
       </w:pPr>
       <w:r>
-        <w:t>Слика 6.2. Лог захтева из Сценарија 1 у Grafana Loki-ју, повезан са trace-ом (Слика 5.4)</w:t>
+        <w:t>Слика 6.3. Лог захтева из Сценарија 1 у Grafana Loki-ју, повезан са trace-ом (Слика 5.4)</w:t>
       </w:r>
     </w:p>
     <w:p>
@@ -11771,7 +11826,7 @@
         <w:pStyle w:val="Slika"/>
       </w:pPr>
       <w:r>
-        <w:t>Слика 6.3. Резултати k6 load test-а (Сценарио 3)</w:t>
+        <w:t>Слика 6.4. Резултати k6 load test-а (Сценарио 3)</w:t>
       </w:r>
     </w:p>
     <w:p>

</xml_diff>

<commit_message>
docs: move QR-sharing screenshot from Uvod to Pocetno resenje next to SharingService description, recompute all page numbers
</commit_message>
<xml_diff>
--- a/docs/diplomski-rad.docx
+++ b/docs/diplomski-rad.docx
@@ -7796,7 +7796,7 @@
         <w:tab/>
         <w:t>Опис проблема</w:t>
         <w:tab/>
-        <w:t>6</w:t>
+        <w:t>5</w:t>
       </w:r>
       <w:r/>
       <w:r/>
@@ -7830,7 +7830,7 @@
         <w:tab/>
         <w:t>Опис коришћених технологија и алата</w:t>
         <w:tab/>
-        <w:t>7</w:t>
+        <w:t>6</w:t>
       </w:r>
       <w:r/>
       <w:r/>
@@ -7864,7 +7864,7 @@
         <w:tab/>
         <w:t>Опис почетног решења</w:t>
         <w:tab/>
-        <w:t>9</w:t>
+        <w:t>8</w:t>
       </w:r>
       <w:r/>
       <w:r/>
@@ -7898,7 +7898,7 @@
         <w:tab/>
         <w:t>Опис решења проблема</w:t>
         <w:tab/>
-        <w:t>12</w:t>
+        <w:t>11</w:t>
       </w:r>
       <w:r/>
       <w:r/>
@@ -7932,7 +7932,7 @@
         <w:tab/>
         <w:t>Тестирање и резултати</w:t>
         <w:tab/>
-        <w:t>15</w:t>
+        <w:t>14</w:t>
       </w:r>
       <w:r/>
       <w:r/>
@@ -7966,7 +7966,7 @@
         <w:tab/>
         <w:t>Закључак</w:t>
         <w:tab/>
-        <w:t>20</w:t>
+        <w:t>19</w:t>
       </w:r>
       <w:r/>
       <w:r/>
@@ -7997,7 +7997,7 @@
       <w:r>
         <w:t>Литература</w:t>
         <w:tab/>
-        <w:t>21</w:t>
+        <w:t>20</w:t>
       </w:r>
       <w:r/>
       <w:r/>
@@ -8024,7 +8024,7 @@
       <w:r>
         <w:t>Биографија</w:t>
         <w:tab/>
-        <w:t>22</w:t>
+        <w:t>21</w:t>
       </w:r>
       <w:r/>
       <w:r/>
@@ -8112,7 +8112,7 @@
         <w:pStyle w:val="BodyText"/>
       </w:pPr>
       <w:r>
-        <w:t>Слика 1.1. Дељење плана путовања путем кода/QR кода ............................................... 4</w:t>
+        <w:t>Слика 4.1. Изглед Travel Planner апликације — преглед планова путовања ............................ 8</w:t>
       </w:r>
     </w:p>
     <w:p>
@@ -8120,7 +8120,7 @@
         <w:pStyle w:val="BodyText"/>
       </w:pPr>
       <w:r>
-        <w:t>Слика 4.1. Изглед Travel Planner апликације — преглед планова путовања ............................ 9</w:t>
+        <w:t>Слика 4.2. Дељење плана путовања путем кода/QR кода ............................................... 9</w:t>
       </w:r>
     </w:p>
     <w:p>
@@ -8128,7 +8128,7 @@
         <w:pStyle w:val="BodyText"/>
       </w:pPr>
       <w:r>
-        <w:t>Слика 4.2. Архитектура система пре надоградње .................................................... 10</w:t>
+        <w:t>Слика 4.3. Архитектура система пре надоградње .................................................... 10</w:t>
       </w:r>
     </w:p>
     <w:p>
@@ -8136,7 +8136,7 @@
         <w:pStyle w:val="BodyText"/>
       </w:pPr>
       <w:r>
-        <w:t>Слика 4.3. Service Fabric Explorer — сва четири сервиса здрава ................................... 10</w:t>
+        <w:t>Слика 4.4. Service Fabric Explorer — сва четири сервиса здрава ................................... 10</w:t>
       </w:r>
     </w:p>
     <w:p>
@@ -8144,7 +8144,7 @@
         <w:pStyle w:val="BodyText"/>
       </w:pPr>
       <w:r>
-        <w:t>Слика 5.1. TO-BE архитектура — додат observability слој .......................................... 12</w:t>
+        <w:t>Слика 5.1. TO-BE архитектура — додат observability слој .......................................... 11</w:t>
       </w:r>
     </w:p>
     <w:p>
@@ -8152,7 +8152,7 @@
         <w:pStyle w:val="BodyText"/>
       </w:pPr>
       <w:r>
-        <w:t>Слика 5.2. Одговор /health/ready endpoint-а ...................................................... 13</w:t>
+        <w:t>Слика 5.2. Одговор /health/ready endpoint-а ...................................................... 12</w:t>
       </w:r>
     </w:p>
     <w:p>
@@ -8160,7 +8160,7 @@
         <w:pStyle w:val="BodyText"/>
       </w:pPr>
       <w:r>
-        <w:t>Слика 5.3. Grafana dashboard „Travel Planner - Overview” ......................................... 14</w:t>
+        <w:t>Слика 5.3. Grafana dashboard „Travel Planner - Overview” ......................................... 13</w:t>
       </w:r>
     </w:p>
     <w:p>
@@ -8168,7 +8168,7 @@
         <w:pStyle w:val="BodyText"/>
       </w:pPr>
       <w:r>
-        <w:t>Слика 5.4. Trace Сценарија 1 у Grafana Tempo-у ................................................... 14</w:t>
+        <w:t>Слика 5.4. Trace Сценарија 1 у Grafana Tempo-у ................................................... 13</w:t>
       </w:r>
     </w:p>
     <w:p>
@@ -8176,7 +8176,7 @@
         <w:pStyle w:val="BodyText"/>
       </w:pPr>
       <w:r>
-        <w:t>Слика 6.1. Резултати тестова у Visual Studio Test Explorer-у ..................................... 16</w:t>
+        <w:t>Слика 6.1. Резултати тестова у Visual Studio Test Explorer-у ..................................... 15</w:t>
       </w:r>
     </w:p>
     <w:p>
@@ -8184,7 +8184,7 @@
         <w:pStyle w:val="BodyText"/>
       </w:pPr>
       <w:r>
-        <w:t>Слика 6.2. Неуспешан тест након намерног враћања „тихог” catch блока ............................. 16</w:t>
+        <w:t>Слика 6.2. Неуспешан тест након намерног враћања „тихог” catch блока ............................. 15</w:t>
       </w:r>
     </w:p>
     <w:p>
@@ -8192,7 +8192,7 @@
         <w:pStyle w:val="BodyText"/>
       </w:pPr>
       <w:r>
-        <w:t>Слика 6.3. Лог захтева из Сценарија 1 у Grafana Loki-ју .......................................... 17</w:t>
+        <w:t>Слика 6.3. Лог захтева из Сценарија 1 у Grafana Loki-ју .......................................... 16</w:t>
       </w:r>
     </w:p>
     <w:p>
@@ -8200,7 +8200,7 @@
         <w:pStyle w:val="BodyText"/>
       </w:pPr>
       <w:r>
-        <w:t>Слика 6.4. Резултати k6 load test-а .............................................................. 18</w:t>
+        <w:t>Слика 6.4. Резултати k6 load test-а .............................................................. 17</w:t>
       </w:r>
     </w:p>
     <w:p>
@@ -8265,7 +8265,7 @@
         <w:pStyle w:val="BodyText"/>
       </w:pPr>
       <w:r>
-        <w:t>Табела 6.1. Резултати аутоматизованог тестирања (dotnet test) .................................... 15</w:t>
+        <w:t>Табела 6.1. Резултати аутоматизованог тестирања (dotnet test) .................................... 14</w:t>
       </w:r>
     </w:p>
     <w:p xmlns:wp14="http://schemas.microsoft.com/office/word/2010/wordml" wp14:textId="77777777">
@@ -8273,7 +8273,7 @@
         <w:pStyle w:val="BodyText"/>
       </w:pPr>
       <w:r>
-        <w:t>Табела 6.2. Поређење система пре и после надоградње .............................................. 18</w:t>
+        <w:t>Табела 6.2. Поређење система пре и после надоградње .............................................. 17</w:t>
       </w:r>
     </w:p>
     <w:p>
@@ -8720,6 +8720,1552 @@
       </w:pPr>
       <w:r>
         <w:t>Travel Planner је микросервисна веб апликација за планирање путовања која кориснику омогућава да на једном месту организује план путовања: основне податке о путовању, дестинације, дневне активности (са приказом кроз календар), трошкове и буџет, белешке, подсетнике, checklist/packing листу, као и дељење плана путем кода или QR кода са другим особама. Овај рад се бави имплементацијом обсервабилности над постојећим системом Travel Planner.</w:t>
+      </w:r>
+    </w:p>
+    <w:p xmlns:wp14="http://schemas.microsoft.com/office/word/2010/wordml" wp14:textId="77777777">
+      <w:pPr>
+        <w:pStyle w:val="BodyText"/>
+      </w:pPr>
+      <w:r>
+        <w:t>Систем је реализован као микросервисна архитектура на платформи Microsoft Service Fabric, са четири одвојена сервиса (Gateway, AuthService, TripService, SharingService) и базом података по сервису (database-per-service) у Microsoft SQL Server-у. Оваква архитектура доноси познате предности микросервиса — независно скалирање, одвојен развој и deployment по сервису — али и познат проблем: један корисников захтев често пролази кроз више процеса, база и мрежних позива, па постаје знатно теже одговорити на питања попут „зашто је овај захтев спор?“, „где тачно долази до грешке?“ или „да ли је систем тренутно здрав?“ него код монолитне апликације.</w:t>
+      </w:r>
+    </w:p>
+    <w:p xmlns:wp14="http://schemas.microsoft.com/office/word/2010/wordml" wp14:textId="05DDD3D1">
+      <w:pPr>
+        <w:pStyle w:val="BodyText"/>
+      </w:pPr>
+      <w:r>
+        <w:rPr/>
+        <w:t xml:space="preserve">Тема </w:t>
+      </w:r>
+      <w:r>
+        <w:rPr/>
+        <w:t>овог</w:t>
+      </w:r>
+      <w:r>
+        <w:rPr/>
+        <w:t xml:space="preserve"> </w:t>
+      </w:r>
+      <w:r>
+        <w:rPr/>
+        <w:t>рада</w:t>
+      </w:r>
+      <w:r>
+        <w:rPr/>
+        <w:t xml:space="preserve">, </w:t>
+      </w:r>
+      <w:r>
+        <w:rPr/>
+        <w:t>Имплементација</w:t>
+      </w:r>
+      <w:r>
+        <w:rPr/>
+        <w:t xml:space="preserve"> </w:t>
+      </w:r>
+      <w:r>
+        <w:rPr/>
+        <w:t>о</w:t>
+      </w:r>
+      <w:r>
+        <w:rPr/>
+        <w:t>б</w:t>
+      </w:r>
+      <w:r>
+        <w:rPr/>
+        <w:t>сервабилности</w:t>
+      </w:r>
+      <w:r>
+        <w:rPr/>
+        <w:t xml:space="preserve"> </w:t>
+      </w:r>
+      <w:r>
+        <w:rPr/>
+        <w:t>микросервисне</w:t>
+      </w:r>
+      <w:r>
+        <w:rPr/>
+        <w:t xml:space="preserve"> </w:t>
+      </w:r>
+      <w:r>
+        <w:rPr/>
+        <w:t>архитектуре</w:t>
+      </w:r>
+      <w:r>
+        <w:rPr/>
+        <w:t xml:space="preserve">, </w:t>
+      </w:r>
+      <w:r>
+        <w:rPr/>
+        <w:t>директно</w:t>
+      </w:r>
+      <w:r>
+        <w:rPr/>
+        <w:t xml:space="preserve"> </w:t>
+      </w:r>
+      <w:r>
+        <w:rPr/>
+        <w:t>адресира</w:t>
+      </w:r>
+      <w:r>
+        <w:rPr/>
+        <w:t xml:space="preserve"> </w:t>
+      </w:r>
+      <w:r>
+        <w:rPr/>
+        <w:t>тај</w:t>
+      </w:r>
+      <w:r>
+        <w:rPr/>
+        <w:t xml:space="preserve"> </w:t>
+      </w:r>
+      <w:r>
+        <w:rPr/>
+        <w:t>проблем</w:t>
+      </w:r>
+      <w:r>
+        <w:rPr/>
+        <w:t xml:space="preserve">. Циљ </w:t>
+      </w:r>
+      <w:r>
+        <w:rPr/>
+        <w:t>рада</w:t>
+      </w:r>
+      <w:r>
+        <w:rPr/>
+        <w:t xml:space="preserve"> </w:t>
+      </w:r>
+      <w:r>
+        <w:rPr/>
+        <w:t>није</w:t>
+      </w:r>
+      <w:r>
+        <w:rPr/>
+        <w:t xml:space="preserve"> </w:t>
+      </w:r>
+      <w:r>
+        <w:rPr/>
+        <w:t>да</w:t>
+      </w:r>
+      <w:r>
+        <w:rPr/>
+        <w:t xml:space="preserve"> </w:t>
+      </w:r>
+      <w:r>
+        <w:rPr/>
+        <w:t>мења</w:t>
+      </w:r>
+      <w:r>
+        <w:rPr/>
+        <w:t xml:space="preserve"> </w:t>
+      </w:r>
+      <w:r>
+        <w:rPr/>
+        <w:t>пословну</w:t>
+      </w:r>
+      <w:r>
+        <w:rPr/>
+        <w:t xml:space="preserve"> </w:t>
+      </w:r>
+      <w:r>
+        <w:rPr/>
+        <w:t>логику</w:t>
+      </w:r>
+      <w:r>
+        <w:rPr/>
+        <w:t xml:space="preserve"> </w:t>
+      </w:r>
+      <w:r>
+        <w:rPr/>
+        <w:t>постојећег</w:t>
+      </w:r>
+      <w:r>
+        <w:rPr/>
+        <w:t xml:space="preserve"> </w:t>
+      </w:r>
+      <w:r>
+        <w:rPr/>
+        <w:t>система</w:t>
+      </w:r>
+      <w:r>
+        <w:rPr/>
+        <w:t xml:space="preserve"> (</w:t>
+      </w:r>
+      <w:r>
+        <w:rPr/>
+        <w:t>планове</w:t>
+      </w:r>
+      <w:r>
+        <w:rPr/>
+        <w:t xml:space="preserve">, </w:t>
+      </w:r>
+      <w:r>
+        <w:rPr/>
+        <w:t>дестинације</w:t>
+      </w:r>
+      <w:r>
+        <w:rPr/>
+        <w:t xml:space="preserve">, </w:t>
+      </w:r>
+      <w:r>
+        <w:rPr/>
+        <w:t>трошкове</w:t>
+      </w:r>
+      <w:r>
+        <w:rPr/>
+        <w:t xml:space="preserve">), </w:t>
+      </w:r>
+      <w:r>
+        <w:rPr/>
+        <w:t>већ</w:t>
+      </w:r>
+      <w:r>
+        <w:rPr/>
+        <w:t xml:space="preserve"> </w:t>
+      </w:r>
+      <w:r>
+        <w:rPr/>
+        <w:t>да</w:t>
+      </w:r>
+      <w:r>
+        <w:rPr/>
+        <w:t xml:space="preserve"> </w:t>
+      </w:r>
+      <w:r>
+        <w:rPr/>
+        <w:t>га</w:t>
+      </w:r>
+      <w:r>
+        <w:rPr/>
+        <w:t xml:space="preserve"> </w:t>
+      </w:r>
+      <w:r>
+        <w:rPr/>
+        <w:t>надогради</w:t>
+      </w:r>
+      <w:r>
+        <w:rPr/>
+        <w:t xml:space="preserve"> </w:t>
+      </w:r>
+      <w:r>
+        <w:rPr/>
+        <w:t>слојем</w:t>
+      </w:r>
+      <w:r>
+        <w:rPr/>
+        <w:t xml:space="preserve"> </w:t>
+      </w:r>
+      <w:r>
+        <w:rPr/>
+        <w:t>о</w:t>
+      </w:r>
+      <w:r>
+        <w:rPr/>
+        <w:t>б</w:t>
+      </w:r>
+      <w:r>
+        <w:rPr/>
+        <w:t>сервабилности</w:t>
+      </w:r>
+      <w:r>
+        <w:rPr/>
+        <w:t xml:space="preserve"> </w:t>
+      </w:r>
+      <w:r>
+        <w:rPr/>
+        <w:t>заснованим</w:t>
+      </w:r>
+      <w:r>
+        <w:rPr/>
+        <w:t xml:space="preserve"> </w:t>
+      </w:r>
+      <w:r>
+        <w:rPr/>
+        <w:t>на</w:t>
+      </w:r>
+      <w:r>
+        <w:rPr/>
+        <w:t xml:space="preserve"> </w:t>
+      </w:r>
+      <w:r>
+        <w:rPr/>
+        <w:t>индустријском</w:t>
+      </w:r>
+      <w:r>
+        <w:rPr/>
+        <w:t xml:space="preserve"> </w:t>
+      </w:r>
+      <w:r>
+        <w:rPr/>
+        <w:t>стандарду</w:t>
+      </w:r>
+      <w:r>
+        <w:rPr/>
+        <w:t xml:space="preserve"> </w:t>
+      </w:r>
+      <w:r>
+        <w:rPr/>
+        <w:t>OpenTelemetry</w:t>
+      </w:r>
+      <w:r>
+        <w:rPr/>
+        <w:t xml:space="preserve"> — </w:t>
+      </w:r>
+      <w:r>
+        <w:rPr/>
+        <w:t>дистрибуирано</w:t>
+      </w:r>
+      <w:r>
+        <w:rPr/>
+        <w:t xml:space="preserve"> </w:t>
+      </w:r>
+      <w:r>
+        <w:rPr/>
+        <w:t>праћење</w:t>
+      </w:r>
+      <w:r>
+        <w:rPr/>
+        <w:t xml:space="preserve"> </w:t>
+      </w:r>
+      <w:r>
+        <w:rPr/>
+        <w:t>захтева</w:t>
+      </w:r>
+      <w:r>
+        <w:rPr/>
+        <w:t xml:space="preserve"> (distributed tracing), </w:t>
+      </w:r>
+      <w:r>
+        <w:rPr/>
+        <w:t>структурисано</w:t>
+      </w:r>
+      <w:r>
+        <w:rPr/>
+        <w:t xml:space="preserve"> </w:t>
+      </w:r>
+      <w:r>
+        <w:rPr/>
+        <w:t>логовање</w:t>
+      </w:r>
+      <w:r>
+        <w:rPr/>
+        <w:t xml:space="preserve">, </w:t>
+      </w:r>
+      <w:r>
+        <w:rPr/>
+        <w:t>метрике</w:t>
+      </w:r>
+      <w:r>
+        <w:rPr/>
+        <w:t xml:space="preserve"> </w:t>
+      </w:r>
+      <w:r>
+        <w:rPr/>
+        <w:t>перформанси</w:t>
+      </w:r>
+      <w:r>
+        <w:rPr/>
+        <w:t xml:space="preserve"> и health check </w:t>
+      </w:r>
+      <w:r>
+        <w:rPr/>
+        <w:t>механизме</w:t>
+      </w:r>
+      <w:r>
+        <w:rPr/>
+        <w:t xml:space="preserve"> — и </w:t>
+      </w:r>
+      <w:r>
+        <w:rPr/>
+        <w:t>да</w:t>
+      </w:r>
+      <w:r>
+        <w:rPr/>
+        <w:t xml:space="preserve"> </w:t>
+      </w:r>
+      <w:r>
+        <w:rPr/>
+        <w:t>ту</w:t>
+      </w:r>
+      <w:r>
+        <w:rPr/>
+        <w:t xml:space="preserve"> </w:t>
+      </w:r>
+      <w:r>
+        <w:rPr/>
+        <w:t>надоградњу</w:t>
+      </w:r>
+      <w:r>
+        <w:rPr/>
+        <w:t xml:space="preserve"> </w:t>
+      </w:r>
+      <w:r>
+        <w:rPr/>
+        <w:t>докаже</w:t>
+      </w:r>
+      <w:r>
+        <w:rPr/>
+        <w:t xml:space="preserve"> </w:t>
+      </w:r>
+      <w:r>
+        <w:rPr/>
+        <w:t>кроз</w:t>
+      </w:r>
+      <w:r>
+        <w:rPr/>
+        <w:t xml:space="preserve"> </w:t>
+      </w:r>
+      <w:r>
+        <w:rPr/>
+        <w:t>стварно</w:t>
+      </w:r>
+      <w:r>
+        <w:rPr/>
+        <w:t xml:space="preserve"> </w:t>
+      </w:r>
+      <w:r>
+        <w:rPr/>
+        <w:t>извршавање</w:t>
+      </w:r>
+      <w:r>
+        <w:rPr/>
+        <w:t xml:space="preserve">, </w:t>
+      </w:r>
+      <w:r>
+        <w:rPr/>
+        <w:t>аутоматизоване</w:t>
+      </w:r>
+      <w:r>
+        <w:rPr/>
+        <w:t xml:space="preserve"> </w:t>
+      </w:r>
+      <w:r>
+        <w:rPr/>
+        <w:t>тестове</w:t>
+      </w:r>
+      <w:r>
+        <w:rPr/>
+        <w:t xml:space="preserve"> и </w:t>
+      </w:r>
+      <w:r>
+        <w:rPr/>
+        <w:t>мерљиве</w:t>
+      </w:r>
+      <w:r>
+        <w:rPr/>
+        <w:t xml:space="preserve"> </w:t>
+      </w:r>
+      <w:r>
+        <w:rPr/>
+        <w:t>резултате</w:t>
+      </w:r>
+      <w:r>
+        <w:rPr/>
+        <w:t xml:space="preserve">, а </w:t>
+      </w:r>
+      <w:r>
+        <w:rPr/>
+        <w:t>не</w:t>
+      </w:r>
+      <w:r>
+        <w:rPr/>
+        <w:t xml:space="preserve"> </w:t>
+      </w:r>
+      <w:r>
+        <w:rPr/>
+        <w:t>само</w:t>
+      </w:r>
+      <w:r>
+        <w:rPr/>
+        <w:t xml:space="preserve"> </w:t>
+      </w:r>
+      <w:r>
+        <w:rPr/>
+        <w:t>кроз</w:t>
+      </w:r>
+      <w:r>
+        <w:rPr/>
+        <w:t xml:space="preserve"> </w:t>
+      </w:r>
+      <w:r>
+        <w:rPr/>
+        <w:t>инсталацију</w:t>
+      </w:r>
+      <w:r>
+        <w:rPr/>
+        <w:t xml:space="preserve"> </w:t>
+      </w:r>
+      <w:r>
+        <w:rPr/>
+        <w:t>алата</w:t>
+      </w:r>
+      <w:r>
+        <w:rPr/>
+        <w:t>.</w:t>
+      </w:r>
+    </w:p>
+    <w:p xmlns:wp14="http://schemas.microsoft.com/office/word/2010/wordml" wp14:textId="77777777">
+      <w:pPr>
+        <w:pStyle w:val="BodyText"/>
+      </w:pPr>
+      <w:r>
+        <w:t>Рад је организован тако да прво анализира постојеће стање система (поглавља 2-4), затим детаљно описује предложено и имплементирано решење (поглавље 5), верификује га кроз тестирање и демонстрационе сценарије над стварно постављеним системом (поглавље 6), и на крају сумира постигнуте резултате, ограничења и правце даљег развоја (поглавље 7).</w:t>
+      </w:r>
+    </w:p>
+    <w:p>
+      <w:pPr>
+        <w:pStyle w:val="text"/>
+        <w:rPr>
+          <w:lang w:val="sr-Cyrl-RS"/>
+        </w:rPr>
+      </w:pPr>
+    </w:p>
+    <w:p>
+      <w:pPr>
+        <w:pStyle w:val="text"/>
+        <w:ind w:left="0"/>
+      </w:pPr>
+    </w:p>
+    <w:p>
+      <w:pPr>
+        <w:pStyle w:val="Heading1"/>
+        <w:rPr>
+          <w:lang w:val="sr-Cyrl-RS"/>
+        </w:rPr>
+      </w:pPr>
+      <w:bookmarkStart w:name="_Toc776203058" w:id="968689803"/>
+      <w:r>
+        <w:rPr>
+          <w:lang w:val="sr-Cyrl-RS"/>
+        </w:rPr>
+        <w:t>Опис проблема</w:t>
+      </w:r>
+      <w:bookmarkEnd w:id="968689803"/>
+    </w:p>
+    <w:p xmlns:wp14="http://schemas.microsoft.com/office/word/2010/wordml" wp14:textId="0AA179DA">
+      <w:pPr>
+        <w:pStyle w:val="BodyText"/>
+      </w:pPr>
+      <w:r>
+        <w:rPr/>
+        <w:t xml:space="preserve">Анализа </w:t>
+      </w:r>
+      <w:r>
+        <w:rPr/>
+        <w:t>постојећег</w:t>
+      </w:r>
+      <w:r>
+        <w:rPr/>
+        <w:t xml:space="preserve"> </w:t>
+      </w:r>
+      <w:r>
+        <w:rPr/>
+        <w:t>система</w:t>
+      </w:r>
+      <w:r>
+        <w:rPr/>
+        <w:t xml:space="preserve"> (</w:t>
+      </w:r>
+      <w:r>
+        <w:rPr/>
+        <w:t>детаљно</w:t>
+      </w:r>
+      <w:r>
+        <w:rPr/>
+        <w:t xml:space="preserve"> </w:t>
+      </w:r>
+      <w:r>
+        <w:rPr/>
+        <w:t>описаног</w:t>
+      </w:r>
+      <w:r>
+        <w:rPr/>
+        <w:t xml:space="preserve"> у </w:t>
+      </w:r>
+      <w:r>
+        <w:rPr/>
+        <w:t>поглављу</w:t>
+      </w:r>
+      <w:r>
+        <w:rPr/>
+        <w:t xml:space="preserve"> 4) </w:t>
+      </w:r>
+      <w:r>
+        <w:rPr/>
+        <w:t>показала</w:t>
+      </w:r>
+      <w:r>
+        <w:rPr/>
+        <w:t xml:space="preserve"> </w:t>
+      </w:r>
+      <w:r>
+        <w:rPr/>
+        <w:t>је</w:t>
+      </w:r>
+      <w:r>
+        <w:rPr/>
+        <w:t xml:space="preserve"> </w:t>
+      </w:r>
+      <w:r>
+        <w:rPr/>
+        <w:t>да</w:t>
+      </w:r>
+      <w:r>
+        <w:rPr/>
+        <w:t xml:space="preserve"> Travel Planner, </w:t>
+      </w:r>
+      <w:r>
+        <w:rPr/>
+        <w:t>иако</w:t>
+      </w:r>
+      <w:r>
+        <w:rPr/>
+        <w:t xml:space="preserve"> </w:t>
+      </w:r>
+      <w:r>
+        <w:rPr/>
+        <w:t>функционално</w:t>
+      </w:r>
+      <w:r>
+        <w:rPr/>
+        <w:t xml:space="preserve"> </w:t>
+      </w:r>
+      <w:r>
+        <w:rPr/>
+        <w:t>комплетан</w:t>
+      </w:r>
+      <w:r>
+        <w:rPr/>
+        <w:t xml:space="preserve"> и </w:t>
+      </w:r>
+      <w:r>
+        <w:rPr/>
+        <w:t>добро</w:t>
+      </w:r>
+      <w:r>
+        <w:rPr/>
+        <w:t xml:space="preserve"> </w:t>
+      </w:r>
+      <w:r>
+        <w:rPr/>
+        <w:t>структурисан</w:t>
+      </w:r>
+      <w:r>
+        <w:rPr/>
+        <w:t xml:space="preserve"> у </w:t>
+      </w:r>
+      <w:r>
+        <w:rPr/>
+        <w:t>погледу</w:t>
+      </w:r>
+      <w:r>
+        <w:rPr/>
+        <w:t xml:space="preserve"> </w:t>
+      </w:r>
+      <w:r>
+        <w:rPr/>
+        <w:t>поделе</w:t>
+      </w:r>
+      <w:r>
+        <w:rPr/>
+        <w:t xml:space="preserve"> </w:t>
+      </w:r>
+      <w:r>
+        <w:rPr/>
+        <w:t>одговорности</w:t>
+      </w:r>
+      <w:r>
+        <w:rPr/>
+        <w:t xml:space="preserve"> </w:t>
+      </w:r>
+      <w:r>
+        <w:rPr/>
+        <w:t>између</w:t>
+      </w:r>
+      <w:r>
+        <w:rPr/>
+        <w:t xml:space="preserve"> </w:t>
+      </w:r>
+      <w:r>
+        <w:rPr/>
+        <w:t>сервиса</w:t>
+      </w:r>
+      <w:r>
+        <w:rPr/>
+        <w:t xml:space="preserve">, </w:t>
+      </w:r>
+      <w:r>
+        <w:rPr/>
+        <w:t>нема</w:t>
+      </w:r>
+      <w:r>
+        <w:rPr/>
+        <w:t xml:space="preserve"> </w:t>
+      </w:r>
+      <w:r>
+        <w:rPr/>
+        <w:t>ниједан</w:t>
+      </w:r>
+      <w:r>
+        <w:rPr/>
+        <w:t xml:space="preserve"> </w:t>
+      </w:r>
+      <w:r>
+        <w:rPr/>
+        <w:t>механизам</w:t>
+      </w:r>
+      <w:r>
+        <w:rPr/>
+        <w:t xml:space="preserve"> </w:t>
+      </w:r>
+      <w:r>
+        <w:rPr/>
+        <w:t>о</w:t>
+      </w:r>
+      <w:r>
+        <w:rPr/>
+        <w:t>б</w:t>
+      </w:r>
+      <w:r>
+        <w:rPr/>
+        <w:t>сервабилности</w:t>
+      </w:r>
+      <w:r>
+        <w:rPr/>
+        <w:t xml:space="preserve"> </w:t>
+      </w:r>
+      <w:r>
+        <w:rPr/>
+        <w:t>изнад</w:t>
+      </w:r>
+      <w:r>
+        <w:rPr/>
+        <w:t xml:space="preserve"> </w:t>
+      </w:r>
+      <w:r>
+        <w:rPr/>
+        <w:t>апсолутног</w:t>
+      </w:r>
+      <w:r>
+        <w:rPr/>
+        <w:t xml:space="preserve"> </w:t>
+      </w:r>
+      <w:r>
+        <w:rPr/>
+        <w:t>минимума</w:t>
+      </w:r>
+      <w:r>
+        <w:rPr/>
+        <w:t xml:space="preserve"> </w:t>
+      </w:r>
+      <w:r>
+        <w:rPr/>
+        <w:t>који</w:t>
+      </w:r>
+      <w:r>
+        <w:rPr/>
+        <w:t xml:space="preserve"> </w:t>
+      </w:r>
+      <w:r>
+        <w:rPr/>
+        <w:t>сам</w:t>
+      </w:r>
+      <w:r>
+        <w:rPr/>
+        <w:t xml:space="preserve"> ASP.NET Core </w:t>
+      </w:r>
+      <w:r>
+        <w:rPr/>
+        <w:t>оквир</w:t>
+      </w:r>
+      <w:r>
+        <w:rPr/>
+        <w:t xml:space="preserve"> </w:t>
+      </w:r>
+      <w:r>
+        <w:rPr/>
+        <w:t>пружа</w:t>
+      </w:r>
+      <w:r>
+        <w:rPr/>
+        <w:t xml:space="preserve"> </w:t>
+      </w:r>
+      <w:r>
+        <w:rPr/>
+        <w:t>подразумевано</w:t>
+      </w:r>
+      <w:r>
+        <w:rPr/>
+        <w:t xml:space="preserve">. </w:t>
+      </w:r>
+      <w:r>
+        <w:rPr/>
+        <w:t>Конкретно</w:t>
+      </w:r>
+      <w:r>
+        <w:rPr/>
+        <w:t xml:space="preserve">, </w:t>
+      </w:r>
+      <w:r>
+        <w:rPr/>
+        <w:t>идентификовани</w:t>
+      </w:r>
+      <w:r>
+        <w:rPr/>
+        <w:t xml:space="preserve"> </w:t>
+      </w:r>
+      <w:r>
+        <w:rPr/>
+        <w:t>су</w:t>
+      </w:r>
+      <w:r>
+        <w:rPr/>
+        <w:t xml:space="preserve"> </w:t>
+      </w:r>
+      <w:r>
+        <w:rPr/>
+        <w:t>следећи</w:t>
+      </w:r>
+      <w:r>
+        <w:rPr/>
+        <w:t xml:space="preserve"> </w:t>
+      </w:r>
+      <w:r>
+        <w:rPr/>
+        <w:t>проблеми</w:t>
+      </w:r>
+      <w:r>
+        <w:rPr/>
+        <w:t>:</w:t>
+      </w:r>
+    </w:p>
+    <w:p xmlns:wp14="http://schemas.microsoft.com/office/word/2010/wordml" wp14:textId="77777777">
+      <w:pPr>
+        <w:pStyle w:val="Heading2"/>
+      </w:pPr>
+      <w:r>
+        <w:t>Немогуће праћење захтева кроз више сервиса</w:t>
+      </w:r>
+    </w:p>
+    <w:p xmlns:wp14="http://schemas.microsoft.com/office/word/2010/wordml" wp14:textId="77777777">
+      <w:pPr>
+        <w:pStyle w:val="BodyText"/>
+      </w:pPr>
+      <w:r>
+        <w:t>Захтев корисника типично пролази кроз ланац Frontend → Gateway → сервис (нпр. AuthService), а поједини токови иду и даље, сервис-сервис (нпр. SharingService → TripService приликом разрешавања дељеног плана). Не постоји ниједан идентификатор (correlation/trace ID) који би повезао логове настале у различитим процесима за исти кориснички захтев. Ако захтев успори или падне негде у ланцу, једини начин да се проблем лоцира био би ручно упоређивање временских печата логова из различитих сервиса — непоуздано и споро.</w:t>
+      </w:r>
+    </w:p>
+    <w:p xmlns:wp14="http://schemas.microsoft.com/office/word/2010/wordml" wp14:textId="77777777">
+      <w:pPr>
+        <w:pStyle w:val="Heading2"/>
+      </w:pPr>
+      <w:r>
+        <w:t>Одсуство метрика перформанси</w:t>
+      </w:r>
+    </w:p>
+    <w:p xmlns:wp14="http://schemas.microsoft.com/office/word/2010/wordml" wp14:textId="77777777">
+      <w:pPr>
+        <w:pStyle w:val="BodyText"/>
+      </w:pPr>
+      <w:r>
+        <w:t>Ниједан сервис не излаже метрике броја захтева, латенције, стопе грешака нити искоришћења ресурса (CPU, меморија). Пад перформанси (нпр. спор упит ка бази) остао би потпуно невидљив док се корисници директно не пожале.</w:t>
+      </w:r>
+    </w:p>
+    <w:p xmlns:wp14="http://schemas.microsoft.com/office/word/2010/wordml" wp14:textId="77777777">
+      <w:pPr>
+        <w:pStyle w:val="Heading2"/>
+      </w:pPr>
+      <w:r>
+        <w:t>Тихе грешке</w:t>
+      </w:r>
+    </w:p>
+    <w:p xmlns:wp14="http://schemas.microsoft.com/office/word/2010/wordml" wp14:textId="77777777">
+      <w:pPr>
+        <w:pStyle w:val="BodyText"/>
+      </w:pPr>
+      <w:r>
+        <w:t>У коду постоје примери у којима се грешка ухвати (try/catch) и обради без иједног трага у логу. Конкретан пример: AuthService/Services/TripClient.cs, метода DeleteUserTripsAsync — при брисању корисничког налога позива се TripService да обрише све планове тог корисника; ако тај позив не успе (сервис недоступан, мрежни проблем), изворни код је само враћао false, без иједног записа у логу. Систем би остао недоследан (обрисан налог, а планови и даље постоје у бази), без иједног трага зашто.</w:t>
+      </w:r>
+    </w:p>
+    <w:p xmlns:wp14="http://schemas.microsoft.com/office/word/2010/wordml" wp14:textId="77777777">
+      <w:pPr>
+        <w:pStyle w:val="Heading2"/>
+      </w:pPr>
+      <w:r>
+        <w:t>Одсуство health check механизама</w:t>
+      </w:r>
+    </w:p>
+    <w:p xmlns:wp14="http://schemas.microsoft.com/office/word/2010/wordml" wp14:textId="77777777">
+      <w:pPr>
+        <w:pStyle w:val="BodyText"/>
+      </w:pPr>
+      <w:r>
+        <w:t>Ниједан сервис не излаже endpoint преко ког би се споља (оркестрација, monitoring алат, човек) проверило да ли сервис стварно ради и да ли су његове зависности (база, други сервиси) доступне. Service Fabric поседује сопствени интерни health модел, али му се health стање апликационог нивоа (нпр. „да ли TripService може да се повеже на своју базу“) никада не пријављује.</w:t>
+      </w:r>
+    </w:p>
+    <w:p xmlns:wp14="http://schemas.microsoft.com/office/word/2010/wordml" wp14:textId="77777777">
+      <w:pPr>
+        <w:pStyle w:val="Heading2"/>
+      </w:pPr>
+      <w:r>
+        <w:t>Нестандардизовано, минимално логовање</w:t>
+      </w:r>
+    </w:p>
+    <w:p xmlns:wp14="http://schemas.microsoft.com/office/word/2010/wordml" wp14:textId="77777777">
+      <w:pPr>
+        <w:pStyle w:val="BodyText"/>
+      </w:pPr>
+      <w:r>
+        <w:t>Свака appsettings.json конфигурација дефинише ниво логовања (Information/Warning), али у пракси се у коду скоро нигде не позива ILogger — grep кроз цео backend је показао 0 позива ILogger/_logger пре овог рада. Постојећи Service Fabric ETW ServiceEventSource механизам користи се искључиво за lifecycle догађаје (покретање Kestrel-а, регистрација сервисног типа), не за токове пословне логике.</w:t>
+      </w:r>
+    </w:p>
+    <w:p xmlns:wp14="http://schemas.microsoft.com/office/word/2010/wordml" wp14:textId="31CA7907">
+      <w:pPr>
+        <w:pStyle w:val="BodyText"/>
+      </w:pPr>
+      <w:r>
+        <w:rPr/>
+        <w:t xml:space="preserve">Ови </w:t>
+      </w:r>
+      <w:r>
+        <w:rPr/>
+        <w:t>проблеми</w:t>
+      </w:r>
+      <w:r>
+        <w:rPr/>
+        <w:t xml:space="preserve"> </w:t>
+      </w:r>
+      <w:r>
+        <w:rPr/>
+        <w:t>су</w:t>
+      </w:r>
+      <w:r>
+        <w:rPr/>
+        <w:t xml:space="preserve"> </w:t>
+      </w:r>
+      <w:r>
+        <w:rPr/>
+        <w:t>директно</w:t>
+      </w:r>
+      <w:r>
+        <w:rPr/>
+        <w:t xml:space="preserve"> </w:t>
+      </w:r>
+      <w:r>
+        <w:rPr/>
+        <w:t>повезани</w:t>
+      </w:r>
+      <w:r>
+        <w:rPr/>
+        <w:t xml:space="preserve"> — </w:t>
+      </w:r>
+      <w:r>
+        <w:rPr/>
+        <w:t>сви</w:t>
+      </w:r>
+      <w:r>
+        <w:rPr/>
+        <w:t xml:space="preserve"> </w:t>
+      </w:r>
+      <w:r>
+        <w:rPr/>
+        <w:t>произилазе</w:t>
+      </w:r>
+      <w:r>
+        <w:rPr/>
+        <w:t xml:space="preserve"> </w:t>
+      </w:r>
+      <w:r>
+        <w:rPr/>
+        <w:t>из</w:t>
+      </w:r>
+      <w:r>
+        <w:rPr/>
+        <w:t xml:space="preserve"> </w:t>
+      </w:r>
+      <w:r>
+        <w:rPr/>
+        <w:t>недостатка</w:t>
+      </w:r>
+      <w:r>
+        <w:rPr/>
+        <w:t xml:space="preserve"> </w:t>
+      </w:r>
+      <w:r>
+        <w:rPr/>
+        <w:t>јединственог</w:t>
+      </w:r>
+      <w:r>
+        <w:rPr/>
+        <w:t xml:space="preserve">, </w:t>
+      </w:r>
+      <w:r>
+        <w:rPr/>
+        <w:t>стандардизованог</w:t>
+      </w:r>
+      <w:r>
+        <w:rPr/>
+        <w:t xml:space="preserve"> </w:t>
+      </w:r>
+      <w:r>
+        <w:rPr/>
+        <w:t>слоја</w:t>
+      </w:r>
+      <w:r>
+        <w:rPr/>
+        <w:t xml:space="preserve"> </w:t>
+      </w:r>
+      <w:r>
+        <w:rPr/>
+        <w:t>о</w:t>
+      </w:r>
+      <w:r>
+        <w:rPr/>
+        <w:t>б</w:t>
+      </w:r>
+      <w:r>
+        <w:rPr/>
+        <w:t>сервабилности</w:t>
+      </w:r>
+      <w:r>
+        <w:rPr/>
+        <w:t xml:space="preserve">, а </w:t>
+      </w:r>
+      <w:r>
+        <w:rPr/>
+        <w:t>не</w:t>
+      </w:r>
+      <w:r>
+        <w:rPr/>
+        <w:t xml:space="preserve"> </w:t>
+      </w:r>
+      <w:r>
+        <w:rPr/>
+        <w:t>из</w:t>
+      </w:r>
+      <w:r>
+        <w:rPr/>
+        <w:t xml:space="preserve"> </w:t>
+      </w:r>
+      <w:r>
+        <w:rPr/>
+        <w:t>појединачних</w:t>
+      </w:r>
+      <w:r>
+        <w:rPr/>
+        <w:t xml:space="preserve">, </w:t>
+      </w:r>
+      <w:r>
+        <w:rPr/>
+        <w:t>изолованих</w:t>
+      </w:r>
+      <w:r>
+        <w:rPr/>
+        <w:t xml:space="preserve"> </w:t>
+      </w:r>
+      <w:r>
+        <w:rPr/>
+        <w:t>пропуста</w:t>
+      </w:r>
+      <w:r>
+        <w:rPr/>
+        <w:t xml:space="preserve">. </w:t>
+      </w:r>
+      <w:r>
+        <w:rPr/>
+        <w:t>То</w:t>
+      </w:r>
+      <w:r>
+        <w:rPr/>
+        <w:t xml:space="preserve"> </w:t>
+      </w:r>
+      <w:r>
+        <w:rPr/>
+        <w:t>је</w:t>
+      </w:r>
+      <w:r>
+        <w:rPr/>
+        <w:t xml:space="preserve"> </w:t>
+      </w:r>
+      <w:r>
+        <w:rPr/>
+        <w:t>управо</w:t>
+      </w:r>
+      <w:r>
+        <w:rPr/>
+        <w:t xml:space="preserve"> </w:t>
+      </w:r>
+      <w:r>
+        <w:rPr/>
+        <w:t>разлог</w:t>
+      </w:r>
+      <w:r>
+        <w:rPr/>
+        <w:t xml:space="preserve"> </w:t>
+      </w:r>
+      <w:r>
+        <w:rPr/>
+        <w:t>зашто</w:t>
+      </w:r>
+      <w:r>
+        <w:rPr/>
+        <w:t xml:space="preserve"> </w:t>
+      </w:r>
+      <w:r>
+        <w:rPr/>
+        <w:t>је</w:t>
+      </w:r>
+      <w:r>
+        <w:rPr/>
+        <w:t xml:space="preserve"> </w:t>
+      </w:r>
+      <w:r>
+        <w:rPr/>
+        <w:t>предложено</w:t>
+      </w:r>
+      <w:r>
+        <w:rPr/>
+        <w:t xml:space="preserve"> </w:t>
+      </w:r>
+      <w:r>
+        <w:rPr/>
+        <w:t>решење</w:t>
+      </w:r>
+      <w:r>
+        <w:rPr/>
+        <w:t xml:space="preserve"> (</w:t>
+      </w:r>
+      <w:r>
+        <w:rPr/>
+        <w:t>поглавље</w:t>
+      </w:r>
+      <w:r>
+        <w:rPr/>
+        <w:t xml:space="preserve"> 5) </w:t>
+      </w:r>
+      <w:r>
+        <w:rPr/>
+        <w:t>целовит</w:t>
+      </w:r>
+      <w:r>
+        <w:rPr/>
+        <w:t xml:space="preserve"> </w:t>
+      </w:r>
+      <w:r>
+        <w:rPr/>
+        <w:t>слој</w:t>
+      </w:r>
+      <w:r>
+        <w:rPr/>
+        <w:t xml:space="preserve"> </w:t>
+      </w:r>
+      <w:r>
+        <w:rPr/>
+        <w:t>заснован</w:t>
+      </w:r>
+      <w:r>
+        <w:rPr/>
+        <w:t xml:space="preserve"> </w:t>
+      </w:r>
+      <w:r>
+        <w:rPr/>
+        <w:t>на</w:t>
+      </w:r>
+      <w:r>
+        <w:rPr/>
+        <w:t xml:space="preserve"> </w:t>
+      </w:r>
+      <w:r>
+        <w:rPr/>
+        <w:t>једном</w:t>
+      </w:r>
+      <w:r>
+        <w:rPr/>
+        <w:t xml:space="preserve"> </w:t>
+      </w:r>
+      <w:r>
+        <w:rPr/>
+        <w:t>стандарду</w:t>
+      </w:r>
+      <w:r>
+        <w:rPr/>
+        <w:t xml:space="preserve"> (</w:t>
+      </w:r>
+      <w:r>
+        <w:rPr/>
+        <w:t>OpenTelemetry</w:t>
+      </w:r>
+      <w:r>
+        <w:rPr/>
+        <w:t xml:space="preserve">), а </w:t>
+      </w:r>
+      <w:r>
+        <w:rPr/>
+        <w:t>не</w:t>
+      </w:r>
+      <w:r>
+        <w:rPr/>
+        <w:t xml:space="preserve"> </w:t>
+      </w:r>
+      <w:r>
+        <w:rPr/>
+        <w:t>низ</w:t>
+      </w:r>
+      <w:r>
+        <w:rPr/>
+        <w:t xml:space="preserve"> ad-hoc </w:t>
+      </w:r>
+      <w:r>
+        <w:rPr/>
+        <w:t>закрпа</w:t>
+      </w:r>
+      <w:r>
+        <w:rPr/>
+        <w:t>.</w:t>
+      </w:r>
+    </w:p>
+    <w:p>
+      <w:pPr>
+        <w:pStyle w:val="Heading1"/>
+        <w:rPr>
+          <w:lang w:val="sr-Cyrl-RS"/>
+        </w:rPr>
+      </w:pPr>
+      <w:bookmarkStart w:name="_Toc1823417154" w:id="531594970"/>
+      <w:r>
+        <w:rPr/>
+        <w:t>Опис</w:t>
+      </w:r>
+      <w:r>
+        <w:rPr/>
+        <w:t xml:space="preserve"> </w:t>
+      </w:r>
+      <w:r>
+        <w:rPr/>
+        <w:t>коришћених</w:t>
+      </w:r>
+      <w:r>
+        <w:rPr/>
+        <w:t xml:space="preserve"> </w:t>
+      </w:r>
+      <w:r>
+        <w:rPr/>
+        <w:t>технологија</w:t>
+      </w:r>
+      <w:r>
+        <w:rPr>
+          <w:lang w:val="sr-Cyrl-RS"/>
+        </w:rPr>
+        <w:t xml:space="preserve"> и</w:t>
+      </w:r>
+      <w:r>
+        <w:rPr/>
+        <w:t xml:space="preserve"> </w:t>
+      </w:r>
+      <w:r>
+        <w:rPr>
+          <w:lang w:val="sr-Cyrl-RS"/>
+        </w:rPr>
+        <w:t>алата</w:t>
+      </w:r>
+      <w:bookmarkEnd w:id="531594970"/>
+    </w:p>
+    <w:p xmlns:wp14="http://schemas.microsoft.com/office/word/2010/wordml" wp14:textId="77777777">
+      <w:pPr>
+        <w:pStyle w:val="Heading2"/>
+      </w:pPr>
+      <w:r>
+        <w:t>Постојеће технологије (backend/frontend)</w:t>
+      </w:r>
+    </w:p>
+    <w:p xmlns:wp14="http://schemas.microsoft.com/office/word/2010/wordml" wp14:textId="77777777">
+      <w:pPr>
+        <w:pStyle w:val="BodyText"/>
+      </w:pPr>
+      <w:r>
+        <w:t>Backend четири сервиса (Gateway, AuthService, TripService, SharingService) реализован је у C#/.NET 8, хостован на Microsoft Service Fabric платформи [3] (stateless сервиси за Gateway/AuthService/TripService, stateful за SharingService), уз Entity Framework Core 8 за приступ подацима, YARP (Yet Another Reverse Proxy) [4] за Gateway рутирање, BCrypt.Net за хеширање лозинки и JWT Bearer аутентикацију. Подаци се чувају у Microsoft SQL Server бази, по принципу database-per-service (UsersDB, TripsDB, SharingDB). Frontend је React 19 (Vite) апликација која комуницира искључиво преко Gateway-а.</w:t>
+      </w:r>
+    </w:p>
+    <w:p>
+      <w:pPr>
+        <w:pStyle w:val="BodyText"/>
+      </w:pPr>
+      <w:r>
+        <w:t>У контексту Service Fabric платформе, stateless сервис не чува стање између позива на самом чвору — сваки захтев се може опслужити било којом инстанцом, а трајно стање се чува искључиво у спољној бази (SQL Server). Stateful сервис, насупрот томе, поседује локално, реплицирано стање непосредно на Service Fabric чворовима (Reliable Collections), поред спољне базе — тако да поједини подаци могу да се читају без мрежног позива ка бази. У овом пројекту, три сервиса (Gateway, AuthService, TripService) су stateless, док је SharingService stateful — детаљније објашњено у поглављу 4.</w:t>
+      </w:r>
+    </w:p>
+    <w:p xmlns:wp14="http://schemas.microsoft.com/office/word/2010/wordml" wp14:textId="77777777">
+      <w:pPr>
+        <w:pStyle w:val="Heading2"/>
+      </w:pPr>
+      <w:r>
+        <w:t>OpenTelemetry</w:t>
+      </w:r>
+    </w:p>
+    <w:p xmlns:wp14="http://schemas.microsoft.com/office/word/2010/wordml" wp14:textId="77777777">
+      <w:pPr>
+        <w:pStyle w:val="BodyText"/>
+      </w:pPr>
+      <w:r>
+        <w:t>OpenTelemetry (OTel) изабран је као централни стандард надоградње јер обједињује сва три облика телеметрије (traces, metrics, logs) под једним, vendor-неутралним API-јем и SDK-ом [1], са великим бројем готових ("auto") инструментација управо за технологије које пројекат већ користи — ASP.NET Core, HttpClient, SqlClient — тако да се велик део вредности добија без писања сопственог инструментационог кода. Верзија OpenTelemetry .NET SDK-а коришћена у раду је 1.18.0, конзистентна кроз сва четири сервиса.</w:t>
+      </w:r>
+    </w:p>
+    <w:p>
+      <w:pPr>
+        <w:pStyle w:val="BodyText"/>
+      </w:pPr>
+      <w:r>
+        <w:t>Алтернативе попут Application Insights-а или vendor-специфичних APM решења (нпр. Datadog, New Relic) су разматране, али одбачене управо због vendor lock-in-а — OTel омогућава промену backend-а за складиштење (Prometheus/Tempo/Loki → неко друго решење) без измене иједног сервиса, пошто је инструментациони код одвојен од места где телеметрија завршава.</w:t>
+      </w:r>
+    </w:p>
+    <w:p xmlns:wp14="http://schemas.microsoft.com/office/word/2010/wordml" wp14:textId="77777777">
+      <w:pPr>
+        <w:pStyle w:val="Heading2"/>
+      </w:pPr>
+      <w:r>
+        <w:t>OpenTelemetry Collector</w:t>
+      </w:r>
+    </w:p>
+    <w:p xmlns:wp14="http://schemas.microsoft.com/office/word/2010/wordml" wp14:textId="77777777">
+      <w:pPr>
+        <w:pStyle w:val="BodyText"/>
+      </w:pPr>
+      <w:r>
+        <w:t>Сервиси не шаљу телеметрију директно ка Prometheus/Tempo/Loki, већ ка једном централном OpenTelemetry Collector-у (OTLP протокол, gRPC на порту 4317). Ово раздваја „како апликација емитује телеметрију” од „где та телеметрија завршава” — каснија измена backend-а за складиштење (нпр. замена Loki-ја другим решењем) не би захтевала измену ниједног сервиса, само Collector-ове конфигурације [9].</w:t>
+      </w:r>
+    </w:p>
+    <w:p xmlns:wp14="http://schemas.microsoft.com/office/word/2010/wordml" wp14:textId="77777777">
+      <w:pPr>
+        <w:pStyle w:val="Heading2"/>
+      </w:pPr>
+      <w:r>
+        <w:t>Prometheus, Grafana Tempo, Grafana Loki</w:t>
+      </w:r>
+    </w:p>
+    <w:p xmlns:wp14="http://schemas.microsoft.com/office/word/2010/wordml" wp14:textId="77777777">
+      <w:pPr>
+        <w:pStyle w:val="BodyText"/>
+      </w:pPr>
+      <w:r>
+        <w:t>За складиштење три врсте телеметрије изабран је такозвани „Grafana stack”: Prometheus [8] за метрике (Collector излаже Prometheus-компатибилан /metrics endpoint који Prometheus периодично scrape-ује), Grafana Tempo [5] за дистрибуирано праћење захтева (trace-ове), и Grafana Loki [6] за централизоване логове. Предност ове комбинације над, на пример, самостојећим Jaeger-ом за tracing јесте што све три компоненте имају нативну, provisioned интеграцију са Grafanom — укључујући унакрсну навигацију (клик са log линије на њен trace, клик са trace-а на метрику) која је директно демонстрирана у поглављу 5.</w:t>
+      </w:r>
+    </w:p>
+    <w:p xmlns:wp14="http://schemas.microsoft.com/office/word/2010/wordml" wp14:textId="77777777">
+      <w:pPr>
+        <w:pStyle w:val="Heading2"/>
+      </w:pPr>
+      <w:r>
+        <w:t>Grafana</w:t>
+      </w:r>
+    </w:p>
+    <w:p xmlns:wp14="http://schemas.microsoft.com/office/word/2010/wordml" wp14:textId="77777777">
+      <w:pPr>
+        <w:pStyle w:val="BodyText"/>
+      </w:pPr>
+      <w:r>
+        <w:t>Grafana [10] је изабрана као јединствен визуелни слој за све три врсте телеметрије, уместо по једног специјализованог алата за сваку (нпр. Jaeger UI за trace-ове, посебан алат за метрике). Grafana подржава велики број data source-ова кроз plugin архитектуру, а Prometheus, Tempo и Loki су сви подржани нативно, без додатних plugin-ова, што је додатни разлог за избор баш ове платформе. Ово директно подржава сценарио „развијач види комплетну слику једног захтева на једном месту”, који је централна теза рада.</w:t>
+      </w:r>
+    </w:p>
+    <w:p xmlns:wp14="http://schemas.microsoft.com/office/word/2010/wordml" wp14:textId="77777777">
+      <w:pPr>
+        <w:pStyle w:val="Heading2"/>
+      </w:pPr>
+      <w:r>
+        <w:t>Health checks</w:t>
+      </w:r>
+    </w:p>
+    <w:p xmlns:wp14="http://schemas.microsoft.com/office/word/2010/wordml" wp14:textId="77777777">
+      <w:pPr>
+        <w:pStyle w:val="BodyText"/>
+      </w:pPr>
+      <w:r>
+        <w:t>Коришћен је уграђен ASP.NET Core механизам (Microsoft.Extensions.Diagnostics.HealthChecks) [2], допуњен пакетом AspNetCore.HealthChecks.SqlServer (верзија 9.0.0, компатибилна са .NET 8) за проверу доступности SQL Server базе по сервису.</w:t>
+      </w:r>
+    </w:p>
+    <w:p xmlns:wp14="http://schemas.microsoft.com/office/word/2010/wordml" wp14:textId="77777777">
+      <w:pPr>
+        <w:pStyle w:val="Heading2"/>
+      </w:pPr>
+      <w:r>
+        <w:t>k6</w:t>
+      </w:r>
+    </w:p>
+    <w:p xmlns:wp14="http://schemas.microsoft.com/office/word/2010/wordml" wp14:textId="77777777">
+      <w:pPr>
+        <w:pStyle w:val="BodyText"/>
+      </w:pPr>
+      <w:r>
+        <w:t>За демонстрацију понашања система под оптерећењем (сценарио 3, поглавље 5) коришћен је k6 (Grafana k6) [7], алат за load testing чији се скриптовани сценарији пишу у JavaScript-у, што га чини лакшим за одржавање и читање у односу на алтернативе попут JMeter-а.</w:t>
+      </w:r>
+    </w:p>
+    <w:p xmlns:wp14="http://schemas.microsoft.com/office/word/2010/wordml" wp14:textId="77777777">
+      <w:pPr>
+        <w:pStyle w:val="Heading2"/>
+      </w:pPr>
+      <w:r>
+        <w:t>xUnit</w:t>
+      </w:r>
+    </w:p>
+    <w:p xmlns:wp14="http://schemas.microsoft.com/office/word/2010/wordml" wp14:textId="77777777">
+      <w:pPr>
+        <w:pStyle w:val="BodyText"/>
+      </w:pPr>
+      <w:r>
+        <w:t>За аутоматизовано тестирање (поглавље 6) коришћен је xUnit [11], стандардни test framework за .NET који Microsoft подразумевано укључује у project template-е за .NET апликације, јер пројекат пре овог рада није имао дефинисан test framework нити иједан тест.</w:t>
+      </w:r>
+    </w:p>
+    <w:p xmlns:wp14="http://schemas.microsoft.com/office/word/2010/wordml" wp14:textId="77777777">
+      <w:pPr>
+        <w:pStyle w:val="Heading2"/>
+      </w:pPr>
+      <w:r>
+        <w:t>Docker / Docker Compose</w:t>
+      </w:r>
+    </w:p>
+    <w:p xmlns:wp14="http://schemas.microsoft.com/office/word/2010/wordml" wp14:textId="77777777">
+      <w:pPr>
+        <w:pStyle w:val="BodyText"/>
+      </w:pPr>
+      <w:r>
+        <w:t>Цела observability инфраструктура (Collector, Prometheus, Tempo, Loki, Grafana) покреће се кроз Docker Compose [12], алат за дефинисање и покретање вишеконтејнерских Docker апликација преко једног YAML фајла, независно од постојећег Service Fabric кластера и SQL Server инстанце — додатак, не замена постојећег начина рада система.</w:t>
+      </w:r>
+    </w:p>
+    <w:p>
+      <w:pPr>
+        <w:pStyle w:val="Heading1"/>
+        <w:rPr/>
+      </w:pPr>
+      <w:bookmarkStart w:name="_Toc459059121" w:id="1803461278"/>
+      <w:r>
+        <w:rPr>
+          <w:lang w:val="sr-Cyrl-RS"/>
+        </w:rPr>
+        <w:t xml:space="preserve">Опис </w:t>
+      </w:r>
+      <w:r>
+        <w:rPr/>
+        <w:t>почетног</w:t>
+      </w:r>
+      <w:r>
+        <w:rPr/>
+        <w:t xml:space="preserve"> </w:t>
+      </w:r>
+      <w:r>
+        <w:rPr/>
+        <w:t>решења</w:t>
+      </w:r>
+      <w:bookmarkEnd w:id="1803461278"/>
+    </w:p>
+    <w:p xmlns:wp14="http://schemas.microsoft.com/office/word/2010/wordml" wp14:textId="77777777">
+      <w:pPr>
+        <w:pStyle w:val="BodyText"/>
+      </w:pPr>
+      <w:r>
+        <w:t>У овом поглављу описано је стање система Travel Planner пре надоградње описане у овом раду — архитектура, технологије и, посебно, постојећи (или тачније, непостојећи) механизми обсервабилности, установљени детаљном анализом изворног кода.</w:t>
+      </w:r>
+    </w:p>
+    <w:p>
+      <w:pPr>
+        <w:pStyle w:val="BodyText"/>
+      </w:pPr>
+      <w:r>
+        <w:t>Слика 4.1 приказује изглед корисничког интерфејса апликације у тренутку почетка овог рада — списак планова путовања корисника.</w:t>
+      </w:r>
+    </w:p>
+    <w:p>
+      <w:pPr>
+        <w:pStyle w:val="BodyText"/>
+        <w:jc w:val="center"/>
+      </w:pPr>
+      <w:r/>
+      <w:r>
+        <w:drawing>
+          <wp:inline>
+            <wp:extent cx="5040000" cy="3678988"/>
+            <wp:docPr id="9" name="Picture 9"/>
+            <wp:cNvGraphicFramePr>
+              <a:graphicFrameLocks noChangeAspect="1"/>
+            </wp:cNvGraphicFramePr>
+            <a:graphic>
+              <a:graphicData uri="http://schemas.openxmlformats.org/drawingml/2006/picture">
+                <pic:pic>
+                  <pic:nvPicPr>
+                    <pic:cNvPr id="0" name="slika_1_1.png"/>
+                    <pic:cNvPicPr/>
+                  </pic:nvPicPr>
+                  <pic:blipFill>
+                    <a:blip r:embed="rId35"/>
+                    <a:stretch>
+                      <a:fillRect/>
+                    </a:stretch>
+                  </pic:blipFill>
+                  <pic:spPr>
+                    <a:xfrm>
+                      <a:off x="0" y="0"/>
+                      <a:ext cx="5040000" cy="3678988"/>
+                    </a:xfrm>
+                    <a:prstGeom prst="rect"/>
+                  </pic:spPr>
+                </pic:pic>
+              </a:graphicData>
+            </a:graphic>
+          </wp:inline>
+        </w:drawing>
+      </w:r>
+    </w:p>
+    <w:p>
+      <w:pPr>
+        <w:pStyle w:val="Slika"/>
+      </w:pPr>
+      <w:r>
+        <w:t>Слика 4.1. Изглед Travel Planner апликације — преглед планова путовања</w:t>
+      </w:r>
+    </w:p>
+    <w:p xmlns:wp14="http://schemas.microsoft.com/office/word/2010/wordml" wp14:textId="77777777">
+      <w:pPr>
+        <w:pStyle w:val="Heading2"/>
+      </w:pPr>
+      <w:r>
+        <w:t>Архитектура система</w:t>
+      </w:r>
+    </w:p>
+    <w:p xmlns:wp14="http://schemas.microsoft.com/office/word/2010/wordml" wp14:textId="77777777">
+      <w:pPr>
+        <w:pStyle w:val="BodyText"/>
+      </w:pPr>
+      <w:r>
+        <w:t>Систем чине четири одвојена сервиса на Microsoft Service Fabric платформи (значење појмова stateless и stateful објашњено је у поглављу 3):</w:t>
+      </w:r>
+    </w:p>
+    <w:p xmlns:wp14="http://schemas.microsoft.com/office/word/2010/wordml" wp14:textId="77777777">
+      <w:pPr>
+        <w:pStyle w:val="1nabrajanje"/>
+      </w:pPr>
+      <w:r>
+        <w:t>Gateway (stateless) — YARP reverse proxy, једина улазна тачка за frontend; рутира захтеве ка осталим сервисима по путањи, без сопствене пословне логике или базе.</w:t>
+      </w:r>
+    </w:p>
+    <w:p xmlns:wp14="http://schemas.microsoft.com/office/word/2010/wordml" wp14:textId="77777777">
+      <w:pPr>
+        <w:pStyle w:val="1nabrajanje"/>
+      </w:pPr>
+      <w:r>
+        <w:t>AuthService (stateless) — регистрација, пријава, издавање и потписивање JWT токена, улоге (Корисник/Admin), администрација корисничких налога. База UsersDB.</w:t>
+      </w:r>
+    </w:p>
+    <w:p xmlns:wp14="http://schemas.microsoft.com/office/word/2010/wordml" wp14:textId="77777777">
+      <w:pPr>
+        <w:pStyle w:val="1nabrajanje"/>
+      </w:pPr>
+      <w:r>
+        <w:t>TripService (stateless) — централни сервис са целокупним садржајем плана: дестинације, активности, трошкови/буџет, checklist, белешке, подсетници. База TripsDB.</w:t>
+      </w:r>
+    </w:p>
+    <w:p xmlns:wp14="http://schemas.microsoft.com/office/word/2010/wordml" wp14:textId="77777777">
+      <w:pPr>
+        <w:pStyle w:val="1nabrajanje"/>
+      </w:pPr>
+      <w:r>
+        <w:t>SharingService (stateful) — дељење плана путем кода/QR-а (VIEW/EDIT). SharingDB је извор истине, а важећи кодови се додатно кеширају у Service Fabric Reliable Collections ради брже валидације — то је разлог зашто је баш овај сервис stateful.</w:t>
       </w:r>
     </w:p>
     <w:p>
@@ -8768,1553 +10314,7 @@
         <w:pStyle w:val="Slika"/>
       </w:pPr>
       <w:r>
-        <w:t>Слика 1.1. Дељење плана путовања путем кода/QR кода</w:t>
-      </w:r>
-    </w:p>
-    <w:p xmlns:wp14="http://schemas.microsoft.com/office/word/2010/wordml" wp14:textId="77777777">
-      <w:pPr>
-        <w:pStyle w:val="BodyText"/>
-      </w:pPr>
-      <w:r>
-        <w:t>Систем је реализован као микросервисна архитектура на платформи Microsoft Service Fabric, са четири одвојена сервиса (Gateway, AuthService, TripService, SharingService) и базом података по сервису (database-per-service) у Microsoft SQL Server-у. Оваква архитектура доноси познате предности микросервиса — независно скалирање, одвојен развој и deployment по сервису — али и познат проблем: један корисников захтев често пролази кроз више процеса, база и мрежних позива, па постаје знатно теже одговорити на питања попут „зашто је овај захтев спор?“, „где тачно долази до грешке?“ или „да ли је систем тренутно здрав?“ него код монолитне апликације.</w:t>
-      </w:r>
-    </w:p>
-    <w:p xmlns:wp14="http://schemas.microsoft.com/office/word/2010/wordml" wp14:textId="05DDD3D1">
-      <w:pPr>
-        <w:pStyle w:val="BodyText"/>
-      </w:pPr>
-      <w:r>
-        <w:rPr/>
-        <w:t xml:space="preserve">Тема </w:t>
-      </w:r>
-      <w:r>
-        <w:rPr/>
-        <w:t>овог</w:t>
-      </w:r>
-      <w:r>
-        <w:rPr/>
-        <w:t xml:space="preserve"> </w:t>
-      </w:r>
-      <w:r>
-        <w:rPr/>
-        <w:t>рада</w:t>
-      </w:r>
-      <w:r>
-        <w:rPr/>
-        <w:t xml:space="preserve">, </w:t>
-      </w:r>
-      <w:r>
-        <w:rPr/>
-        <w:t>Имплементација</w:t>
-      </w:r>
-      <w:r>
-        <w:rPr/>
-        <w:t xml:space="preserve"> </w:t>
-      </w:r>
-      <w:r>
-        <w:rPr/>
-        <w:t>о</w:t>
-      </w:r>
-      <w:r>
-        <w:rPr/>
-        <w:t>б</w:t>
-      </w:r>
-      <w:r>
-        <w:rPr/>
-        <w:t>сервабилности</w:t>
-      </w:r>
-      <w:r>
-        <w:rPr/>
-        <w:t xml:space="preserve"> </w:t>
-      </w:r>
-      <w:r>
-        <w:rPr/>
-        <w:t>микросервисне</w:t>
-      </w:r>
-      <w:r>
-        <w:rPr/>
-        <w:t xml:space="preserve"> </w:t>
-      </w:r>
-      <w:r>
-        <w:rPr/>
-        <w:t>архитектуре</w:t>
-      </w:r>
-      <w:r>
-        <w:rPr/>
-        <w:t xml:space="preserve">, </w:t>
-      </w:r>
-      <w:r>
-        <w:rPr/>
-        <w:t>директно</w:t>
-      </w:r>
-      <w:r>
-        <w:rPr/>
-        <w:t xml:space="preserve"> </w:t>
-      </w:r>
-      <w:r>
-        <w:rPr/>
-        <w:t>адресира</w:t>
-      </w:r>
-      <w:r>
-        <w:rPr/>
-        <w:t xml:space="preserve"> </w:t>
-      </w:r>
-      <w:r>
-        <w:rPr/>
-        <w:t>тај</w:t>
-      </w:r>
-      <w:r>
-        <w:rPr/>
-        <w:t xml:space="preserve"> </w:t>
-      </w:r>
-      <w:r>
-        <w:rPr/>
-        <w:t>проблем</w:t>
-      </w:r>
-      <w:r>
-        <w:rPr/>
-        <w:t xml:space="preserve">. Циљ </w:t>
-      </w:r>
-      <w:r>
-        <w:rPr/>
-        <w:t>рада</w:t>
-      </w:r>
-      <w:r>
-        <w:rPr/>
-        <w:t xml:space="preserve"> </w:t>
-      </w:r>
-      <w:r>
-        <w:rPr/>
-        <w:t>није</w:t>
-      </w:r>
-      <w:r>
-        <w:rPr/>
-        <w:t xml:space="preserve"> </w:t>
-      </w:r>
-      <w:r>
-        <w:rPr/>
-        <w:t>да</w:t>
-      </w:r>
-      <w:r>
-        <w:rPr/>
-        <w:t xml:space="preserve"> </w:t>
-      </w:r>
-      <w:r>
-        <w:rPr/>
-        <w:t>мења</w:t>
-      </w:r>
-      <w:r>
-        <w:rPr/>
-        <w:t xml:space="preserve"> </w:t>
-      </w:r>
-      <w:r>
-        <w:rPr/>
-        <w:t>пословну</w:t>
-      </w:r>
-      <w:r>
-        <w:rPr/>
-        <w:t xml:space="preserve"> </w:t>
-      </w:r>
-      <w:r>
-        <w:rPr/>
-        <w:t>логику</w:t>
-      </w:r>
-      <w:r>
-        <w:rPr/>
-        <w:t xml:space="preserve"> </w:t>
-      </w:r>
-      <w:r>
-        <w:rPr/>
-        <w:t>постојећег</w:t>
-      </w:r>
-      <w:r>
-        <w:rPr/>
-        <w:t xml:space="preserve"> </w:t>
-      </w:r>
-      <w:r>
-        <w:rPr/>
-        <w:t>система</w:t>
-      </w:r>
-      <w:r>
-        <w:rPr/>
-        <w:t xml:space="preserve"> (</w:t>
-      </w:r>
-      <w:r>
-        <w:rPr/>
-        <w:t>планове</w:t>
-      </w:r>
-      <w:r>
-        <w:rPr/>
-        <w:t xml:space="preserve">, </w:t>
-      </w:r>
-      <w:r>
-        <w:rPr/>
-        <w:t>дестинације</w:t>
-      </w:r>
-      <w:r>
-        <w:rPr/>
-        <w:t xml:space="preserve">, </w:t>
-      </w:r>
-      <w:r>
-        <w:rPr/>
-        <w:t>трошкове</w:t>
-      </w:r>
-      <w:r>
-        <w:rPr/>
-        <w:t xml:space="preserve">), </w:t>
-      </w:r>
-      <w:r>
-        <w:rPr/>
-        <w:t>већ</w:t>
-      </w:r>
-      <w:r>
-        <w:rPr/>
-        <w:t xml:space="preserve"> </w:t>
-      </w:r>
-      <w:r>
-        <w:rPr/>
-        <w:t>да</w:t>
-      </w:r>
-      <w:r>
-        <w:rPr/>
-        <w:t xml:space="preserve"> </w:t>
-      </w:r>
-      <w:r>
-        <w:rPr/>
-        <w:t>га</w:t>
-      </w:r>
-      <w:r>
-        <w:rPr/>
-        <w:t xml:space="preserve"> </w:t>
-      </w:r>
-      <w:r>
-        <w:rPr/>
-        <w:t>надогради</w:t>
-      </w:r>
-      <w:r>
-        <w:rPr/>
-        <w:t xml:space="preserve"> </w:t>
-      </w:r>
-      <w:r>
-        <w:rPr/>
-        <w:t>слојем</w:t>
-      </w:r>
-      <w:r>
-        <w:rPr/>
-        <w:t xml:space="preserve"> </w:t>
-      </w:r>
-      <w:r>
-        <w:rPr/>
-        <w:t>о</w:t>
-      </w:r>
-      <w:r>
-        <w:rPr/>
-        <w:t>б</w:t>
-      </w:r>
-      <w:r>
-        <w:rPr/>
-        <w:t>сервабилности</w:t>
-      </w:r>
-      <w:r>
-        <w:rPr/>
-        <w:t xml:space="preserve"> </w:t>
-      </w:r>
-      <w:r>
-        <w:rPr/>
-        <w:t>заснованим</w:t>
-      </w:r>
-      <w:r>
-        <w:rPr/>
-        <w:t xml:space="preserve"> </w:t>
-      </w:r>
-      <w:r>
-        <w:rPr/>
-        <w:t>на</w:t>
-      </w:r>
-      <w:r>
-        <w:rPr/>
-        <w:t xml:space="preserve"> </w:t>
-      </w:r>
-      <w:r>
-        <w:rPr/>
-        <w:t>индустријском</w:t>
-      </w:r>
-      <w:r>
-        <w:rPr/>
-        <w:t xml:space="preserve"> </w:t>
-      </w:r>
-      <w:r>
-        <w:rPr/>
-        <w:t>стандарду</w:t>
-      </w:r>
-      <w:r>
-        <w:rPr/>
-        <w:t xml:space="preserve"> </w:t>
-      </w:r>
-      <w:r>
-        <w:rPr/>
-        <w:t>OpenTelemetry</w:t>
-      </w:r>
-      <w:r>
-        <w:rPr/>
-        <w:t xml:space="preserve"> — </w:t>
-      </w:r>
-      <w:r>
-        <w:rPr/>
-        <w:t>дистрибуирано</w:t>
-      </w:r>
-      <w:r>
-        <w:rPr/>
-        <w:t xml:space="preserve"> </w:t>
-      </w:r>
-      <w:r>
-        <w:rPr/>
-        <w:t>праћење</w:t>
-      </w:r>
-      <w:r>
-        <w:rPr/>
-        <w:t xml:space="preserve"> </w:t>
-      </w:r>
-      <w:r>
-        <w:rPr/>
-        <w:t>захтева</w:t>
-      </w:r>
-      <w:r>
-        <w:rPr/>
-        <w:t xml:space="preserve"> (distributed tracing), </w:t>
-      </w:r>
-      <w:r>
-        <w:rPr/>
-        <w:t>структурисано</w:t>
-      </w:r>
-      <w:r>
-        <w:rPr/>
-        <w:t xml:space="preserve"> </w:t>
-      </w:r>
-      <w:r>
-        <w:rPr/>
-        <w:t>логовање</w:t>
-      </w:r>
-      <w:r>
-        <w:rPr/>
-        <w:t xml:space="preserve">, </w:t>
-      </w:r>
-      <w:r>
-        <w:rPr/>
-        <w:t>метрике</w:t>
-      </w:r>
-      <w:r>
-        <w:rPr/>
-        <w:t xml:space="preserve"> </w:t>
-      </w:r>
-      <w:r>
-        <w:rPr/>
-        <w:t>перформанси</w:t>
-      </w:r>
-      <w:r>
-        <w:rPr/>
-        <w:t xml:space="preserve"> и health check </w:t>
-      </w:r>
-      <w:r>
-        <w:rPr/>
-        <w:t>механизме</w:t>
-      </w:r>
-      <w:r>
-        <w:rPr/>
-        <w:t xml:space="preserve"> — и </w:t>
-      </w:r>
-      <w:r>
-        <w:rPr/>
-        <w:t>да</w:t>
-      </w:r>
-      <w:r>
-        <w:rPr/>
-        <w:t xml:space="preserve"> </w:t>
-      </w:r>
-      <w:r>
-        <w:rPr/>
-        <w:t>ту</w:t>
-      </w:r>
-      <w:r>
-        <w:rPr/>
-        <w:t xml:space="preserve"> </w:t>
-      </w:r>
-      <w:r>
-        <w:rPr/>
-        <w:t>надоградњу</w:t>
-      </w:r>
-      <w:r>
-        <w:rPr/>
-        <w:t xml:space="preserve"> </w:t>
-      </w:r>
-      <w:r>
-        <w:rPr/>
-        <w:t>докаже</w:t>
-      </w:r>
-      <w:r>
-        <w:rPr/>
-        <w:t xml:space="preserve"> </w:t>
-      </w:r>
-      <w:r>
-        <w:rPr/>
-        <w:t>кроз</w:t>
-      </w:r>
-      <w:r>
-        <w:rPr/>
-        <w:t xml:space="preserve"> </w:t>
-      </w:r>
-      <w:r>
-        <w:rPr/>
-        <w:t>стварно</w:t>
-      </w:r>
-      <w:r>
-        <w:rPr/>
-        <w:t xml:space="preserve"> </w:t>
-      </w:r>
-      <w:r>
-        <w:rPr/>
-        <w:t>извршавање</w:t>
-      </w:r>
-      <w:r>
-        <w:rPr/>
-        <w:t xml:space="preserve">, </w:t>
-      </w:r>
-      <w:r>
-        <w:rPr/>
-        <w:t>аутоматизоване</w:t>
-      </w:r>
-      <w:r>
-        <w:rPr/>
-        <w:t xml:space="preserve"> </w:t>
-      </w:r>
-      <w:r>
-        <w:rPr/>
-        <w:t>тестове</w:t>
-      </w:r>
-      <w:r>
-        <w:rPr/>
-        <w:t xml:space="preserve"> и </w:t>
-      </w:r>
-      <w:r>
-        <w:rPr/>
-        <w:t>мерљиве</w:t>
-      </w:r>
-      <w:r>
-        <w:rPr/>
-        <w:t xml:space="preserve"> </w:t>
-      </w:r>
-      <w:r>
-        <w:rPr/>
-        <w:t>резултате</w:t>
-      </w:r>
-      <w:r>
-        <w:rPr/>
-        <w:t xml:space="preserve">, а </w:t>
-      </w:r>
-      <w:r>
-        <w:rPr/>
-        <w:t>не</w:t>
-      </w:r>
-      <w:r>
-        <w:rPr/>
-        <w:t xml:space="preserve"> </w:t>
-      </w:r>
-      <w:r>
-        <w:rPr/>
-        <w:t>само</w:t>
-      </w:r>
-      <w:r>
-        <w:rPr/>
-        <w:t xml:space="preserve"> </w:t>
-      </w:r>
-      <w:r>
-        <w:rPr/>
-        <w:t>кроз</w:t>
-      </w:r>
-      <w:r>
-        <w:rPr/>
-        <w:t xml:space="preserve"> </w:t>
-      </w:r>
-      <w:r>
-        <w:rPr/>
-        <w:t>инсталацију</w:t>
-      </w:r>
-      <w:r>
-        <w:rPr/>
-        <w:t xml:space="preserve"> </w:t>
-      </w:r>
-      <w:r>
-        <w:rPr/>
-        <w:t>алата</w:t>
-      </w:r>
-      <w:r>
-        <w:rPr/>
-        <w:t>.</w:t>
-      </w:r>
-    </w:p>
-    <w:p xmlns:wp14="http://schemas.microsoft.com/office/word/2010/wordml" wp14:textId="77777777">
-      <w:pPr>
-        <w:pStyle w:val="BodyText"/>
-      </w:pPr>
-      <w:r>
-        <w:t>Рад је организован тако да прво анализира постојеће стање система (поглавља 2-4), затим детаљно описује предложено и имплементирано решење (поглавље 5), верификује га кроз тестирање и демонстрационе сценарије над стварно постављеним системом (поглавље 6), и на крају сумира постигнуте резултате, ограничења и правце даљег развоја (поглавље 7).</w:t>
-      </w:r>
-    </w:p>
-    <w:p>
-      <w:pPr>
-        <w:pStyle w:val="text"/>
-        <w:rPr>
-          <w:lang w:val="sr-Cyrl-RS"/>
-        </w:rPr>
-      </w:pPr>
-    </w:p>
-    <w:p>
-      <w:pPr>
-        <w:pStyle w:val="text"/>
-        <w:ind w:left="0"/>
-      </w:pPr>
-    </w:p>
-    <w:p>
-      <w:pPr>
-        <w:pStyle w:val="Heading1"/>
-        <w:rPr>
-          <w:lang w:val="sr-Cyrl-RS"/>
-        </w:rPr>
-      </w:pPr>
-      <w:bookmarkStart w:name="_Toc776203058" w:id="968689803"/>
-      <w:r>
-        <w:rPr>
-          <w:lang w:val="sr-Cyrl-RS"/>
-        </w:rPr>
-        <w:t>Опис проблема</w:t>
-      </w:r>
-      <w:bookmarkEnd w:id="968689803"/>
-    </w:p>
-    <w:p xmlns:wp14="http://schemas.microsoft.com/office/word/2010/wordml" wp14:textId="0AA179DA">
-      <w:pPr>
-        <w:pStyle w:val="BodyText"/>
-      </w:pPr>
-      <w:r>
-        <w:rPr/>
-        <w:t xml:space="preserve">Анализа </w:t>
-      </w:r>
-      <w:r>
-        <w:rPr/>
-        <w:t>постојећег</w:t>
-      </w:r>
-      <w:r>
-        <w:rPr/>
-        <w:t xml:space="preserve"> </w:t>
-      </w:r>
-      <w:r>
-        <w:rPr/>
-        <w:t>система</w:t>
-      </w:r>
-      <w:r>
-        <w:rPr/>
-        <w:t xml:space="preserve"> (</w:t>
-      </w:r>
-      <w:r>
-        <w:rPr/>
-        <w:t>детаљно</w:t>
-      </w:r>
-      <w:r>
-        <w:rPr/>
-        <w:t xml:space="preserve"> </w:t>
-      </w:r>
-      <w:r>
-        <w:rPr/>
-        <w:t>описаног</w:t>
-      </w:r>
-      <w:r>
-        <w:rPr/>
-        <w:t xml:space="preserve"> у </w:t>
-      </w:r>
-      <w:r>
-        <w:rPr/>
-        <w:t>поглављу</w:t>
-      </w:r>
-      <w:r>
-        <w:rPr/>
-        <w:t xml:space="preserve"> 4) </w:t>
-      </w:r>
-      <w:r>
-        <w:rPr/>
-        <w:t>показала</w:t>
-      </w:r>
-      <w:r>
-        <w:rPr/>
-        <w:t xml:space="preserve"> </w:t>
-      </w:r>
-      <w:r>
-        <w:rPr/>
-        <w:t>је</w:t>
-      </w:r>
-      <w:r>
-        <w:rPr/>
-        <w:t xml:space="preserve"> </w:t>
-      </w:r>
-      <w:r>
-        <w:rPr/>
-        <w:t>да</w:t>
-      </w:r>
-      <w:r>
-        <w:rPr/>
-        <w:t xml:space="preserve"> Travel Planner, </w:t>
-      </w:r>
-      <w:r>
-        <w:rPr/>
-        <w:t>иако</w:t>
-      </w:r>
-      <w:r>
-        <w:rPr/>
-        <w:t xml:space="preserve"> </w:t>
-      </w:r>
-      <w:r>
-        <w:rPr/>
-        <w:t>функционално</w:t>
-      </w:r>
-      <w:r>
-        <w:rPr/>
-        <w:t xml:space="preserve"> </w:t>
-      </w:r>
-      <w:r>
-        <w:rPr/>
-        <w:t>комплетан</w:t>
-      </w:r>
-      <w:r>
-        <w:rPr/>
-        <w:t xml:space="preserve"> и </w:t>
-      </w:r>
-      <w:r>
-        <w:rPr/>
-        <w:t>добро</w:t>
-      </w:r>
-      <w:r>
-        <w:rPr/>
-        <w:t xml:space="preserve"> </w:t>
-      </w:r>
-      <w:r>
-        <w:rPr/>
-        <w:t>структурисан</w:t>
-      </w:r>
-      <w:r>
-        <w:rPr/>
-        <w:t xml:space="preserve"> у </w:t>
-      </w:r>
-      <w:r>
-        <w:rPr/>
-        <w:t>погледу</w:t>
-      </w:r>
-      <w:r>
-        <w:rPr/>
-        <w:t xml:space="preserve"> </w:t>
-      </w:r>
-      <w:r>
-        <w:rPr/>
-        <w:t>поделе</w:t>
-      </w:r>
-      <w:r>
-        <w:rPr/>
-        <w:t xml:space="preserve"> </w:t>
-      </w:r>
-      <w:r>
-        <w:rPr/>
-        <w:t>одговорности</w:t>
-      </w:r>
-      <w:r>
-        <w:rPr/>
-        <w:t xml:space="preserve"> </w:t>
-      </w:r>
-      <w:r>
-        <w:rPr/>
-        <w:t>између</w:t>
-      </w:r>
-      <w:r>
-        <w:rPr/>
-        <w:t xml:space="preserve"> </w:t>
-      </w:r>
-      <w:r>
-        <w:rPr/>
-        <w:t>сервиса</w:t>
-      </w:r>
-      <w:r>
-        <w:rPr/>
-        <w:t xml:space="preserve">, </w:t>
-      </w:r>
-      <w:r>
-        <w:rPr/>
-        <w:t>нема</w:t>
-      </w:r>
-      <w:r>
-        <w:rPr/>
-        <w:t xml:space="preserve"> </w:t>
-      </w:r>
-      <w:r>
-        <w:rPr/>
-        <w:t>ниједан</w:t>
-      </w:r>
-      <w:r>
-        <w:rPr/>
-        <w:t xml:space="preserve"> </w:t>
-      </w:r>
-      <w:r>
-        <w:rPr/>
-        <w:t>механизам</w:t>
-      </w:r>
-      <w:r>
-        <w:rPr/>
-        <w:t xml:space="preserve"> </w:t>
-      </w:r>
-      <w:r>
-        <w:rPr/>
-        <w:t>о</w:t>
-      </w:r>
-      <w:r>
-        <w:rPr/>
-        <w:t>б</w:t>
-      </w:r>
-      <w:r>
-        <w:rPr/>
-        <w:t>сервабилности</w:t>
-      </w:r>
-      <w:r>
-        <w:rPr/>
-        <w:t xml:space="preserve"> </w:t>
-      </w:r>
-      <w:r>
-        <w:rPr/>
-        <w:t>изнад</w:t>
-      </w:r>
-      <w:r>
-        <w:rPr/>
-        <w:t xml:space="preserve"> </w:t>
-      </w:r>
-      <w:r>
-        <w:rPr/>
-        <w:t>апсолутног</w:t>
-      </w:r>
-      <w:r>
-        <w:rPr/>
-        <w:t xml:space="preserve"> </w:t>
-      </w:r>
-      <w:r>
-        <w:rPr/>
-        <w:t>минимума</w:t>
-      </w:r>
-      <w:r>
-        <w:rPr/>
-        <w:t xml:space="preserve"> </w:t>
-      </w:r>
-      <w:r>
-        <w:rPr/>
-        <w:t>који</w:t>
-      </w:r>
-      <w:r>
-        <w:rPr/>
-        <w:t xml:space="preserve"> </w:t>
-      </w:r>
-      <w:r>
-        <w:rPr/>
-        <w:t>сам</w:t>
-      </w:r>
-      <w:r>
-        <w:rPr/>
-        <w:t xml:space="preserve"> ASP.NET Core </w:t>
-      </w:r>
-      <w:r>
-        <w:rPr/>
-        <w:t>оквир</w:t>
-      </w:r>
-      <w:r>
-        <w:rPr/>
-        <w:t xml:space="preserve"> </w:t>
-      </w:r>
-      <w:r>
-        <w:rPr/>
-        <w:t>пружа</w:t>
-      </w:r>
-      <w:r>
-        <w:rPr/>
-        <w:t xml:space="preserve"> </w:t>
-      </w:r>
-      <w:r>
-        <w:rPr/>
-        <w:t>подразумевано</w:t>
-      </w:r>
-      <w:r>
-        <w:rPr/>
-        <w:t xml:space="preserve">. </w:t>
-      </w:r>
-      <w:r>
-        <w:rPr/>
-        <w:t>Конкретно</w:t>
-      </w:r>
-      <w:r>
-        <w:rPr/>
-        <w:t xml:space="preserve">, </w:t>
-      </w:r>
-      <w:r>
-        <w:rPr/>
-        <w:t>идентификовани</w:t>
-      </w:r>
-      <w:r>
-        <w:rPr/>
-        <w:t xml:space="preserve"> </w:t>
-      </w:r>
-      <w:r>
-        <w:rPr/>
-        <w:t>су</w:t>
-      </w:r>
-      <w:r>
-        <w:rPr/>
-        <w:t xml:space="preserve"> </w:t>
-      </w:r>
-      <w:r>
-        <w:rPr/>
-        <w:t>следећи</w:t>
-      </w:r>
-      <w:r>
-        <w:rPr/>
-        <w:t xml:space="preserve"> </w:t>
-      </w:r>
-      <w:r>
-        <w:rPr/>
-        <w:t>проблеми</w:t>
-      </w:r>
-      <w:r>
-        <w:rPr/>
-        <w:t>:</w:t>
-      </w:r>
-    </w:p>
-    <w:p xmlns:wp14="http://schemas.microsoft.com/office/word/2010/wordml" wp14:textId="77777777">
-      <w:pPr>
-        <w:pStyle w:val="Heading2"/>
-      </w:pPr>
-      <w:r>
-        <w:t>Немогуће праћење захтева кроз више сервиса</w:t>
-      </w:r>
-    </w:p>
-    <w:p xmlns:wp14="http://schemas.microsoft.com/office/word/2010/wordml" wp14:textId="77777777">
-      <w:pPr>
-        <w:pStyle w:val="BodyText"/>
-      </w:pPr>
-      <w:r>
-        <w:t>Захтев корисника типично пролази кроз ланац Frontend → Gateway → сервис (нпр. AuthService), а поједини токови иду и даље, сервис-сервис (нпр. SharingService → TripService приликом разрешавања дељеног плана). Не постоји ниједан идентификатор (correlation/trace ID) који би повезао логове настале у различитим процесима за исти кориснички захтев. Ако захтев успори или падне негде у ланцу, једини начин да се проблем лоцира био би ручно упоређивање временских печата логова из различитих сервиса — непоуздано и споро.</w:t>
-      </w:r>
-    </w:p>
-    <w:p xmlns:wp14="http://schemas.microsoft.com/office/word/2010/wordml" wp14:textId="77777777">
-      <w:pPr>
-        <w:pStyle w:val="Heading2"/>
-      </w:pPr>
-      <w:r>
-        <w:t>Одсуство метрика перформанси</w:t>
-      </w:r>
-    </w:p>
-    <w:p xmlns:wp14="http://schemas.microsoft.com/office/word/2010/wordml" wp14:textId="77777777">
-      <w:pPr>
-        <w:pStyle w:val="BodyText"/>
-      </w:pPr>
-      <w:r>
-        <w:t>Ниједан сервис не излаже метрике броја захтева, латенције, стопе грешака нити искоришћења ресурса (CPU, меморија). Пад перформанси (нпр. спор упит ка бази) остао би потпуно невидљив док се корисници директно не пожале.</w:t>
-      </w:r>
-    </w:p>
-    <w:p xmlns:wp14="http://schemas.microsoft.com/office/word/2010/wordml" wp14:textId="77777777">
-      <w:pPr>
-        <w:pStyle w:val="Heading2"/>
-      </w:pPr>
-      <w:r>
-        <w:t>Тихе грешке</w:t>
-      </w:r>
-    </w:p>
-    <w:p xmlns:wp14="http://schemas.microsoft.com/office/word/2010/wordml" wp14:textId="77777777">
-      <w:pPr>
-        <w:pStyle w:val="BodyText"/>
-      </w:pPr>
-      <w:r>
-        <w:t>У коду постоје примери у којима се грешка ухвати (try/catch) и обради без иједног трага у логу. Конкретан пример: AuthService/Services/TripClient.cs, метода DeleteUserTripsAsync — при брисању корисничког налога позива се TripService да обрише све планове тог корисника; ако тај позив не успе (сервис недоступан, мрежни проблем), изворни код је само враћао false, без иједног записа у логу. Систем би остао недоследан (обрисан налог, а планови и даље постоје у бази), без иједног трага зашто.</w:t>
-      </w:r>
-    </w:p>
-    <w:p xmlns:wp14="http://schemas.microsoft.com/office/word/2010/wordml" wp14:textId="77777777">
-      <w:pPr>
-        <w:pStyle w:val="Heading2"/>
-      </w:pPr>
-      <w:r>
-        <w:t>Одсуство health check механизама</w:t>
-      </w:r>
-    </w:p>
-    <w:p xmlns:wp14="http://schemas.microsoft.com/office/word/2010/wordml" wp14:textId="77777777">
-      <w:pPr>
-        <w:pStyle w:val="BodyText"/>
-      </w:pPr>
-      <w:r>
-        <w:t>Ниједан сервис не излаже endpoint преко ког би се споља (оркестрација, monitoring алат, човек) проверило да ли сервис стварно ради и да ли су његове зависности (база, други сервиси) доступне. Service Fabric поседује сопствени интерни health модел, али му се health стање апликационог нивоа (нпр. „да ли TripService може да се повеже на своју базу“) никада не пријављује.</w:t>
-      </w:r>
-    </w:p>
-    <w:p xmlns:wp14="http://schemas.microsoft.com/office/word/2010/wordml" wp14:textId="77777777">
-      <w:pPr>
-        <w:pStyle w:val="Heading2"/>
-      </w:pPr>
-      <w:r>
-        <w:t>Нестандардизовано, минимално логовање</w:t>
-      </w:r>
-    </w:p>
-    <w:p xmlns:wp14="http://schemas.microsoft.com/office/word/2010/wordml" wp14:textId="77777777">
-      <w:pPr>
-        <w:pStyle w:val="BodyText"/>
-      </w:pPr>
-      <w:r>
-        <w:t>Свака appsettings.json конфигурација дефинише ниво логовања (Information/Warning), али у пракси се у коду скоро нигде не позива ILogger — grep кроз цео backend је показао 0 позива ILogger/_logger пре овог рада. Постојећи Service Fabric ETW ServiceEventSource механизам користи се искључиво за lifecycle догађаје (покретање Kestrel-а, регистрација сервисног типа), не за токове пословне логике.</w:t>
-      </w:r>
-    </w:p>
-    <w:p xmlns:wp14="http://schemas.microsoft.com/office/word/2010/wordml" wp14:textId="31CA7907">
-      <w:pPr>
-        <w:pStyle w:val="BodyText"/>
-      </w:pPr>
-      <w:r>
-        <w:rPr/>
-        <w:t xml:space="preserve">Ови </w:t>
-      </w:r>
-      <w:r>
-        <w:rPr/>
-        <w:t>проблеми</w:t>
-      </w:r>
-      <w:r>
-        <w:rPr/>
-        <w:t xml:space="preserve"> </w:t>
-      </w:r>
-      <w:r>
-        <w:rPr/>
-        <w:t>су</w:t>
-      </w:r>
-      <w:r>
-        <w:rPr/>
-        <w:t xml:space="preserve"> </w:t>
-      </w:r>
-      <w:r>
-        <w:rPr/>
-        <w:t>директно</w:t>
-      </w:r>
-      <w:r>
-        <w:rPr/>
-        <w:t xml:space="preserve"> </w:t>
-      </w:r>
-      <w:r>
-        <w:rPr/>
-        <w:t>повезани</w:t>
-      </w:r>
-      <w:r>
-        <w:rPr/>
-        <w:t xml:space="preserve"> — </w:t>
-      </w:r>
-      <w:r>
-        <w:rPr/>
-        <w:t>сви</w:t>
-      </w:r>
-      <w:r>
-        <w:rPr/>
-        <w:t xml:space="preserve"> </w:t>
-      </w:r>
-      <w:r>
-        <w:rPr/>
-        <w:t>произилазе</w:t>
-      </w:r>
-      <w:r>
-        <w:rPr/>
-        <w:t xml:space="preserve"> </w:t>
-      </w:r>
-      <w:r>
-        <w:rPr/>
-        <w:t>из</w:t>
-      </w:r>
-      <w:r>
-        <w:rPr/>
-        <w:t xml:space="preserve"> </w:t>
-      </w:r>
-      <w:r>
-        <w:rPr/>
-        <w:t>недостатка</w:t>
-      </w:r>
-      <w:r>
-        <w:rPr/>
-        <w:t xml:space="preserve"> </w:t>
-      </w:r>
-      <w:r>
-        <w:rPr/>
-        <w:t>јединственог</w:t>
-      </w:r>
-      <w:r>
-        <w:rPr/>
-        <w:t xml:space="preserve">, </w:t>
-      </w:r>
-      <w:r>
-        <w:rPr/>
-        <w:t>стандардизованог</w:t>
-      </w:r>
-      <w:r>
-        <w:rPr/>
-        <w:t xml:space="preserve"> </w:t>
-      </w:r>
-      <w:r>
-        <w:rPr/>
-        <w:t>слоја</w:t>
-      </w:r>
-      <w:r>
-        <w:rPr/>
-        <w:t xml:space="preserve"> </w:t>
-      </w:r>
-      <w:r>
-        <w:rPr/>
-        <w:t>о</w:t>
-      </w:r>
-      <w:r>
-        <w:rPr/>
-        <w:t>б</w:t>
-      </w:r>
-      <w:r>
-        <w:rPr/>
-        <w:t>сервабилности</w:t>
-      </w:r>
-      <w:r>
-        <w:rPr/>
-        <w:t xml:space="preserve">, а </w:t>
-      </w:r>
-      <w:r>
-        <w:rPr/>
-        <w:t>не</w:t>
-      </w:r>
-      <w:r>
-        <w:rPr/>
-        <w:t xml:space="preserve"> </w:t>
-      </w:r>
-      <w:r>
-        <w:rPr/>
-        <w:t>из</w:t>
-      </w:r>
-      <w:r>
-        <w:rPr/>
-        <w:t xml:space="preserve"> </w:t>
-      </w:r>
-      <w:r>
-        <w:rPr/>
-        <w:t>појединачних</w:t>
-      </w:r>
-      <w:r>
-        <w:rPr/>
-        <w:t xml:space="preserve">, </w:t>
-      </w:r>
-      <w:r>
-        <w:rPr/>
-        <w:t>изолованих</w:t>
-      </w:r>
-      <w:r>
-        <w:rPr/>
-        <w:t xml:space="preserve"> </w:t>
-      </w:r>
-      <w:r>
-        <w:rPr/>
-        <w:t>пропуста</w:t>
-      </w:r>
-      <w:r>
-        <w:rPr/>
-        <w:t xml:space="preserve">. </w:t>
-      </w:r>
-      <w:r>
-        <w:rPr/>
-        <w:t>То</w:t>
-      </w:r>
-      <w:r>
-        <w:rPr/>
-        <w:t xml:space="preserve"> </w:t>
-      </w:r>
-      <w:r>
-        <w:rPr/>
-        <w:t>је</w:t>
-      </w:r>
-      <w:r>
-        <w:rPr/>
-        <w:t xml:space="preserve"> </w:t>
-      </w:r>
-      <w:r>
-        <w:rPr/>
-        <w:t>управо</w:t>
-      </w:r>
-      <w:r>
-        <w:rPr/>
-        <w:t xml:space="preserve"> </w:t>
-      </w:r>
-      <w:r>
-        <w:rPr/>
-        <w:t>разлог</w:t>
-      </w:r>
-      <w:r>
-        <w:rPr/>
-        <w:t xml:space="preserve"> </w:t>
-      </w:r>
-      <w:r>
-        <w:rPr/>
-        <w:t>зашто</w:t>
-      </w:r>
-      <w:r>
-        <w:rPr/>
-        <w:t xml:space="preserve"> </w:t>
-      </w:r>
-      <w:r>
-        <w:rPr/>
-        <w:t>је</w:t>
-      </w:r>
-      <w:r>
-        <w:rPr/>
-        <w:t xml:space="preserve"> </w:t>
-      </w:r>
-      <w:r>
-        <w:rPr/>
-        <w:t>предложено</w:t>
-      </w:r>
-      <w:r>
-        <w:rPr/>
-        <w:t xml:space="preserve"> </w:t>
-      </w:r>
-      <w:r>
-        <w:rPr/>
-        <w:t>решење</w:t>
-      </w:r>
-      <w:r>
-        <w:rPr/>
-        <w:t xml:space="preserve"> (</w:t>
-      </w:r>
-      <w:r>
-        <w:rPr/>
-        <w:t>поглавље</w:t>
-      </w:r>
-      <w:r>
-        <w:rPr/>
-        <w:t xml:space="preserve"> 5) </w:t>
-      </w:r>
-      <w:r>
-        <w:rPr/>
-        <w:t>целовит</w:t>
-      </w:r>
-      <w:r>
-        <w:rPr/>
-        <w:t xml:space="preserve"> </w:t>
-      </w:r>
-      <w:r>
-        <w:rPr/>
-        <w:t>слој</w:t>
-      </w:r>
-      <w:r>
-        <w:rPr/>
-        <w:t xml:space="preserve"> </w:t>
-      </w:r>
-      <w:r>
-        <w:rPr/>
-        <w:t>заснован</w:t>
-      </w:r>
-      <w:r>
-        <w:rPr/>
-        <w:t xml:space="preserve"> </w:t>
-      </w:r>
-      <w:r>
-        <w:rPr/>
-        <w:t>на</w:t>
-      </w:r>
-      <w:r>
-        <w:rPr/>
-        <w:t xml:space="preserve"> </w:t>
-      </w:r>
-      <w:r>
-        <w:rPr/>
-        <w:t>једном</w:t>
-      </w:r>
-      <w:r>
-        <w:rPr/>
-        <w:t xml:space="preserve"> </w:t>
-      </w:r>
-      <w:r>
-        <w:rPr/>
-        <w:t>стандарду</w:t>
-      </w:r>
-      <w:r>
-        <w:rPr/>
-        <w:t xml:space="preserve"> (</w:t>
-      </w:r>
-      <w:r>
-        <w:rPr/>
-        <w:t>OpenTelemetry</w:t>
-      </w:r>
-      <w:r>
-        <w:rPr/>
-        <w:t xml:space="preserve">), а </w:t>
-      </w:r>
-      <w:r>
-        <w:rPr/>
-        <w:t>не</w:t>
-      </w:r>
-      <w:r>
-        <w:rPr/>
-        <w:t xml:space="preserve"> </w:t>
-      </w:r>
-      <w:r>
-        <w:rPr/>
-        <w:t>низ</w:t>
-      </w:r>
-      <w:r>
-        <w:rPr/>
-        <w:t xml:space="preserve"> ad-hoc </w:t>
-      </w:r>
-      <w:r>
-        <w:rPr/>
-        <w:t>закрпа</w:t>
-      </w:r>
-      <w:r>
-        <w:rPr/>
-        <w:t>.</w:t>
-      </w:r>
-    </w:p>
-    <w:p>
-      <w:pPr>
-        <w:pStyle w:val="Heading1"/>
-        <w:rPr>
-          <w:lang w:val="sr-Cyrl-RS"/>
-        </w:rPr>
-      </w:pPr>
-      <w:bookmarkStart w:name="_Toc1823417154" w:id="531594970"/>
-      <w:r>
-        <w:rPr/>
-        <w:t>Опис</w:t>
-      </w:r>
-      <w:r>
-        <w:rPr/>
-        <w:t xml:space="preserve"> </w:t>
-      </w:r>
-      <w:r>
-        <w:rPr/>
-        <w:t>коришћених</w:t>
-      </w:r>
-      <w:r>
-        <w:rPr/>
-        <w:t xml:space="preserve"> </w:t>
-      </w:r>
-      <w:r>
-        <w:rPr/>
-        <w:t>технологија</w:t>
-      </w:r>
-      <w:r>
-        <w:rPr>
-          <w:lang w:val="sr-Cyrl-RS"/>
-        </w:rPr>
-        <w:t xml:space="preserve"> и</w:t>
-      </w:r>
-      <w:r>
-        <w:rPr/>
-        <w:t xml:space="preserve"> </w:t>
-      </w:r>
-      <w:r>
-        <w:rPr>
-          <w:lang w:val="sr-Cyrl-RS"/>
-        </w:rPr>
-        <w:t>алата</w:t>
-      </w:r>
-      <w:bookmarkEnd w:id="531594970"/>
-    </w:p>
-    <w:p xmlns:wp14="http://schemas.microsoft.com/office/word/2010/wordml" wp14:textId="77777777">
-      <w:pPr>
-        <w:pStyle w:val="Heading2"/>
-      </w:pPr>
-      <w:r>
-        <w:t>Постојеће технологије (backend/frontend)</w:t>
-      </w:r>
-    </w:p>
-    <w:p xmlns:wp14="http://schemas.microsoft.com/office/word/2010/wordml" wp14:textId="77777777">
-      <w:pPr>
-        <w:pStyle w:val="BodyText"/>
-      </w:pPr>
-      <w:r>
-        <w:t>Backend четири сервиса (Gateway, AuthService, TripService, SharingService) реализован је у C#/.NET 8, хостован на Microsoft Service Fabric платформи [3] (stateless сервиси за Gateway/AuthService/TripService, stateful за SharingService), уз Entity Framework Core 8 за приступ подацима, YARP (Yet Another Reverse Proxy) [4] за Gateway рутирање, BCrypt.Net за хеширање лозинки и JWT Bearer аутентикацију. Подаци се чувају у Microsoft SQL Server бази, по принципу database-per-service (UsersDB, TripsDB, SharingDB). Frontend је React 19 (Vite) апликација која комуницира искључиво преко Gateway-а.</w:t>
-      </w:r>
-    </w:p>
-    <w:p>
-      <w:pPr>
-        <w:pStyle w:val="BodyText"/>
-      </w:pPr>
-      <w:r>
-        <w:t>У контексту Service Fabric платформе, stateless сервис не чува стање између позива на самом чвору — сваки захтев се може опслужити било којом инстанцом, а трајно стање се чува искључиво у спољној бази (SQL Server). Stateful сервис, насупрот томе, поседује локално, реплицирано стање непосредно на Service Fabric чворовима (Reliable Collections), поред спољне базе — тако да поједини подаци могу да се читају без мрежног позива ка бази. У овом пројекту, три сервиса (Gateway, AuthService, TripService) су stateless, док је SharingService stateful — детаљније објашњено у поглављу 4.</w:t>
-      </w:r>
-    </w:p>
-    <w:p xmlns:wp14="http://schemas.microsoft.com/office/word/2010/wordml" wp14:textId="77777777">
-      <w:pPr>
-        <w:pStyle w:val="Heading2"/>
-      </w:pPr>
-      <w:r>
-        <w:t>OpenTelemetry</w:t>
-      </w:r>
-    </w:p>
-    <w:p xmlns:wp14="http://schemas.microsoft.com/office/word/2010/wordml" wp14:textId="77777777">
-      <w:pPr>
-        <w:pStyle w:val="BodyText"/>
-      </w:pPr>
-      <w:r>
-        <w:t>OpenTelemetry (OTel) изабран је као централни стандард надоградње јер обједињује сва три облика телеметрије (traces, metrics, logs) под једним, vendor-неутралним API-јем и SDK-ом [1], са великим бројем готових ("auto") инструментација управо за технологије које пројекат већ користи — ASP.NET Core, HttpClient, SqlClient — тако да се велик део вредности добија без писања сопственог инструментационог кода. Верзија OpenTelemetry .NET SDK-а коришћена у раду је 1.18.0, конзистентна кроз сва четири сервиса.</w:t>
-      </w:r>
-    </w:p>
-    <w:p>
-      <w:pPr>
-        <w:pStyle w:val="BodyText"/>
-      </w:pPr>
-      <w:r>
-        <w:t>Алтернативе попут Application Insights-а или vendor-специфичних APM решења (нпр. Datadog, New Relic) су разматране, али одбачене управо због vendor lock-in-а — OTel омогућава промену backend-а за складиштење (Prometheus/Tempo/Loki → неко друго решење) без измене иједног сервиса, пошто је инструментациони код одвојен од места где телеметрија завршава.</w:t>
-      </w:r>
-    </w:p>
-    <w:p xmlns:wp14="http://schemas.microsoft.com/office/word/2010/wordml" wp14:textId="77777777">
-      <w:pPr>
-        <w:pStyle w:val="Heading2"/>
-      </w:pPr>
-      <w:r>
-        <w:t>OpenTelemetry Collector</w:t>
-      </w:r>
-    </w:p>
-    <w:p xmlns:wp14="http://schemas.microsoft.com/office/word/2010/wordml" wp14:textId="77777777">
-      <w:pPr>
-        <w:pStyle w:val="BodyText"/>
-      </w:pPr>
-      <w:r>
-        <w:t>Сервиси не шаљу телеметрију директно ка Prometheus/Tempo/Loki, већ ка једном централном OpenTelemetry Collector-у (OTLP протокол, gRPC на порту 4317). Ово раздваја „како апликација емитује телеметрију” од „где та телеметрија завршава” — каснија измена backend-а за складиштење (нпр. замена Loki-ја другим решењем) не би захтевала измену ниједног сервиса, само Collector-ове конфигурације [9].</w:t>
-      </w:r>
-    </w:p>
-    <w:p xmlns:wp14="http://schemas.microsoft.com/office/word/2010/wordml" wp14:textId="77777777">
-      <w:pPr>
-        <w:pStyle w:val="Heading2"/>
-      </w:pPr>
-      <w:r>
-        <w:t>Prometheus, Grafana Tempo, Grafana Loki</w:t>
-      </w:r>
-    </w:p>
-    <w:p xmlns:wp14="http://schemas.microsoft.com/office/word/2010/wordml" wp14:textId="77777777">
-      <w:pPr>
-        <w:pStyle w:val="BodyText"/>
-      </w:pPr>
-      <w:r>
-        <w:t>За складиштење три врсте телеметрије изабран је такозвани „Grafana stack”: Prometheus [8] за метрике (Collector излаже Prometheus-компатибилан /metrics endpoint који Prometheus периодично scrape-ује), Grafana Tempo [5] за дистрибуирано праћење захтева (trace-ове), и Grafana Loki [6] за централизоване логове. Предност ове комбинације над, на пример, самостојећим Jaeger-ом за tracing јесте што све три компоненте имају нативну, provisioned интеграцију са Grafanom — укључујући унакрсну навигацију (клик са log линије на њен trace, клик са trace-а на метрику) која је директно демонстрирана у поглављу 5.</w:t>
-      </w:r>
-    </w:p>
-    <w:p xmlns:wp14="http://schemas.microsoft.com/office/word/2010/wordml" wp14:textId="77777777">
-      <w:pPr>
-        <w:pStyle w:val="Heading2"/>
-      </w:pPr>
-      <w:r>
-        <w:t>Grafana</w:t>
-      </w:r>
-    </w:p>
-    <w:p xmlns:wp14="http://schemas.microsoft.com/office/word/2010/wordml" wp14:textId="77777777">
-      <w:pPr>
-        <w:pStyle w:val="BodyText"/>
-      </w:pPr>
-      <w:r>
-        <w:t>Grafana [10] је изабрана као јединствен визуелни слој за све три врсте телеметрије, уместо по једног специјализованог алата за сваку (нпр. Jaeger UI за trace-ове, посебан алат за метрике). Grafana подржава велики број data source-ова кроз plugin архитектуру, а Prometheus, Tempo и Loki су сви подржани нативно, без додатних plugin-ова, што је додатни разлог за избор баш ове платформе. Ово директно подржава сценарио „развијач види комплетну слику једног захтева на једном месту”, који је централна теза рада.</w:t>
-      </w:r>
-    </w:p>
-    <w:p xmlns:wp14="http://schemas.microsoft.com/office/word/2010/wordml" wp14:textId="77777777">
-      <w:pPr>
-        <w:pStyle w:val="Heading2"/>
-      </w:pPr>
-      <w:r>
-        <w:t>Health checks</w:t>
-      </w:r>
-    </w:p>
-    <w:p xmlns:wp14="http://schemas.microsoft.com/office/word/2010/wordml" wp14:textId="77777777">
-      <w:pPr>
-        <w:pStyle w:val="BodyText"/>
-      </w:pPr>
-      <w:r>
-        <w:t>Коришћен је уграђен ASP.NET Core механизам (Microsoft.Extensions.Diagnostics.HealthChecks) [2], допуњен пакетом AspNetCore.HealthChecks.SqlServer (верзија 9.0.0, компатибилна са .NET 8) за проверу доступности SQL Server базе по сервису.</w:t>
-      </w:r>
-    </w:p>
-    <w:p xmlns:wp14="http://schemas.microsoft.com/office/word/2010/wordml" wp14:textId="77777777">
-      <w:pPr>
-        <w:pStyle w:val="Heading2"/>
-      </w:pPr>
-      <w:r>
-        <w:t>k6</w:t>
-      </w:r>
-    </w:p>
-    <w:p xmlns:wp14="http://schemas.microsoft.com/office/word/2010/wordml" wp14:textId="77777777">
-      <w:pPr>
-        <w:pStyle w:val="BodyText"/>
-      </w:pPr>
-      <w:r>
-        <w:t>За демонстрацију понашања система под оптерећењем (сценарио 3, поглавље 5) коришћен је k6 (Grafana k6) [7], алат за load testing чији се скриптовани сценарији пишу у JavaScript-у, што га чини лакшим за одржавање и читање у односу на алтернативе попут JMeter-а.</w:t>
-      </w:r>
-    </w:p>
-    <w:p xmlns:wp14="http://schemas.microsoft.com/office/word/2010/wordml" wp14:textId="77777777">
-      <w:pPr>
-        <w:pStyle w:val="Heading2"/>
-      </w:pPr>
-      <w:r>
-        <w:t>xUnit</w:t>
-      </w:r>
-    </w:p>
-    <w:p xmlns:wp14="http://schemas.microsoft.com/office/word/2010/wordml" wp14:textId="77777777">
-      <w:pPr>
-        <w:pStyle w:val="BodyText"/>
-      </w:pPr>
-      <w:r>
-        <w:t>За аутоматизовано тестирање (поглавље 6) коришћен је xUnit [11], стандардни test framework за .NET који Microsoft подразумевано укључује у project template-е за .NET апликације, јер пројекат пре овог рада није имао дефинисан test framework нити иједан тест.</w:t>
-      </w:r>
-    </w:p>
-    <w:p xmlns:wp14="http://schemas.microsoft.com/office/word/2010/wordml" wp14:textId="77777777">
-      <w:pPr>
-        <w:pStyle w:val="Heading2"/>
-      </w:pPr>
-      <w:r>
-        <w:t>Docker / Docker Compose</w:t>
-      </w:r>
-    </w:p>
-    <w:p xmlns:wp14="http://schemas.microsoft.com/office/word/2010/wordml" wp14:textId="77777777">
-      <w:pPr>
-        <w:pStyle w:val="BodyText"/>
-      </w:pPr>
-      <w:r>
-        <w:t>Цела observability инфраструктура (Collector, Prometheus, Tempo, Loki, Grafana) покреће се кроз Docker Compose [12], алат за дефинисање и покретање вишеконтејнерских Docker апликација преко једног YAML фајла, независно од постојећег Service Fabric кластера и SQL Server инстанце — додатак, не замена постојећег начина рада система.</w:t>
-      </w:r>
-    </w:p>
-    <w:p>
-      <w:pPr>
-        <w:pStyle w:val="Heading1"/>
-        <w:rPr/>
-      </w:pPr>
-      <w:bookmarkStart w:name="_Toc459059121" w:id="1803461278"/>
-      <w:r>
-        <w:rPr>
-          <w:lang w:val="sr-Cyrl-RS"/>
-        </w:rPr>
-        <w:t xml:space="preserve">Опис </w:t>
-      </w:r>
-      <w:r>
-        <w:rPr/>
-        <w:t>почетног</w:t>
-      </w:r>
-      <w:r>
-        <w:rPr/>
-        <w:t xml:space="preserve"> </w:t>
-      </w:r>
-      <w:r>
-        <w:rPr/>
-        <w:t>решења</w:t>
-      </w:r>
-      <w:bookmarkEnd w:id="1803461278"/>
-    </w:p>
-    <w:p xmlns:wp14="http://schemas.microsoft.com/office/word/2010/wordml" wp14:textId="77777777">
-      <w:pPr>
-        <w:pStyle w:val="BodyText"/>
-      </w:pPr>
-      <w:r>
-        <w:t>У овом поглављу описано је стање система Travel Planner пре надоградње описане у овом раду — архитектура, технологије и, посебно, постојећи (или тачније, непостојећи) механизми обсервабилности, установљени детаљном анализом изворног кода.</w:t>
-      </w:r>
-    </w:p>
-    <w:p>
-      <w:pPr>
-        <w:pStyle w:val="BodyText"/>
-      </w:pPr>
-      <w:r>
-        <w:t>Слика 4.1 приказује изглед корисничког интерфејса апликације у тренутку почетка овог рада — списак планова путовања корисника.</w:t>
-      </w:r>
-    </w:p>
-    <w:p>
-      <w:pPr>
-        <w:pStyle w:val="BodyText"/>
-        <w:jc w:val="center"/>
-      </w:pPr>
-      <w:r/>
-      <w:r>
-        <w:drawing>
-          <wp:inline>
-            <wp:extent cx="5040000" cy="3678988"/>
-            <wp:docPr id="9" name="Picture 9"/>
-            <wp:cNvGraphicFramePr>
-              <a:graphicFrameLocks noChangeAspect="1"/>
-            </wp:cNvGraphicFramePr>
-            <a:graphic>
-              <a:graphicData uri="http://schemas.openxmlformats.org/drawingml/2006/picture">
-                <pic:pic>
-                  <pic:nvPicPr>
-                    <pic:cNvPr id="0" name="slika_1_1.png"/>
-                    <pic:cNvPicPr/>
-                  </pic:nvPicPr>
-                  <pic:blipFill>
-                    <a:blip r:embed="rId35"/>
-                    <a:stretch>
-                      <a:fillRect/>
-                    </a:stretch>
-                  </pic:blipFill>
-                  <pic:spPr>
-                    <a:xfrm>
-                      <a:off x="0" y="0"/>
-                      <a:ext cx="5040000" cy="3678988"/>
-                    </a:xfrm>
-                    <a:prstGeom prst="rect"/>
-                  </pic:spPr>
-                </pic:pic>
-              </a:graphicData>
-            </a:graphic>
-          </wp:inline>
-        </w:drawing>
-      </w:r>
-    </w:p>
-    <w:p>
-      <w:pPr>
-        <w:pStyle w:val="Slika"/>
-      </w:pPr>
-      <w:r>
-        <w:t>Слика 4.1. Изглед Travel Planner апликације — преглед планова путовања</w:t>
-      </w:r>
-    </w:p>
-    <w:p xmlns:wp14="http://schemas.microsoft.com/office/word/2010/wordml" wp14:textId="77777777">
-      <w:pPr>
-        <w:pStyle w:val="Heading2"/>
-      </w:pPr>
-      <w:r>
-        <w:t>Архитектура система</w:t>
-      </w:r>
-    </w:p>
-    <w:p xmlns:wp14="http://schemas.microsoft.com/office/word/2010/wordml" wp14:textId="77777777">
-      <w:pPr>
-        <w:pStyle w:val="BodyText"/>
-      </w:pPr>
-      <w:r>
-        <w:t>Систем чине четири одвојена сервиса на Microsoft Service Fabric платформи (значење појмова stateless и stateful објашњено је у поглављу 3):</w:t>
-      </w:r>
-    </w:p>
-    <w:p xmlns:wp14="http://schemas.microsoft.com/office/word/2010/wordml" wp14:textId="77777777">
-      <w:pPr>
-        <w:pStyle w:val="1nabrajanje"/>
-      </w:pPr>
-      <w:r>
-        <w:t>Gateway (stateless) — YARP reverse proxy, једина улазна тачка за frontend; рутира захтеве ка осталим сервисима по путањи, без сопствене пословне логике или базе.</w:t>
-      </w:r>
-    </w:p>
-    <w:p xmlns:wp14="http://schemas.microsoft.com/office/word/2010/wordml" wp14:textId="77777777">
-      <w:pPr>
-        <w:pStyle w:val="1nabrajanje"/>
-      </w:pPr>
-      <w:r>
-        <w:t>AuthService (stateless) — регистрација, пријава, издавање и потписивање JWT токена, улоге (Корисник/Admin), администрација корисничких налога. База UsersDB.</w:t>
-      </w:r>
-    </w:p>
-    <w:p xmlns:wp14="http://schemas.microsoft.com/office/word/2010/wordml" wp14:textId="77777777">
-      <w:pPr>
-        <w:pStyle w:val="1nabrajanje"/>
-      </w:pPr>
-      <w:r>
-        <w:t>TripService (stateless) — централни сервис са целокупним садржајем плана: дестинације, активности, трошкови/буџет, checklist, белешке, подсетници. База TripsDB.</w:t>
-      </w:r>
-    </w:p>
-    <w:p xmlns:wp14="http://schemas.microsoft.com/office/word/2010/wordml" wp14:textId="77777777">
-      <w:pPr>
-        <w:pStyle w:val="1nabrajanje"/>
-      </w:pPr>
-      <w:r>
-        <w:t>SharingService (stateful) — дељење плана путем кода/QR-а (VIEW/EDIT). SharingDB је извор истине, а важећи кодови се додатно кеширају у Service Fabric Reliable Collections ради брже валидације — то је разлог зашто је баш овај сервис stateful.</w:t>
+        <w:t>Слика 4.2. Дељење плана путовања путем кода/QR кода</w:t>
       </w:r>
     </w:p>
     <w:p xmlns:wp14="http://schemas.microsoft.com/office/word/2010/wordml" wp14:textId="77777777">
@@ -10364,7 +10364,7 @@
         <w:jc w:val="center"/>
       </w:pPr>
       <w:r>
-        <w:t>Слика 4.2. Архитектура система пре надоградње</w:t>
+        <w:t>Слика 4.3. Архитектура система пре надоградње</w:t>
       </w:r>
       <w:bookmarkEnd w:id="100"/>
     </w:p>
@@ -10414,7 +10414,7 @@
         <w:pStyle w:val="Slika"/>
       </w:pPr>
       <w:r>
-        <w:t>Слика 4.3. Service Fabric Explorer — сва четири сервиса здрава (Healthy)</w:t>
+        <w:t>Слика 4.4. Service Fabric Explorer — сва четири сервиса здрава (Healthy)</w:t>
       </w:r>
     </w:p>
     <w:p xmlns:wp14="http://schemas.microsoft.com/office/word/2010/wordml" wp14:textId="77777777">

</xml_diff>

<commit_message>
docs: fix List of Figures line-wrap and update figure count from 11 to 12 in both bib cards
</commit_message>
<xml_diff>
--- a/docs/diplomski-rad.docx
+++ b/docs/diplomski-rad.docx
@@ -2136,7 +2136,7 @@
                 <w:szCs w:val="18"/>
                 <w:lang w:val="sr-Cyrl-RS"/>
               </w:rPr>
-              <w:t xml:space="preserve"> страна / 12 цитата / 2 табеле / 11 слика / 0 графика / 0 прилога</w:t>
+              <w:t xml:space="preserve"> страна / 12 цитата / 2 табеле / 12 слика / 0 графика / 0 прилога</w:t>
             </w:r>
           </w:p>
         </w:tc>
@@ -4670,7 +4670,7 @@
                 <w:sz w:val="18"/>
                 <w:szCs w:val="18"/>
               </w:rPr>
-              <w:t xml:space="preserve"> pages / 12 references / 2 tables / 11 figures / 0 graphs / 0 appendixes</w:t>
+              <w:t xml:space="preserve"> pages / 12 references / 2 tables / 12 figures / 0 graphs / 0 appendixes</w:t>
             </w:r>
           </w:p>
         </w:tc>
@@ -8112,7 +8112,7 @@
         <w:pStyle w:val="BodyText"/>
       </w:pPr>
       <w:r>
-        <w:t>Слика 4.1. Изглед Travel Planner апликације — преглед планова путовања ............................ 8</w:t>
+        <w:t>Слика 4.1. Изглед Travel Planner апликације — преглед планова путовања .................. 8</w:t>
       </w:r>
     </w:p>
     <w:p>
@@ -8184,7 +8184,7 @@
         <w:pStyle w:val="BodyText"/>
       </w:pPr>
       <w:r>
-        <w:t>Слика 6.2. Неуспешан тест након намерног враћања „тихог” catch блока ............................. 15</w:t>
+        <w:t>Слика 6.2. Неуспешан тест након намерног враћања „тихог” catch блока ................... 15</w:t>
       </w:r>
     </w:p>
     <w:p>

</xml_diff>

<commit_message>
docs: distribute technology references throughout implementation chapters (4-6), not just chapter 3, to address literature-usage feedback
</commit_message>
<xml_diff>
--- a/docs/diplomski-rad.docx
+++ b/docs/diplomski-rad.docx
@@ -9599,7 +9599,7 @@
         <w:pStyle w:val="BodyText"/>
       </w:pPr>
       <w:r>
-        <w:t>Ниједан сервис не излаже endpoint преко ког би се споља (оркестрација, monitoring алат, човек) проверило да ли сервис стварно ради и да ли су његове зависности (база, други сервиси) доступне. Service Fabric поседује сопствени интерни health модел, али му се health стање апликационог нивоа (нпр. „да ли TripService може да се повеже на своју базу“) никада не пријављује.</w:t>
+        <w:t>Ниједан сервис не излаже endpoint преко ког би се споља (оркестрација, monitoring алат, човек) проверило да ли сервис стварно ради и да ли су његове зависности (база, други сервиси) доступне. Service Fabric [3] поседује сопствени интерни health модел, али му се health стање апликационог нивоа (нпр. „да ли TripService може да се повеже на своју базу“) никада не пријављује.</w:t>
       </w:r>
     </w:p>
     <w:p xmlns:wp14="http://schemas.microsoft.com/office/word/2010/wordml" wp14:textId="77777777">
@@ -10233,7 +10233,7 @@
         <w:pStyle w:val="BodyText"/>
       </w:pPr>
       <w:r>
-        <w:t>Систем чине четири одвојена сервиса на Microsoft Service Fabric платформи (значење појмова stateless и stateful објашњено је у поглављу 3):</w:t>
+        <w:t>Систем чине четири одвојена сервиса на Microsoft Service Fabric [3] платформи (значење појмова stateless и stateful објашњено је у поглављу 3):</w:t>
       </w:r>
     </w:p>
     <w:p xmlns:wp14="http://schemas.microsoft.com/office/word/2010/wordml" wp14:textId="77777777">
@@ -10241,7 +10241,7 @@
         <w:pStyle w:val="1nabrajanje"/>
       </w:pPr>
       <w:r>
-        <w:t>Gateway (stateless) — YARP reverse proxy, једина улазна тачка за frontend; рутира захтеве ка осталим сервисима по путањи, без сопствене пословне логике или базе.</w:t>
+        <w:t>Gateway (stateless) — YARP [4] reverse proxy, једина улазна тачка за frontend; рутира захтеве ка осталим сервисима по путањи, без сопствене пословне логике или базе.</w:t>
       </w:r>
     </w:p>
     <w:p xmlns:wp14="http://schemas.microsoft.com/office/word/2010/wordml" wp14:textId="77777777">
@@ -10865,7 +10865,7 @@
         <w:pStyle w:val="BodyText"/>
       </w:pPr>
       <w:r>
-        <w:t>Свих четири сервиса шаљу телеметрију преко OTLP протокола ка једном OpenTelemetry Collector-у, који је даље усмерава: trace-ове ка Tempo-у, метрике ка Prometheus-у (преко сопственог /metrics endpoint-а који Prometheus периодично scrape-uje), логове ка Loki-ју. Grafana приказује сва три извора обједињено, укључујући унакрсну навигацију (log линија → trace, trace → метрика).</w:t>
+        <w:t>Свих четири сервиса шаљу телеметрију преко OTLP протокола ка једном OpenTelemetry Collector-у [9], који је даље усмерава: trace-ове ка Tempo-у [5], метрике ка Prometheus-у [8] (преко сопственог /metrics endpoint-а који Prometheus периодично scrape-uje), логове ка Loki-ју [6]. Grafana [10] приказује сва три извора обједињено, укључујући унакрсну навигацију (log линија → trace, trace → метрика).</w:t>
       </w:r>
     </w:p>
     <w:p xmlns:wp14="http://schemas.microsoft.com/office/word/2010/wordml" wp14:textId="77777777">
@@ -10940,7 +10940,7 @@
         <w:pStyle w:val="BodyText"/>
       </w:pPr>
       <w:r>
-        <w:t>Сваки сервис излаже два endpoint-а: /health/live (процес је жив, не додирује зависности — намењен одлукама о рестарту) и /health/ready (процес и критичне зависности спремни да опслуже саобраћај). За AuthService/TripService/SharingService, /health/ready проверава доступност сопствене SQL Server базе. Gateway нема сопствену базу — његов /health/ready проверава мрежну доступност три downstream сервиса, преко истих адреса које YARP већ користи за рутирање (без дуплирања конфигурације). Одговор је структурисан JSON са статусом сваке појединачне провере и, у случају грешке, читљивом поруком.</w:t>
+        <w:t>Сваки сервис излаже два endpoint-а [2]: /health/live (процес је жив, не додирује зависности — намењен одлукама о рестарту) и /health/ready (процес и критичне зависности спремни да опслуже саобраћај). За AuthService/TripService/SharingService, /health/ready проверава доступност сопствене SQL Server базе. Gateway нема сопствену базу — његов /health/ready проверава мрежну доступност три downstream сервиса, преко истих адреса које YARP већ користи за рутирање (без дуплирања конфигурације). Одговор је структурисан JSON са статусом сваке појединачне провере и, у случају грешке, читљивом поруком.</w:t>
       </w:r>
     </w:p>
     <w:p>
@@ -11005,7 +11005,7 @@
         <w:pStyle w:val="BodyText"/>
       </w:pPr>
       <w:r>
-        <w:t>Заједничка OpenTelemetry конфигурација (traces + metrics + logs) дефинисана је у по једној ObservabilityExtensions класи по сервису (исти образац поновљен по сервису, јер пројекат нема дељену библиотеку између сервиса), и укључује:</w:t>
+        <w:t>Заједничка OpenTelemetry [1] конфигурација (traces + metrics + logs) дефинисана је у по једној ObservabilityExtensions класи по сервису (исти образац поновљен по сервису, јер пројекат нема дељену библиотеку између сервиса), и укључује:</w:t>
       </w:r>
     </w:p>
     <w:p xmlns:wp14="http://schemas.microsoft.com/office/word/2010/wordml" wp14:textId="77777777">
@@ -11053,7 +11053,7 @@
         <w:pStyle w:val="BodyText"/>
       </w:pPr>
       <w:r>
-        <w:t>Provisioned dashboard „Travel Planner - Overview” приказује RED метрике (request rate, error rate, p95 latency), ресурсе (меморија/CPU/GC) и ток логова, све филтрирано по сервису преко template варијабле. Datasource-и (Prometheus/Tempo/Loki) су такође provisioned, укључујући derived field везу која омогућава да се из log линије у Loki-ју једним кликом отвори одговарајући trace у Tempo-у.</w:t>
+        <w:t>Provisioned dashboard [10] „Travel Planner - Overview” приказује RED метрике (request rate, error rate, p95 latency), ресурсе (меморија/CPU/GC) и ток логова, све филтрирано по сервису преко template варијабле. Datasource-и (Prometheus/Tempo/Loki) су такође provisioned, укључујући derived field везу која омогућава да се из log линије у Loki-ју једним кликом отвори одговарајући trace у Tempo-у.</w:t>
       </w:r>
     </w:p>
     <w:p>
@@ -11220,7 +11220,7 @@
         <w:pStyle w:val="BodyText"/>
       </w:pPr>
       <w:r>
-        <w:t>Четири xUnit пројекта (по један за сваки сервис) не користе WebApplicationFactory (Service Fabric hosting модел нема класичну Program улазну тачку потребну за то) — сваки тест подиже прав Kestrel host на ефемерном порту преко издвојених ConfigureServices/ConfigurePipeline метода, без mock-а базе података.</w:t>
+        <w:t>Четири xUnit [11] пројекта (по један за сваки сервис) не користе WebApplicationFactory (Service Fabric hosting модел нема класичну Program улазну тачку потребну за то) — сваки тест подиже прав Kestrel host на ефемерном порту преко издвојених ConfigureServices/ConfigurePipeline метода, без mock-а базе података.</w:t>
       </w:r>
     </w:p>
     <w:p xmlns:wp14="http://schemas.microsoft.com/office/word/2010/wordml" wp14:textId="77777777">
@@ -11777,7 +11777,7 @@
         <w:pStyle w:val="BodyText"/>
       </w:pPr>
       <w:r>
-        <w:t>k6 load test (скрипта: observability/load-tests/scenario3-load-test.js) са расподелом до 30 паралелних виртуелних корисника, реалистичан ток (пријава па преглед планова). Резултат: 780 захтева, 0% неуспешних, p95 латенција измерена на клијенту (k6) износила је 2.12 секунде, а независно измерена на серверу (Prometheus хистограм из OTel метрике) 2.14 секунде — готово идентично, што потврђује да метрике стварно одражавају понашање система под оптерећењем, не само да „нешто броје”.</w:t>
+        <w:t>k6 [7] load test (скрипта: observability/load-tests/scenario3-load-test.js) са расподелом до 30 паралелних виртуелних корисника, реалистичан ток (пријава па преглед планова). Резултат: 780 захтева, 0% неуспешних, p95 латенција измерена на клијенту (k6) износила је 2.12 секунде, а независно измерена на серверу (Prometheus хистограм из OTel метрике) 2.14 секунде — готово идентично, што потврђује да метрике стварно одражавају понашање система под оптерећењем, не само да „нешто броје”.</w:t>
       </w:r>
     </w:p>
     <w:p>

</xml_diff>

<commit_message>
docs: apply professor's third-round corrections - updated title, filled committee members, cleaned physical description fields, justified abstracts, reverted bullet font to Times New Roman per explicit instruction, updated Table of Contents with full subsection structure, removed leftover MSIP sensitivity watermark
</commit_message>
<xml_diff>
--- a/docs/diplomski-rad.docx
+++ b/docs/diplomski-rad.docx
@@ -337,6 +337,31 @@
         </w:rPr>
         <w:t>СЕРВАБИЛНОСТИ МИКРОСЕРВИСНЕ АРХИТЕКТУРЕ</w:t>
       </w:r>
+      <w:r>
+        <w:rPr>
+          <w:rFonts w:ascii="Arial" w:hAnsi="Arial"/>
+          <w:b/>
+          <w:sz w:val="50"/>
+        </w:rPr>
+        <w:t xml:space="preserve"> на примеру </w:t>
+      </w:r>
+      <w:r>
+        <w:rPr>
+          <w:rFonts w:ascii="Arial" w:hAnsi="Arial"/>
+          <w:b/>
+          <w:i/>
+          <w:sz w:val="50"/>
+        </w:rPr>
+        <w:t>TravelPlanner</w:t>
+      </w:r>
+      <w:r>
+        <w:rPr>
+          <w:rFonts w:ascii="Arial" w:hAnsi="Arial"/>
+          <w:b/>
+          <w:sz w:val="50"/>
+        </w:rPr>
+        <w:t xml:space="preserve"> апликације</w:t>
+      </w:r>
     </w:p>
     <w:p>
       <w:pPr>
@@ -1327,6 +1352,13 @@
                 <w:sz w:val="18"/>
               </w:rPr>
             </w:r>
+            <w:r>
+              <w:rPr>
+                <w:rFonts w:ascii="Arial" w:hAnsi="Arial"/>
+                <w:sz w:val="18"/>
+              </w:rPr>
+              <w:t xml:space="preserve"> на примеру TravelPlanner апликације</w:t>
+            </w:r>
           </w:p>
         </w:tc>
       </w:tr>
@@ -2116,7 +2148,7 @@
                 <w:szCs w:val="18"/>
                 <w:lang w:val="sr-Cyrl-RS"/>
               </w:rPr>
-              <w:t xml:space="preserve">7 поглавља / </w:t>
+              <w:t>7 / 21 / 12 / 2 / 12 / 0 / 0</w:t>
             </w:r>
             <w:r>
               <w:rPr>
@@ -2126,7 +2158,6 @@
                 <w:szCs w:val="18"/>
                 <w:lang w:val="sr-Cyrl-RS"/>
               </w:rPr>
-              <w:t>21</w:t>
             </w:r>
             <w:r>
               <w:rPr>
@@ -2136,7 +2167,6 @@
                 <w:szCs w:val="18"/>
                 <w:lang w:val="sr-Cyrl-RS"/>
               </w:rPr>
-              <w:t xml:space="preserve"> страна / 12 цитата / 2 табеле / 12 слика / 0 графика / 0 прилога</w:t>
             </w:r>
           </w:p>
         </w:tc>
@@ -2778,6 +2808,7 @@
           <w:p>
             <w:pPr>
               <w:spacing w:before="60" w:after="60"/>
+              <w:jc w:val="both"/>
               <w:rPr>
                 <w:rFonts w:ascii="Arial" w:hAnsi="Arial"/>
                 <w:sz w:val="18"/>
@@ -3062,6 +3093,9 @@
                 <w:lang w:val="sr-Cyrl-RS"/>
               </w:rPr>
             </w:pPr>
+            <w:r>
+              <w:t>др Милана Бојанић, ванредни професор</w:t>
+            </w:r>
           </w:p>
         </w:tc>
       </w:tr>
@@ -3127,6 +3161,9 @@
                 <w:sz w:val="18"/>
               </w:rPr>
             </w:pPr>
+            <w:r>
+              <w:t>др Бојан Јелачић, доцент</w:t>
+            </w:r>
           </w:p>
         </w:tc>
         <w:tc>
@@ -3993,6 +4030,13 @@
                 <w:sz w:val="18"/>
               </w:rPr>
             </w:r>
+            <w:r>
+              <w:rPr>
+                <w:rFonts w:ascii="Arial" w:hAnsi="Arial"/>
+                <w:sz w:val="18"/>
+              </w:rPr>
+              <w:t xml:space="preserve"> on example TravelPlanner application</w:t>
+            </w:r>
           </w:p>
         </w:tc>
       </w:tr>
@@ -4652,7 +4696,7 @@
                 <w:sz w:val="18"/>
                 <w:szCs w:val="18"/>
               </w:rPr>
-              <w:t xml:space="preserve">7 chapters / </w:t>
+              <w:t>7 / 21 / 12 / 2 / 12 / 0 / 0</w:t>
             </w:r>
             <w:r>
               <w:rPr>
@@ -4661,7 +4705,6 @@
                 <w:sz w:val="18"/>
                 <w:szCs w:val="18"/>
               </w:rPr>
-              <w:t>21</w:t>
             </w:r>
             <w:r>
               <w:rPr>
@@ -4670,7 +4713,6 @@
                 <w:sz w:val="18"/>
                 <w:szCs w:val="18"/>
               </w:rPr>
-              <w:t xml:space="preserve"> pages / 12 references / 2 tables / 12 figures / 0 graphs / 0 appendixes</w:t>
             </w:r>
           </w:p>
         </w:tc>
@@ -5224,6 +5266,7 @@
           <w:p>
             <w:pPr>
               <w:spacing w:before="60" w:after="60"/>
+              <w:jc w:val="both"/>
               <w:rPr>
                 <w:rFonts w:ascii="Arial" w:hAnsi="Arial"/>
                 <w:sz w:val="18"/>
@@ -5489,6 +5532,9 @@
                 <w:sz w:val="18"/>
               </w:rPr>
             </w:pPr>
+            <w:r>
+              <w:t>PhD Milana Bojanić, Associate professor</w:t>
+            </w:r>
           </w:p>
         </w:tc>
       </w:tr>
@@ -5565,6 +5611,9 @@
                 <w:sz w:val="18"/>
               </w:rPr>
             </w:pPr>
+            <w:r>
+              <w:t>PhD Bojan Jelačić, Assistant professor</w:t>
+            </w:r>
           </w:p>
         </w:tc>
         <w:tc>
@@ -6547,6 +6596,9 @@
             <w:tcMar/>
           </w:tcPr>
           <w:p xmlns:wp14="http://schemas.microsoft.com/office/word/2010/wordml" wp14:textId="672E259C">
+            <w:pPr>
+              <w:jc w:val="both"/>
+            </w:pPr>
             <w:r>
               <w:rPr/>
               <w:t xml:space="preserve">Анализирати </w:t>
@@ -7819,6 +7871,86 @@
     </w:p>
     <w:p>
       <w:pPr>
+        <w:pStyle w:val="TOC2"/>
+        <w:tabs>
+          <w:tab w:pos="480" w:val="left"/>
+          <w:tab w:pos="9113" w:val="right" w:leader="dot"/>
+        </w:tabs>
+      </w:pPr>
+      <w:r>
+        <w:t>2.1.</w:t>
+        <w:tab/>
+        <w:t>Немогуће праћење захтева кроз више сервиса</w:t>
+        <w:tab/>
+        <w:t>5</w:t>
+      </w:r>
+    </w:p>
+    <w:p>
+      <w:pPr>
+        <w:pStyle w:val="TOC2"/>
+        <w:tabs>
+          <w:tab w:pos="480" w:val="left"/>
+          <w:tab w:pos="9113" w:val="right" w:leader="dot"/>
+        </w:tabs>
+      </w:pPr>
+      <w:r>
+        <w:t>2.2.</w:t>
+        <w:tab/>
+        <w:t>Одсуство метрика перформанси</w:t>
+        <w:tab/>
+        <w:t>5</w:t>
+      </w:r>
+    </w:p>
+    <w:p>
+      <w:pPr>
+        <w:pStyle w:val="TOC2"/>
+        <w:tabs>
+          <w:tab w:pos="480" w:val="left"/>
+          <w:tab w:pos="9113" w:val="right" w:leader="dot"/>
+        </w:tabs>
+      </w:pPr>
+      <w:r>
+        <w:t>2.3.</w:t>
+        <w:tab/>
+        <w:t>Тихе грешке</w:t>
+        <w:tab/>
+        <w:t>5</w:t>
+      </w:r>
+    </w:p>
+    <w:p>
+      <w:pPr>
+        <w:pStyle w:val="TOC2"/>
+        <w:tabs>
+          <w:tab w:pos="480" w:val="left"/>
+          <w:tab w:pos="9113" w:val="right" w:leader="dot"/>
+        </w:tabs>
+      </w:pPr>
+      <w:r>
+        <w:t>2.4.</w:t>
+        <w:tab/>
+        <w:t>Одсуство health check механизама</w:t>
+        <w:tab/>
+        <w:t>5</w:t>
+      </w:r>
+    </w:p>
+    <w:p>
+      <w:pPr>
+        <w:pStyle w:val="TOC2"/>
+        <w:tabs>
+          <w:tab w:pos="480" w:val="left"/>
+          <w:tab w:pos="9113" w:val="right" w:leader="dot"/>
+        </w:tabs>
+      </w:pPr>
+      <w:r>
+        <w:t>2.5.</w:t>
+        <w:tab/>
+        <w:t>Нестандардизовано, минимално логовање</w:t>
+        <w:tab/>
+        <w:t>5</w:t>
+      </w:r>
+    </w:p>
+    <w:p>
+      <w:pPr>
         <w:pStyle w:val="TOC1"/>
         <w:tabs>
           <w:tab w:val="left" w:leader="none" w:pos="480"/>
@@ -7853,6 +7985,150 @@
     </w:p>
     <w:p>
       <w:pPr>
+        <w:pStyle w:val="TOC2"/>
+        <w:tabs>
+          <w:tab w:pos="480" w:val="left"/>
+          <w:tab w:pos="9113" w:val="right" w:leader="dot"/>
+        </w:tabs>
+      </w:pPr>
+      <w:r>
+        <w:t>3.1.</w:t>
+        <w:tab/>
+        <w:t>Постојеће технологије (backend/frontend)</w:t>
+        <w:tab/>
+        <w:t>6</w:t>
+      </w:r>
+    </w:p>
+    <w:p>
+      <w:pPr>
+        <w:pStyle w:val="TOC2"/>
+        <w:tabs>
+          <w:tab w:pos="480" w:val="left"/>
+          <w:tab w:pos="9113" w:val="right" w:leader="dot"/>
+        </w:tabs>
+      </w:pPr>
+      <w:r>
+        <w:t>3.2.</w:t>
+        <w:tab/>
+        <w:t>OpenTelemetry</w:t>
+        <w:tab/>
+        <w:t>6</w:t>
+      </w:r>
+    </w:p>
+    <w:p>
+      <w:pPr>
+        <w:pStyle w:val="TOC2"/>
+        <w:tabs>
+          <w:tab w:pos="480" w:val="left"/>
+          <w:tab w:pos="9113" w:val="right" w:leader="dot"/>
+        </w:tabs>
+      </w:pPr>
+      <w:r>
+        <w:t>3.3.</w:t>
+        <w:tab/>
+        <w:t>OpenTelemetry Collector</w:t>
+        <w:tab/>
+        <w:t>6</w:t>
+      </w:r>
+    </w:p>
+    <w:p>
+      <w:pPr>
+        <w:pStyle w:val="TOC2"/>
+        <w:tabs>
+          <w:tab w:pos="480" w:val="left"/>
+          <w:tab w:pos="9113" w:val="right" w:leader="dot"/>
+        </w:tabs>
+      </w:pPr>
+      <w:r>
+        <w:t>3.4.</w:t>
+        <w:tab/>
+        <w:t>Prometheus, Grafana Tempo, Grafana Loki</w:t>
+        <w:tab/>
+        <w:t>6</w:t>
+      </w:r>
+    </w:p>
+    <w:p>
+      <w:pPr>
+        <w:pStyle w:val="TOC2"/>
+        <w:tabs>
+          <w:tab w:pos="480" w:val="left"/>
+          <w:tab w:pos="9113" w:val="right" w:leader="dot"/>
+        </w:tabs>
+      </w:pPr>
+      <w:r>
+        <w:t>3.5.</w:t>
+        <w:tab/>
+        <w:t>Grafana</w:t>
+        <w:tab/>
+        <w:t>7</w:t>
+      </w:r>
+    </w:p>
+    <w:p>
+      <w:pPr>
+        <w:pStyle w:val="TOC2"/>
+        <w:tabs>
+          <w:tab w:pos="480" w:val="left"/>
+          <w:tab w:pos="9113" w:val="right" w:leader="dot"/>
+        </w:tabs>
+      </w:pPr>
+      <w:r>
+        <w:t>3.6.</w:t>
+        <w:tab/>
+        <w:t>Health checks</w:t>
+        <w:tab/>
+        <w:t>7</w:t>
+      </w:r>
+    </w:p>
+    <w:p>
+      <w:pPr>
+        <w:pStyle w:val="TOC2"/>
+        <w:tabs>
+          <w:tab w:pos="480" w:val="left"/>
+          <w:tab w:pos="9113" w:val="right" w:leader="dot"/>
+        </w:tabs>
+      </w:pPr>
+      <w:r>
+        <w:t>3.7.</w:t>
+        <w:tab/>
+        <w:t>k6</w:t>
+        <w:tab/>
+        <w:t>7</w:t>
+      </w:r>
+    </w:p>
+    <w:p>
+      <w:pPr>
+        <w:pStyle w:val="TOC2"/>
+        <w:tabs>
+          <w:tab w:pos="480" w:val="left"/>
+          <w:tab w:pos="9113" w:val="right" w:leader="dot"/>
+        </w:tabs>
+      </w:pPr>
+      <w:r>
+        <w:t>3.8.</w:t>
+        <w:tab/>
+        <w:t>xUnit</w:t>
+        <w:tab/>
+        <w:t>7</w:t>
+      </w:r>
+    </w:p>
+    <w:p>
+      <w:pPr>
+        <w:pStyle w:val="TOC2"/>
+        <w:tabs>
+          <w:tab w:pos="480" w:val="left"/>
+          <w:tab w:pos="9113" w:val="right" w:leader="dot"/>
+        </w:tabs>
+      </w:pPr>
+      <w:r>
+        <w:t>3.9.</w:t>
+        <w:tab/>
+        <w:t>Docker / Docker Compose</w:t>
+        <w:tab/>
+        <w:t>7</w:t>
+      </w:r>
+    </w:p>
+    <w:p>
+      <w:pPr>
         <w:pStyle w:val="TOC1"/>
         <w:tabs>
           <w:tab w:val="left" w:leader="none" w:pos="480"/>
@@ -7887,6 +8163,38 @@
     </w:p>
     <w:p>
       <w:pPr>
+        <w:pStyle w:val="TOC2"/>
+        <w:tabs>
+          <w:tab w:pos="480" w:val="left"/>
+          <w:tab w:pos="9113" w:val="right" w:leader="dot"/>
+        </w:tabs>
+      </w:pPr>
+      <w:r>
+        <w:t>4.1.</w:t>
+        <w:tab/>
+        <w:t>Архитектура система</w:t>
+        <w:tab/>
+        <w:t>8</w:t>
+      </w:r>
+    </w:p>
+    <w:p>
+      <w:pPr>
+        <w:pStyle w:val="TOC2"/>
+        <w:tabs>
+          <w:tab w:pos="480" w:val="left"/>
+          <w:tab w:pos="9113" w:val="right" w:leader="dot"/>
+        </w:tabs>
+      </w:pPr>
+      <w:r>
+        <w:t>4.2.</w:t>
+        <w:tab/>
+        <w:t>Постојећи механизми обсервабилности</w:t>
+        <w:tab/>
+        <w:t>10</w:t>
+      </w:r>
+    </w:p>
+    <w:p>
+      <w:pPr>
         <w:pStyle w:val="TOC1"/>
         <w:tabs>
           <w:tab w:val="left" w:leader="none" w:pos="480"/>
@@ -7921,6 +8229,70 @@
     </w:p>
     <w:p>
       <w:pPr>
+        <w:pStyle w:val="TOC2"/>
+        <w:tabs>
+          <w:tab w:pos="480" w:val="left"/>
+          <w:tab w:pos="9113" w:val="right" w:leader="dot"/>
+        </w:tabs>
+      </w:pPr>
+      <w:r>
+        <w:t>5.1.</w:t>
+        <w:tab/>
+        <w:t>TO-BE архитектура</w:t>
+        <w:tab/>
+        <w:t>11</w:t>
+      </w:r>
+    </w:p>
+    <w:p>
+      <w:pPr>
+        <w:pStyle w:val="TOC2"/>
+        <w:tabs>
+          <w:tab w:pos="480" w:val="left"/>
+          <w:tab w:pos="9113" w:val="right" w:leader="dot"/>
+        </w:tabs>
+      </w:pPr>
+      <w:r>
+        <w:t>5.2.</w:t>
+        <w:tab/>
+        <w:t>Health checks</w:t>
+        <w:tab/>
+        <w:t>11</w:t>
+      </w:r>
+    </w:p>
+    <w:p>
+      <w:pPr>
+        <w:pStyle w:val="TOC2"/>
+        <w:tabs>
+          <w:tab w:pos="480" w:val="left"/>
+          <w:tab w:pos="9113" w:val="right" w:leader="dot"/>
+        </w:tabs>
+      </w:pPr>
+      <w:r>
+        <w:t>5.3.</w:t>
+        <w:tab/>
+        <w:t>Инструментација сервиса</w:t>
+        <w:tab/>
+        <w:t>12</w:t>
+      </w:r>
+    </w:p>
+    <w:p>
+      <w:pPr>
+        <w:pStyle w:val="TOC2"/>
+        <w:tabs>
+          <w:tab w:pos="480" w:val="left"/>
+          <w:tab w:pos="9113" w:val="right" w:leader="dot"/>
+        </w:tabs>
+      </w:pPr>
+      <w:r>
+        <w:t>5.4.</w:t>
+        <w:tab/>
+        <w:t>Grafana dashboard</w:t>
+        <w:tab/>
+        <w:t>12</w:t>
+      </w:r>
+    </w:p>
+    <w:p>
+      <w:pPr>
         <w:pStyle w:val="TOC1"/>
         <w:tabs>
           <w:tab w:val="left" w:leader="none" w:pos="480"/>
@@ -7955,6 +8327,150 @@
     </w:p>
     <w:p>
       <w:pPr>
+        <w:pStyle w:val="TOC2"/>
+        <w:tabs>
+          <w:tab w:pos="480" w:val="left"/>
+          <w:tab w:pos="9113" w:val="right" w:leader="dot"/>
+        </w:tabs>
+      </w:pPr>
+      <w:r>
+        <w:t>6.1.</w:t>
+        <w:tab/>
+        <w:t>Рефакторинг ради тестабилности</w:t>
+        <w:tab/>
+        <w:t>14</w:t>
+      </w:r>
+    </w:p>
+    <w:p>
+      <w:pPr>
+        <w:pStyle w:val="TOC2"/>
+        <w:tabs>
+          <w:tab w:pos="480" w:val="left"/>
+          <w:tab w:pos="9113" w:val="right" w:leader="dot"/>
+        </w:tabs>
+      </w:pPr>
+      <w:r>
+        <w:t>6.2.</w:t>
+        <w:tab/>
+        <w:t>Тест пројекти и стратегија</w:t>
+        <w:tab/>
+        <w:t>14</w:t>
+      </w:r>
+    </w:p>
+    <w:p>
+      <w:pPr>
+        <w:pStyle w:val="TOC2"/>
+        <w:tabs>
+          <w:tab w:pos="480" w:val="left"/>
+          <w:tab w:pos="9113" w:val="right" w:leader="dot"/>
+        </w:tabs>
+      </w:pPr>
+      <w:r>
+        <w:t>6.3.</w:t>
+        <w:tab/>
+        <w:t>Резултати</w:t>
+        <w:tab/>
+        <w:t>15</w:t>
+      </w:r>
+    </w:p>
+    <w:p>
+      <w:pPr>
+        <w:pStyle w:val="TOC2"/>
+        <w:tabs>
+          <w:tab w:pos="480" w:val="left"/>
+          <w:tab w:pos="9113" w:val="right" w:leader="dot"/>
+        </w:tabs>
+      </w:pPr>
+      <w:r>
+        <w:t>6.4.</w:t>
+        <w:tab/>
+        <w:t>Демонстрација неуспешног теста</w:t>
+        <w:tab/>
+        <w:t>15</w:t>
+      </w:r>
+    </w:p>
+    <w:p>
+      <w:pPr>
+        <w:pStyle w:val="TOC2"/>
+        <w:tabs>
+          <w:tab w:pos="480" w:val="left"/>
+          <w:tab w:pos="9113" w:val="right" w:leader="dot"/>
+        </w:tabs>
+      </w:pPr>
+      <w:r>
+        <w:t>6.5.</w:t>
+        <w:tab/>
+        <w:t>Демонстрациони сценарији</w:t>
+        <w:tab/>
+        <w:t>16</w:t>
+      </w:r>
+    </w:p>
+    <w:p>
+      <w:pPr>
+        <w:pStyle w:val="TOC3"/>
+        <w:tabs>
+          <w:tab w:pos="480" w:val="left"/>
+          <w:tab w:pos="9113" w:val="right" w:leader="dot"/>
+        </w:tabs>
+      </w:pPr>
+      <w:r>
+        <w:t>6.5.1.</w:t>
+        <w:tab/>
+        <w:t>Сценарио 1 — нормалан захтев кроз више сервиса</w:t>
+        <w:tab/>
+        <w:t>16</w:t>
+      </w:r>
+    </w:p>
+    <w:p>
+      <w:pPr>
+        <w:pStyle w:val="TOC3"/>
+        <w:tabs>
+          <w:tab w:pos="480" w:val="left"/>
+          <w:tab w:pos="9113" w:val="right" w:leader="dot"/>
+        </w:tabs>
+      </w:pPr>
+      <w:r>
+        <w:t>6.5.2.</w:t>
+        <w:tab/>
+        <w:t>Сценарио 2 — грешка (пад зависности)</w:t>
+        <w:tab/>
+        <w:t>16</w:t>
+      </w:r>
+    </w:p>
+    <w:p>
+      <w:pPr>
+        <w:pStyle w:val="TOC3"/>
+        <w:tabs>
+          <w:tab w:pos="480" w:val="left"/>
+          <w:tab w:pos="9113" w:val="right" w:leader="dot"/>
+        </w:tabs>
+      </w:pPr>
+      <w:r>
+        <w:t>6.5.3.</w:t>
+        <w:tab/>
+        <w:t>Сценарио 3 — повећано оптерећење</w:t>
+        <w:tab/>
+        <w:t>17</w:t>
+      </w:r>
+    </w:p>
+    <w:p>
+      <w:pPr>
+        <w:pStyle w:val="TOC3"/>
+        <w:tabs>
+          <w:tab w:pos="480" w:val="left"/>
+          <w:tab w:pos="9113" w:val="right" w:leader="dot"/>
+        </w:tabs>
+      </w:pPr>
+      <w:r>
+        <w:t>6.5.4.</w:t>
+        <w:tab/>
+        <w:t>Сценарио 4 — спора зависност (уско грло)</w:t>
+        <w:tab/>
+        <w:t>17</w:t>
+      </w:r>
+    </w:p>
+    <w:p>
+      <w:pPr>
         <w:pStyle w:val="TOC1"/>
         <w:tabs>
           <w:tab w:val="left" w:leader="none" w:pos="480"/>
@@ -7986,6 +8502,22 @@
       </w:r>
       <w:r/>
       <w:r/>
+    </w:p>
+    <w:p>
+      <w:pPr>
+        <w:pStyle w:val="TOC2"/>
+        <w:tabs>
+          <w:tab w:pos="480" w:val="left"/>
+          <w:tab w:pos="9113" w:val="right" w:leader="dot"/>
+        </w:tabs>
+      </w:pPr>
+      <w:r>
+        <w:t>7.1.</w:t>
+        <w:tab/>
+        <w:t>Правци даљег развоја</w:t>
+        <w:tab/>
+        <w:t>19</w:t>
+      </w:r>
     </w:p>
     <w:p>
       <w:pPr>
@@ -13024,145 +13556,8 @@
 </file>
 
 <file path=word/footer2.xml><?xml version="1.0" encoding="utf-8"?>
-<w:ftr xmlns:wpc="http://schemas.microsoft.com/office/word/2010/wordprocessingCanvas" xmlns:cx="http://schemas.microsoft.com/office/drawing/2014/chartex" xmlns:cx1="http://schemas.microsoft.com/office/drawing/2015/9/8/chartex" xmlns:cx2="http://schemas.microsoft.com/office/drawing/2015/10/21/chartex" xmlns:cx3="http://schemas.microsoft.com/office/drawing/2016/5/9/chartex" xmlns:cx4="http://schemas.microsoft.com/office/drawing/2016/5/10/chartex" xmlns:cx5="http://schemas.microsoft.com/office/drawing/2016/5/11/chartex" xmlns:cx6="http://schemas.microsoft.com/office/drawing/2016/5/12/chartex" xmlns:cx7="http://schemas.microsoft.com/office/drawing/2016/5/13/chartex" xmlns:cx8="http://schemas.microsoft.com/office/drawing/2016/5/14/chartex" xmlns:mc="http://schemas.openxmlformats.org/markup-compatibility/2006" xmlns:aink="http://schemas.microsoft.com/office/drawing/2016/ink" xmlns:am3d="http://schemas.microsoft.com/office/drawing/2017/model3d" xmlns:o="urn:schemas-microsoft-com:office:office" xmlns:oel="http://schemas.microsoft.com/office/2019/extlst" xmlns:r="http://schemas.openxmlformats.org/officeDocument/2006/relationships" xmlns:m="http://schemas.openxmlformats.org/officeDocument/2006/math" xmlns:v="urn:schemas-microsoft-com:vml" xmlns:wp14="http://schemas.microsoft.com/office/word/2010/wordprocessingDrawing" xmlns:wp="http://schemas.openxmlformats.org/drawingml/2006/wordprocessingDrawing" xmlns:w10="urn:schemas-microsoft-com:office:word" xmlns:w="http://schemas.openxmlformats.org/wordprocessingml/2006/main" xmlns:w14="http://schemas.microsoft.com/office/word/2010/wordml" xmlns:w15="http://schemas.microsoft.com/office/word/2012/wordml" xmlns:w16cex="http://schemas.microsoft.com/office/word/2018/wordml/cex" xmlns:w16cid="http://schemas.microsoft.com/office/word/2016/wordml/cid" xmlns:w16="http://schemas.microsoft.com/office/word/2018/wordml" xmlns:w16du="http://schemas.microsoft.com/office/word/2023/wordml/word16du" xmlns:w16sdtdh="http://schemas.microsoft.com/office/word/2020/wordml/sdtdatahash" xmlns:w16sdtfl="http://schemas.microsoft.com/office/word/2024/wordml/sdtformatlock" xmlns:w16se="http://schemas.microsoft.com/office/word/2015/wordml/symex" xmlns:wpg="http://schemas.microsoft.com/office/word/2010/wordprocessingGroup" xmlns:wpi="http://schemas.microsoft.com/office/word/2010/wordprocessingInk" xmlns:wne="http://schemas.microsoft.com/office/word/2006/wordml" xmlns:wps="http://schemas.microsoft.com/office/word/2010/wordprocessingShape" xmlns:a="http://schemas.openxmlformats.org/drawingml/2006/main" xmlns:a14="http://schemas.microsoft.com/office/drawing/2010/main" mc:Ignorable="w14 w15 w16se w16cid w16 w16cex w16sdtdh w16sdtfl w16du wp14">
-  <w:p>
-    <w:pPr>
-      <w:pStyle w:val="Footer"/>
-    </w:pPr>
-    <w:r>
-      <w:rPr>
-        <w:noProof/>
-      </w:rPr>
-      <mc:AlternateContent>
-        <mc:Choice Requires="wps">
-          <w:drawing>
-            <wp:anchor distT="0" distB="0" distL="114300" distR="114300" simplePos="0" relativeHeight="251630592" behindDoc="0" locked="0" layoutInCell="0" allowOverlap="1" wp14:anchorId="5660AEC6" wp14:editId="570FFD2D">
-              <wp:simplePos x="0" y="0"/>
-              <wp:positionH relativeFrom="page">
-                <wp:posOffset>0</wp:posOffset>
-              </wp:positionH>
-              <wp:positionV relativeFrom="page">
-                <wp:posOffset>10250170</wp:posOffset>
-              </wp:positionV>
-              <wp:extent cx="7560945" cy="252730"/>
-              <wp:effectExtent l="0" t="0" r="0" b="0"/>
-              <wp:wrapNone/>
-              <wp:docPr id="1877349935" name="MSIPCMb52146ab84d1d0a567eae5b6" descr="{&quot;HashCode&quot;:1235388660,&quot;Height&quot;:842.0,&quot;Width&quot;:595.0,&quot;Placement&quot;:&quot;Footer&quot;,&quot;Index&quot;:&quot;Primary&quot;,&quot;Section&quot;:1,&quot;Top&quot;:0.0,&quot;Left&quot;:0.0}"/>
-              <wp:cNvGraphicFramePr>
-                <a:graphicFrameLocks xmlns:a="http://schemas.openxmlformats.org/drawingml/2006/main"/>
-              </wp:cNvGraphicFramePr>
-              <a:graphic xmlns:a="http://schemas.openxmlformats.org/drawingml/2006/main">
-                <a:graphicData uri="http://schemas.microsoft.com/office/word/2010/wordprocessingShape">
-                  <wps:wsp>
-                    <wps:cNvSpPr txBox="1">
-                      <a:spLocks/>
-                    </wps:cNvSpPr>
-                    <wps:spPr bwMode="auto">
-                      <a:xfrm>
-                        <a:off x="0" y="0"/>
-                        <a:ext cx="7560945" cy="252730"/>
-                      </a:xfrm>
-                      <a:prstGeom prst="rect">
-                        <a:avLst/>
-                      </a:prstGeom>
-                      <a:noFill/>
-                      <a:ln>
-                        <a:noFill/>
-                      </a:ln>
-                      <a:extLst>
-                        <a:ext uri="{909E8E84-426E-40DD-AFC4-6F175D3DCCD1}">
-                          <a14:hiddenFill xmlns:a14="http://schemas.microsoft.com/office/drawing/2010/main">
-                            <a:solidFill>
-                              <a:srgbClr val="FFFFFF"/>
-                            </a:solidFill>
-                          </a14:hiddenFill>
-                        </a:ext>
-                        <a:ext uri="{91240B29-F687-4F45-9708-019B960494DF}">
-                          <a14:hiddenLine xmlns:a14="http://schemas.microsoft.com/office/drawing/2010/main" w="9525">
-                            <a:solidFill>
-                              <a:srgbClr val="000000"/>
-                            </a:solidFill>
-                            <a:miter lim="800000"/>
-                            <a:headEnd/>
-                            <a:tailEnd/>
-                          </a14:hiddenLine>
-                        </a:ext>
-                      </a:extLst>
-                    </wps:spPr>
-                    <wps:txbx>
-                      <w:txbxContent>
-                        <w:p>
-                          <w:pPr>
-                            <w:jc w:val="center"/>
-                            <w:rPr>
-                              <w:rFonts w:ascii="Arial" w:hAnsi="Arial" w:cs="Arial"/>
-                              <w:color w:val="626469"/>
-                              <w:sz w:val="12"/>
-                            </w:rPr>
-                          </w:pPr>
-                          <w:r>
-                            <w:rPr>
-                              <w:rFonts w:ascii="Arial" w:hAnsi="Arial" w:cs="Arial"/>
-                              <w:color w:val="626469"/>
-                              <w:sz w:val="12"/>
-                            </w:rPr>
-                            <w:t>Internal</w:t>
-                          </w:r>
-                        </w:p>
-                      </w:txbxContent>
-                    </wps:txbx>
-                    <wps:bodyPr rot="0" vert="horz" wrap="square" lIns="91440" tIns="0" rIns="91440" bIns="0" anchor="b" anchorCtr="0" upright="1">
-                      <a:noAutofit/>
-                    </wps:bodyPr>
-                  </wps:wsp>
-                </a:graphicData>
-              </a:graphic>
-              <wp14:sizeRelH relativeFrom="page">
-                <wp14:pctWidth>0</wp14:pctWidth>
-              </wp14:sizeRelH>
-              <wp14:sizeRelV relativeFrom="page">
-                <wp14:pctHeight>0</wp14:pctHeight>
-              </wp14:sizeRelV>
-            </wp:anchor>
-          </w:drawing>
-        </mc:Choice>
-        <mc:Fallback>
-          <w:pict w14:anchorId="01FACD93">
-            <v:shapetype id="_x0000_t202" coordsize="21600,21600" o:spt="202" path="m,l,21600r21600,l21600,xe" w14:anchorId="5660AEC6">
-              <v:stroke joinstyle="miter"/>
-              <v:path gradientshapeok="t" o:connecttype="rect"/>
-            </v:shapetype>
-            <v:shape id="MSIPCMb52146ab84d1d0a567eae5b6" style="position:absolute;margin-left:0;margin-top:807.1pt;width:595.35pt;height:19.9pt;z-index:251630592;visibility:visible;mso-wrap-style:square;mso-width-percent:0;mso-height-percent:0;mso-wrap-distance-left:9pt;mso-wrap-distance-top:0;mso-wrap-distance-right:9pt;mso-wrap-distance-bottom:0;mso-position-horizontal:absolute;mso-position-horizontal-relative:page;mso-position-vertical:absolute;mso-position-vertical-relative:page;mso-width-percent:0;mso-height-percent:0;mso-width-relative:page;mso-height-relative:page;v-text-anchor:bottom" alt="{&quot;HashCode&quot;:1235388660,&quot;Height&quot;:842.0,&quot;Width&quot;:595.0,&quot;Placement&quot;:&quot;Footer&quot;,&quot;Index&quot;:&quot;Primary&quot;,&quot;Section&quot;:1,&quot;Top&quot;:0.0,&quot;Left&quot;:0.0}" o:spid="_x0000_s1026" o:allowincell="f" filled="f" stroked="f" type="#_x0000_t202" o:gfxdata="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">
-              <v:path arrowok="t"/>
-              <v:textbox inset=",0,,0">
-                <w:txbxContent>
-                  <w:p>
-                    <w:pPr>
-                      <w:jc w:val="center"/>
-                      <w:rPr>
-                        <w:rFonts w:ascii="Arial" w:hAnsi="Arial" w:cs="Arial"/>
-                        <w:color w:val="626469"/>
-                        <w:sz w:val="12"/>
-                      </w:rPr>
-                    </w:pPr>
-                    <w:r>
-                      <w:rPr>
-                        <w:rFonts w:ascii="Arial" w:hAnsi="Arial" w:cs="Arial"/>
-                        <w:color w:val="626469"/>
-                        <w:sz w:val="12"/>
-                      </w:rPr>
-                      <w:t>Internal</w:t>
-                    </w:r>
-                  </w:p>
-                </w:txbxContent>
-              </v:textbox>
-              <w10:wrap anchorx="page" anchory="page"/>
-            </v:shape>
-          </w:pict>
-        </mc:Fallback>
-      </mc:AlternateContent>
-    </w:r>
-  </w:p>
+<w:ftr xmlns:w="http://schemas.openxmlformats.org/wordprocessingml/2006/main">
+  <w:p/>
 </w:ftr>
 </file>
 
@@ -19781,8 +20176,7 @@
       <w:ind w:left="709" w:right="289"/>
     </w:pPr>
     <w:rPr>
-      <w:rFonts w:ascii="CHelvPlain" w:hAnsi="CHelvPlain"/>
-      <w:sz w:val="22"/>
+      <w:sz w:val="24"/>
     </w:rPr>
   </w:style>
   <w:style w:type="paragraph" w:styleId="2nabrajanje" w:customStyle="1">

</xml_diff>

<commit_message>
docs: remove resolved professor comments (Sadrzaj update and font fix both confirmed applied)
</commit_message>
<xml_diff>
--- a/docs/diplomski-rad.docx
+++ b/docs/diplomski-rad.docx
@@ -7170,7 +7170,6 @@
           <w:lang w:val="sr-Cyrl-RS"/>
         </w:rPr>
       </w:pPr>
-      <w:commentRangeStart w:id="43"/>
       <w:r>
         <w:rPr>
           <w:b/>
@@ -7180,18 +7179,6 @@
           <w:lang w:val="sr-Cyrl-RS"/>
         </w:rPr>
         <w:t>Садржај</w:t>
-      </w:r>
-      <w:commentRangeEnd w:id="43"/>
-      <w:r>
-        <w:rPr>
-          <w:rStyle w:val="CommentReference"/>
-          <w:b/>
-          <w:bCs/>
-          <w:sz w:val="36"/>
-          <w:szCs w:val="36"/>
-          <w:lang w:val="sr-Cyrl-RS"/>
-        </w:rPr>
-        <w:commentReference w:id="43"/>
       </w:r>
     </w:p>
     <w:p>
@@ -9759,7 +9746,6 @@
       <w:pPr>
         <w:pStyle w:val="1nabrajanje"/>
       </w:pPr>
-      <w:commentRangeStart w:id="55"/>
       <w:r>
         <w:t>HealthEndpointsTests (сва четири сервиса) — интеграциони тестови, прав HTTP позив ка правом покренутом host-у. За AuthService/TripService/SharingService користи се права локална SQL Server база. Gateway користи FakeDownstreamServer (минималан прав HTTP сервер покренут у тест процесу) да симулира доступан/недоступан downstream сервис. Покривено за сва четири сервиса: /health/live враћа Healthy без обзира на доступност зависности; /health/ready враћа Healthy + 200 када је зависност доступна, а Unhealthy + 503</w:t>
       </w:r>
@@ -9784,14 +9770,6 @@
       </w:pPr>
       <w:r>
         <w:t>TripClientTests (AuthService.Tests) — регресиони тест за поменути „тих” catch блок. Са лажним HttpMessageHandler-ом (успех / HTTP 500 / баца HttpRequestException) и лажним ILogger&lt;TripClient&gt; који хвата позиве, три теста доказују да успешан позив не производи ниједан лог, неуспешан HTTP статус производи LogWarning, а мрежни квар производи LogError.</w:t>
-      </w:r>
-      <w:commentRangeEnd w:id="55"/>
-      <w:r>
-        <w:rPr>
-          <w:rStyle w:val="CommentReference"/>
-          <w:sz w:val="22"/>
-        </w:rPr>
-        <w:commentReference w:id="55"/>
       </w:r>
     </w:p>
     <w:p>
@@ -11163,64 +11141,19 @@
 </file>
 
 <file path=word/comments.xml><?xml version="1.0" encoding="utf-8"?>
-<w:comments xmlns:wpc="http://schemas.microsoft.com/office/word/2010/wordprocessingCanvas" xmlns:cx="http://schemas.microsoft.com/office/drawing/2014/chartex" xmlns:cx1="http://schemas.microsoft.com/office/drawing/2015/9/8/chartex" xmlns:cx2="http://schemas.microsoft.com/office/drawing/2015/10/21/chartex" xmlns:cx3="http://schemas.microsoft.com/office/drawing/2016/5/9/chartex" xmlns:cx4="http://schemas.microsoft.com/office/drawing/2016/5/10/chartex" xmlns:cx5="http://schemas.microsoft.com/office/drawing/2016/5/11/chartex" xmlns:cx6="http://schemas.microsoft.com/office/drawing/2016/5/12/chartex" xmlns:cx7="http://schemas.microsoft.com/office/drawing/2016/5/13/chartex" xmlns:cx8="http://schemas.microsoft.com/office/drawing/2016/5/14/chartex" xmlns:mc="http://schemas.openxmlformats.org/markup-compatibility/2006" xmlns:aink="http://schemas.microsoft.com/office/drawing/2016/ink" xmlns:am3d="http://schemas.microsoft.com/office/drawing/2017/model3d" xmlns:o="urn:schemas-microsoft-com:office:office" xmlns:oel="http://schemas.microsoft.com/office/2019/extlst" xmlns:r="http://schemas.openxmlformats.org/officeDocument/2006/relationships" xmlns:m="http://schemas.openxmlformats.org/officeDocument/2006/math" xmlns:v="urn:schemas-microsoft-com:vml" xmlns:wp14="http://schemas.microsoft.com/office/word/2010/wordprocessingDrawing" xmlns:wp="http://schemas.openxmlformats.org/drawingml/2006/wordprocessingDrawing" xmlns:w10="urn:schemas-microsoft-com:office:word" xmlns:w="http://schemas.openxmlformats.org/wordprocessingml/2006/main" xmlns:w14="http://schemas.microsoft.com/office/word/2010/wordml" xmlns:w15="http://schemas.microsoft.com/office/word/2012/wordml" xmlns:w16cex="http://schemas.microsoft.com/office/word/2018/wordml/cex" xmlns:w16cid="http://schemas.microsoft.com/office/word/2016/wordml/cid" xmlns:w16="http://schemas.microsoft.com/office/word/2018/wordml" xmlns:w16du="http://schemas.microsoft.com/office/word/2023/wordml/word16du" xmlns:w16sdtdh="http://schemas.microsoft.com/office/word/2020/wordml/sdtdatahash" xmlns:w16sdtfl="http://schemas.microsoft.com/office/word/2024/wordml/sdtformatlock" xmlns:w16se="http://schemas.microsoft.com/office/word/2015/wordml/symex" xmlns:wpg="http://schemas.microsoft.com/office/word/2010/wordprocessingGroup" xmlns:wpi="http://schemas.microsoft.com/office/word/2010/wordprocessingInk" xmlns:wne="http://schemas.microsoft.com/office/word/2006/wordml" xmlns:wps="http://schemas.microsoft.com/office/word/2010/wordprocessingShape" mc:Ignorable="w14 w15 w16se w16cid w16 w16cex w16sdtdh w16sdtfl w16du wp14">
-  <w:comment w:id="43" w:author="Sebastijan Stoja" w:date="2026-09-16T12:37:00Z" w:initials="SS">
-    <w:p>
-      <w:pPr>
-        <w:pStyle w:val="CommentText"/>
-      </w:pPr>
-      <w:r>
-        <w:rPr>
-          <w:rStyle w:val="CommentReference"/>
-        </w:rPr>
-        <w:annotationRef/>
-      </w:r>
-      <w:r>
-        <w:rPr>
-          <w:lang w:val="sr-Latn-RS"/>
-        </w:rPr>
-        <w:t>Sadrzaj ne prati novi. Treba da se uradi update</w:t>
-      </w:r>
-    </w:p>
-  </w:comment>
-  <w:comment w:id="55" w:author="Sebastijan Stoja" w:date="2026-09-16T12:38:00Z" w:initials="SS">
-    <w:p>
-      <w:pPr>
-        <w:pStyle w:val="CommentText"/>
-      </w:pPr>
-      <w:r>
-        <w:rPr>
-          <w:rStyle w:val="CommentReference"/>
-        </w:rPr>
-        <w:annotationRef/>
-      </w:r>
-      <w:r>
-        <w:t>Zasto drugi font? Za tekst koji nije naslov ili formular koristimo Times new roman 12</w:t>
-      </w:r>
-    </w:p>
-  </w:comment>
-</w:comments>
+<w:comments xmlns:w="http://schemas.openxmlformats.org/wordprocessingml/2006/main"/>
 </file>
 
 <file path=word/commentsExtended.xml><?xml version="1.0" encoding="utf-8"?>
-<w15:commentsEx xmlns:wpc="http://schemas.microsoft.com/office/word/2010/wordprocessingCanvas" xmlns:cx="http://schemas.microsoft.com/office/drawing/2014/chartex" xmlns:cx1="http://schemas.microsoft.com/office/drawing/2015/9/8/chartex" xmlns:cx2="http://schemas.microsoft.com/office/drawing/2015/10/21/chartex" xmlns:cx3="http://schemas.microsoft.com/office/drawing/2016/5/9/chartex" xmlns:cx4="http://schemas.microsoft.com/office/drawing/2016/5/10/chartex" xmlns:cx5="http://schemas.microsoft.com/office/drawing/2016/5/11/chartex" xmlns:cx6="http://schemas.microsoft.com/office/drawing/2016/5/12/chartex" xmlns:cx7="http://schemas.microsoft.com/office/drawing/2016/5/13/chartex" xmlns:cx8="http://schemas.microsoft.com/office/drawing/2016/5/14/chartex" xmlns:mc="http://schemas.openxmlformats.org/markup-compatibility/2006" xmlns:aink="http://schemas.microsoft.com/office/drawing/2016/ink" xmlns:am3d="http://schemas.microsoft.com/office/drawing/2017/model3d" xmlns:o="urn:schemas-microsoft-com:office:office" xmlns:oel="http://schemas.microsoft.com/office/2019/extlst" xmlns:r="http://schemas.openxmlformats.org/officeDocument/2006/relationships" xmlns:m="http://schemas.openxmlformats.org/officeDocument/2006/math" xmlns:v="urn:schemas-microsoft-com:vml" xmlns:wp14="http://schemas.microsoft.com/office/word/2010/wordprocessingDrawing" xmlns:wp="http://schemas.openxmlformats.org/drawingml/2006/wordprocessingDrawing" xmlns:w10="urn:schemas-microsoft-com:office:word" xmlns:w="http://schemas.openxmlformats.org/wordprocessingml/2006/main" xmlns:w14="http://schemas.microsoft.com/office/word/2010/wordml" xmlns:w15="http://schemas.microsoft.com/office/word/2012/wordml" xmlns:w16cex="http://schemas.microsoft.com/office/word/2018/wordml/cex" xmlns:w16cid="http://schemas.microsoft.com/office/word/2016/wordml/cid" xmlns:w16="http://schemas.microsoft.com/office/word/2018/wordml" xmlns:w16du="http://schemas.microsoft.com/office/word/2023/wordml/word16du" xmlns:w16sdtdh="http://schemas.microsoft.com/office/word/2020/wordml/sdtdatahash" xmlns:w16sdtfl="http://schemas.microsoft.com/office/word/2024/wordml/sdtformatlock" xmlns:w16se="http://schemas.microsoft.com/office/word/2015/wordml/symex" xmlns:wpg="http://schemas.microsoft.com/office/word/2010/wordprocessingGroup" xmlns:wpi="http://schemas.microsoft.com/office/word/2010/wordprocessingInk" xmlns:wne="http://schemas.microsoft.com/office/word/2006/wordml" xmlns:wps="http://schemas.microsoft.com/office/word/2010/wordprocessingShape" mc:Ignorable="w14 w15 w16se w16cid w16 w16cex w16sdtdh w16sdtfl w16du wp14">
-  <w15:commentEx w15:paraId="7B8E2BBB" w15:done="0"/>
-  <w15:commentEx w15:paraId="53DA2C32" w15:done="0"/>
-</w15:commentsEx>
+<w15:commentsEx xmlns:w15="http://schemas.microsoft.com/office/word/2012/wordml"/>
 </file>
 
 <file path=word/commentsExtensible.xml><?xml version="1.0" encoding="utf-8"?>
-<w16cex:commentsExtensible xmlns:wpc="http://schemas.microsoft.com/office/word/2010/wordprocessingCanvas" xmlns:cx="http://schemas.microsoft.com/office/drawing/2014/chartex" xmlns:cx1="http://schemas.microsoft.com/office/drawing/2015/9/8/chartex" xmlns:cx2="http://schemas.microsoft.com/office/drawing/2015/10/21/chartex" xmlns:cx3="http://schemas.microsoft.com/office/drawing/2016/5/9/chartex" xmlns:cx4="http://schemas.microsoft.com/office/drawing/2016/5/10/chartex" xmlns:cx5="http://schemas.microsoft.com/office/drawing/2016/5/11/chartex" xmlns:cx6="http://schemas.microsoft.com/office/drawing/2016/5/12/chartex" xmlns:cx7="http://schemas.microsoft.com/office/drawing/2016/5/13/chartex" xmlns:cx8="http://schemas.microsoft.com/office/drawing/2016/5/14/chartex" xmlns:cr="http://schemas.microsoft.com/office/comments/2020/reactions" xmlns:mc="http://schemas.openxmlformats.org/markup-compatibility/2006" xmlns:aink="http://schemas.microsoft.com/office/drawing/2016/ink" xmlns:am3d="http://schemas.microsoft.com/office/drawing/2017/model3d" xmlns:o="urn:schemas-microsoft-com:office:office" xmlns:oel="http://schemas.microsoft.com/office/2019/extlst" xmlns:r="http://schemas.openxmlformats.org/officeDocument/2006/relationships" xmlns:m="http://schemas.openxmlformats.org/officeDocument/2006/math" xmlns:v="urn:schemas-microsoft-com:vml" xmlns:wp14="http://schemas.microsoft.com/office/word/2010/wordprocessingDrawing" xmlns:wp="http://schemas.openxmlformats.org/drawingml/2006/wordprocessingDrawing" xmlns:w10="urn:schemas-microsoft-com:office:word" xmlns:w="http://schemas.openxmlformats.org/wordprocessingml/2006/main" xmlns:w14="http://schemas.microsoft.com/office/word/2010/wordml" xmlns:w15="http://schemas.microsoft.com/office/word/2012/wordml" xmlns:w16cex="http://schemas.microsoft.com/office/word/2018/wordml/cex" xmlns:w16cid="http://schemas.microsoft.com/office/word/2016/wordml/cid" xmlns:w16="http://schemas.microsoft.com/office/word/2018/wordml" xmlns:w16du="http://schemas.microsoft.com/office/word/2023/wordml/word16du" xmlns:w16sdtdh="http://schemas.microsoft.com/office/word/2020/wordml/sdtdatahash" xmlns:w16sdtfl="http://schemas.microsoft.com/office/word/2024/wordml/sdtformatlock" xmlns:w16se="http://schemas.microsoft.com/office/word/2015/wordml/symex" xmlns:wpg="http://schemas.microsoft.com/office/word/2010/wordprocessingGroup" xmlns:wpi="http://schemas.microsoft.com/office/word/2010/wordprocessingInk" xmlns:wne="http://schemas.microsoft.com/office/word/2006/wordml" xmlns:wps="http://schemas.microsoft.com/office/word/2010/wordprocessingShape" mc:Ignorable="w14 w15 w16se w16cid w16 w16cex w16sdtdh w16sdtfl cr w16du wp14">
-  <w16cex:commentExtensible w16cex:durableId="29854354" w16cex:dateUtc="2026-09-16T10:37:00Z"/>
-  <w16cex:commentExtensible w16cex:durableId="1037B37F" w16cex:dateUtc="2026-09-16T10:38:00Z"/>
-</w16cex:commentsExtensible>
+<w16cex:commentsExtensible xmlns:w16cex="http://schemas.microsoft.com/office/word/2018/wordml/cex"/>
 </file>
 
 <file path=word/commentsIds.xml><?xml version="1.0" encoding="utf-8"?>
-<w16cid:commentsIds xmlns:wpc="http://schemas.microsoft.com/office/word/2010/wordprocessingCanvas" xmlns:cx="http://schemas.microsoft.com/office/drawing/2014/chartex" xmlns:cx1="http://schemas.microsoft.com/office/drawing/2015/9/8/chartex" xmlns:cx2="http://schemas.microsoft.com/office/drawing/2015/10/21/chartex" xmlns:cx3="http://schemas.microsoft.com/office/drawing/2016/5/9/chartex" xmlns:cx4="http://schemas.microsoft.com/office/drawing/2016/5/10/chartex" xmlns:cx5="http://schemas.microsoft.com/office/drawing/2016/5/11/chartex" xmlns:cx6="http://schemas.microsoft.com/office/drawing/2016/5/12/chartex" xmlns:cx7="http://schemas.microsoft.com/office/drawing/2016/5/13/chartex" xmlns:cx8="http://schemas.microsoft.com/office/drawing/2016/5/14/chartex" xmlns:mc="http://schemas.openxmlformats.org/markup-compatibility/2006" xmlns:aink="http://schemas.microsoft.com/office/drawing/2016/ink" xmlns:am3d="http://schemas.microsoft.com/office/drawing/2017/model3d" xmlns:o="urn:schemas-microsoft-com:office:office" xmlns:oel="http://schemas.microsoft.com/office/2019/extlst" xmlns:r="http://schemas.openxmlformats.org/officeDocument/2006/relationships" xmlns:m="http://schemas.openxmlformats.org/officeDocument/2006/math" xmlns:v="urn:schemas-microsoft-com:vml" xmlns:wp14="http://schemas.microsoft.com/office/word/2010/wordprocessingDrawing" xmlns:wp="http://schemas.openxmlformats.org/drawingml/2006/wordprocessingDrawing" xmlns:w10="urn:schemas-microsoft-com:office:word" xmlns:w="http://schemas.openxmlformats.org/wordprocessingml/2006/main" xmlns:w14="http://schemas.microsoft.com/office/word/2010/wordml" xmlns:w15="http://schemas.microsoft.com/office/word/2012/wordml" xmlns:w16cex="http://schemas.microsoft.com/office/word/2018/wordml/cex" xmlns:w16cid="http://schemas.microsoft.com/office/word/2016/wordml/cid" xmlns:w16="http://schemas.microsoft.com/office/word/2018/wordml" xmlns:w16du="http://schemas.microsoft.com/office/word/2023/wordml/word16du" xmlns:w16sdtdh="http://schemas.microsoft.com/office/word/2020/wordml/sdtdatahash" xmlns:w16sdtfl="http://schemas.microsoft.com/office/word/2024/wordml/sdtformatlock" xmlns:w16se="http://schemas.microsoft.com/office/word/2015/wordml/symex" xmlns:wpg="http://schemas.microsoft.com/office/word/2010/wordprocessingGroup" xmlns:wpi="http://schemas.microsoft.com/office/word/2010/wordprocessingInk" xmlns:wne="http://schemas.microsoft.com/office/word/2006/wordml" xmlns:wps="http://schemas.microsoft.com/office/word/2010/wordprocessingShape" mc:Ignorable="w14 w15 w16se w16cid w16 w16cex w16sdtdh w16sdtfl w16du wp14">
-  <w16cid:commentId w16cid:paraId="7B8E2BBB" w16cid:durableId="29854354"/>
-  <w16cid:commentId w16cid:paraId="53DA2C32" w16cid:durableId="1037B37F"/>
-</w16cid:commentsIds>
+<w16cid:commentsIds xmlns:w16cid="http://schemas.microsoft.com/office/word/2016/wordml/cid"/>
 </file>
 
 <file path=word/endnotes.xml><?xml version="1.0" encoding="utf-8"?>

</xml_diff>

<commit_message>
docs: fix Table of Contents subsection alignment using robust absolute tab positions (avoids indent-dependent tab math that rendered inconsistently), update document metadata author
</commit_message>
<xml_diff>
--- a/docs/diplomski-rad.docx
+++ b/docs/diplomski-rad.docx
@@ -7268,80 +7268,80 @@
     </w:p>
     <w:p>
       <w:pPr>
-        <w:pStyle w:val="TOC2"/>
+        <w:pStyle w:val="TOC1"/>
         <w:tabs>
-          <w:tab w:pos="480" w:val="left"/>
-          <w:tab w:pos="9113" w:val="right" w:leader="dot"/>
+          <w:tab w:pos="567" w:val="left"/>
+          <w:tab w:pos="9900" w:val="right" w:leader="dot"/>
         </w:tabs>
-      </w:pPr>
-      <w:r>
-        <w:t>2.1.</w:t>
+        <w:ind w:left="0"/>
+      </w:pPr>
+      <w:r>
         <w:tab/>
-        <w:t>Немогуће праћење захтева кроз више сервиса</w:t>
+        <w:t>2.1. Немогуће праћење захтева кроз више сервиса</w:t>
         <w:tab/>
         <w:t>5</w:t>
       </w:r>
     </w:p>
     <w:p>
       <w:pPr>
-        <w:pStyle w:val="TOC2"/>
+        <w:pStyle w:val="TOC1"/>
         <w:tabs>
-          <w:tab w:pos="480" w:val="left"/>
-          <w:tab w:pos="9113" w:val="right" w:leader="dot"/>
+          <w:tab w:pos="567" w:val="left"/>
+          <w:tab w:pos="9900" w:val="right" w:leader="dot"/>
         </w:tabs>
-      </w:pPr>
-      <w:r>
-        <w:t>2.2.</w:t>
+        <w:ind w:left="0"/>
+      </w:pPr>
+      <w:r>
         <w:tab/>
-        <w:t>Одсуство метрика перформанси</w:t>
+        <w:t>2.2. Одсуство метрика перформанси</w:t>
         <w:tab/>
         <w:t>5</w:t>
       </w:r>
     </w:p>
     <w:p>
       <w:pPr>
-        <w:pStyle w:val="TOC2"/>
+        <w:pStyle w:val="TOC1"/>
         <w:tabs>
-          <w:tab w:pos="480" w:val="left"/>
-          <w:tab w:pos="9113" w:val="right" w:leader="dot"/>
+          <w:tab w:pos="567" w:val="left"/>
+          <w:tab w:pos="9900" w:val="right" w:leader="dot"/>
         </w:tabs>
-      </w:pPr>
-      <w:r>
-        <w:t>2.3.</w:t>
+        <w:ind w:left="0"/>
+      </w:pPr>
+      <w:r>
         <w:tab/>
-        <w:t>Тихе грешке</w:t>
+        <w:t>2.3. Тихе грешке</w:t>
         <w:tab/>
         <w:t>5</w:t>
       </w:r>
     </w:p>
     <w:p>
       <w:pPr>
-        <w:pStyle w:val="TOC2"/>
+        <w:pStyle w:val="TOC1"/>
         <w:tabs>
-          <w:tab w:pos="480" w:val="left"/>
-          <w:tab w:pos="9113" w:val="right" w:leader="dot"/>
+          <w:tab w:pos="567" w:val="left"/>
+          <w:tab w:pos="9900" w:val="right" w:leader="dot"/>
         </w:tabs>
-      </w:pPr>
-      <w:r>
-        <w:t>2.4.</w:t>
+        <w:ind w:left="0"/>
+      </w:pPr>
+      <w:r>
         <w:tab/>
-        <w:t>Одсуство health check механизама</w:t>
+        <w:t>2.4. Одсуство health check механизама</w:t>
         <w:tab/>
         <w:t>5</w:t>
       </w:r>
     </w:p>
     <w:p>
       <w:pPr>
-        <w:pStyle w:val="TOC2"/>
+        <w:pStyle w:val="TOC1"/>
         <w:tabs>
-          <w:tab w:pos="480" w:val="left"/>
-          <w:tab w:pos="9113" w:val="right" w:leader="dot"/>
+          <w:tab w:pos="567" w:val="left"/>
+          <w:tab w:pos="9900" w:val="right" w:leader="dot"/>
         </w:tabs>
-      </w:pPr>
-      <w:r>
-        <w:t>2.5.</w:t>
+        <w:ind w:left="0"/>
+      </w:pPr>
+      <w:r>
         <w:tab/>
-        <w:t>Нестандардизовано, минимално логовање</w:t>
+        <w:t>2.5. Нестандардизовано, минимално логовање</w:t>
         <w:tab/>
         <w:t>5</w:t>
       </w:r>
@@ -7368,144 +7368,144 @@
     </w:p>
     <w:p>
       <w:pPr>
-        <w:pStyle w:val="TOC2"/>
+        <w:pStyle w:val="TOC1"/>
         <w:tabs>
-          <w:tab w:pos="480" w:val="left"/>
-          <w:tab w:pos="9113" w:val="right" w:leader="dot"/>
+          <w:tab w:pos="567" w:val="left"/>
+          <w:tab w:pos="9900" w:val="right" w:leader="dot"/>
         </w:tabs>
-      </w:pPr>
-      <w:r>
-        <w:t>3.1.</w:t>
+        <w:ind w:left="0"/>
+      </w:pPr>
+      <w:r>
         <w:tab/>
-        <w:t>Постојеће технологије (backend/frontend)</w:t>
+        <w:t>3.1. Постојеће технологије (backend/frontend)</w:t>
         <w:tab/>
         <w:t>6</w:t>
       </w:r>
     </w:p>
     <w:p>
       <w:pPr>
-        <w:pStyle w:val="TOC2"/>
+        <w:pStyle w:val="TOC1"/>
         <w:tabs>
-          <w:tab w:pos="480" w:val="left"/>
-          <w:tab w:pos="9113" w:val="right" w:leader="dot"/>
+          <w:tab w:pos="567" w:val="left"/>
+          <w:tab w:pos="9900" w:val="right" w:leader="dot"/>
         </w:tabs>
-      </w:pPr>
-      <w:r>
-        <w:t>3.2.</w:t>
+        <w:ind w:left="0"/>
+      </w:pPr>
+      <w:r>
         <w:tab/>
-        <w:t>OpenTelemetry</w:t>
+        <w:t>3.2. OpenTelemetry</w:t>
         <w:tab/>
         <w:t>6</w:t>
       </w:r>
     </w:p>
     <w:p>
       <w:pPr>
-        <w:pStyle w:val="TOC2"/>
+        <w:pStyle w:val="TOC1"/>
         <w:tabs>
-          <w:tab w:pos="480" w:val="left"/>
-          <w:tab w:pos="9113" w:val="right" w:leader="dot"/>
+          <w:tab w:pos="567" w:val="left"/>
+          <w:tab w:pos="9900" w:val="right" w:leader="dot"/>
         </w:tabs>
-      </w:pPr>
-      <w:r>
-        <w:t>3.3.</w:t>
+        <w:ind w:left="0"/>
+      </w:pPr>
+      <w:r>
         <w:tab/>
-        <w:t>OpenTelemetry Collector</w:t>
+        <w:t>3.3. OpenTelemetry Collector</w:t>
         <w:tab/>
         <w:t>6</w:t>
       </w:r>
     </w:p>
     <w:p>
       <w:pPr>
-        <w:pStyle w:val="TOC2"/>
+        <w:pStyle w:val="TOC1"/>
         <w:tabs>
-          <w:tab w:pos="480" w:val="left"/>
-          <w:tab w:pos="9113" w:val="right" w:leader="dot"/>
+          <w:tab w:pos="567" w:val="left"/>
+          <w:tab w:pos="9900" w:val="right" w:leader="dot"/>
         </w:tabs>
-      </w:pPr>
-      <w:r>
-        <w:t>3.4.</w:t>
+        <w:ind w:left="0"/>
+      </w:pPr>
+      <w:r>
         <w:tab/>
-        <w:t>Prometheus, Grafana Tempo, Grafana Loki</w:t>
+        <w:t>3.4. Prometheus, Grafana Tempo, Grafana Loki</w:t>
         <w:tab/>
         <w:t>6</w:t>
       </w:r>
     </w:p>
     <w:p>
       <w:pPr>
-        <w:pStyle w:val="TOC2"/>
+        <w:pStyle w:val="TOC1"/>
         <w:tabs>
-          <w:tab w:pos="480" w:val="left"/>
-          <w:tab w:pos="9113" w:val="right" w:leader="dot"/>
+          <w:tab w:pos="567" w:val="left"/>
+          <w:tab w:pos="9900" w:val="right" w:leader="dot"/>
         </w:tabs>
-      </w:pPr>
-      <w:r>
-        <w:t>3.5.</w:t>
+        <w:ind w:left="0"/>
+      </w:pPr>
+      <w:r>
         <w:tab/>
-        <w:t>Grafana</w:t>
+        <w:t>3.5. Grafana</w:t>
         <w:tab/>
         <w:t>7</w:t>
       </w:r>
     </w:p>
     <w:p>
       <w:pPr>
-        <w:pStyle w:val="TOC2"/>
+        <w:pStyle w:val="TOC1"/>
         <w:tabs>
-          <w:tab w:pos="480" w:val="left"/>
-          <w:tab w:pos="9113" w:val="right" w:leader="dot"/>
+          <w:tab w:pos="567" w:val="left"/>
+          <w:tab w:pos="9900" w:val="right" w:leader="dot"/>
         </w:tabs>
-      </w:pPr>
-      <w:r>
-        <w:t>3.6.</w:t>
+        <w:ind w:left="0"/>
+      </w:pPr>
+      <w:r>
         <w:tab/>
-        <w:t>Health checks</w:t>
+        <w:t>3.6. Health checks</w:t>
         <w:tab/>
         <w:t>7</w:t>
       </w:r>
     </w:p>
     <w:p>
       <w:pPr>
-        <w:pStyle w:val="TOC2"/>
+        <w:pStyle w:val="TOC1"/>
         <w:tabs>
-          <w:tab w:pos="480" w:val="left"/>
-          <w:tab w:pos="9113" w:val="right" w:leader="dot"/>
+          <w:tab w:pos="567" w:val="left"/>
+          <w:tab w:pos="9900" w:val="right" w:leader="dot"/>
         </w:tabs>
-      </w:pPr>
-      <w:r>
-        <w:t>3.7.</w:t>
+        <w:ind w:left="0"/>
+      </w:pPr>
+      <w:r>
         <w:tab/>
-        <w:t>k6</w:t>
+        <w:t>3.7. k6</w:t>
         <w:tab/>
         <w:t>7</w:t>
       </w:r>
     </w:p>
     <w:p>
       <w:pPr>
-        <w:pStyle w:val="TOC2"/>
+        <w:pStyle w:val="TOC1"/>
         <w:tabs>
-          <w:tab w:pos="480" w:val="left"/>
-          <w:tab w:pos="9113" w:val="right" w:leader="dot"/>
+          <w:tab w:pos="567" w:val="left"/>
+          <w:tab w:pos="9900" w:val="right" w:leader="dot"/>
         </w:tabs>
-      </w:pPr>
-      <w:r>
-        <w:t>3.8.</w:t>
+        <w:ind w:left="0"/>
+      </w:pPr>
+      <w:r>
         <w:tab/>
-        <w:t>xUnit</w:t>
+        <w:t>3.8. xUnit</w:t>
         <w:tab/>
         <w:t>7</w:t>
       </w:r>
     </w:p>
     <w:p>
       <w:pPr>
-        <w:pStyle w:val="TOC2"/>
+        <w:pStyle w:val="TOC1"/>
         <w:tabs>
-          <w:tab w:pos="480" w:val="left"/>
-          <w:tab w:pos="9113" w:val="right" w:leader="dot"/>
+          <w:tab w:pos="567" w:val="left"/>
+          <w:tab w:pos="9900" w:val="right" w:leader="dot"/>
         </w:tabs>
-      </w:pPr>
-      <w:r>
-        <w:t>3.9.</w:t>
+        <w:ind w:left="0"/>
+      </w:pPr>
+      <w:r>
         <w:tab/>
-        <w:t>Docker / Docker Compose</w:t>
+        <w:t>3.9. Docker / Docker Compose</w:t>
         <w:tab/>
         <w:t>7</w:t>
       </w:r>
@@ -7532,32 +7532,32 @@
     </w:p>
     <w:p>
       <w:pPr>
-        <w:pStyle w:val="TOC2"/>
+        <w:pStyle w:val="TOC1"/>
         <w:tabs>
-          <w:tab w:pos="480" w:val="left"/>
-          <w:tab w:pos="9113" w:val="right" w:leader="dot"/>
+          <w:tab w:pos="567" w:val="left"/>
+          <w:tab w:pos="9900" w:val="right" w:leader="dot"/>
         </w:tabs>
-      </w:pPr>
-      <w:r>
-        <w:t>4.1.</w:t>
+        <w:ind w:left="0"/>
+      </w:pPr>
+      <w:r>
         <w:tab/>
-        <w:t>Архитектура система</w:t>
+        <w:t>4.1. Архитектура система</w:t>
         <w:tab/>
         <w:t>8</w:t>
       </w:r>
     </w:p>
     <w:p>
       <w:pPr>
-        <w:pStyle w:val="TOC2"/>
+        <w:pStyle w:val="TOC1"/>
         <w:tabs>
-          <w:tab w:pos="480" w:val="left"/>
-          <w:tab w:pos="9113" w:val="right" w:leader="dot"/>
+          <w:tab w:pos="567" w:val="left"/>
+          <w:tab w:pos="9900" w:val="right" w:leader="dot"/>
         </w:tabs>
-      </w:pPr>
-      <w:r>
-        <w:t>4.2.</w:t>
+        <w:ind w:left="0"/>
+      </w:pPr>
+      <w:r>
         <w:tab/>
-        <w:t>Постојећи механизми обсервабилности</w:t>
+        <w:t>4.2. Постојећи механизми обсервабилности</w:t>
         <w:tab/>
         <w:t>10</w:t>
       </w:r>
@@ -7584,64 +7584,64 @@
     </w:p>
     <w:p>
       <w:pPr>
-        <w:pStyle w:val="TOC2"/>
+        <w:pStyle w:val="TOC1"/>
         <w:tabs>
-          <w:tab w:pos="480" w:val="left"/>
-          <w:tab w:pos="9113" w:val="right" w:leader="dot"/>
+          <w:tab w:pos="567" w:val="left"/>
+          <w:tab w:pos="9900" w:val="right" w:leader="dot"/>
         </w:tabs>
-      </w:pPr>
-      <w:r>
-        <w:t>5.1.</w:t>
+        <w:ind w:left="0"/>
+      </w:pPr>
+      <w:r>
         <w:tab/>
-        <w:t>TO-BE архитектура</w:t>
+        <w:t>5.1. TO-BE архитектура</w:t>
         <w:tab/>
         <w:t>11</w:t>
       </w:r>
     </w:p>
     <w:p>
       <w:pPr>
-        <w:pStyle w:val="TOC2"/>
+        <w:pStyle w:val="TOC1"/>
         <w:tabs>
-          <w:tab w:pos="480" w:val="left"/>
-          <w:tab w:pos="9113" w:val="right" w:leader="dot"/>
+          <w:tab w:pos="567" w:val="left"/>
+          <w:tab w:pos="9900" w:val="right" w:leader="dot"/>
         </w:tabs>
-      </w:pPr>
-      <w:r>
-        <w:t>5.2.</w:t>
+        <w:ind w:left="0"/>
+      </w:pPr>
+      <w:r>
         <w:tab/>
-        <w:t>Health checks</w:t>
+        <w:t>5.2. Health checks</w:t>
         <w:tab/>
         <w:t>11</w:t>
       </w:r>
     </w:p>
     <w:p>
       <w:pPr>
-        <w:pStyle w:val="TOC2"/>
+        <w:pStyle w:val="TOC1"/>
         <w:tabs>
-          <w:tab w:pos="480" w:val="left"/>
-          <w:tab w:pos="9113" w:val="right" w:leader="dot"/>
+          <w:tab w:pos="567" w:val="left"/>
+          <w:tab w:pos="9900" w:val="right" w:leader="dot"/>
         </w:tabs>
-      </w:pPr>
-      <w:r>
-        <w:t>5.3.</w:t>
+        <w:ind w:left="0"/>
+      </w:pPr>
+      <w:r>
         <w:tab/>
-        <w:t>Инструментација сервиса</w:t>
+        <w:t>5.3. Инструментација сервиса</w:t>
         <w:tab/>
         <w:t>12</w:t>
       </w:r>
     </w:p>
     <w:p>
       <w:pPr>
-        <w:pStyle w:val="TOC2"/>
+        <w:pStyle w:val="TOC1"/>
         <w:tabs>
-          <w:tab w:pos="480" w:val="left"/>
-          <w:tab w:pos="9113" w:val="right" w:leader="dot"/>
+          <w:tab w:pos="567" w:val="left"/>
+          <w:tab w:pos="9900" w:val="right" w:leader="dot"/>
         </w:tabs>
-      </w:pPr>
-      <w:r>
-        <w:t>5.4.</w:t>
+        <w:ind w:left="0"/>
+      </w:pPr>
+      <w:r>
         <w:tab/>
-        <w:t>Grafana dashboard</w:t>
+        <w:t>5.4. Grafana dashboard</w:t>
         <w:tab/>
         <w:t>12</w:t>
       </w:r>
@@ -7668,144 +7668,144 @@
     </w:p>
     <w:p>
       <w:pPr>
-        <w:pStyle w:val="TOC2"/>
+        <w:pStyle w:val="TOC1"/>
         <w:tabs>
-          <w:tab w:pos="480" w:val="left"/>
-          <w:tab w:pos="9113" w:val="right" w:leader="dot"/>
+          <w:tab w:pos="567" w:val="left"/>
+          <w:tab w:pos="9900" w:val="right" w:leader="dot"/>
         </w:tabs>
-      </w:pPr>
-      <w:r>
-        <w:t>6.1.</w:t>
+        <w:ind w:left="0"/>
+      </w:pPr>
+      <w:r>
         <w:tab/>
-        <w:t>Рефакторинг ради тестабилности</w:t>
+        <w:t>6.1. Рефакторинг ради тестабилности</w:t>
         <w:tab/>
         <w:t>14</w:t>
       </w:r>
     </w:p>
     <w:p>
       <w:pPr>
-        <w:pStyle w:val="TOC2"/>
+        <w:pStyle w:val="TOC1"/>
         <w:tabs>
-          <w:tab w:pos="480" w:val="left"/>
-          <w:tab w:pos="9113" w:val="right" w:leader="dot"/>
+          <w:tab w:pos="567" w:val="left"/>
+          <w:tab w:pos="9900" w:val="right" w:leader="dot"/>
         </w:tabs>
-      </w:pPr>
-      <w:r>
-        <w:t>6.2.</w:t>
+        <w:ind w:left="0"/>
+      </w:pPr>
+      <w:r>
         <w:tab/>
-        <w:t>Тест пројекти и стратегија</w:t>
+        <w:t>6.2. Тест пројекти и стратегија</w:t>
         <w:tab/>
         <w:t>14</w:t>
       </w:r>
     </w:p>
     <w:p>
       <w:pPr>
-        <w:pStyle w:val="TOC2"/>
+        <w:pStyle w:val="TOC1"/>
         <w:tabs>
-          <w:tab w:pos="480" w:val="left"/>
-          <w:tab w:pos="9113" w:val="right" w:leader="dot"/>
+          <w:tab w:pos="567" w:val="left"/>
+          <w:tab w:pos="9900" w:val="right" w:leader="dot"/>
         </w:tabs>
-      </w:pPr>
-      <w:r>
-        <w:t>6.3.</w:t>
+        <w:ind w:left="0"/>
+      </w:pPr>
+      <w:r>
         <w:tab/>
-        <w:t>Резултати</w:t>
+        <w:t>6.3. Резултати</w:t>
         <w:tab/>
         <w:t>15</w:t>
       </w:r>
     </w:p>
     <w:p>
       <w:pPr>
-        <w:pStyle w:val="TOC2"/>
+        <w:pStyle w:val="TOC1"/>
         <w:tabs>
-          <w:tab w:pos="480" w:val="left"/>
-          <w:tab w:pos="9113" w:val="right" w:leader="dot"/>
+          <w:tab w:pos="567" w:val="left"/>
+          <w:tab w:pos="9900" w:val="right" w:leader="dot"/>
         </w:tabs>
-      </w:pPr>
-      <w:r>
-        <w:t>6.4.</w:t>
+        <w:ind w:left="0"/>
+      </w:pPr>
+      <w:r>
         <w:tab/>
-        <w:t>Демонстрација неуспешног теста</w:t>
+        <w:t>6.4. Демонстрација неуспешног теста</w:t>
         <w:tab/>
         <w:t>15</w:t>
       </w:r>
     </w:p>
     <w:p>
       <w:pPr>
-        <w:pStyle w:val="TOC2"/>
+        <w:pStyle w:val="TOC1"/>
         <w:tabs>
-          <w:tab w:pos="480" w:val="left"/>
-          <w:tab w:pos="9113" w:val="right" w:leader="dot"/>
+          <w:tab w:pos="567" w:val="left"/>
+          <w:tab w:pos="9900" w:val="right" w:leader="dot"/>
         </w:tabs>
-      </w:pPr>
-      <w:r>
-        <w:t>6.5.</w:t>
+        <w:ind w:left="0"/>
+      </w:pPr>
+      <w:r>
         <w:tab/>
-        <w:t>Демонстрациони сценарији</w:t>
+        <w:t>6.5. Демонстрациони сценарији</w:t>
         <w:tab/>
         <w:t>16</w:t>
       </w:r>
     </w:p>
     <w:p>
       <w:pPr>
-        <w:pStyle w:val="TOC3"/>
+        <w:pStyle w:val="TOC1"/>
         <w:tabs>
-          <w:tab w:pos="480" w:val="left"/>
-          <w:tab w:pos="9113" w:val="right" w:leader="dot"/>
+          <w:tab w:pos="964" w:val="left"/>
+          <w:tab w:pos="9900" w:val="right" w:leader="dot"/>
         </w:tabs>
-      </w:pPr>
-      <w:r>
-        <w:t>6.5.1.</w:t>
+        <w:ind w:left="0"/>
+      </w:pPr>
+      <w:r>
         <w:tab/>
-        <w:t>Сценарио 1 — нормалан захтев кроз више сервиса</w:t>
+        <w:t>6.5.1. Сценарио 1 — нормалан захтев кроз више сервиса</w:t>
         <w:tab/>
         <w:t>16</w:t>
       </w:r>
     </w:p>
     <w:p>
       <w:pPr>
-        <w:pStyle w:val="TOC3"/>
+        <w:pStyle w:val="TOC1"/>
         <w:tabs>
-          <w:tab w:pos="480" w:val="left"/>
-          <w:tab w:pos="9113" w:val="right" w:leader="dot"/>
+          <w:tab w:pos="964" w:val="left"/>
+          <w:tab w:pos="9900" w:val="right" w:leader="dot"/>
         </w:tabs>
-      </w:pPr>
-      <w:r>
-        <w:t>6.5.2.</w:t>
+        <w:ind w:left="0"/>
+      </w:pPr>
+      <w:r>
         <w:tab/>
-        <w:t>Сценарио 2 — грешка (пад зависности)</w:t>
+        <w:t>6.5.2. Сценарио 2 — грешка (пад зависности)</w:t>
         <w:tab/>
         <w:t>16</w:t>
       </w:r>
     </w:p>
     <w:p>
       <w:pPr>
-        <w:pStyle w:val="TOC3"/>
+        <w:pStyle w:val="TOC1"/>
         <w:tabs>
-          <w:tab w:pos="480" w:val="left"/>
-          <w:tab w:pos="9113" w:val="right" w:leader="dot"/>
+          <w:tab w:pos="964" w:val="left"/>
+          <w:tab w:pos="9900" w:val="right" w:leader="dot"/>
         </w:tabs>
-      </w:pPr>
-      <w:r>
-        <w:t>6.5.3.</w:t>
+        <w:ind w:left="0"/>
+      </w:pPr>
+      <w:r>
         <w:tab/>
-        <w:t>Сценарио 3 — повећано оптерећење</w:t>
+        <w:t>6.5.3. Сценарио 3 — повећано оптерећење</w:t>
         <w:tab/>
         <w:t>17</w:t>
       </w:r>
     </w:p>
     <w:p>
       <w:pPr>
-        <w:pStyle w:val="TOC3"/>
+        <w:pStyle w:val="TOC1"/>
         <w:tabs>
-          <w:tab w:pos="480" w:val="left"/>
-          <w:tab w:pos="9113" w:val="right" w:leader="dot"/>
+          <w:tab w:pos="964" w:val="left"/>
+          <w:tab w:pos="9900" w:val="right" w:leader="dot"/>
         </w:tabs>
-      </w:pPr>
-      <w:r>
-        <w:t>6.5.4.</w:t>
+        <w:ind w:left="0"/>
+      </w:pPr>
+      <w:r>
         <w:tab/>
-        <w:t>Сценарио 4 — спора зависност (уско грло)</w:t>
+        <w:t>6.5.4. Сценарио 4 — спора зависност (уско грло)</w:t>
         <w:tab/>
         <w:t>17</w:t>
       </w:r>
@@ -7832,16 +7832,16 @@
     </w:p>
     <w:p>
       <w:pPr>
-        <w:pStyle w:val="TOC2"/>
+        <w:pStyle w:val="TOC1"/>
         <w:tabs>
-          <w:tab w:pos="480" w:val="left"/>
-          <w:tab w:pos="9113" w:val="right" w:leader="dot"/>
+          <w:tab w:pos="567" w:val="left"/>
+          <w:tab w:pos="9900" w:val="right" w:leader="dot"/>
         </w:tabs>
-      </w:pPr>
-      <w:r>
-        <w:t>7.1.</w:t>
+        <w:ind w:left="0"/>
+      </w:pPr>
+      <w:r>
         <w:tab/>
-        <w:t>Правци даљег развоја</w:t>
+        <w:t>7.1. Правци даљег развоја</w:t>
         <w:tab/>
         <w:t>19</w:t>
       </w:r>

</xml_diff>